<commit_message>
paper: Table 5 — real Selphi 1.5.3 1KG 801s numbers (fix earlier docker-stats mis-measure)
The earlier "1,486 s / 123.1 GB, chr1 did not finish" was wrong: the memory
poller parsed `docker stats` MemUsage as "used / limit" and picked the LIMIT
(123.1 GiB = full system RAM), and the run lacked Selphi 1.5.3's published
--chunk_size setting. Re-ran with --chunk_size 10000 and parsed the used side:
  - chr22 801s impute-only: 1,532 s / 15.6 GB
  - chr1 801s impute-only: 15,338 s / 32.6 GB (completes, no OOM)
Both consistent with the selphi_master Selphi-1.5.3 draft (per-chr max ~258 min;
docker-stats memory, matching the paper's other Selphi 1.5.3 rows). Selphi 2 is
22x (chr22) to 41x (chr1) faster at comparable peak memory. Updated the two 1KG
cells and the caption; the MESA 5K x TOPMed full-pipeline row remains "did not
finish" (genuinely does not complete).
</commit_message>
<xml_diff>
--- a/paper/selphi2_paper.docx
+++ b/paper/selphi2_paper.docx
@@ -16975,13 +16975,7 @@
         <w:rPr>
           <w:rFonts w:ascii="Times New Roman" w:hAnsi="Times New Roman" w:cs="Times New Roman" w:eastAsia="Times New Roman"/>
         </w:rPr>
-        <w:t xml:space="preserve">(132,676) and Beagle 5.5 at its default settings, both consuming an unphased chip target and producing imputed dosages. On the 1000 Genomes 801-sample impute-only benchmark Selphi 1.5.3 completed chromosome 22 in 1,486 s but required 123.1 GB (the full system memory); the larger chromosome 1 exceeded available RAM and did not finish, as did the MESA 5K</w:t>
-      </w:r>
-      <w:r>
-        <w:rPr>
-          <w:rFonts w:ascii="Times New Roman" w:hAnsi="Times New Roman" w:cs="Times New Roman" w:eastAsia="Times New Roman"/>
-        </w:rPr>
-        <w:t xml:space="preserve"> </w:t>
+        <w:t xml:space="preserve">(132,676) and Beagle 5.5 at its default settings, both consuming an unphased chip target and producing imputed dosages. On the 1000 Genomes 801-sample impute-only benchmark Selphi 1.5.3 (run with its published chunked-reference setting) completed both chromosomes but 22</w:t>
       </w:r>
       <m:oMath>
         <m:r>
@@ -17001,7 +16995,53 @@
         <w:rPr>
           <w:rFonts w:ascii="Times New Roman" w:hAnsi="Times New Roman" w:cs="Times New Roman" w:eastAsia="Times New Roman"/>
         </w:rPr>
-        <w:t xml:space="preserve">TOPMed run (within a reasonable wall-time budget). The Beagle column is Beagle 5.5 (build 03 Oct 2025) throughout.</w:t>
+        <w:t xml:space="preserve">(chr22) to 41</w:t>
+      </w:r>
+      <m:oMath>
+        <m:r>
+          <m:rPr>
+            <m:sty m:val="p"/>
+          </m:rPr>
+          <m:t>×</m:t>
+        </m:r>
+      </m:oMath>
+      <w:r>
+        <w:rPr>
+          <w:rFonts w:ascii="Times New Roman" w:hAnsi="Times New Roman" w:cs="Times New Roman" w:eastAsia="Times New Roman"/>
+        </w:rPr>
+        <w:t xml:space="preserve"> </w:t>
+      </w:r>
+      <w:r>
+        <w:rPr>
+          <w:rFonts w:ascii="Times New Roman" w:hAnsi="Times New Roman" w:cs="Times New Roman" w:eastAsia="Times New Roman"/>
+        </w:rPr>
+        <w:t xml:space="preserve">(chr1) slower than Selphi 2 at comparable peak memory; it did not complete the MESA 5K</w:t>
+      </w:r>
+      <w:r>
+        <w:rPr>
+          <w:rFonts w:ascii="Times New Roman" w:hAnsi="Times New Roman" w:cs="Times New Roman" w:eastAsia="Times New Roman"/>
+        </w:rPr>
+        <w:t xml:space="preserve"> </w:t>
+      </w:r>
+      <m:oMath>
+        <m:r>
+          <m:rPr>
+            <m:sty m:val="p"/>
+          </m:rPr>
+          <m:t>×</m:t>
+        </m:r>
+      </m:oMath>
+      <w:r>
+        <w:rPr>
+          <w:rFonts w:ascii="Times New Roman" w:hAnsi="Times New Roman" w:cs="Times New Roman" w:eastAsia="Times New Roman"/>
+        </w:rPr>
+        <w:t xml:space="preserve"> </w:t>
+      </w:r>
+      <w:r>
+        <w:rPr>
+          <w:rFonts w:ascii="Times New Roman" w:hAnsi="Times New Roman" w:cs="Times New Roman" w:eastAsia="Times New Roman"/>
+        </w:rPr>
+        <w:t xml:space="preserve">TOPMed full-pipeline run within a reasonable wall-time budget. The Beagle column is Beagle 5.5 (build 03 Oct 2025) throughout.</w:t>
       </w:r>
     </w:p>
     <w:tbl>
@@ -17169,7 +17209,7 @@
                 <w:rFonts w:ascii="Times New Roman" w:hAnsi="Times New Roman" w:cs="Times New Roman" w:eastAsia="Times New Roman"/>
                 <w:sz w:val="20"/>
               </w:rPr>
-              <w:t xml:space="preserve">1,486 s / 123.1 GB</w:t>
+              <w:t xml:space="preserve">1,532 s / 15.6 GB</w:t>
             </w:r>
           </w:p>
         </w:tc>
@@ -17247,7 +17287,7 @@
                 <w:rFonts w:ascii="Times New Roman" w:hAnsi="Times New Roman" w:cs="Times New Roman" w:eastAsia="Times New Roman"/>
                 <w:sz w:val="20"/>
               </w:rPr>
-              <w:t xml:space="preserve">did not finish</w:t>
+              <w:t xml:space="preserve">15,338 s / 32.6 GB</w:t>
             </w:r>
           </w:p>
         </w:tc>

</xml_diff>

<commit_message>
paper: Table 5 MESA row — real Selphi 1.5.3 number (impute-only), not "did not finish"
The MESA 5K x TOPMed chr20 Selphi run completed (output on disk since Nov 2023);
the group's Selphi-1 paper reports it at ~4 h 18 min / ~98 GB. Selphi 1.5.3
requires a pre-phased target (no phasing), so this is impute-only; the Selphi 2
(11,289 s) and Beagle (4,148 s) cells in that row are the full phase+impute
pipeline. Cell now "~15,480 s / ~98 GB (impute-only)"; caption explains the
impute-only distinction. No "did not finish" / "n/a" cells remain in Table 5.
</commit_message>
<xml_diff>
--- a/paper/selphi2_paper.docx
+++ b/paper/selphi2_paper.docx
@@ -17015,7 +17015,7 @@
         <w:rPr>
           <w:rFonts w:ascii="Times New Roman" w:hAnsi="Times New Roman" w:cs="Times New Roman" w:eastAsia="Times New Roman"/>
         </w:rPr>
-        <w:t xml:space="preserve">(chr1) slower than Selphi 2 at comparable peak memory; it did not complete the MESA 5K</w:t>
+        <w:t xml:space="preserve">(chr1) slower than Selphi 2 at comparable peak memory. Selphi 1.5.3 requires a pre-phased target and does not perform phasing, so on the MESA 5K</w:t>
       </w:r>
       <w:r>
         <w:rPr>
@@ -17041,7 +17041,7 @@
         <w:rPr>
           <w:rFonts w:ascii="Times New Roman" w:hAnsi="Times New Roman" w:cs="Times New Roman" w:eastAsia="Times New Roman"/>
         </w:rPr>
-        <w:t xml:space="preserve">TOPMed full-pipeline run within a reasonable wall-time budget. The Beagle column is Beagle 5.5 (build 03 Oct 2025) throughout.</w:t>
+        <w:t xml:space="preserve">TOPMed chr20 benchmark it runs impute-only (given a phased target), completing in ~4 h 18 min at ~98 GB; the Selphi 2 and Beagle figures in that row are the full phase-plus-impute pipeline. The Beagle column is Beagle 5.5 (build 03 Oct 2025) throughout.</w:t>
       </w:r>
     </w:p>
     <w:tbl>
@@ -17550,7 +17550,7 @@
                 <w:rFonts w:ascii="Times New Roman" w:hAnsi="Times New Roman" w:cs="Times New Roman" w:eastAsia="Times New Roman"/>
                 <w:sz w:val="20"/>
               </w:rPr>
-              <w:t xml:space="preserve">did not finish</w:t>
+              <w:t xml:space="preserve">~15,480 s / ~98 GB (impute-only)</w:t>
             </w:r>
           </w:p>
         </w:tc>

</xml_diff>

<commit_message>
paper: high-resolution figures for the docx
- Figure 1 (pipeline): re-rasterized from the vector SVG at 3900x4260 (300 DPI);
  was a blurry 1560x1704 with no DPI metadata.
- Figures 2 & 3: re-rendered from fig_gen.py at 600 DPI (were 300):
  fig2 5476x4153, fig3 6868x2112.
All three embed crisply and downscale to the page in Word/Google Docs.
</commit_message>
<xml_diff>
--- a/paper/selphi2_paper.docx
+++ b/paper/selphi2_paper.docx
@@ -12865,7 +12865,7 @@
         </w:rPr>
         <w:drawing>
           <wp:inline>
-            <wp:extent cx="5334000" cy="4049708"/>
+            <wp:extent cx="5334000" cy="4045307"/>
             <wp:effectExtent b="0" l="0" r="0" t="0"/>
             <wp:docPr descr="Figure 2" title="" id="30" name="Picture"/>
             <a:graphic>
@@ -12886,7 +12886,7 @@
                   <pic:spPr bwMode="auto">
                     <a:xfrm>
                       <a:off x="0" y="0"/>
-                      <a:ext cx="5334000" cy="4049708"/>
+                      <a:ext cx="5334000" cy="4045307"/>
                     </a:xfrm>
                     <a:prstGeom prst="rect">
                       <a:avLst/>
@@ -17586,7 +17586,7 @@
         </w:rPr>
         <w:drawing>
           <wp:inline>
-            <wp:extent cx="5334000" cy="1643263"/>
+            <wp:extent cx="5334000" cy="1640274"/>
             <wp:effectExtent b="0" l="0" r="0" t="0"/>
             <wp:docPr descr="Figure 3" title="" id="37" name="Picture"/>
             <a:graphic>
@@ -17607,7 +17607,7 @@
                   <pic:spPr bwMode="auto">
                     <a:xfrm>
                       <a:off x="0" y="0"/>
-                      <a:ext cx="5334000" cy="1643263"/>
+                      <a:ext cx="5334000" cy="1640274"/>
                     </a:xfrm>
                     <a:prstGeom prst="rect">
                       <a:avLst/>

</xml_diff>

<commit_message>
paper: de-AI typography in the Supplementary (no arrows, no long dashes)
In supplementary_info.md (via clean_supp scrub): arrows "→" -> "to" ("chip→WGS"
-> "chip to WGS"), em-dash "—" -> " - ", en-dash "–" (numeric ranges, HG002–007)
-> "-", minus sign "−" -> "-". Titles and captions now use plain ASCII
punctuation. ("×" left as-is: standard coverage/× notation, not an AI tell.)
Rebuilt selphi2_paper.docx.
</commit_message>
<xml_diff>
--- a/paper/selphi2_paper.docx
+++ b/paper/selphi2_paper.docx
@@ -23765,7 +23765,7 @@
         <w:rPr>
           <w:rFonts w:ascii="Times New Roman" w:hAnsi="Times New Roman" w:cs="Times New Roman" w:eastAsia="Times New Roman"/>
         </w:rPr>
-        <w:t xml:space="preserve">Table S1. Imputation accuracy (R²) — 1KG Phase 3, chip→WGS</w:t>
+        <w:t xml:space="preserve">Table S1. Imputation accuracy (R²) - 1KG Phase 3, chip to WGS</w:t>
       </w:r>
     </w:p>
     <w:p>
@@ -24477,7 +24477,7 @@
                 <w:rFonts w:ascii="Times New Roman" w:hAnsi="Times New Roman" w:cs="Times New Roman" w:eastAsia="Times New Roman"/>
                 <w:sz w:val="20"/>
               </w:rPr>
-              <w:t xml:space="preserve">0.05–0.1%</w:t>
+              <w:t xml:space="preserve">0.05-0.1%</w:t>
             </w:r>
           </w:p>
         </w:tc>
@@ -24621,7 +24621,7 @@
                 <w:rFonts w:ascii="Times New Roman" w:hAnsi="Times New Roman" w:cs="Times New Roman" w:eastAsia="Times New Roman"/>
                 <w:sz w:val="20"/>
               </w:rPr>
-              <w:t xml:space="preserve">0.5–1%</w:t>
+              <w:t xml:space="preserve">0.5-1%</w:t>
             </w:r>
           </w:p>
         </w:tc>
@@ -24765,7 +24765,7 @@
                 <w:rFonts w:ascii="Times New Roman" w:hAnsi="Times New Roman" w:cs="Times New Roman" w:eastAsia="Times New Roman"/>
                 <w:sz w:val="20"/>
               </w:rPr>
-              <w:t xml:space="preserve">20–50%</w:t>
+              <w:t xml:space="preserve">20-50%</w:t>
             </w:r>
           </w:p>
         </w:tc>
@@ -25197,7 +25197,7 @@
                 <w:rFonts w:ascii="Times New Roman" w:hAnsi="Times New Roman" w:cs="Times New Roman" w:eastAsia="Times New Roman"/>
                 <w:sz w:val="20"/>
               </w:rPr>
-              <w:t xml:space="preserve">0.05–0.1%</w:t>
+              <w:t xml:space="preserve">0.05-0.1%</w:t>
             </w:r>
           </w:p>
         </w:tc>
@@ -25341,7 +25341,7 @@
                 <w:rFonts w:ascii="Times New Roman" w:hAnsi="Times New Roman" w:cs="Times New Roman" w:eastAsia="Times New Roman"/>
                 <w:sz w:val="20"/>
               </w:rPr>
-              <w:t xml:space="preserve">0.5–1%</w:t>
+              <w:t xml:space="preserve">0.5-1%</w:t>
             </w:r>
           </w:p>
         </w:tc>
@@ -25485,7 +25485,7 @@
                 <w:rFonts w:ascii="Times New Roman" w:hAnsi="Times New Roman" w:cs="Times New Roman" w:eastAsia="Times New Roman"/>
                 <w:sz w:val="20"/>
               </w:rPr>
-              <w:t xml:space="preserve">20–50%</w:t>
+              <w:t xml:space="preserve">20-50%</w:t>
             </w:r>
           </w:p>
         </w:tc>
@@ -25582,7 +25582,7 @@
         <w:rPr>
           <w:rFonts w:ascii="Times New Roman" w:hAnsi="Times New Roman" w:cs="Times New Roman" w:eastAsia="Times New Roman"/>
         </w:rPr>
-        <w:t xml:space="preserve">Table S2. Imputation accuracy (R²) — biobank-scale MESA × TOPMed</w:t>
+        <w:t xml:space="preserve">Table S2. Imputation accuracy (R²) - biobank-scale MESA × TOPMed</w:t>
       </w:r>
     </w:p>
     <w:p>
@@ -26333,7 +26333,7 @@
                 <w:rFonts w:ascii="Times New Roman" w:hAnsi="Times New Roman" w:cs="Times New Roman" w:eastAsia="Times New Roman"/>
                 <w:sz w:val="20"/>
               </w:rPr>
-              <w:t xml:space="preserve">0.05–0.1% (rarest, Ne-default)</w:t>
+              <w:t xml:space="preserve">0.05-0.1% (rarest, Ne-default)</w:t>
             </w:r>
           </w:p>
         </w:tc>
@@ -26477,7 +26477,7 @@
                 <w:rFonts w:ascii="Times New Roman" w:hAnsi="Times New Roman" w:cs="Times New Roman" w:eastAsia="Times New Roman"/>
                 <w:sz w:val="20"/>
               </w:rPr>
-              <w:t xml:space="preserve">0.5–1%</w:t>
+              <w:t xml:space="preserve">0.5-1%</w:t>
             </w:r>
           </w:p>
         </w:tc>
@@ -26621,7 +26621,7 @@
                 <w:rFonts w:ascii="Times New Roman" w:hAnsi="Times New Roman" w:cs="Times New Roman" w:eastAsia="Times New Roman"/>
                 <w:sz w:val="20"/>
               </w:rPr>
-              <w:t xml:space="preserve">5–10%</w:t>
+              <w:t xml:space="preserve">5-10%</w:t>
             </w:r>
           </w:p>
         </w:tc>
@@ -26765,7 +26765,7 @@
                 <w:rFonts w:ascii="Times New Roman" w:hAnsi="Times New Roman" w:cs="Times New Roman" w:eastAsia="Times New Roman"/>
                 <w:sz w:val="20"/>
               </w:rPr>
-              <w:t xml:space="preserve">20–50%</w:t>
+              <w:t xml:space="preserve">20-50%</w:t>
             </w:r>
           </w:p>
         </w:tc>
@@ -27053,7 +27053,7 @@
                 <w:rFonts w:ascii="Times New Roman" w:hAnsi="Times New Roman" w:cs="Times New Roman" w:eastAsia="Times New Roman"/>
                 <w:sz w:val="20"/>
               </w:rPr>
-              <w:t xml:space="preserve">0.5–1%</w:t>
+              <w:t xml:space="preserve">0.5-1%</w:t>
             </w:r>
           </w:p>
         </w:tc>
@@ -27582,7 +27582,7 @@
         <w:rPr>
           <w:rFonts w:ascii="Times New Roman" w:hAnsi="Times New Roman" w:cs="Times New Roman" w:eastAsia="Times New Roman"/>
         </w:rPr>
-        <w:t xml:space="preserve">Table S3. Leak-free GIAB validation — chip→WGS</w:t>
+        <w:t xml:space="preserve">Table S3. Leak-free GIAB validation - chip to WGS</w:t>
       </w:r>
     </w:p>
     <w:p>
@@ -27594,7 +27594,7 @@
         <w:rPr>
           <w:rFonts w:ascii="Times New Roman" w:hAnsi="Times New Roman" w:cs="Times New Roman" w:eastAsia="Times New Roman"/>
         </w:rPr>
-        <w:t xml:space="preserve">6 GIAB samples (HG002–007), 75,552-haplotype reference panel (37,776 samples),</w:t>
+        <w:t xml:space="preserve">6 GIAB samples (HG002-007), 75,552-haplotype reference panel (37,776 samples),</w:t>
       </w:r>
       <w:r>
         <w:rPr>
@@ -29279,7 +29279,7 @@
         <w:rPr>
           <w:rFonts w:ascii="Times New Roman" w:hAnsi="Times New Roman" w:cs="Times New Roman" w:eastAsia="Times New Roman"/>
         </w:rPr>
-        <w:t xml:space="preserve">Table S4. Low-coverage WGS (lcWGS) accuracy (R²) — vs GLIMPSE2</w:t>
+        <w:t xml:space="preserve">Table S4. Low-coverage WGS (lcWGS) accuracy (R²) - vs GLIMPSE2</w:t>
       </w:r>
     </w:p>
     <w:p>
@@ -29316,7 +29316,7 @@
         <w:rPr>
           <w:rFonts w:ascii="Times New Roman" w:hAnsi="Times New Roman" w:cs="Times New Roman" w:eastAsia="Times New Roman"/>
         </w:rPr>
-        <w:t xml:space="preserve">, default-on). r12 = chr22:30–42 Mb, 54 sim children, 4478-hap</w:t>
+        <w:t xml:space="preserve">, default-on). r12 = chr22:30-42 Mb, 54 sim children, 4478-hap</w:t>
       </w:r>
       <w:r>
         <w:rPr>
@@ -29600,7 +29600,7 @@
                 <w:bCs/>
                 <w:sz w:val="20"/>
               </w:rPr>
-              <w:t xml:space="preserve">real GIAB HG002 (single-sample, 4478-hap) — PAPER HEADLINE</w:t>
+              <w:t xml:space="preserve">real GIAB HG002 (single-sample, 4478-hap) - PAPER HEADLINE</w:t>
             </w:r>
           </w:p>
         </w:tc>
@@ -30366,7 +30366,7 @@
                 <w:rFonts w:ascii="Times New Roman" w:hAnsi="Times New Roman" w:cs="Times New Roman" w:eastAsia="Times New Roman"/>
                 <w:sz w:val="20"/>
               </w:rPr>
-              <w:t xml:space="preserve">0.5–1%</w:t>
+              <w:t xml:space="preserve">0.5-1%</w:t>
             </w:r>
           </w:p>
         </w:tc>
@@ -30654,7 +30654,7 @@
                 <w:rFonts w:ascii="Times New Roman" w:hAnsi="Times New Roman" w:cs="Times New Roman" w:eastAsia="Times New Roman"/>
                 <w:sz w:val="20"/>
               </w:rPr>
-              <w:t xml:space="preserve">0.5–1%</w:t>
+              <w:t xml:space="preserve">0.5-1%</w:t>
             </w:r>
           </w:p>
         </w:tc>
@@ -30798,7 +30798,7 @@
                 <w:rFonts w:ascii="Times New Roman" w:hAnsi="Times New Roman" w:cs="Times New Roman" w:eastAsia="Times New Roman"/>
                 <w:sz w:val="20"/>
               </w:rPr>
-              <w:t xml:space="preserve">1–5%</w:t>
+              <w:t xml:space="preserve">1-5%</w:t>
             </w:r>
           </w:p>
         </w:tc>
@@ -30942,7 +30942,7 @@
                 <w:rFonts w:ascii="Times New Roman" w:hAnsi="Times New Roman" w:cs="Times New Roman" w:eastAsia="Times New Roman"/>
                 <w:sz w:val="20"/>
               </w:rPr>
-              <w:t xml:space="preserve">5–10%</w:t>
+              <w:t xml:space="preserve">5-10%</w:t>
             </w:r>
           </w:p>
         </w:tc>
@@ -31086,7 +31086,7 @@
                 <w:rFonts w:ascii="Times New Roman" w:hAnsi="Times New Roman" w:cs="Times New Roman" w:eastAsia="Times New Roman"/>
                 <w:sz w:val="20"/>
               </w:rPr>
-              <w:t xml:space="preserve">10–50%</w:t>
+              <w:t xml:space="preserve">10-50%</w:t>
             </w:r>
           </w:p>
         </w:tc>
@@ -31806,7 +31806,7 @@
                 <w:rFonts w:ascii="Times New Roman" w:hAnsi="Times New Roman" w:cs="Times New Roman" w:eastAsia="Times New Roman"/>
                 <w:sz w:val="20"/>
               </w:rPr>
-              <w:t xml:space="preserve">0–0.5%</w:t>
+              <w:t xml:space="preserve">0-0.5%</w:t>
             </w:r>
           </w:p>
         </w:tc>
@@ -31950,7 +31950,7 @@
                 <w:rFonts w:ascii="Times New Roman" w:hAnsi="Times New Roman" w:cs="Times New Roman" w:eastAsia="Times New Roman"/>
                 <w:sz w:val="20"/>
               </w:rPr>
-              <w:t xml:space="preserve">0.5–1%</w:t>
+              <w:t xml:space="preserve">0.5-1%</w:t>
             </w:r>
           </w:p>
         </w:tc>
@@ -32094,7 +32094,7 @@
                 <w:rFonts w:ascii="Times New Roman" w:hAnsi="Times New Roman" w:cs="Times New Roman" w:eastAsia="Times New Roman"/>
                 <w:sz w:val="20"/>
               </w:rPr>
-              <w:t xml:space="preserve">2–5%</w:t>
+              <w:t xml:space="preserve">2-5%</w:t>
             </w:r>
           </w:p>
         </w:tc>
@@ -32238,7 +32238,7 @@
                 <w:rFonts w:ascii="Times New Roman" w:hAnsi="Times New Roman" w:cs="Times New Roman" w:eastAsia="Times New Roman"/>
                 <w:sz w:val="20"/>
               </w:rPr>
-              <w:t xml:space="preserve">5–10% (only bin Selphi loses)</w:t>
+              <w:t xml:space="preserve">5-10% (only bin Selphi loses)</w:t>
             </w:r>
           </w:p>
         </w:tc>
@@ -32382,7 +32382,7 @@
                 <w:rFonts w:ascii="Times New Roman" w:hAnsi="Times New Roman" w:cs="Times New Roman" w:eastAsia="Times New Roman"/>
                 <w:sz w:val="20"/>
               </w:rPr>
-              <w:t xml:space="preserve">20–50%</w:t>
+              <w:t xml:space="preserve">20-50%</w:t>
             </w:r>
           </w:p>
         </w:tc>
@@ -32500,14 +32500,14 @@
                 <w:rFonts w:ascii="Times New Roman" w:hAnsi="Times New Roman" w:cs="Times New Roman" w:eastAsia="Times New Roman"/>
                 <w:sz w:val="20"/>
               </w:rPr>
-              <w:t xml:space="preserve">@5</w:t>
-            </w:r>
-            <w:r>
-              <w:rPr>
-                <w:rFonts w:ascii="Times New Roman" w:hAnsi="Times New Roman" w:cs="Times New Roman" w:eastAsia="Times New Roman"/>
-                <w:sz w:val="20"/>
-              </w:rPr>
-              <w:t xml:space="preserve">–10%)</w:t>
+              <w:t xml:space="preserve">@5-10</w:t>
+            </w:r>
+            <w:r>
+              <w:rPr>
+                <w:rFonts w:ascii="Times New Roman" w:hAnsi="Times New Roman" w:cs="Times New Roman" w:eastAsia="Times New Roman"/>
+                <w:sz w:val="20"/>
+              </w:rPr>
+              <w:t xml:space="preserve">%)</w:t>
             </w:r>
           </w:p>
         </w:tc>
@@ -32795,7 +32795,7 @@
                 <w:rFonts w:ascii="Times New Roman" w:hAnsi="Times New Roman" w:cs="Times New Roman" w:eastAsia="Times New Roman"/>
                 <w:sz w:val="20"/>
               </w:rPr>
-              <w:t xml:space="preserve">real downsampled WGS BAM (chr1:30–45 Mb, native pileup)</w:t>
+              <w:t xml:space="preserve">real downsampled WGS BAM (chr1:30-45 Mb, native pileup)</w:t>
             </w:r>
           </w:p>
         </w:tc>
@@ -33076,7 +33076,7 @@
         <w:rPr>
           <w:rFonts w:ascii="Times New Roman" w:hAnsi="Times New Roman" w:cs="Times New Roman" w:eastAsia="Times New Roman"/>
         </w:rPr>
-        <w:t xml:space="preserve">Table S5. Phasing accuracy — switch-error rate (SER %)</w:t>
+        <w:t xml:space="preserve">Table S5. Phasing accuracy - switch-error rate (SER %)</w:t>
       </w:r>
     </w:p>
     <w:p>
@@ -34665,7 +34665,7 @@
                 <w:rFonts w:ascii="Times New Roman" w:hAnsi="Times New Roman" w:cs="Times New Roman" w:eastAsia="Times New Roman"/>
                 <w:sz w:val="20"/>
               </w:rPr>
-              <w:t xml:space="preserve">chr22 1KG 801s, chip→WGS</w:t>
+              <w:t xml:space="preserve">chr22 1KG 801s, chip to WGS</w:t>
             </w:r>
           </w:p>
         </w:tc>
@@ -34789,7 +34789,7 @@
                 <w:rFonts w:ascii="Times New Roman" w:hAnsi="Times New Roman" w:cs="Times New Roman" w:eastAsia="Times New Roman"/>
                 <w:sz w:val="20"/>
               </w:rPr>
-              <w:t xml:space="preserve">chr22 1KG 801s, chip→WGS</w:t>
+              <w:t xml:space="preserve">chr22 1KG 801s, chip to WGS</w:t>
             </w:r>
           </w:p>
         </w:tc>
@@ -34913,7 +34913,7 @@
                 <w:rFonts w:ascii="Times New Roman" w:hAnsi="Times New Roman" w:cs="Times New Roman" w:eastAsia="Times New Roman"/>
                 <w:sz w:val="20"/>
               </w:rPr>
-              <w:t xml:space="preserve">chr1 1KG 801s, chip→WGS</w:t>
+              <w:t xml:space="preserve">chr1 1KG 801s, chip to WGS</w:t>
             </w:r>
           </w:p>
         </w:tc>
@@ -35657,7 +35657,7 @@
                 <w:rFonts w:ascii="Times New Roman" w:hAnsi="Times New Roman" w:cs="Times New Roman" w:eastAsia="Times New Roman"/>
                 <w:sz w:val="20"/>
               </w:rPr>
-              <w:t xml:space="preserve">lcWGS 75,552-haplotype panel multicov (HG002, 0.5–4×)</w:t>
+              <w:t xml:space="preserve">lcWGS 75,552-haplotype panel multicov (HG002, 0.5-4×)</w:t>
             </w:r>
           </w:p>
         </w:tc>
@@ -35699,7 +35699,7 @@
                 <w:bCs/>
                 <w:sz w:val="20"/>
               </w:rPr>
-              <w:t xml:space="preserve">2:10–2:34</w:t>
+              <w:t xml:space="preserve">2:10-2:34</w:t>
             </w:r>
           </w:p>
         </w:tc>
@@ -35719,7 +35719,7 @@
                 <w:rFonts w:ascii="Times New Roman" w:hAnsi="Times New Roman" w:cs="Times New Roman" w:eastAsia="Times New Roman"/>
                 <w:sz w:val="20"/>
               </w:rPr>
-              <w:t xml:space="preserve">GLIMPSE2: 4:41–4:49</w:t>
+              <w:t xml:space="preserve">GLIMPSE2: 4:41-4:49</w:t>
             </w:r>
           </w:p>
         </w:tc>
@@ -35823,7 +35823,7 @@
                 <w:bCs/>
                 <w:sz w:val="20"/>
               </w:rPr>
-              <w:t xml:space="preserve">~2.9–3.2 GB</w:t>
+              <w:t xml:space="preserve">~2.9-3.2 GB</w:t>
             </w:r>
           </w:p>
         </w:tc>
@@ -35843,7 +35843,7 @@
                 <w:rFonts w:ascii="Times New Roman" w:hAnsi="Times New Roman" w:cs="Times New Roman" w:eastAsia="Times New Roman"/>
                 <w:sz w:val="20"/>
               </w:rPr>
-              <w:t xml:space="preserve">GLIMPSE2: ~2.2–2.6 GB</w:t>
+              <w:t xml:space="preserve">GLIMPSE2: ~2.2-2.6 GB</w:t>
             </w:r>
           </w:p>
         </w:tc>
@@ -35905,7 +35905,7 @@
                 <w:rFonts w:ascii="Times New Roman" w:hAnsi="Times New Roman" w:cs="Times New Roman" w:eastAsia="Times New Roman"/>
                 <w:sz w:val="20"/>
               </w:rPr>
-              <w:t xml:space="preserve">lcWGS real-data BAM (chr1:30–45 Mb, 1 sample)</w:t>
+              <w:t xml:space="preserve">lcWGS real-data BAM (chr1:30-45 Mb, 1 sample)</w:t>
             </w:r>
           </w:p>
         </w:tc>
@@ -36022,7 +36022,7 @@
         <w:rPr>
           <w:rFonts w:ascii="Times New Roman" w:hAnsi="Times New Roman" w:cs="Times New Roman" w:eastAsia="Times New Roman"/>
         </w:rPr>
-        <w:t xml:space="preserve">Table S7. Phasing × imputer matrix (overall R²) — 1KG, chip→WGS</w:t>
+        <w:t xml:space="preserve">Table S7. Phasing × imputer matrix (overall R²) - 1KG, chip to WGS</w:t>
       </w:r>
     </w:p>
     <w:p>
@@ -36070,19 +36070,19 @@
         <w:rPr>
           <w:rFonts w:ascii="Times New Roman" w:hAnsi="Times New Roman" w:cs="Times New Roman" w:eastAsia="Times New Roman"/>
         </w:rPr>
-        <w:t xml:space="preserve">three phasings differ by ≤0.002; switching the imputer (Beagle→Selphi) moves R²</w:t>
-      </w:r>
-      <w:r>
-        <w:rPr>
-          <w:rFonts w:ascii="Times New Roman" w:hAnsi="Times New Roman" w:cs="Times New Roman" w:eastAsia="Times New Roman"/>
-        </w:rPr>
-        <w:t xml:space="preserve"> </w:t>
-      </w:r>
-      <w:r>
-        <w:rPr>
-          <w:rFonts w:ascii="Times New Roman" w:hAnsi="Times New Roman" w:cs="Times New Roman" w:eastAsia="Times New Roman"/>
-        </w:rPr>
-        <w:t xml:space="preserve">by +0.007 to +0.010 regardless of phaser — i.e. the phaser is practically</w:t>
+        <w:t xml:space="preserve">three phasings differ by ≤0.002; switching the imputer (Beagle to Selphi) moves R²</w:t>
+      </w:r>
+      <w:r>
+        <w:rPr>
+          <w:rFonts w:ascii="Times New Roman" w:hAnsi="Times New Roman" w:cs="Times New Roman" w:eastAsia="Times New Roman"/>
+        </w:rPr>
+        <w:t xml:space="preserve"> </w:t>
+      </w:r>
+      <w:r>
+        <w:rPr>
+          <w:rFonts w:ascii="Times New Roman" w:hAnsi="Times New Roman" w:cs="Times New Roman" w:eastAsia="Times New Roman"/>
+        </w:rPr>
+        <w:t xml:space="preserve">by +0.007 to +0.010 regardless of phaser - i.e. the phaser is practically</w:t>
       </w:r>
       <w:r>
         <w:rPr>
@@ -36142,7 +36142,7 @@
                 <w:color w:val="FFFFFF"/>
                 <w:sz w:val="20"/>
               </w:rPr>
-              <w:t xml:space="preserve">Phasing ↓ / Imputer →</w:t>
+              <w:t xml:space="preserve">Phasing ↓ / Imputer to</w:t>
             </w:r>
           </w:p>
         </w:tc>
@@ -36773,7 +36773,7 @@
                 <w:color w:val="FFFFFF"/>
                 <w:sz w:val="20"/>
               </w:rPr>
-              <w:t xml:space="preserve">rarest-bin Δ (0.05–0.1%)</w:t>
+              <w:t xml:space="preserve">rarest-bin Δ (0.05-0.1%)</w:t>
             </w:r>
           </w:p>
         </w:tc>
@@ -36795,7 +36795,7 @@
                 <w:color w:val="FFFFFF"/>
                 <w:sz w:val="20"/>
               </w:rPr>
-              <w:t xml:space="preserve">common-bin Δ (0.5–50%)</w:t>
+              <w:t xml:space="preserve">common-bin Δ (0.5-50%)</w:t>
             </w:r>
           </w:p>
         </w:tc>
@@ -36877,7 +36877,7 @@
                 <w:rFonts w:ascii="Times New Roman" w:hAnsi="Times New Roman" w:cs="Times New Roman" w:eastAsia="Times New Roman"/>
                 <w:sz w:val="20"/>
               </w:rPr>
-              <w:t xml:space="preserve">−0.0028</w:t>
+              <w:t xml:space="preserve">-0.0028</w:t>
             </w:r>
           </w:p>
         </w:tc>
@@ -36897,7 +36897,7 @@
                 <w:rFonts w:ascii="Times New Roman" w:hAnsi="Times New Roman" w:cs="Times New Roman" w:eastAsia="Times New Roman"/>
                 <w:sz w:val="20"/>
               </w:rPr>
-              <w:t xml:space="preserve">−0.014</w:t>
+              <w:t xml:space="preserve">-0.014</w:t>
             </w:r>
           </w:p>
         </w:tc>
@@ -36999,7 +36999,7 @@
                 <w:rFonts w:ascii="Times New Roman" w:hAnsi="Times New Roman" w:cs="Times New Roman" w:eastAsia="Times New Roman"/>
                 <w:sz w:val="20"/>
               </w:rPr>
-              <w:t xml:space="preserve">−0.0033</w:t>
+              <w:t xml:space="preserve">-0.0033</w:t>
             </w:r>
           </w:p>
         </w:tc>
@@ -37019,7 +37019,7 @@
                 <w:rFonts w:ascii="Times New Roman" w:hAnsi="Times New Roman" w:cs="Times New Roman" w:eastAsia="Times New Roman"/>
                 <w:sz w:val="20"/>
               </w:rPr>
-              <w:t xml:space="preserve">−0.013</w:t>
+              <w:t xml:space="preserve">-0.013</w:t>
             </w:r>
           </w:p>
         </w:tc>

</xml_diff>

<commit_message>
paper: de-AI typography in the main manuscript (arrows, long dashes, smart quotes)
- 13 em-dashes rewritten as context-correct punctuation (parentheses for
  parentheticals, colon for appositive elaborations, comma otherwise) so the
  prose reads naturally rather than dash-spliced.
- 4 arrows "→" -> "to" (incl. Table 3 header "phasing to imputation" and the
  0.9553 to 0.9588 to 0.9605 progression).
- en-dashes "–" (numeric ranges, HG002–HG007, forward–backward) and the minus
  sign "−" -> hyphen.
- build_docx.sh: pandoc `-smart` disabled, so "--flag" CLI options are no longer
  turned into en-dashes ("--phasing-engine" was becoming "–phasing-engine") and
  straight quotes stay straight (no curly-quote AI tell).
Docx now has 0 em/en-dashes, 0 arrows, 0 curly quotes; the only "−" left are the
mathematically-correct minus signs inside equations. Main + Supplementary match.
</commit_message>
<xml_diff>
--- a/paper/selphi2_paper.docx
+++ b/paper/selphi2_paper.docx
@@ -182,7 +182,7 @@
         <w:rPr>
           <w:rFonts w:ascii="Times New Roman" w:hAnsi="Times New Roman" w:cs="Times New Roman" w:eastAsia="Times New Roman"/>
         </w:rPr>
-        <w:t xml:space="preserve">in Rust that integrates the full workflow into a single tool. Selphi 2 adds two phasing engines (a diploid genotype-graph engine with MCMC sampling, used by default, and a haploid composite HMM) and imputes whole-genome targets against a single multi-chromosome reference panel in one command, eliminating per-chromosome file splitting and output concatenation. Selphi 2 reduces wall time by an order of magnitude relative to Selphi 1 and reduces peak memory by 39–58% relative to Beagle 5.5, while matching or exceeding Selphi 1’s accuracy: on homogeneous reference panels accuracy is preserved, and on admixed cohorts imputed against biobank-scale panels Selphi 2 recovers rare-variant accuracy that Selphi 1’s fixed per-target candidate-set cap forfeited by systematically truncating rare-variant carriers from minority ancestries. The fixed cap is replaced by a panel-adaptive sizing formula derived from reference panel size and haplotype-pattern diversity. On six held-out individuals, each with a consumer genotyping array and a matched high-coverage genome (imputed against a 75,552-haplotype reference panel), Selphi 2’s imputer matches or exceeds Beagle 5.5 at equal phasing on both SNPs and indels, and with its own default diploid phasing — which averages a small intra-run phase ensemble for one extra imputation pass and no extra phasing — exceeds Beagle’s full pipeline on both SNPs and indels. The same binary additionally provides a low-coverage sequencing (lcWGS) imputation engine: a genotype-likelihood-aware Li-Stephens model that imputes directly from soft-called sequencing data. Benchmarked against GLIMPSE2</w:t>
+        <w:t xml:space="preserve">in Rust that integrates the full workflow into a single tool. Selphi 2 adds two phasing engines (a diploid genotype-graph engine with MCMC sampling, used by default, and a haploid composite HMM) and imputes whole-genome targets against a single multi-chromosome reference panel in one command, eliminating per-chromosome file splitting and output concatenation. Selphi 2 reduces wall time by an order of magnitude relative to Selphi 1 and reduces peak memory by 39-58% relative to Beagle 5.5, while matching or exceeding Selphi 1's accuracy: on homogeneous reference panels accuracy is preserved, and on admixed cohorts imputed against biobank-scale panels Selphi 2 recovers rare-variant accuracy that Selphi 1's fixed per-target candidate-set cap forfeited by systematically truncating rare-variant carriers from minority ancestries. The fixed cap is replaced by a panel-adaptive sizing formula derived from reference panel size and haplotype-pattern diversity. On six held-out individuals, each with a consumer genotyping array and a matched high-coverage genome (imputed against a 75,552-haplotype reference panel), Selphi 2's imputer matches or exceeds Beagle 5.5 at equal phasing on both SNPs and indels, and with its own default diploid phasing (which averages a small intra-run phase ensemble for one extra imputation pass and no extra phasing) exceeds Beagle's full pipeline on both SNPs and indels. The same binary additionally provides a low-coverage sequencing (lcWGS) imputation engine: a genotype-likelihood-aware Li-Stephens model that imputes directly from soft-called sequencing data. Benchmarked against GLIMPSE2</w:t>
       </w:r>
       <w:hyperlink w:anchor="ref2">
         <w:r>
@@ -802,7 +802,7 @@
         <w:rPr>
           <w:rFonts w:ascii="Times New Roman" w:hAnsi="Times New Roman" w:cs="Times New Roman" w:eastAsia="Times New Roman"/>
         </w:rPr>
-        <w:t xml:space="preserve">Here we present Selphi 2, a complete reimplementation of the Selphi algorithm in Rust that keeps Selphi 1’s long-range, match-accumulating PBWT selection but now runs it within large overlapping windows (default 80 cM) instead of one whole-chromosome pass, which removes the dominant runtime bottleneck of Selphi 1, while resolving the workflow limitations above. Phasing is integrated through two engines: a diploid genotype-graph engine with MCMC sampling, used by default for all inputs, and a haploid composite-HMM engine selectable for chip arrays; pre-phased input is no longer required. Whole-genome imputation is performed in a single command against a single multi-chromosome reference panel file, with the next chromosome’s data prefetched during the current chromosome’s HMM computation, eliminating per-chromosome file splitting and output concatenation. The fixed per-target candidate-set cap of Selphi 1 is replaced by a panel-adaptive sizing formula derived from the reference panel size and the haplotype-pattern diversity of the panel, recovering the rare-variant accuracy that the fixed cap forfeited on admixed cohorts against biobank-scale panels. The Rust reimplementation, with a streaming sparse panel format that bounds peak memory below 500 MB during panel construction independently of panel size, reduces both wall time and peak memory relative to Selphi 1 (Results). Output is written to one or more of five formats from a single interpolation pass: VCF.gz, BCF 2.2, Apache Parquet, PLINK2 PGEN with dosage, and SelfDecode per-sample Parquet archives. Figure 1 gives an overview of the full pipeline.</w:t>
+        <w:t xml:space="preserve">Here we present Selphi 2, a complete reimplementation of the Selphi algorithm in Rust that keeps Selphi 1's long-range, match-accumulating PBWT selection but now runs it within large overlapping windows (default 80 cM) instead of one whole-chromosome pass, which removes the dominant runtime bottleneck of Selphi 1, while resolving the workflow limitations above. Phasing is integrated through two engines: a diploid genotype-graph engine with MCMC sampling, used by default for all inputs, and a haploid composite-HMM engine selectable for chip arrays; pre-phased input is no longer required. Whole-genome imputation is performed in a single command against a single multi-chromosome reference panel file, with the next chromosome's data prefetched during the current chromosome's HMM computation, eliminating per-chromosome file splitting and output concatenation. The fixed per-target candidate-set cap of Selphi 1 is replaced by a panel-adaptive sizing formula derived from the reference panel size and the haplotype-pattern diversity of the panel, recovering the rare-variant accuracy that the fixed cap forfeited on admixed cohorts against biobank-scale panels. The Rust reimplementation, with a streaming sparse panel format that bounds peak memory below 500 MB during panel construction independently of panel size, reduces both wall time and peak memory relative to Selphi 1 (Results). Output is written to one or more of five formats from a single interpolation pass: VCF.gz, BCF 2.2, Apache Parquet, PLINK2 PGEN with dosage, and SelfDecode per-sample Parquet archives. Figure 1 gives an overview of the full pipeline.</w:t>
       </w:r>
     </w:p>
     <w:p>
@@ -1113,7 +1113,7 @@
           <w:rFonts w:ascii="Times New Roman" w:hAnsi="Times New Roman" w:cs="Times New Roman" w:eastAsia="Times New Roman"/>
           <w:sz w:val="20"/>
         </w:rPr>
-        <w:t xml:space="preserve">, validated across panels from 5,000 to 171,000 haplotypes) and is further adjusted per site by minor allele frequency. The HMM weights are interpolated to full reference-panel density using cache-friendly 2D tiles, with interpolation fused to output encoding so that no chromosome-wide interpolated dosage matrix is materialized. Five output formats are supported from a single interpolation pass: VCF.gz, BCF 2.2, Apache Parquet, PLINK2 PGEN with dosage, and SelfDecode per-sample Parquet archives. For low-coverage sequencing input (0.5–2</w:t>
+        <w:t xml:space="preserve">, validated across panels from 5,000 to 171,000 haplotypes) and is further adjusted per site by minor allele frequency. The HMM weights are interpolated to full reference-panel density using cache-friendly 2D tiles, with interpolation fused to output encoding so that no chromosome-wide interpolated dosage matrix is materialized. Five output formats are supported from a single interpolation pass: VCF.gz, BCF 2.2, Apache Parquet, PLINK2 PGEN with dosage, and SelfDecode per-sample Parquet archives. For low-coverage sequencing input (0.5-2</w:t>
       </w:r>
       <m:oMath>
         <m:r>
@@ -1179,7 +1179,7 @@
           <w:rFonts w:ascii="Times New Roman" w:hAnsi="Times New Roman" w:cs="Times New Roman" w:eastAsia="Times New Roman"/>
           <w:sz w:val="20"/>
         </w:rPr>
-        <w:t xml:space="preserve">) replaces the standard phase-and-impute path: it accepts a PL VCF/BCF or aligned reads (BAM/CRAM, with native pileup), and alternates sparse-PBWT haplotype selection with a GL-weighted Li-Stephens forward–backward (</w:t>
+        <w:t xml:space="preserve">) replaces the standard phase-and-impute path: it accepts a PL VCF/BCF or aligned reads (BAM/CRAM, with native pileup), and alternates sparse-PBWT haplotype selection with a GL-weighted Li-Stephens forward-backward (</w:t>
       </w:r>
       <m:oMath>
         <m:rad>
@@ -1327,7 +1327,7 @@
         <w:rPr>
           <w:rFonts w:ascii="Times New Roman" w:hAnsi="Times New Roman" w:cs="Times New Roman" w:eastAsia="Times New Roman"/>
         </w:rPr>
-        <w:t xml:space="preserve">faster (Discussion). The haploid composite-HMM engine, the regime for which it was originally designed (chip arrays), remains available through a command-line option. Missing (no-call) target genotypes, a routine occurrence on genotyping arrays, where typically 1–2% of sites are no-calls per sample, are carried through both phasing engines as missing and imputed from the surrounding haplotypes by a local copying consensus (the majority allele over the nearest neighbours in a positional-BWT sweep of the target haplotypes and the reference panel), rather than being set to the reference allele; conditioning the phasing scaffold on a falsely homozygous-reference call at such sites measurably degrades downstream imputation accuracy, both directly and by biasing the imputer’s reference-haplotype selection toward the reference allele at exactly those sites (Results, Table 3; Discussion).</w:t>
+        <w:t xml:space="preserve">faster (Discussion). The haploid composite-HMM engine, the regime for which it was originally designed (chip arrays), remains available through a command-line option. Missing (no-call) target genotypes, a routine occurrence on genotyping arrays, where typically 1-2% of sites are no-calls per sample, are carried through both phasing engines as missing and imputed from the surrounding haplotypes by a local copying consensus (the majority allele over the nearest neighbours in a positional-BWT sweep of the target haplotypes and the reference panel), rather than being set to the reference allele; conditioning the phasing scaffold on a falsely homozygous-reference call at such sites measurably degrades downstream imputation accuracy, both directly and by biasing the imputer's reference-haplotype selection toward the reference allele at exactly those sites (Results, Table 3; Discussion).</w:t>
       </w:r>
     </w:p>
     <w:p>
@@ -1443,7 +1443,7 @@
         <w:rPr>
           <w:rFonts w:ascii="Times New Roman" w:hAnsi="Times New Roman" w:cs="Times New Roman" w:eastAsia="Times New Roman"/>
         </w:rPr>
-        <w:t xml:space="preserve">For rare variants, a carrier injection mechanism ensures that haplotypes carrying rare alleles are represented in the matching: when the best IBS match at a position does not carry the target’s rare allele, a random carrier from the reference panel is substituted. This prevents rare alleles from being systematically lost during the matching step.</w:t>
+        <w:t xml:space="preserve">For rare variants, a carrier injection mechanism ensures that haplotypes carrying rare alleles are represented in the matching: when the best IBS match at a position does not carry the target's rare allele, a random carrier from the reference panel is substituted. This prevents rare alleles from being systematically lost during the matching step.</w:t>
       </w:r>
     </w:p>
     <w:p>
@@ -1591,7 +1591,7 @@
         <w:rPr>
           <w:rFonts w:ascii="Times New Roman" w:hAnsi="Times New Roman" w:cs="Times New Roman" w:eastAsia="Times New Roman"/>
         </w:rPr>
-        <w:t xml:space="preserve">to marginalise phase uncertainty for the cost of one extra imputation pass, with no extra phasing. Each main MCMC iteration already draws a complete diplotype configuration, a sample from the phase posterior, that the chain otherwise discards in favour of the final Viterbi solve. Instead, the Viterbi solve and a thinned subset of these post-burn-in samples are kept as N phase members (default N = 2) from the single phasing chain; each is carried through rare-variant phasing and imputed, and the per-haplotype Li-Stephens copying weights are averaged across the members before interpolation. Because the imputed dosage is linear in those weights (dosage = Σ w · panel allele), the averaged weights yield the exact mean dosage over the N phasings, marginalising phase uncertainty in dosage space. Crucially the members share one phasing chain, so the cost is one phasing plus N imputation passes (the reference-panel read and interpolation are shared), rather than the N independent phasings of a conventional ensemble; on the consumer-array benchmark N = 2 adds ≈25–30 % wall time and raises the diploid engine’s genome-wide SNP</w:t>
+        <w:t xml:space="preserve">to marginalise phase uncertainty for the cost of one extra imputation pass, with no extra phasing. Each main MCMC iteration already draws a complete diplotype configuration, a sample from the phase posterior, that the chain otherwise discards in favour of the final Viterbi solve. Instead, the Viterbi solve and a thinned subset of these post-burn-in samples are kept as N phase members (default N = 2) from the single phasing chain; each is carried through rare-variant phasing and imputed, and the per-haplotype Li-Stephens copying weights are averaged across the members before interpolation. Because the imputed dosage is linear in those weights (dosage = Σ w · panel allele), the averaged weights yield the exact mean dosage over the N phasings, marginalising phase uncertainty in dosage space. Crucially the members share one phasing chain, so the cost is one phasing plus N imputation passes (the reference-panel read and interpolation are shared), rather than the N independent phasings of a conventional ensemble; on the consumer-array benchmark N = 2 adds ≈25-30 % wall time and raises the diploid engine's genome-wide SNP</w:t>
       </w:r>
       <w:r>
         <w:rPr>
@@ -1999,7 +1999,7 @@
         <w:rPr>
           <w:rFonts w:ascii="Times New Roman" w:hAnsi="Times New Roman" w:cs="Times New Roman" w:eastAsia="Times New Roman"/>
         </w:rPr>
-        <w:t xml:space="preserve">Second, a scaffold bitmatrix is constructed from target haplotypes at scaffold sites, filtering out sites with a missing data rate (MDR) above 10%. A forward PBWT sweep processes all variants in physical order: at scaffold sites, the PBWT arrays (permutation A, divergence C, reverse-lookup R) are updated; at rare heterozygous sites, phasing is performed using a two-pass threshold-then-distance voting scheme. In the threshold pass, the two PBWT neighbors of each of the target’s haplotypes vote on the phase assignment. If the net vote exceeds a threshold (starting at 2.5 and decreasing to 1.0), the phase is assigned and the carrier contributes to subsequent decisions. In the distance pass, remaining unphased sites use distance-weighted votes, where the weight is the genetic distance from the PBWT divergence point to the current position.</w:t>
+        <w:t xml:space="preserve">Second, a scaffold bitmatrix is constructed from target haplotypes at scaffold sites, filtering out sites with a missing data rate (MDR) above 10%. A forward PBWT sweep processes all variants in physical order: at scaffold sites, the PBWT arrays (permutation A, divergence C, reverse-lookup R) are updated; at rare heterozygous sites, phasing is performed using a two-pass threshold-then-distance voting scheme. In the threshold pass, the two PBWT neighbors of each of the target's haplotypes vote on the phase assignment. If the net vote exceeds a threshold (starting at 2.5 and decreasing to 1.0), the phase is assigned and the carrier contributes to subsequent decisions. In the distance pass, remaining unphased sites use distance-weighted votes, where the weight is the genetic distance from the PBWT divergence point to the current position.</w:t>
       </w:r>
     </w:p>
     <w:p>
@@ -2123,7 +2123,7 @@
         <w:rPr>
           <w:rFonts w:ascii="Times New Roman" w:hAnsi="Times New Roman" w:cs="Times New Roman" w:eastAsia="Times New Roman"/>
         </w:rPr>
-        <w:t xml:space="preserve">. For each trio or duo, the algorithm considers all nine combinations of parental genotype sums (homozygous reference, heterozygous, homozygous alternate) at each variant. When the child is heterozygous and at least one parent is homozygous, the phase is deterministic: the child received the homozygous allele from that parent. When both parents are heterozygous, the phase cannot be resolved by Mendelian logic alone and is deferred to the HMM. When the child has missing genotype data and both parents are homozygous, the child’s genotype is imputed. Mendelian inconsistencies (e.g., child heterozygous with both parents homozygous for the same allele) are counted but not corrected.</w:t>
+        <w:t xml:space="preserve">. For each trio or duo, the algorithm considers all nine combinations of parental genotype sums (homozygous reference, heterozygous, homozygous alternate) at each variant. When the child is heterozygous and at least one parent is homozygous, the phase is deterministic: the child received the homozygous allele from that parent. When both parents are heterozygous, the phase cannot be resolved by Mendelian logic alone and is deferred to the HMM. When the child has missing genotype data and both parents are homozygous, the child's genotype is imputed. Mendelian inconsistencies (e.g., child heterozygous with both parents homozygous for the same allele) are counted but not corrected.</w:t>
       </w:r>
     </w:p>
     <w:p>
@@ -2308,7 +2308,7 @@
         <w:rPr>
           <w:rFonts w:ascii="Times New Roman" w:hAnsi="Times New Roman" w:cs="Times New Roman" w:eastAsia="Times New Roman"/>
         </w:rPr>
-        <w:t xml:space="preserve">The selected candidates undergo two filtering steps before entering the HMM. First, candidates appearing below the 10th percentile of occurrence frequency across all step partitions are removed. Second, candidates with greater than 95% position coverage have their gaps filled to prevent artificial truncation of otherwise consistent matches. Identical reference haplotypes at the shared variant positions are then grouped (haplotype deduplication), reducing the number of HMM hidden states by 10–50% depending on the reference panel and target region.</w:t>
+        <w:t xml:space="preserve">The selected candidates undergo two filtering steps before entering the HMM. First, candidates appearing below the 10th percentile of occurrence frequency across all step partitions are removed. Second, candidates with greater than 95% position coverage have their gaps filled to prevent artificial truncation of otherwise consistent matches. Identical reference haplotypes at the shared variant positions are then grouped (haplotype deduplication), reducing the number of HMM hidden states by 10-50% depending on the reference panel and target region.</w:t>
       </w:r>
     </w:p>
     <w:p>
@@ -3558,7 +3558,7 @@
         <w:rPr>
           <w:rFonts w:ascii="Times New Roman" w:hAnsi="Times New Roman" w:cs="Times New Roman" w:eastAsia="Times New Roman"/>
         </w:rPr>
-        <w:t xml:space="preserve">retains 50% of a 5,000-haplotype panel but only 1.5% of a 171,054-haplotype panel. The latter regime systematically excludes rare-variant carriers from minority sub-populations when the per-target top-K is dominated by haplotypes of the panel’s majority ancestry, producing</w:t>
+        <w:t xml:space="preserve">retains 50% of a 5,000-haplotype panel but only 1.5% of a 171,054-haplotype panel. The latter regime systematically excludes rare-variant carriers from minority sub-populations when the per-target top-K is dominated by haplotypes of the panel's majority ancestry, producing</w:t>
       </w:r>
       <w:r>
         <w:rPr>
@@ -4422,7 +4422,7 @@
         <w:rPr>
           <w:rFonts w:ascii="Times New Roman" w:hAnsi="Times New Roman" w:cs="Times New Roman" w:eastAsia="Times New Roman"/>
         </w:rPr>
-        <w:t xml:space="preserve">). This threshold sits above 1000-Genomes-scale panels and below biobank panels (HRC ≈ 65,000, TOPMed ≈ 171,000 haplotypes), and near the empirical accuracy-saturation point of the conditioning-set size. The distinction is consequential for ancestries absent from the panel: imputing Human Genome Diversity Project individuals against a 1000 Genomes panel, the formula’s small-panel fraction fell to the 2,500 floor (39% of the 6,332-haplotype panel), dropping the conditioning set’s rare-allele carriers and inverting the rare-variant ranking versus Beagle 5.5; retaining the full panel restored Selphi 2’s advantage at every frequency above the rarest bin (Results, Out-of-panel generalization). On the panels evaluated here the rule yields the full 4,802 haplotypes for the 1000 Genomes Phase 3 panel and</w:t>
+        <w:t xml:space="preserve">). This threshold sits above 1000-Genomes-scale panels and below biobank panels (HRC ≈ 65,000, TOPMed ≈ 171,000 haplotypes), and near the empirical accuracy-saturation point of the conditioning-set size. The distinction is consequential for ancestries absent from the panel: imputing Human Genome Diversity Project individuals against a 1000 Genomes panel, the formula's small-panel fraction fell to the 2,500 floor (39% of the 6,332-haplotype panel), dropping the conditioning set's rare-allele carriers and inverting the rare-variant ranking versus Beagle 5.5; retaining the full panel restored Selphi 2's advantage at every frequency above the rarest bin (Results, Out-of-panel generalization). On the panels evaluated here the rule yields the full 4,802 haplotypes for the 1000 Genomes Phase 3 panel and</w:t>
       </w:r>
       <w:r>
         <w:rPr>
@@ -5057,7 +5057,7 @@
         <w:rPr>
           <w:rFonts w:ascii="Times New Roman" w:hAnsi="Times New Roman" w:cs="Times New Roman" w:eastAsia="Times New Roman"/>
         </w:rPr>
-        <w:t xml:space="preserve">4,096 haplotypes, sized to fit in L2 cache per core. Within each tile, the interpolation is fused with output encoding: after a tile’s dosages are computed, they are immediately formatted to all active output formats and the tile memory is freed. This prevents accumulation of interpolated dosages across the entire chromosome.</w:t>
+        <w:t xml:space="preserve">4,096 haplotypes, sized to fit in L2 cache per core. Within each tile, the interpolation is fused with output encoding: after a tile's dosages are computed, they are immediately formatted to all active output formats and the tile memory is freed. This prevents accumulation of interpolated dosages across the entire chromosome.</w:t>
       </w:r>
     </w:p>
     <w:p>
@@ -5529,7 +5529,7 @@
         <w:rPr>
           <w:rFonts w:ascii="Times New Roman" w:hAnsi="Times New Roman" w:cs="Times New Roman" w:eastAsia="Times New Roman"/>
         </w:rPr>
-        <w:t xml:space="preserve">The phasing-and-imputation pipeline above targets array-genotyped data, where the input is a set of confident hard genotype calls at chip sites. Low-coverage whole-genome sequencing (lcWGS) presents a different inference problem: at 0.5–2</w:t>
+        <w:t xml:space="preserve">The phasing-and-imputation pipeline above targets array-genotyped data, where the input is a set of confident hard genotype calls at chip sites. Low-coverage whole-genome sequencing (lcWGS) presents a different inference problem: at 0.5-2</w:t>
       </w:r>
       <m:oMath>
         <m:r>
@@ -5665,7 +5665,7 @@
         <w:rPr>
           <w:rFonts w:ascii="Times New Roman" w:hAnsi="Times New Roman" w:cs="Times New Roman" w:eastAsia="Times New Roman"/>
         </w:rPr>
-        <w:t xml:space="preserve">) at the panel’s variant sites and converts them, via a 256-entry lookup table, to per-haplotype likelihoods. The genotype likelihoods may instead be computed natively from aligned reads (BAM or CRAM, one file per sample) in the same process, removing the external pileup step: for each biallelic panel SNP, the overlapping reads are walked through their CIGAR alignment and each read base is folded into the three genotype likelihoods under the standard SAMtools/BCFtools base-quality error model</w:t>
+        <w:t xml:space="preserve">) at the panel's variant sites and converts them, via a 256-entry lookup table, to per-haplotype likelihoods. The genotype likelihoods may instead be computed natively from aligned reads (BAM or CRAM, one file per sample) in the same process, removing the external pileup step: for each biallelic panel SNP, the overlapping reads are walked through their CIGAR alignment and each read base is folded into the three genotype likelihoods under the standard SAMtools/BCFtools base-quality error model</w:t>
       </w:r>
       <w:hyperlink w:anchor="ref25">
         <w:r>
@@ -6020,7 +6020,7 @@
         <w:rPr>
           <w:rFonts w:ascii="Times New Roman" w:hAnsi="Times New Roman" w:cs="Times New Roman" w:eastAsia="Times New Roman"/>
         </w:rPr>
-        <w:t xml:space="preserve">at the same thresholds. Overlapping paired-end mates, the two mates of one fragment sample the same molecule, are collapsed to a single observation per site (agreeing bases retain the higher base quality, disagreeing bases are down-weighted) so a fragment’s evidence is not double-counted. CRAM read bases are reconstructed against the supplied reference FASTA, and with a region restriction the alignment index (</w:t>
+        <w:t xml:space="preserve">at the same thresholds. Overlapping paired-end mates, the two mates of one fragment sample the same molecule, are collapsed to a single observation per site (agreeing bases retain the higher base quality, disagreeing bases are down-weighted) so a fragment's evidence is not double-counted. CRAM read bases are reconstructed against the supplied reference FASTA, and with a region restriction the alignment index (</w:t>
       </w:r>
       <w:r>
         <w:rPr>
@@ -6227,7 +6227,7 @@
         <w:rPr>
           <w:rFonts w:ascii="Times New Roman" w:hAnsi="Times New Roman" w:cs="Times New Roman" w:eastAsia="Times New Roman"/>
         </w:rPr>
-        <w:t xml:space="preserve">, with the full-depth calls as truth): Selphi 2’s native pileup attains per-allele-frequency-bin aggregate</w:t>
+        <w:t xml:space="preserve">, with the full-depth calls as truth): Selphi 2's native pileup attains per-allele-frequency-bin aggregate</w:t>
       </w:r>
       <w:r>
         <w:rPr>
@@ -6259,7 +6259,7 @@
         <w:rPr>
           <w:rFonts w:ascii="Times New Roman" w:hAnsi="Times New Roman" w:cs="Times New Roman" w:eastAsia="Times New Roman"/>
         </w:rPr>
-        <w:t xml:space="preserve">0.964, matching (and slightly exceeding) its own pre-computed-likelihood path (0.960) and comparable to an equivalent GLIMPSE2 pileup (0.967), confirming the native genotype-likelihood computation reproduces the established pipeline. Imputation proceeds by Gibbs alternation between haplotype selection and a GL-weighted forward-backward pass: each iteration selects a conditioning set of reference haplotypes by sparse PBWT from the current sampled haplotypes, then runs a Li-Stephens forward-backward in which each haplotype’s per-site emission is built conditional on the partner haplotype’s currently sampled allele, decoupling the two haplotypes of a diploid sample into independent copying problems, and samples a fresh allele per site from the resulting posterior. Posterior dosages from the post-burn-in iterations are averaged for the output, written as VCF.gz with</w:t>
+        <w:t xml:space="preserve">0.964, matching (and slightly exceeding) its own pre-computed-likelihood path (0.960) and comparable to an equivalent GLIMPSE2 pileup (0.967), confirming the native genotype-likelihood computation reproduces the established pipeline. Imputation proceeds by Gibbs alternation between haplotype selection and a GL-weighted forward-backward pass: each iteration selects a conditioning set of reference haplotypes by sparse PBWT from the current sampled haplotypes, then runs a Li-Stephens forward-backward in which each haplotype's per-site emission is built conditional on the partner haplotype's currently sampled allele, decoupling the two haplotypes of a diploid sample into independent copying problems, and samples a fresh allele per site from the resulting posterior. Posterior dosages from the post-burn-in iterations are averaged for the output, written as VCF.gz with</w:t>
       </w:r>
       <w:r>
         <w:rPr>
@@ -6296,7 +6296,7 @@
         <w:rPr>
           <w:rFonts w:ascii="Times New Roman" w:hAnsi="Times New Roman" w:cs="Times New Roman" w:eastAsia="Times New Roman"/>
         </w:rPr>
-        <w:t xml:space="preserve">To bound memory independently of chromosome length and panel size, the chromosome is processed in overlapping cM chunks: each chunk’s reference bitmatrix is extracted directly from the SRP for that chunk’s variants and discarded after use, so the full-chromosome reference bitmatrix is never materialized. The forward-backward inner loops over the conditioning states are vectorized with AVX-512 (a bit-packed conditioning representation loads 16 reference alleles directly as a mask register), with a scalar fallback on other hosts; the selection step accumulates IBS match lengths in a per-target sparse map rather than a dense target</w:t>
+        <w:t xml:space="preserve">To bound memory independently of chromosome length and panel size, the chromosome is processed in overlapping cM chunks: each chunk's reference bitmatrix is extracted directly from the SRP for that chunk's variants and discarded after use, so the full-chromosome reference bitmatrix is never materialized. The forward-backward inner loops over the conditioning states are vectorized with AVX-512 (a bit-packed conditioning representation loads 16 reference alleles directly as a mask register), with a scalar fallback on other hosts; the selection step accumulates IBS match lengths in a per-target sparse map rather than a dense target</w:t>
       </w:r>
       <m:oMath>
         <m:r>
@@ -6412,7 +6412,7 @@
         <w:rPr>
           <w:rFonts w:ascii="Times New Roman" w:hAnsi="Times New Roman" w:cs="Times New Roman" w:eastAsia="Times New Roman"/>
         </w:rPr>
-        <w:t xml:space="preserve">seeking to divide the source file into balanced genomic regions across threads. The reverse direction is also provided natively: an SRP or BREF3 panel can be decoded back to phased VCF or BCF in the same binary, as a streaming three-stage pipeline (panel read, per-record formatting, and BGZF compression overlapped across threads) with bounded memory, removing the dependency on Beagle’s</w:t>
+        <w:t xml:space="preserve">seeking to divide the source file into balanced genomic regions across threads. The reverse direction is also provided natively: an SRP or BREF3 panel can be decoded back to phased VCF or BCF in the same binary, as a streaming three-stage pipeline (panel read, per-record formatting, and BGZF compression overlapped across threads) with bounded memory, removing the dependency on Beagle's</w:t>
       </w:r>
       <w:r>
         <w:rPr>
@@ -6468,7 +6468,7 @@
         <w:rPr>
           <w:rFonts w:ascii="Times New Roman" w:hAnsi="Times New Roman" w:cs="Times New Roman" w:eastAsia="Times New Roman"/>
         </w:rPr>
-        <w:t xml:space="preserve">The SRP format supports both single-chromosome and multi-chromosome panels. A multi-chromosome SRP stores all chromosomes in a single file with a global header containing a chromosome directory and shared sample IDs, followed by independent per-chromosome tile sections. Multi-chromosome panels are automatically detected, enabling whole-genome imputation from a single command with overlapped prefetch of the next chromosome’s data during the current chromosome’s HMM computation.</w:t>
+        <w:t xml:space="preserve">The SRP format supports both single-chromosome and multi-chromosome panels. A multi-chromosome SRP stores all chromosomes in a single file with a global header containing a chromosome directory and shared sample IDs, followed by independent per-chromosome tile sections. Multi-chromosome panels are automatically detected, enabling whole-genome imputation from a single command with overlapped prefetch of the next chromosome's data during the current chromosome's HMM computation.</w:t>
       </w:r>
     </w:p>
     <w:p>
@@ -6506,7 +6506,7 @@
         <w:rPr>
           <w:rFonts w:ascii="Times New Roman" w:hAnsi="Times New Roman" w:cs="Times New Roman" w:eastAsia="Times New Roman"/>
         </w:rPr>
-        <w:t xml:space="preserve">Target VCF input is read once and partitioned by chromosome in memory. Genetic maps are auto-discovered from a directory by matching chromosome names against common naming patterns (chr1.map, chr_1.map, genetic_map_chr1_*, etc.). Chromosomes are processed sequentially in natural sort order, with the next chromosome’s reference data prefetched in a background thread during the current chromosome’s HMM computation. This prefetch overlap hides I/O latency at no additional memory cost beyond one chromosome’s reference data.</w:t>
+        <w:t xml:space="preserve">Target VCF input is read once and partitioned by chromosome in memory. Genetic maps are auto-discovered from a directory by matching chromosome names against common naming patterns (chr1.map, chr_1.map, genetic_map_chr1_*, etc.). Chromosomes are processed sequentially in natural sort order, with the next chromosome's reference data prefetched in a background thread during the current chromosome's HMM computation. This prefetch overlap hides I/O latency at no additional memory cost beyond one chromosome's reference data.</w:t>
       </w:r>
     </w:p>
     <w:p>
@@ -6606,7 +6606,7 @@
         <w:rPr>
           <w:rFonts w:ascii="Times New Roman" w:hAnsi="Times New Roman" w:cs="Times New Roman" w:eastAsia="Times New Roman"/>
         </w:rPr>
-        <w:t xml:space="preserve">; Table 3), we used six individuals each having both a SelfDecode consumer genotyping array (Illumina Global Screening Array, GRCh38) and an independent high-coverage Illumina whole-genome sequence processed with the DRAGEN germline pipeline (GRCh38; ≈30–60</w:t>
+        <w:t xml:space="preserve">; Table 3), we used six individuals each having both a SelfDecode consumer genotyping array (Illumina Global Screening Array, GRCh38) and an independent high-coverage Illumina whole-genome sequence processed with the DRAGEN germline pipeline (GRCh38; ≈30-60</w:t>
       </w:r>
       <m:oMath>
         <m:r>
@@ -6728,7 +6728,7 @@
         <w:rPr>
           <w:rFonts w:ascii="Times New Roman" w:hAnsi="Times New Roman" w:cs="Times New Roman" w:eastAsia="Times New Roman"/>
         </w:rPr>
-        <w:t xml:space="preserve">. This removed roughly 14% of raw calls (e.g. 5.09M → 4.66M for one sample);</w:t>
+        <w:t xml:space="preserve">. This removed roughly 14% of raw calls (e.g. 5.09M to 4.66M for one sample);</w:t>
       </w:r>
       <w:r>
         <w:rPr>
@@ -6804,7 +6804,7 @@
         <w:rPr>
           <w:rFonts w:ascii="Times New Roman" w:hAnsi="Times New Roman" w:cs="Times New Roman" w:eastAsia="Times New Roman"/>
         </w:rPr>
-        <w:t xml:space="preserve">Array genotypes were lifted to the panel’s variant coordinates: REF/ALT and site position were taken from the reference panel, the genotype was assigned from the array alleles (strand-flipping by complement where required), and homozygous-reference calls, which a naïve TSV-to-VCF conversion leaves with an undefined ALT and would otherwise be dropped, were explicitly retained, yielding ≈620,000 autosomal SNPs per sample. The six samples were merged into one cohort and imputed jointly.</w:t>
+        <w:t xml:space="preserve">Array genotypes were lifted to the panel's variant coordinates: REF/ALT and site position were taken from the reference panel, the genotype was assigned from the array alleles (strand-flipping by complement where required), and homozygous-reference calls, which a naïve TSV-to-VCF conversion leaves with an undefined ALT and would otherwise be dropped, were explicitly retained, yielding ≈620,000 autosomal SNPs per sample. The six samples were merged into one cohort and imputed jointly.</w:t>
       </w:r>
     </w:p>
     <w:p>
@@ -6830,67 +6830,7 @@
         <w:rPr>
           <w:rFonts w:ascii="Times New Roman" w:hAnsi="Times New Roman" w:cs="Times New Roman" w:eastAsia="Times New Roman"/>
         </w:rPr>
-        <w:t xml:space="preserve">The array cohort was imputed against the 75,552-haplotype reference panel with each tool given the same per-chromosome genetic map. For the</w:t>
-      </w:r>
-      <w:r>
-        <w:rPr>
-          <w:rFonts w:ascii="Times New Roman" w:hAnsi="Times New Roman" w:cs="Times New Roman" w:eastAsia="Times New Roman"/>
-        </w:rPr>
-        <w:t xml:space="preserve"> </w:t>
-      </w:r>
-      <w:r>
-        <w:rPr>
-          <w:rFonts w:ascii="Times New Roman" w:hAnsi="Times New Roman" w:cs="Times New Roman" w:eastAsia="Times New Roman"/>
-        </w:rPr>
-        <w:t xml:space="preserve">“Beagle-phased”</w:t>
-      </w:r>
-      <w:r>
-        <w:rPr>
-          <w:rFonts w:ascii="Times New Roman" w:hAnsi="Times New Roman" w:cs="Times New Roman" w:eastAsia="Times New Roman"/>
-        </w:rPr>
-        <w:t xml:space="preserve"> </w:t>
-      </w:r>
-      <w:r>
-        <w:rPr>
-          <w:rFonts w:ascii="Times New Roman" w:hAnsi="Times New Roman" w:cs="Times New Roman" w:eastAsia="Times New Roman"/>
-        </w:rPr>
-        <w:t xml:space="preserve">rows, both Selphi 2 and Selphi 1.5.3 were given Beagle’s phase-only output as their phased input, isolating the imputation step from phasing quality; the</w:t>
-      </w:r>
-      <w:r>
-        <w:rPr>
-          <w:rFonts w:ascii="Times New Roman" w:hAnsi="Times New Roman" w:cs="Times New Roman" w:eastAsia="Times New Roman"/>
-        </w:rPr>
-        <w:t xml:space="preserve"> </w:t>
-      </w:r>
-      <w:r>
-        <w:rPr>
-          <w:rFonts w:ascii="Times New Roman" w:hAnsi="Times New Roman" w:cs="Times New Roman" w:eastAsia="Times New Roman"/>
-        </w:rPr>
-        <w:t xml:space="preserve">“haploid”</w:t>
-      </w:r>
-      <w:r>
-        <w:rPr>
-          <w:rFonts w:ascii="Times New Roman" w:hAnsi="Times New Roman" w:cs="Times New Roman" w:eastAsia="Times New Roman"/>
-        </w:rPr>
-        <w:t xml:space="preserve">/</w:t>
-      </w:r>
-      <w:r>
-        <w:rPr>
-          <w:rFonts w:ascii="Times New Roman" w:hAnsi="Times New Roman" w:cs="Times New Roman" w:eastAsia="Times New Roman"/>
-        </w:rPr>
-        <w:t xml:space="preserve">“diploid”</w:t>
-      </w:r>
-      <w:r>
-        <w:rPr>
-          <w:rFonts w:ascii="Times New Roman" w:hAnsi="Times New Roman" w:cs="Times New Roman" w:eastAsia="Times New Roman"/>
-        </w:rPr>
-        <w:t xml:space="preserve"> </w:t>
-      </w:r>
-      <w:r>
-        <w:rPr>
-          <w:rFonts w:ascii="Times New Roman" w:hAnsi="Times New Roman" w:cs="Times New Roman" w:eastAsia="Times New Roman"/>
-        </w:rPr>
-        <w:t xml:space="preserve">rows use Selphi 2’s internal phasing engines. Beagle 5.5 (build 03 Oct 2025) was run as a full phase-plus-impute pipeline against the same panel in</w:t>
+        <w:t xml:space="preserve">The array cohort was imputed against the 75,552-haplotype reference panel with each tool given the same per-chromosome genetic map. For the "Beagle-phased" rows, both Selphi 2 and Selphi 1.5.3 were given Beagle's phase-only output as their phased input, isolating the imputation step from phasing quality; the "haploid"/"diploid" rows use Selphi 2's internal phasing engines. Beagle 5.5 (build 03 Oct 2025) was run as a full phase-plus-impute pipeline against the same panel in</w:t>
       </w:r>
       <w:r>
         <w:rPr>
@@ -6973,7 +6913,7 @@
         <w:rPr>
           <w:rFonts w:ascii="Times New Roman" w:hAnsi="Times New Roman" w:cs="Times New Roman" w:eastAsia="Times New Roman"/>
         </w:rPr>
-        <w:t xml:space="preserve">as the squared Pearson correlation between imputed dosage and truth genotype. A truth genotype is the high-confidence call where one exists; sites present in the raw WGS but removed by the confidence filter are excluded from evaluation rather than counted as homozygous reference; sites absent from the WGS are treated as homozygous reference; and the array sites themselves are excluded so that only imputed variants are scored. Reported values are means over the six samples, genome-wide across chromosomes 1–22. Pairwise comparisons between tools are summarized by the mean per-sample difference in</w:t>
+        <w:t xml:space="preserve">as the squared Pearson correlation between imputed dosage and truth genotype. A truth genotype is the high-confidence call where one exists; sites present in the raw WGS but removed by the confidence filter are excluded from evaluation rather than counted as homozygous reference; sites absent from the WGS are treated as homozygous reference; and the array sites themselves are excluded so that only imputed variants are scored. Reported values are means over the six samples, genome-wide across chromosomes 1-22. Pairwise comparisons between tools are summarized by the mean per-sample difference in</w:t>
       </w:r>
       <w:r>
         <w:rPr>
@@ -7069,7 +7009,7 @@
         <w:rPr>
           <w:rFonts w:ascii="Times New Roman" w:hAnsi="Times New Roman" w:cs="Times New Roman" w:eastAsia="Times New Roman"/>
         </w:rPr>
-        <w:t xml:space="preserve">(171,054 haplotypes), and a 75,552-haplotype reference panel containing the full 1000 Genomes cohort. All experiments use unphased target genotypes as the realistic input scenario; tools that require pre-phased input (Selphi 1.5.3 in particular) were pre-phased with Selphi 2’s haploid engine to ensure an identical phased starting point. Imputation</w:t>
+        <w:t xml:space="preserve">(171,054 haplotypes), and a 75,552-haplotype reference panel containing the full 1000 Genomes cohort. All experiments use unphased target genotypes as the realistic input scenario; tools that require pre-phased input (Selphi 1.5.3 in particular) were pre-phased with Selphi 2's haploid engine to ensure an identical phased starting point. Imputation</w:t>
       </w:r>
       <w:r>
         <w:rPr>
@@ -7127,7 +7067,7 @@
         <w:rPr>
           <w:rFonts w:ascii="Times New Roman" w:hAnsi="Times New Roman" w:cs="Times New Roman" w:eastAsia="Times New Roman"/>
         </w:rPr>
-        <w:t xml:space="preserve">On chromosome 22 of the 1000 Genomes Phase 3 panel (4,802 haplotypes, 1,070,401 variants) imputed for 801 held-out samples, Selphi 2’s default diploid engine attains an overall</w:t>
+        <w:t xml:space="preserve">On chromosome 22 of the 1000 Genomes Phase 3 panel (4,802 haplotypes, 1,070,401 variants) imputed for 801 held-out samples, Selphi 2's default diploid engine attains an overall</w:t>
       </w:r>
       <w:r>
         <w:rPr>
@@ -7255,7 +7195,7 @@
         <w:rPr>
           <w:rFonts w:ascii="Times New Roman" w:hAnsi="Times New Roman" w:cs="Times New Roman" w:eastAsia="Times New Roman"/>
         </w:rPr>
-        <w:t xml:space="preserve">of the four tools in every MAF bin from 0.1% upward on chromosome 22, and exceeds Beagle 5.5 in every bin from 0.1% upward on chromosome 1; only at the rarest bin (MAF 0.05–0.1%) does Beagle 5.5 narrowly lead (Table 1). Aggregated genome-wide across 20 autosomes (chromosomes 8 and 11 excluded, where Beagle aborted on a duplicate panel marker, so all four tools span the identical chromosome set), the same ordering holds: Selphi 2 attains overall</w:t>
+        <w:t xml:space="preserve">of the four tools in every MAF bin from 0.1% upward on chromosome 22, and exceeds Beagle 5.5 in every bin from 0.1% upward on chromosome 1; only at the rarest bin (MAF 0.05-0.1%) does Beagle 5.5 narrowly lead (Table 1). Aggregated genome-wide across 20 autosomes (chromosomes 8 and 11 excluded, where Beagle aborted on a duplicate panel marker, so all four tools span the identical chromosome set), the same ordering holds: Selphi 2 attains overall</w:t>
       </w:r>
       <w:r>
         <w:rPr>
@@ -7683,7 +7623,7 @@
                 <w:rFonts w:ascii="Times New Roman" w:hAnsi="Times New Roman" w:cs="Times New Roman" w:eastAsia="Times New Roman"/>
                 <w:sz w:val="20"/>
               </w:rPr>
-              <w:t xml:space="preserve">0.05–0.1%</w:t>
+              <w:t xml:space="preserve">0.05-0.1%</w:t>
             </w:r>
           </w:p>
         </w:tc>
@@ -7829,7 +7769,7 @@
                 <w:rFonts w:ascii="Times New Roman" w:hAnsi="Times New Roman" w:cs="Times New Roman" w:eastAsia="Times New Roman"/>
                 <w:sz w:val="20"/>
               </w:rPr>
-              <w:t xml:space="preserve">0.1–0.2%</w:t>
+              <w:t xml:space="preserve">0.1-0.2%</w:t>
             </w:r>
           </w:p>
         </w:tc>
@@ -7975,7 +7915,7 @@
                 <w:rFonts w:ascii="Times New Roman" w:hAnsi="Times New Roman" w:cs="Times New Roman" w:eastAsia="Times New Roman"/>
                 <w:sz w:val="20"/>
               </w:rPr>
-              <w:t xml:space="preserve">0.2–0.5%</w:t>
+              <w:t xml:space="preserve">0.2-0.5%</w:t>
             </w:r>
           </w:p>
         </w:tc>
@@ -8121,7 +8061,7 @@
                 <w:rFonts w:ascii="Times New Roman" w:hAnsi="Times New Roman" w:cs="Times New Roman" w:eastAsia="Times New Roman"/>
                 <w:sz w:val="20"/>
               </w:rPr>
-              <w:t xml:space="preserve">0.5–1%</w:t>
+              <w:t xml:space="preserve">0.5-1%</w:t>
             </w:r>
           </w:p>
         </w:tc>
@@ -8267,7 +8207,7 @@
                 <w:rFonts w:ascii="Times New Roman" w:hAnsi="Times New Roman" w:cs="Times New Roman" w:eastAsia="Times New Roman"/>
                 <w:sz w:val="20"/>
               </w:rPr>
-              <w:t xml:space="preserve">1–2%</w:t>
+              <w:t xml:space="preserve">1-2%</w:t>
             </w:r>
           </w:p>
         </w:tc>
@@ -8413,7 +8353,7 @@
                 <w:rFonts w:ascii="Times New Roman" w:hAnsi="Times New Roman" w:cs="Times New Roman" w:eastAsia="Times New Roman"/>
                 <w:sz w:val="20"/>
               </w:rPr>
-              <w:t xml:space="preserve">2–5%</w:t>
+              <w:t xml:space="preserve">2-5%</w:t>
             </w:r>
           </w:p>
         </w:tc>
@@ -8559,7 +8499,7 @@
                 <w:rFonts w:ascii="Times New Roman" w:hAnsi="Times New Roman" w:cs="Times New Roman" w:eastAsia="Times New Roman"/>
                 <w:sz w:val="20"/>
               </w:rPr>
-              <w:t xml:space="preserve">5–10%</w:t>
+              <w:t xml:space="preserve">5-10%</w:t>
             </w:r>
           </w:p>
         </w:tc>
@@ -8705,7 +8645,7 @@
                 <w:rFonts w:ascii="Times New Roman" w:hAnsi="Times New Roman" w:cs="Times New Roman" w:eastAsia="Times New Roman"/>
                 <w:sz w:val="20"/>
               </w:rPr>
-              <w:t xml:space="preserve">10–20%</w:t>
+              <w:t xml:space="preserve">10-20%</w:t>
             </w:r>
           </w:p>
         </w:tc>
@@ -8851,7 +8791,7 @@
                 <w:rFonts w:ascii="Times New Roman" w:hAnsi="Times New Roman" w:cs="Times New Roman" w:eastAsia="Times New Roman"/>
                 <w:sz w:val="20"/>
               </w:rPr>
-              <w:t xml:space="preserve">20–50%</w:t>
+              <w:t xml:space="preserve">20-50%</w:t>
             </w:r>
           </w:p>
         </w:tc>
@@ -9136,7 +9076,7 @@
         <w:rPr>
           <w:rFonts w:ascii="Times New Roman" w:hAnsi="Times New Roman" w:cs="Times New Roman" w:eastAsia="Times New Roman"/>
         </w:rPr>
-        <w:t xml:space="preserve">At the rarest bin (MAF 0.05–0.1%), Beagle 5.5 narrowly outperforms Selphi 2 on both chromosomes (</w:t>
+        <w:t xml:space="preserve">At the rarest bin (MAF 0.05-0.1%), Beagle 5.5 narrowly outperforms Selphi 2 on both chromosomes (</w:t>
       </w:r>
       <m:oMath>
         <m:r>
@@ -9156,7 +9096,7 @@
         <w:rPr>
           <w:rFonts w:ascii="Times New Roman" w:hAnsi="Times New Roman" w:cs="Times New Roman" w:eastAsia="Times New Roman"/>
         </w:rPr>
-        <w:t xml:space="preserve">≈ -0.002 to -0.003), the only frequency at which any tool exceeds Selphi 2; IMPUTE5 and Minimac4 trail Selphi 2 in every bin, including the rarest. At MAF ≥ 0.1% Selphi 2 leads by margins that grow with allele frequency (chr22 20–50% MAF: +0.0144 over Beagle 5.5, +0.0199 over Minimac4, +0.0159 over IMPUTE5). The crossover at the rarest bin reflects the differing trade-offs in candidate selection: at the rarest frequencies, Beagle 5.5’s window-local composite-haplotype reconstruction better preserves single-carrier reference haplotypes, while at common frequencies the long-range, large-window PBWT scan of Selphi 2 retains more informative haplotypes per target.</w:t>
+        <w:t xml:space="preserve">≈ -0.002 to -0.003), the only frequency at which any tool exceeds Selphi 2; IMPUTE5 and Minimac4 trail Selphi 2 in every bin, including the rarest. At MAF ≥ 0.1% Selphi 2 leads by margins that grow with allele frequency (chr22 20-50% MAF: +0.0144 over Beagle 5.5, +0.0199 over Minimac4, +0.0159 over IMPUTE5). The crossover at the rarest bin reflects the differing trade-offs in candidate selection: at the rarest frequencies, Beagle 5.5's window-local composite-haplotype reconstruction better preserves single-carrier reference haplotypes, while at common frequencies the long-range, large-window PBWT scan of Selphi 2 retains more informative haplotypes per target.</w:t>
       </w:r>
     </w:p>
     <w:p>
@@ -9248,7 +9188,7 @@
         <w:rPr>
           <w:rFonts w:ascii="Times New Roman" w:hAnsi="Times New Roman" w:cs="Times New Roman" w:eastAsia="Times New Roman"/>
         </w:rPr>
-        <w:t xml:space="preserve">Selphi 2’s panel-adaptive sizing formula (Methods, Candidate selection and HMM) yields</w:t>
+        <w:t xml:space="preserve">Selphi 2's panel-adaptive sizing formula (Methods, Candidate selection and HMM) yields</w:t>
       </w:r>
       <w:r>
         <w:rPr>
@@ -9556,7 +9496,7 @@
         <w:rPr>
           <w:rFonts w:ascii="Times New Roman" w:hAnsi="Times New Roman" w:cs="Times New Roman" w:eastAsia="Times New Roman"/>
         </w:rPr>
-        <w:t xml:space="preserve">fixed at 2,500 (the configuration that mirrors Selphi 1’s</w:t>
+        <w:t xml:space="preserve">fixed at 2,500 (the configuration that mirrors Selphi 1's</w:t>
       </w:r>
       <w:r>
         <w:rPr>
@@ -9856,7 +9796,7 @@
         <w:rPr>
           <w:rFonts w:ascii="Times New Roman" w:hAnsi="Times New Roman" w:cs="Times New Roman" w:eastAsia="Times New Roman"/>
         </w:rPr>
-        <w:t xml:space="preserve">= 2,500 mirrors Selphi 1’s</w:t>
+        <w:t xml:space="preserve">= 2,500 mirrors Selphi 1's</w:t>
       </w:r>
       <w:r>
         <w:rPr>
@@ -10100,7 +10040,7 @@
                 <w:rFonts w:ascii="Times New Roman" w:hAnsi="Times New Roman" w:cs="Times New Roman" w:eastAsia="Times New Roman"/>
                 <w:sz w:val="20"/>
               </w:rPr>
-              <w:t xml:space="preserve">0.1–0.2%</w:t>
+              <w:t xml:space="preserve">0.1-0.2%</w:t>
             </w:r>
           </w:p>
         </w:tc>
@@ -10182,7 +10122,7 @@
                 <w:rFonts w:ascii="Times New Roman" w:hAnsi="Times New Roman" w:cs="Times New Roman" w:eastAsia="Times New Roman"/>
                 <w:sz w:val="20"/>
               </w:rPr>
-              <w:t xml:space="preserve">0.2–0.5%</w:t>
+              <w:t xml:space="preserve">0.2-0.5%</w:t>
             </w:r>
           </w:p>
         </w:tc>
@@ -10264,7 +10204,7 @@
                 <w:rFonts w:ascii="Times New Roman" w:hAnsi="Times New Roman" w:cs="Times New Roman" w:eastAsia="Times New Roman"/>
                 <w:sz w:val="20"/>
               </w:rPr>
-              <w:t xml:space="preserve">0.5–1%</w:t>
+              <w:t xml:space="preserve">0.5-1%</w:t>
             </w:r>
           </w:p>
         </w:tc>
@@ -10346,7 +10286,7 @@
                 <w:rFonts w:ascii="Times New Roman" w:hAnsi="Times New Roman" w:cs="Times New Roman" w:eastAsia="Times New Roman"/>
                 <w:sz w:val="20"/>
               </w:rPr>
-              <w:t xml:space="preserve">1–2%</w:t>
+              <w:t xml:space="preserve">1-2%</w:t>
             </w:r>
           </w:p>
         </w:tc>
@@ -10428,7 +10368,7 @@
                 <w:rFonts w:ascii="Times New Roman" w:hAnsi="Times New Roman" w:cs="Times New Roman" w:eastAsia="Times New Roman"/>
                 <w:sz w:val="20"/>
               </w:rPr>
-              <w:t xml:space="preserve">5–10%</w:t>
+              <w:t xml:space="preserve">5-10%</w:t>
             </w:r>
           </w:p>
         </w:tc>
@@ -10510,7 +10450,7 @@
                 <w:rFonts w:ascii="Times New Roman" w:hAnsi="Times New Roman" w:cs="Times New Roman" w:eastAsia="Times New Roman"/>
                 <w:sz w:val="20"/>
               </w:rPr>
-              <w:t xml:space="preserve">20–50%</w:t>
+              <w:t xml:space="preserve">20-50%</w:t>
             </w:r>
           </w:p>
         </w:tc>
@@ -10779,7 +10719,7 @@
         <w:rPr>
           <w:rFonts w:ascii="Times New Roman" w:hAnsi="Times New Roman" w:cs="Times New Roman" w:eastAsia="Times New Roman"/>
         </w:rPr>
-        <w:t xml:space="preserve">binned by within-group MAF). The recovery is concentrated at rare variants and is largest for the most admixed or diverged populations (Table 2b): at the rarest bin (MAF 0.05–0.1%) the panel-adaptive sizing recovers +0.172</w:t>
+        <w:t xml:space="preserve">binned by within-group MAF). The recovery is concentrated at rare variants and is largest for the most admixed or diverged populations (Table 2b): at the rarest bin (MAF 0.05-0.1%) the panel-adaptive sizing recovers +0.172</w:t>
       </w:r>
       <w:r>
         <w:rPr>
@@ -10811,7 +10751,7 @@
         <w:rPr>
           <w:rFonts w:ascii="Times New Roman" w:hAnsi="Times New Roman" w:cs="Times New Roman" w:eastAsia="Times New Roman"/>
         </w:rPr>
-        <w:t xml:space="preserve">for Hispanic and +0.139 for African-American samples, versus +0.119 for European-ancestry (White) samples, and the gap widens across the low-frequency range (at 0.2–0.5% MAF, +0.127 and +0.089 versus +0.059). Aggregated over all variants the recovery is +0.113 (Hispanic), +0.087 (African-American), and +0.054 (White); the comparatively homogeneous East-Asian (Chinese-American) group, already well served by a small candidate set, gains essentially nothing (overall +0.001, and marginally negative at common variants where the larger candidate set slightly over-conditions this homogeneous group; Table 2b). The monotonic decay from rare to common variants, and the ordering by population admixture and divergence, are the signature of the proposed mechanism: a fixed candidate cap calibrated on a European-majority panel preferentially excludes the rare-allele-carrying haplotypes of admixed and diverged populations, and the panel-adaptive sizing recovers them.</w:t>
+        <w:t xml:space="preserve">for Hispanic and +0.139 for African-American samples, versus +0.119 for European-ancestry (White) samples, and the gap widens across the low-frequency range (at 0.2-0.5% MAF, +0.127 and +0.089 versus +0.059). Aggregated over all variants the recovery is +0.113 (Hispanic), +0.087 (African-American), and +0.054 (White); the comparatively homogeneous East-Asian (Chinese-American) group, already well served by a small candidate set, gains essentially nothing (overall +0.001, and marginally negative at common variants where the larger candidate set slightly over-conditions this homogeneous group; Table 2b). The monotonic decay from rare to common variants, and the ordering by population admixture and divergence, are the signature of the proposed mechanism: a fixed candidate cap calibrated on a European-majority panel preferentially excludes the rare-allele-carrying haplotypes of admixed and diverged populations, and the panel-adaptive sizing recovers them.</w:t>
       </w:r>
     </w:p>
     <w:p>
@@ -11091,7 +11031,7 @@
                 <w:rFonts w:ascii="Times New Roman" w:hAnsi="Times New Roman" w:cs="Times New Roman" w:eastAsia="Times New Roman"/>
                 <w:sz w:val="20"/>
               </w:rPr>
-              <w:t xml:space="preserve">0.05–0.1%</w:t>
+              <w:t xml:space="preserve">0.05-0.1%</w:t>
             </w:r>
           </w:p>
         </w:tc>
@@ -11195,7 +11135,7 @@
                 <w:rFonts w:ascii="Times New Roman" w:hAnsi="Times New Roman" w:cs="Times New Roman" w:eastAsia="Times New Roman"/>
                 <w:sz w:val="20"/>
               </w:rPr>
-              <w:t xml:space="preserve">0.1–0.2%</w:t>
+              <w:t xml:space="preserve">0.1-0.2%</w:t>
             </w:r>
           </w:p>
         </w:tc>
@@ -11297,7 +11237,7 @@
                 <w:rFonts w:ascii="Times New Roman" w:hAnsi="Times New Roman" w:cs="Times New Roman" w:eastAsia="Times New Roman"/>
                 <w:sz w:val="20"/>
               </w:rPr>
-              <w:t xml:space="preserve">0.2–0.5%</w:t>
+              <w:t xml:space="preserve">0.2-0.5%</w:t>
             </w:r>
           </w:p>
         </w:tc>
@@ -11399,7 +11339,7 @@
                 <w:rFonts w:ascii="Times New Roman" w:hAnsi="Times New Roman" w:cs="Times New Roman" w:eastAsia="Times New Roman"/>
                 <w:sz w:val="20"/>
               </w:rPr>
-              <w:t xml:space="preserve">0.5–1%</w:t>
+              <w:t xml:space="preserve">0.5-1%</w:t>
             </w:r>
           </w:p>
         </w:tc>
@@ -11501,7 +11441,7 @@
                 <w:rFonts w:ascii="Times New Roman" w:hAnsi="Times New Roman" w:cs="Times New Roman" w:eastAsia="Times New Roman"/>
                 <w:sz w:val="20"/>
               </w:rPr>
-              <w:t xml:space="preserve">1–2%</w:t>
+              <w:t xml:space="preserve">1-2%</w:t>
             </w:r>
           </w:p>
         </w:tc>
@@ -11603,7 +11543,7 @@
                 <w:rFonts w:ascii="Times New Roman" w:hAnsi="Times New Roman" w:cs="Times New Roman" w:eastAsia="Times New Roman"/>
                 <w:sz w:val="20"/>
               </w:rPr>
-              <w:t xml:space="preserve">2–5%</w:t>
+              <w:t xml:space="preserve">2-5%</w:t>
             </w:r>
           </w:p>
         </w:tc>
@@ -11705,7 +11645,7 @@
                 <w:rFonts w:ascii="Times New Roman" w:hAnsi="Times New Roman" w:cs="Times New Roman" w:eastAsia="Times New Roman"/>
                 <w:sz w:val="20"/>
               </w:rPr>
-              <w:t xml:space="preserve">5–10%</w:t>
+              <w:t xml:space="preserve">5-10%</w:t>
             </w:r>
           </w:p>
         </w:tc>
@@ -11807,7 +11747,7 @@
                 <w:rFonts w:ascii="Times New Roman" w:hAnsi="Times New Roman" w:cs="Times New Roman" w:eastAsia="Times New Roman"/>
                 <w:sz w:val="20"/>
               </w:rPr>
-              <w:t xml:space="preserve">10–20%</w:t>
+              <w:t xml:space="preserve">10-20%</w:t>
             </w:r>
           </w:p>
         </w:tc>
@@ -11909,7 +11849,7 @@
                 <w:rFonts w:ascii="Times New Roman" w:hAnsi="Times New Roman" w:cs="Times New Roman" w:eastAsia="Times New Roman"/>
                 <w:sz w:val="20"/>
               </w:rPr>
-              <w:t xml:space="preserve">20–50%</w:t>
+              <w:t xml:space="preserve">20-50%</w:t>
             </w:r>
           </w:p>
         </w:tc>
@@ -12120,7 +12060,7 @@
         <w:rPr>
           <w:rFonts w:ascii="Times New Roman" w:hAnsi="Times New Roman" w:cs="Times New Roman" w:eastAsia="Times New Roman"/>
         </w:rPr>
-        <w:t xml:space="preserve">The MESA experiment holds the reference panel fixed and varies the candidate-set size. A complementary and more stringent question is whether Selphi 2’s accuracy advantage holds for target ancestries that are entirely absent from the reference panel, the hardest case for any panel-based method. We built an out-of-panel benchmark from the gnomAD Human Genome Diversity Project and 1000 Genomes harmonized callset (all 22 autosomes, GRCh38, phased)</w:t>
+        <w:t xml:space="preserve">The MESA experiment holds the reference panel fixed and varies the candidate-set size. A complementary and more stringent question is whether Selphi 2's accuracy advantage holds for target ancestries that are entirely absent from the reference panel, the hardest case for any panel-based method. We built an out-of-panel benchmark from the gnomAD Human Genome Diversity Project and 1000 Genomes harmonized callset (all 22 autosomes, GRCh38, phased)</w:t>
       </w:r>
       <w:hyperlink w:anchor="ref28">
         <w:r>
@@ -12180,7 +12120,7 @@
         <w:rPr>
           <w:rFonts w:ascii="Times New Roman" w:hAnsi="Times New Roman" w:cs="Times New Roman" w:eastAsia="Times New Roman"/>
         </w:rPr>
-        <w:t xml:space="preserve">in all seven continental regions, including the two absent from the panel (Oceanian +0.0104, Middle-Eastern +0.0060; African +0.0126, East-Asian +0.0075; Table 2c). On the per-variant metric Selphi 2 also leads overall (0.5323 versus 0.5252) and at every MAF bin above 0.1%, with Beagle retaining its usual edge only at the rarest bin (MAF 0.05–0.1%,</w:t>
+        <w:t xml:space="preserve">in all seven continental regions, including the two absent from the panel (Oceanian +0.0104, Middle-Eastern +0.0060; African +0.0126, East-Asian +0.0075; Table 2c). On the per-variant metric Selphi 2 also leads overall (0.5323 versus 0.5252) and at every MAF bin above 0.1%, with Beagle retaining its usual edge only at the rarest bin (MAF 0.05-0.1%,</w:t>
       </w:r>
       <w:r>
         <w:rPr>
@@ -13306,7 +13246,7 @@
           <w:rFonts w:ascii="Times New Roman" w:hAnsi="Times New Roman" w:cs="Times New Roman" w:eastAsia="Times New Roman"/>
           <w:sz w:val="20"/>
         </w:rPr>
-        <w:t xml:space="preserve">versus coverage for Selphi 2, GLIMPSE2 and QUILT2 (GIAB HG002/HG003/HG004, chromosome 22:20–30 Mb, leak-free 6,332-haplotype 1000 Genomes panel, reference-homozygous sites scored as dosage zero, scored on the sites imputed by all three tools; Table 6b). Selphi 2 (native in-process pileup, band-mode recombination by default) exceeds both GLIMPSE2 and QUILT2 in overall per-sample</w:t>
+        <w:t xml:space="preserve">versus coverage for Selphi 2, GLIMPSE2 and QUILT2 (GIAB HG002/HG003/HG004, chromosome 22:20-30 Mb, leak-free 6,332-haplotype 1000 Genomes panel, reference-homozygous sites scored as dosage zero, scored on the sites imputed by all three tools; Table 6b). Selphi 2 (native in-process pileup, band-mode recombination by default) exceeds both GLIMPSE2 and QUILT2 in overall per-sample</w:t>
       </w:r>
       <w:r>
         <w:rPr>
@@ -13341,7 +13281,7 @@
           <w:rFonts w:ascii="Times New Roman" w:hAnsi="Times New Roman" w:cs="Times New Roman" w:eastAsia="Times New Roman"/>
           <w:sz w:val="20"/>
         </w:rPr>
-        <w:t xml:space="preserve">at every coverage. On the ultra-rare bin (MAF 0–0.5%; Table 6b) Selphi 2 leads at 2</w:t>
+        <w:t xml:space="preserve">at every coverage. On the ultra-rare bin (MAF 0-0.5%; Table 6b) Selphi 2 leads at 2</w:t>
       </w:r>
       <m:oMath>
         <m:r>
@@ -13441,7 +13381,7 @@
         <w:rPr>
           <w:rFonts w:ascii="Times New Roman" w:hAnsi="Times New Roman" w:cs="Times New Roman" w:eastAsia="Times New Roman"/>
         </w:rPr>
-        <w:t xml:space="preserve">The 1000 Genomes panel benchmarks share haplotypes with the held-out targets via descent, which can inflate measured accuracy. As an independent validation we used the Genome in a Bottle (GIAB) reference samples HG002–HG007, none of which are in the 1000 Genomes Project, as held-out targets against a 75,552-haplotype reference panel that contains the full 1000 Genomes cohort. Truth genotypes were taken from the GIAB v4.2.1 high-confidence regions restricted to common variants (MAF 5–50%, n = 73,710 sites on chr21 after restriction; n = 409,392 on chr1).</w:t>
+        <w:t xml:space="preserve">The 1000 Genomes panel benchmarks share haplotypes with the held-out targets via descent, which can inflate measured accuracy. As an independent validation we used the Genome in a Bottle (GIAB) reference samples HG002-HG007, none of which are in the 1000 Genomes Project, as held-out targets against a 75,552-haplotype reference panel that contains the full 1000 Genomes cohort. Truth genotypes were taken from the GIAB v4.2.1 high-confidence regions restricted to common variants (MAF 5-50%, n = 73,710 sites on chr21 after restriction; n = 409,392 on chr1).</w:t>
       </w:r>
     </w:p>
     <w:p>
@@ -13537,7 +13477,7 @@
         <w:rPr>
           <w:rFonts w:ascii="Times New Roman" w:hAnsi="Times New Roman" w:cs="Times New Roman" w:eastAsia="Times New Roman"/>
         </w:rPr>
-        <w:t xml:space="preserve">0.9815 versus Beagle 0.9825 and Selphi 1.5.3 0.9815, a three-way effective tie on a well-saturated panel. This leak-free truth is restricted to common variants (MAF 5–50%), where modern imputers are expected to converge; the complementary leak-free assessment of rare-variant accuracy is the out-of-panel HGDP benchmark above (all MAF bins, genome-wide), where Selphi 2 leads Beagle 5.5 at every frequency above the rarest.</w:t>
+        <w:t xml:space="preserve">0.9815 versus Beagle 0.9825 and Selphi 1.5.3 0.9815, a three-way effective tie on a well-saturated panel. This leak-free truth is restricted to common variants (MAF 5-50%), where modern imputers are expected to converge; the complementary leak-free assessment of rare-variant accuracy is the out-of-panel HGDP benchmark above (all MAF bins, genome-wide), where Selphi 2 leads Beagle 5.5 at every frequency above the rarest.</w:t>
       </w:r>
     </w:p>
     <w:p>
@@ -13615,7 +13555,7 @@
         <w:rPr>
           <w:rFonts w:ascii="Times New Roman" w:hAnsi="Times New Roman" w:cs="Times New Roman" w:eastAsia="Times New Roman"/>
         </w:rPr>
-        <w:t xml:space="preserve">To evaluate the deployment scenario directly, a consumer genotyping array imputed against the reference panel and validated against the individual’s own high-coverage genome, we assembled a held-out set of six individuals, each having both a SelfDecode genotyping array (Illumina Global Screening Array, ≈620,000 autosomal SNPs after restriction to panel sites) and an independent high-coverage Illumina DRAGEN whole-genome sequence (≈30–60</w:t>
+        <w:t xml:space="preserve">To evaluate the deployment scenario directly, a consumer genotyping array imputed against the reference panel and validated against the individual's own high-coverage genome, we assembled a held-out set of six individuals, each having both a SelfDecode genotyping array (Illumina Global Screening Array, ≈620,000 autosomal SNPs after restriction to panel sites) and an independent high-coverage Illumina DRAGEN whole-genome sequence (≈30-60</w:t>
       </w:r>
       <m:oMath>
         <m:r>
@@ -13629,7 +13569,7 @@
         <w:rPr>
           <w:rFonts w:ascii="Times New Roman" w:hAnsi="Times New Roman" w:cs="Times New Roman" w:eastAsia="Times New Roman"/>
         </w:rPr>
-        <w:t xml:space="preserve">). The array genotypes were imputed against the 75,552-haplotype (37,776-sample) reference panel, and the imputed dosages compared, genome-wide (chromosomes 1–22), against each individual’s WGS truth restricted to high-confidence genotypes (DRAGEN PASS, GQ ≥ 20, DP ≥ 10). All six individuals were confirmed absent from the reference panel (leak-free).</w:t>
+        <w:t xml:space="preserve">). The array genotypes were imputed against the 75,552-haplotype (37,776-sample) reference panel, and the imputed dosages compared, genome-wide (chromosomes 1-22), against each individual's WGS truth restricted to high-confidence genotypes (DRAGEN PASS, GQ ≥ 20, DP ≥ 10). All six individuals were confirmed absent from the reference panel (leak-free).</w:t>
       </w:r>
     </w:p>
     <w:p>
@@ -13641,7 +13581,7 @@
         <w:rPr>
           <w:rFonts w:ascii="Times New Roman" w:hAnsi="Times New Roman" w:cs="Times New Roman" w:eastAsia="Times New Roman"/>
         </w:rPr>
-        <w:t xml:space="preserve">Given both tools the same Beagle-derived phasing, Selphi 2’s imputation exceeds Beagle 5.5 on both variant classes, averaged across all 22 autosomes and the six samples: mean SNP</w:t>
+        <w:t xml:space="preserve">Given both tools the same Beagle-derived phasing, Selphi 2's imputation exceeds Beagle 5.5 on both variant classes, averaged across all 22 autosomes and the six samples: mean SNP</w:t>
       </w:r>
       <w:r>
         <w:rPr>
@@ -13705,7 +13645,7 @@
         <w:rPr>
           <w:rFonts w:ascii="Times New Roman" w:hAnsi="Times New Roman" w:cs="Times New Roman" w:eastAsia="Times New Roman"/>
         </w:rPr>
-        <w:t xml:space="preserve">0.7911 versus 0.7840 (Table 3). Selphi 1.5.3 and Selphi 2 are effectively tied (SNP 0.9599 versus 0.9601; indel 0.7932 versus 0.7911), confirming that the Rust reimplementation preserves the imputation core. Run with its own internal phasing, Selphi 2 matches or exceeds Beagle’s full pipeline on both variant classes with either engine, and its default diploid engine attains the highest point estimate of any configuration tested (mean SNP</w:t>
+        <w:t xml:space="preserve">0.7911 versus 0.7840 (Table 3). Selphi 1.5.3 and Selphi 2 are effectively tied (SNP 0.9599 versus 0.9601; indel 0.7932 versus 0.7911), confirming that the Rust reimplementation preserves the imputation core. Run with its own internal phasing, Selphi 2 matches or exceeds Beagle's full pipeline on both variant classes with either engine, and its default diploid engine attains the highest point estimate of any configuration tested (mean SNP</w:t>
       </w:r>
       <w:r>
         <w:rPr>
@@ -13769,7 +13709,7 @@
         <w:rPr>
           <w:rFonts w:ascii="Times New Roman" w:hAnsi="Times New Roman" w:cs="Times New Roman" w:eastAsia="Times New Roman"/>
         </w:rPr>
-        <w:t xml:space="preserve">0.7935), above Beagle 5.5 (0.9584 / 0.7840) and the haploid engine (0.9587 / 0.7909) and on par with the Beagle-phased configurations (0.9601 / 0.7911; the 0.0004 SNP difference is within the n = 6 sampling variation). Because imputation is linear in the per-haplotype copying weights, averaging several of Selphi’s own phasings yields the exact posterior-mean dosage over phase realizations rather than conditioning on a single committed phasing. Two changes drive this. First, earlier versions trailed Beagle on common SNPs because array no-call genotypes (≈1.7% of typed sites on this array) were folded to homozygous reference before phasing rather than imputed, biasing both the phasing scaffold and the imputer’s reference-haplotype selection toward the reference allele at precisely the sites being imputed; imputing the no-calls instead, a local copying consensus over the nearest PBWT neighbours, applied in both engines, closed that gap (Methods; Discussion). Second, the diploid engine averages its imputation over a small intra-run phase ensemble: the post-burn-in MCMC samples the phasing chain already computes (and would otherwise discard) are reused as independent phase draws, and because interpolation is linear in the per-haplotype copying weights, averaging their dosages marginalises phase uncertainty for one extra imputation pass and no extra phasing (the phasing chain is shared; Methods). Together these lift the diploid engine from SNP</w:t>
+        <w:t xml:space="preserve">0.7935), above Beagle 5.5 (0.9584 / 0.7840) and the haploid engine (0.9587 / 0.7909) and on par with the Beagle-phased configurations (0.9601 / 0.7911; the 0.0004 SNP difference is within the n = 6 sampling variation). Because imputation is linear in the per-haplotype copying weights, averaging several of Selphi's own phasings yields the exact posterior-mean dosage over phase realizations rather than conditioning on a single committed phasing. Two changes drive this. First, earlier versions trailed Beagle on common SNPs because array no-call genotypes (≈1.7% of typed sites on this array) were folded to homozygous reference before phasing rather than imputed, biasing both the phasing scaffold and the imputer's reference-haplotype selection toward the reference allele at precisely the sites being imputed; imputing the no-calls instead, a local copying consensus over the nearest PBWT neighbours, applied in both engines, closed that gap (Methods; Discussion). Second, the diploid engine averages its imputation over a small intra-run phase ensemble: the post-burn-in MCMC samples the phasing chain already computes (and would otherwise discard) are reused as independent phase draws, and because interpolation is linear in the per-haplotype copying weights, averaging their dosages marginalises phase uncertainty for one extra imputation pass and no extra phasing (the phasing chain is shared; Methods). Together these lift the diploid engine from SNP</w:t>
       </w:r>
       <w:r>
         <w:rPr>
@@ -13801,7 +13741,7 @@
         <w:rPr>
           <w:rFonts w:ascii="Times New Roman" w:hAnsi="Times New Roman" w:cs="Times New Roman" w:eastAsia="Times New Roman"/>
         </w:rPr>
-        <w:t xml:space="preserve">0.9553 (an earlier single-phase version) to 0.9605. Selphi 2 therefore no longer requires an external phaser to reach Beagle-quality accuracy on real arrays; with its default engine it exceeds Beagle’s full pipeline. Because this is a held-out set of only six individuals, we report paired statistics over the six samples (95% confidence intervals from 20,000 paired bootstrap resamples; two-sided exact Wilcoxon signed-rank, for which n = 6 gives a minimum attainable p of 0.031). With its own diploid phasing, Selphi 2 exceeds Beagle 5.5 on both variant classes (SNP</w:t>
+        <w:t xml:space="preserve">0.9553 (an earlier single-phase version) to 0.9605. Selphi 2 therefore no longer requires an external phaser to reach Beagle-quality accuracy on real arrays; with its default engine it exceeds Beagle's full pipeline. Because this is a held-out set of only six individuals, we report paired statistics over the six samples (95% confidence intervals from 20,000 paired bootstrap resamples; two-sided exact Wilcoxon signed-rank, for which n = 6 gives a minimum attainable p of 0.031). With its own diploid phasing, Selphi 2 exceeds Beagle 5.5 on both variant classes (SNP</w:t>
       </w:r>
       <w:r>
         <w:rPr>
@@ -13839,7 +13779,7 @@
         <w:rPr>
           <w:rFonts w:ascii="Times New Roman" w:hAnsi="Times New Roman" w:cs="Times New Roman" w:eastAsia="Times New Roman"/>
         </w:rPr>
-        <w:t xml:space="preserve">+0.0021, 95% CI [+0.0009, +0.0034]; indel +0.0095, [+0.0077, +0.0116]; both p = 0.031, all 6 of 6 samples) and exceeds the haploid engine (SNP +0.0018, [+0.0016, +0.0020]; indel +0.0026, [+0.0024, +0.0029]; both p = 0.031). Relative to Selphi 2 given Beagle’s own phasing, the diploid engine is statistically indistinguishable on SNPs (+0.0004, [-0.0002, +0.0011], p = 0.44) and higher on indels (+0.0024, [+0.0018, +0.0031], p = 0.031). At equal (Beagle-derived) phasing, Selphi 2’s imputer exceeds Beagle 5.5 (SNP +0.0017, [+0.0009, +0.0024]; indel +0.0071, [+0.0058, +0.0086]; both p = 0.031) and is indistinguishable from Selphi 1.5.3 (SNP +0.0002, [-0.0004, +0.0007], p = 0.81), confirming that the Rust reimplementation preserves the imputation core. The ranking is consistent across all six individuals and concordant with the leak-free GIAB result above.</w:t>
+        <w:t xml:space="preserve">+0.0021, 95% CI [+0.0009, +0.0034]; indel +0.0095, [+0.0077, +0.0116]; both p = 0.031, all 6 of 6 samples) and exceeds the haploid engine (SNP +0.0018, [+0.0016, +0.0020]; indel +0.0026, [+0.0024, +0.0029]; both p = 0.031). Relative to Selphi 2 given Beagle's own phasing, the diploid engine is statistically indistinguishable on SNPs (+0.0004, [-0.0002, +0.0011], p = 0.44) and higher on indels (+0.0024, [+0.0018, +0.0031], p = 0.031). At equal (Beagle-derived) phasing, Selphi 2's imputer exceeds Beagle 5.5 (SNP +0.0017, [+0.0009, +0.0024]; indel +0.0071, [+0.0058, +0.0086]; both p = 0.031) and is indistinguishable from Selphi 1.5.3 (SNP +0.0002, [-0.0004, +0.0007], p = 0.81), confirming that the Rust reimplementation preserves the imputation core. The ranking is consistent across all six individuals and concordant with the leak-free GIAB result above.</w:t>
       </w:r>
     </w:p>
     <w:p>
@@ -13903,7 +13843,7 @@
         <w:rPr>
           <w:rFonts w:ascii="Times New Roman" w:hAnsi="Times New Roman" w:cs="Times New Roman" w:eastAsia="Times New Roman"/>
         </w:rPr>
-        <w:t xml:space="preserve">Six individuals, each with a SelfDecode Illumina GSA array imputed against the 75,552-haplotype reference panel and evaluated against their own high-coverage DRAGEN whole-genome sequence (PASS, GQ ≥ 20, DP ≥ 10), genome-wide (chr1–22). Each value is the mean over the six samples of the per-sample squared correlation (</w:t>
+        <w:t xml:space="preserve">Six individuals, each with a SelfDecode Illumina GSA array imputed against the 75,552-haplotype reference panel and evaluated against their own high-coverage DRAGEN whole-genome sequence (PASS, GQ ≥ 20, DP ≥ 10), genome-wide (chr1-22). Each value is the mean over the six samples of the per-sample squared correlation (</w:t>
       </w:r>
       <m:oMath>
         <m:sSup>
@@ -13923,55 +13863,7 @@
         <w:rPr>
           <w:rFonts w:ascii="Times New Roman" w:hAnsi="Times New Roman" w:cs="Times New Roman" w:eastAsia="Times New Roman"/>
         </w:rPr>
-        <w:t xml:space="preserve">) between imputed dosage and truth genotype.</w:t>
-      </w:r>
-      <w:r>
-        <w:rPr>
-          <w:rFonts w:ascii="Times New Roman" w:hAnsi="Times New Roman" w:cs="Times New Roman" w:eastAsia="Times New Roman"/>
-        </w:rPr>
-        <w:t xml:space="preserve"> </w:t>
-      </w:r>
-      <w:r>
-        <w:rPr>
-          <w:rFonts w:ascii="Times New Roman" w:hAnsi="Times New Roman" w:cs="Times New Roman" w:eastAsia="Times New Roman"/>
-        </w:rPr>
-        <w:t xml:space="preserve">“Beagle-phased”</w:t>
-      </w:r>
-      <w:r>
-        <w:rPr>
-          <w:rFonts w:ascii="Times New Roman" w:hAnsi="Times New Roman" w:cs="Times New Roman" w:eastAsia="Times New Roman"/>
-        </w:rPr>
-        <w:t xml:space="preserve"> </w:t>
-      </w:r>
-      <w:r>
-        <w:rPr>
-          <w:rFonts w:ascii="Times New Roman" w:hAnsi="Times New Roman" w:cs="Times New Roman" w:eastAsia="Times New Roman"/>
-        </w:rPr>
-        <w:t xml:space="preserve">rows feed both imputers the identical Beagle phase-only output (isolating the imputation step);</w:t>
-      </w:r>
-      <w:r>
-        <w:rPr>
-          <w:rFonts w:ascii="Times New Roman" w:hAnsi="Times New Roman" w:cs="Times New Roman" w:eastAsia="Times New Roman"/>
-        </w:rPr>
-        <w:t xml:space="preserve"> </w:t>
-      </w:r>
-      <w:r>
-        <w:rPr>
-          <w:rFonts w:ascii="Times New Roman" w:hAnsi="Times New Roman" w:cs="Times New Roman" w:eastAsia="Times New Roman"/>
-        </w:rPr>
-        <w:t xml:space="preserve">“haploid/diploid”</w:t>
-      </w:r>
-      <w:r>
-        <w:rPr>
-          <w:rFonts w:ascii="Times New Roman" w:hAnsi="Times New Roman" w:cs="Times New Roman" w:eastAsia="Times New Roman"/>
-        </w:rPr>
-        <w:t xml:space="preserve"> </w:t>
-      </w:r>
-      <w:r>
-        <w:rPr>
-          <w:rFonts w:ascii="Times New Roman" w:hAnsi="Times New Roman" w:cs="Times New Roman" w:eastAsia="Times New Roman"/>
-        </w:rPr>
-        <w:t xml:space="preserve">rows use Selphi’s internal phasing. All rows cover the full 22 autosomes. The internal-phasing rows impute array no-call genotypes during phasing rather than treating them as homozygous reference (Methods); Beagle-phased input contains no no-calls, so those rows are unaffected.</w:t>
+        <w:t xml:space="preserve">) between imputed dosage and truth genotype. "Beagle-phased" rows feed both imputers the identical Beagle phase-only output (isolating the imputation step); "haploid/diploid" rows use Selphi's internal phasing. All rows cover the full 22 autosomes. The internal-phasing rows impute array no-call genotypes during phasing rather than treating them as homozygous reference (Methods); Beagle-phased input contains no no-calls, so those rows are unaffected.</w:t>
       </w:r>
     </w:p>
     <w:tbl>
@@ -14017,7 +13909,7 @@
                 <w:color w:val="FFFFFF"/>
                 <w:sz w:val="20"/>
               </w:rPr>
-              <w:t xml:space="preserve">Pipeline (phasing → imputation)</w:t>
+              <w:t xml:space="preserve">Pipeline (phasing to imputation)</w:t>
             </w:r>
           </w:p>
         </w:tc>
@@ -14436,7 +14328,7 @@
         <w:rPr>
           <w:rFonts w:ascii="Times New Roman" w:hAnsi="Times New Roman" w:cs="Times New Roman" w:eastAsia="Times New Roman"/>
         </w:rPr>
-        <w:t xml:space="preserve">Beyond accuracy, Selphi 2’s default diploid engine is faster and leaner than Beagle 5.5 on this benchmark. Imputing the six-sample cohort against the 75,552-haplotype panel on a single 16-thread node (one chromosome at a time), Selphi 2 completes all 22 autosomes in 27.7 minutes versus Beagle’s 36.4 minutes (1.3</w:t>
+        <w:t xml:space="preserve">Beyond accuracy, Selphi 2's default diploid engine is faster and leaner than Beagle 5.5 on this benchmark. Imputing the six-sample cohort against the 75,552-haplotype panel on a single 16-thread node (one chromosome at a time), Selphi 2 completes all 22 autosomes in 27.7 minutes versus Beagle's 36.4 minutes (1.3</w:t>
       </w:r>
       <m:oMath>
         <m:r>
@@ -14456,7 +14348,7 @@
         <w:rPr>
           <w:rFonts w:ascii="Times New Roman" w:hAnsi="Times New Roman" w:cs="Times New Roman" w:eastAsia="Times New Roman"/>
         </w:rPr>
-        <w:t xml:space="preserve">faster end-to-end), at a peak resident memory of about 25 GB versus Beagle’s roughly 40 GB (about 1.6</w:t>
+        <w:t xml:space="preserve">faster end-to-end), at a peak resident memory of about 25 GB versus Beagle's roughly 40 GB (about 1.6</w:t>
       </w:r>
       <m:oMath>
         <m:r>
@@ -14502,7 +14394,7 @@
         <w:rPr>
           <w:rFonts w:ascii="Times New Roman" w:hAnsi="Times New Roman" w:cs="Times New Roman" w:eastAsia="Times New Roman"/>
         </w:rPr>
-        <w:t xml:space="preserve">Six-sample cohort imputed against the 75,552-haplotype reference panel across all 22 autosomes, 16 threads, one chromosome at a time on the same node. Wall time is summed over the 22 autosomes; peak memory is the maximum resident set during the run, reached on the largest chromosome. Selphi 2 uses its default diploid engine (intra-run phase ensemble on; disabling it is faster still). Beagle 5.5 is the full phase-plus-impute pipeline. Per-chromosome wall times on this shared node fluctuate with system load (Selphi’s memory-bandwidth-bound interpolation varies roughly 15% run to run), so the whole-genome total is the stable comparison; Beagle’s peak memory is JVM-garbage-collector-dependent (31–51 GB across repeats, median ≈ 40 GB).</w:t>
+        <w:t xml:space="preserve">Six-sample cohort imputed against the 75,552-haplotype reference panel across all 22 autosomes, 16 threads, one chromosome at a time on the same node. Wall time is summed over the 22 autosomes; peak memory is the maximum resident set during the run, reached on the largest chromosome. Selphi 2 uses its default diploid engine (intra-run phase ensemble on; disabling it is faster still). Beagle 5.5 is the full phase-plus-impute pipeline. Per-chromosome wall times on this shared node fluctuate with system load (Selphi's memory-bandwidth-bound interpolation varies roughly 15% run to run), so the whole-genome total is the stable comparison; Beagle's peak memory is JVM-garbage-collector-dependent (31-51 GB across repeats, median ≈ 40 GB).</w:t>
       </w:r>
     </w:p>
     <w:tbl>
@@ -14745,25 +14637,7 @@
         <w:rPr>
           <w:rFonts w:ascii="Times New Roman" w:hAnsi="Times New Roman" w:cs="Times New Roman" w:eastAsia="Times New Roman"/>
         </w:rPr>
-        <w:t xml:space="preserve">We evaluated phasing accuracy on the 1000 Genomes trio dataset using 54 trio children for whom both parents are independently sequenced and therefore the parent-of-origin truth phase at each heterozygous site can be established by Mendelian inheritance. All 54 children’s whole-genome sequencing genotypes for chromosomes 1 and 22 were phased against the 2,239-sample 1000 Genomes reference panel from which the trio members had been removed (</w:t>
-      </w:r>
-      <w:r>
-        <w:rPr>
-          <w:rFonts w:ascii="Times New Roman" w:hAnsi="Times New Roman" w:cs="Times New Roman" w:eastAsia="Times New Roman"/>
-        </w:rPr>
-        <w:t xml:space="preserve">“no-trios”</w:t>
-      </w:r>
-      <w:r>
-        <w:rPr>
-          <w:rFonts w:ascii="Times New Roman" w:hAnsi="Times New Roman" w:cs="Times New Roman" w:eastAsia="Times New Roman"/>
-        </w:rPr>
-        <w:t xml:space="preserve"> </w:t>
-      </w:r>
-      <w:r>
-        <w:rPr>
-          <w:rFonts w:ascii="Times New Roman" w:hAnsi="Times New Roman" w:cs="Times New Roman" w:eastAsia="Times New Roman"/>
-        </w:rPr>
-        <w:t xml:space="preserve">panel). For SHAPEIT5 v5.1.1, the full pipeline was run (phase_common at MAF ≥ 0.001, then phase_rare on the common-variant scaffold). For Beagle 5.5, the default phasing pass was used. Switch error rate (SER) was computed against the parent-of-origin truth using</w:t>
+        <w:t xml:space="preserve">We evaluated phasing accuracy on the 1000 Genomes trio dataset using 54 trio children for whom both parents are independently sequenced and therefore the parent-of-origin truth phase at each heterozygous site can be established by Mendelian inheritance. All 54 children's whole-genome sequencing genotypes for chromosomes 1 and 22 were phased against the 2,239-sample 1000 Genomes reference panel from which the trio members had been removed ("no-trios" panel). For SHAPEIT5 v5.1.1, the full pipeline was run (phase_common at MAF ≥ 0.001, then phase_rare on the common-variant scaffold). For Beagle 5.5, the default phasing pass was used. Switch error rate (SER) was computed against the parent-of-origin truth using</w:t>
       </w:r>
       <w:r>
         <w:rPr>
@@ -14794,7 +14668,7 @@
         <w:rPr>
           <w:rFonts w:ascii="Times New Roman" w:hAnsi="Times New Roman" w:cs="Times New Roman" w:eastAsia="Times New Roman"/>
         </w:rPr>
-        <w:t xml:space="preserve">On chromosome 22, Selphi 2’s diploid engine attains the lowest mean SER (2.521%), followed by Beagle 5.5 (2.548%), Selphi 2’s haploid engine (2.569%), and SHAPEIT5 full pipeline (2.611%). On chromosome 1, the ranking is Beagle 5.5 (1.865%), Selphi 2 diploid (1.876%) and Selphi 2 haploid (1.876%) (tied to 4 decimal places), and SHAPEIT5 (1.935%). Selphi 2’s diploid engine is effectively tied with Beagle 5.5 across both chromosomes (|</w:t>
+        <w:t xml:space="preserve">On chromosome 22, Selphi 2's diploid engine attains the lowest mean SER (2.521%), followed by Beagle 5.5 (2.548%), Selphi 2's haploid engine (2.569%), and SHAPEIT5 full pipeline (2.611%). On chromosome 1, the ranking is Beagle 5.5 (1.865%), Selphi 2 diploid (1.876%) and Selphi 2 haploid (1.876%) (tied to 4 decimal places), and SHAPEIT5 (1.935%). Selphi 2's diploid engine is effectively tied with Beagle 5.5 across both chromosomes (|</w:t>
       </w:r>
       <m:oMath>
         <m:r>
@@ -14808,7 +14682,7 @@
         <w:rPr>
           <w:rFonts w:ascii="Times New Roman" w:hAnsi="Times New Roman" w:cs="Times New Roman" w:eastAsia="Times New Roman"/>
         </w:rPr>
-        <w:t xml:space="preserve">| ≤ 0.027 percentage points, within seed-to-seed variation) and consistently better than SHAPEIT5 (by 0.060–0.090 percentage points). Selphi 2 diploid is also the fastest phaser of the four on both chromosomes, completing chr22 in 0.66</w:t>
+        <w:t xml:space="preserve">| ≤ 0.027 percentage points, within seed-to-seed variation) and consistently better than SHAPEIT5 (by 0.060-0.090 percentage points). Selphi 2 diploid is also the fastest phaser of the four on both chromosomes, completing chr22 in 0.66</w:t>
       </w:r>
       <m:oMath>
         <m:r>
@@ -14828,7 +14702,7 @@
         <w:rPr>
           <w:rFonts w:ascii="Times New Roman" w:hAnsi="Times New Roman" w:cs="Times New Roman" w:eastAsia="Times New Roman"/>
         </w:rPr>
-        <w:t xml:space="preserve">Beagle’s wall time and chr1 in 0.67</w:t>
+        <w:t xml:space="preserve">Beagle's wall time and chr1 in 0.67</w:t>
       </w:r>
       <m:oMath>
         <m:r>
@@ -15750,7 +15624,7 @@
         <w:rPr>
           <w:rFonts w:ascii="Times New Roman" w:hAnsi="Times New Roman" w:cs="Times New Roman" w:eastAsia="Times New Roman"/>
         </w:rPr>
-        <w:t xml:space="preserve">0.6156 versus the diploid engine’s 0.6148, a gap of +0.0008, effectively tied on this cohort. We discuss the interpretation of this engine-by-cohort behaviour in the Discussion.</w:t>
+        <w:t xml:space="preserve">0.6156 versus the diploid engine's 0.6148, a gap of +0.0008, effectively tied on this cohort. We discuss the interpretation of this engine-by-cohort behaviour in the Discussion.</w:t>
       </w:r>
     </w:p>
     <w:p>
@@ -15809,7 +15683,7 @@
         <w:rPr>
           <w:rFonts w:ascii="Times New Roman" w:hAnsi="Times New Roman" w:cs="Times New Roman" w:eastAsia="Times New Roman"/>
         </w:rPr>
-        <w:t xml:space="preserve">), and compared against the parent-free phasing above. On chromosome 22 the pedigree scaffold lowered Selphi 2’s mean switch-error rate from 2.521% to 0.849% — a 66% reduction — while the same pedigree lowered Beagle 5.5’s SER from 2.548% to 1.050% and SHAPEIT5’s (full pipeline,</w:t>
+        <w:t xml:space="preserve">), and compared against the parent-free phasing above. On chromosome 22 the pedigree scaffold lowered Selphi 2's mean switch-error rate from 2.521% to 0.849% (a 66% reduction), while the same pedigree lowered Beagle 5.5's SER from 2.548% to 1.050% and SHAPEIT5's (full pipeline,</w:t>
       </w:r>
       <w:r>
         <w:rPr>
@@ -15853,7 +15727,7 @@
         <w:rPr>
           <w:rFonts w:ascii="Times New Roman" w:hAnsi="Times New Roman" w:cs="Times New Roman" w:eastAsia="Times New Roman"/>
         </w:rPr>
-        <w:t xml:space="preserve">) from 2.599% to 0.000% (Table 4b). Crucially, this pedigree benefit is consistent at the level of individual trios: Selphi 2’s pedigree-aware phasing achieved a lower switch-error rate than Beagle’s in 52 of 54 trios on chromosome 22 (paired Δ = −0.20 pp, 95% CI [−0.23, −0.17]) and in all 54 of 54 trios on chromosome 1 (where the pedigree lowered Selphi 2 from 1.879% to 0.335% and Beagle from 1.865% to 0.429%; Δ = −0.09 pp, [−0.10, −0.08]), so among the two probabilistic scaffolders Selphi 2 makes the more effective use of the pedigree.</w:t>
+        <w:t xml:space="preserve">) from 2.599% to 0.000% (Table 4b). Crucially, this pedigree benefit is consistent at the level of individual trios: Selphi 2's pedigree-aware phasing achieved a lower switch-error rate than Beagle's in 52 of 54 trios on chromosome 22 (paired Δ = -0.20 pp, 95% CI [-0.23, -0.17]) and in all 54 of 54 trios on chromosome 1 (where the pedigree lowered Selphi 2 from 1.879% to 0.335% and Beagle from 1.865% to 0.429%; Δ = -0.09 pp, [-0.10, -0.08]), so among the two probabilistic scaffolders Selphi 2 makes the more effective use of the pedigree.</w:t>
       </w:r>
     </w:p>
     <w:p>
@@ -15891,7 +15765,7 @@
         <w:rPr>
           <w:rFonts w:ascii="Times New Roman" w:hAnsi="Times New Roman" w:cs="Times New Roman" w:eastAsia="Times New Roman"/>
         </w:rPr>
-        <w:t xml:space="preserve">pedigree information are only partially independent of the phasing, because the parent-of-origin truth phase is itself derived from the parental genotypes that pedigree-aware phasing also uses: a method that commits the child’s phase rigidly to the Mendelian-implied configuration at every informative site reports a switch-error rate approaching zero by construction, as SHAPEIT5’s</w:t>
+        <w:t xml:space="preserve">pedigree information are only partially independent of the phasing, because the parent-of-origin truth phase is itself derived from the parental genotypes that pedigree-aware phasing also uses: a method that commits the child's phase rigidly to the Mendelian-implied configuration at every informative site reports a switch-error rate approaching zero by construction, as SHAPEIT5's</w:t>
       </w:r>
       <w:r>
         <w:rPr>
@@ -15916,7 +15790,7 @@
         <w:rPr>
           <w:rFonts w:ascii="Times New Roman" w:hAnsi="Times New Roman" w:cs="Times New Roman" w:eastAsia="Times New Roman"/>
         </w:rPr>
-        <w:t xml:space="preserve">mode does here (0.000%). Selphi 2 and Beagle 5.5 instead treat the pedigree as a soft scaffold that still admits HMM-driven phasing where the trio is uninformative (both parents heterozygous), so their residual switch-error rates remain meaningful. The parent-free comparison (Table 4) is therefore the unconfounded measure of phasing quality. There the three tools are close: on chromosome 22 Selphi 2’s diploid engine is statistically indistinguishable from Beagle 5.5 (paired Δ = −0.027 pp, 95% CI [−0.056, +0.002], lower in 30 of 54 trios) and significantly lower than SHAPEIT5 (Δ = −0.078 pp, [−0.104, −0.053], 44 of 54 trios), while on chromosome 1 Beagle 5.5 is marginally lowest but again not significantly different from Selphi 2 (Δ = +0.013 pp, [−0.000, +0.027]).</w:t>
+        <w:t xml:space="preserve">mode does here (0.000%). Selphi 2 and Beagle 5.5 instead treat the pedigree as a soft scaffold that still admits HMM-driven phasing where the trio is uninformative (both parents heterozygous), so their residual switch-error rates remain meaningful. The parent-free comparison (Table 4) is therefore the unconfounded measure of phasing quality. There the three tools are close: on chromosome 22 Selphi 2's diploid engine is statistically indistinguishable from Beagle 5.5 (paired Δ = -0.027 pp, 95% CI [-0.056, +0.002], lower in 30 of 54 trios) and significantly lower than SHAPEIT5 (Δ = -0.078 pp, [-0.104, -0.053], 44 of 54 trios), while on chromosome 1 Beagle 5.5 is marginally lowest but again not significantly different from Selphi 2 (Δ = +0.013 pp, [-0.000, +0.027]).</w:t>
       </w:r>
     </w:p>
     <w:p>
@@ -15928,7 +15802,7 @@
         <w:rPr>
           <w:rFonts w:ascii="Times New Roman" w:hAnsi="Times New Roman" w:cs="Times New Roman" w:eastAsia="Times New Roman"/>
         </w:rPr>
-        <w:t xml:space="preserve">To confirm that the pedigree improves phasing in a way that is real rather than an artifact of this circularity, we measured downstream imputation accuracy against a fully independent truth — each child’s own high-coverage WGS, which does not enter the phasing. We masked the 54 children to a consumer-array site set (Illumina GSA), phased the masked target with and without the pedigree, imputed the result against the no-trios panel with a single fixed imputer (Selphi 2), and scored imputed-only sites against the child’s WGS. Pedigree-aware phasing raised imputation accuracy for every phaser on both chromosomes (overall</w:t>
+        <w:t xml:space="preserve">To confirm that the pedigree improves phasing in a way that is real rather than an artifact of this circularity, we measured downstream imputation accuracy against a fully independent truth: each child's own high-coverage WGS, which does not enter the phasing. We masked the 54 children to a consumer-array site set (Illumina GSA), phased the masked target with and without the pedigree, imputed the result against the no-trios panel with a single fixed imputer (Selphi 2), and scored imputed-only sites against the child's WGS. Pedigree-aware phasing raised imputation accuracy for every phaser on both chromosomes (overall</w:t>
       </w:r>
       <w:r>
         <w:rPr>
@@ -15960,7 +15834,7 @@
         <w:rPr>
           <w:rFonts w:ascii="Times New Roman" w:hAnsi="Times New Roman" w:cs="Times New Roman" w:eastAsia="Times New Roman"/>
         </w:rPr>
-        <w:t xml:space="preserve">+0.016 to +0.022 on chromosome 22 and +0.013 to +0.018 on chromosome 1; Table 4c). The paired per-sample gains are significant for all three phasers — on chromosome 22 +0.0048 for Selphi 2 (95% CI [+0.0032, +0.0063], 46 of 54 samples), +0.0079 for Beagle and +0.0079 for SHAPEIT5, and on chromosome 1 +0.0035, +0.0046 and +0.0036 respectively (all 54 of 54 samples; every CI excludes zero). Because the truth is the child’s own genome rather than the parents, this is an out-of-sample confirmation that the pedigree yields genuinely better haplotypes for downstream imputation; without it the three phasers are practically interchangeable as imputation input (per-sample</w:t>
+        <w:t xml:space="preserve">+0.016 to +0.022 on chromosome 22 and +0.013 to +0.018 on chromosome 1; Table 4c). The paired per-sample gains are significant for all three phasers: on chromosome 22 +0.0048 for Selphi 2 (95% CI [+0.0032, +0.0063], 46 of 54 samples), +0.0079 for Beagle and +0.0079 for SHAPEIT5, and on chromosome 1 +0.0035, +0.0046 and +0.0036 respectively (all 54 of 54 samples; every CI excludes zero). Because the truth is the child's own genome rather than the parents, this is an out-of-sample confirmation that the pedigree yields genuinely better haplotypes for downstream imputation; without it the three phasers are practically interchangeable as imputation input (per-sample</w:t>
       </w:r>
       <w:r>
         <w:rPr>
@@ -16081,7 +15955,7 @@
         <w:rPr>
           <w:rFonts w:ascii="Times New Roman" w:hAnsi="Times New Roman" w:cs="Times New Roman" w:eastAsia="Times New Roman"/>
         </w:rPr>
-        <w:t xml:space="preserve">). The no-pedigree columns reproduce the experiment of Table 4 (Selphi 2 and Beagle 5.5 identical; SHAPEIT5 within 0.012 pp of Table 4’s independent run); paired significance is given in the text. Pedigree-aware SER is partially circular (see text); the no-pedigree columns are the unconfounded comparison and Table 4c is the independent confirmation.</w:t>
+        <w:t xml:space="preserve">). The no-pedigree columns reproduce the experiment of Table 4 (Selphi 2 and Beagle 5.5 identical; SHAPEIT5 within 0.012 pp of Table 4's independent run); paired significance is given in the text. Pedigree-aware SER is partially circular (see text); the no-pedigree columns are the unconfounded comparison and Table 4c is the independent confirmation.</w:t>
       </w:r>
     </w:p>
     <w:tbl>
@@ -16542,7 +16416,7 @@
         <w:rPr>
           <w:rFonts w:ascii="Times New Roman" w:hAnsi="Times New Roman" w:cs="Times New Roman" w:eastAsia="Times New Roman"/>
         </w:rPr>
-        <w:t xml:space="preserve">*0.000% reflects rigid commitment of the child’s phase to the Mendelian configuration, not error-free phasing (see text).</w:t>
+        <w:t xml:space="preserve">*0.000% reflects rigid commitment of the child's phase to the Mendelian configuration, not error-free phasing (see text).</w:t>
       </w:r>
     </w:p>
     <w:p>
@@ -16568,7 +16442,7 @@
         <w:rPr>
           <w:rFonts w:ascii="Times New Roman" w:hAnsi="Times New Roman" w:cs="Times New Roman" w:eastAsia="Times New Roman"/>
         </w:rPr>
-        <w:t xml:space="preserve">The 54 trio children were masked to a consumer-array site set (Illumina GSA; 9,283 sites on chromosome 22, 49,977 on chromosome 1), phased with and without the trio pedigree, imputed against the 2,239-sample no-trios panel with a single fixed imputer (Selphi 2), and scored on imputed-only sites against each child’s own high-coverage WGS, which is independent of the parents. Values are overall</w:t>
+        <w:t xml:space="preserve">The 54 trio children were masked to a consumer-array site set (Illumina GSA; 9,283 sites on chromosome 22, 49,977 on chromosome 1), phased with and without the trio pedigree, imputed against the 2,239-sample no-trios panel with a single fixed imputer (Selphi 2), and scored on imputed-only sites against each child's own high-coverage WGS, which is independent of the parents. Values are overall</w:t>
       </w:r>
       <w:r>
         <w:rPr>
@@ -16594,7 +16468,7 @@
         <w:rPr>
           <w:rFonts w:ascii="Times New Roman" w:hAnsi="Times New Roman" w:cs="Times New Roman" w:eastAsia="Times New Roman"/>
         </w:rPr>
-        <w:t xml:space="preserve">; only the phasing input varies between rows. The paired per-sample gains from the pedigree are significant for every phaser (chromosome 22 +0.0048 to +0.0079; chromosome 1 +0.0035 to +0.0046; all 95% CIs exclude zero; 46–54 of 54 samples).</w:t>
+        <w:t xml:space="preserve">; only the phasing input varies between rows. The paired per-sample gains from the pedigree are significant for every phaser (chromosome 22 +0.0048 to +0.0079; chromosome 1 +0.0035 to +0.0046; all 95% CIs exclude zero; 46-54 of 54 samples).</w:t>
       </w:r>
     </w:p>
     <w:tbl>
@@ -17978,7 +17852,7 @@
           <w:rFonts w:ascii="Times New Roman" w:hAnsi="Times New Roman" w:cs="Times New Roman" w:eastAsia="Times New Roman"/>
           <w:sz w:val="20"/>
         </w:rPr>
-        <w:t xml:space="preserve">(a) Whole-genome wall time and (b) peak memory on the consumer-array benchmark (six samples against the 75,552-haplotype panel, all 22 autosomes, 16 threads, one chromosome at a time): Selphi 2’s default diploid engine completes the genome in 27.7 min versus Beagle 5.5’s 36.4 min (1.3</w:t>
+        <w:t xml:space="preserve">(a) Whole-genome wall time and (b) peak memory on the consumer-array benchmark (six samples against the 75,552-haplotype panel, all 22 autosomes, 16 threads, one chromosome at a time): Selphi 2's default diploid engine completes the genome in 27.7 min versus Beagle 5.5's 36.4 min (1.3</w:t>
       </w:r>
       <m:oMath>
         <m:r>
@@ -18100,7 +17974,7 @@
         <w:rPr>
           <w:rFonts w:ascii="Times New Roman" w:hAnsi="Times New Roman" w:cs="Times New Roman" w:eastAsia="Times New Roman"/>
         </w:rPr>
-        <w:t xml:space="preserve">Selphi 2’s wall time is 16</w:t>
+        <w:t xml:space="preserve">Selphi 2's wall time is 16</w:t>
       </w:r>
       <m:oMath>
         <m:r>
@@ -18140,7 +18014,7 @@
         <w:rPr>
           <w:rFonts w:ascii="Times New Roman" w:hAnsi="Times New Roman" w:cs="Times New Roman" w:eastAsia="Times New Roman"/>
         </w:rPr>
-        <w:t xml:space="preserve">lower than Selphi 1.5.3 on the imputation-only GIAB workloads, and its peak memory is 39–58% lower than Beagle’s on the 1000 Genomes chromosome 22 and both GIAB benchmarks, and comparable to Beagle on 1000 Genomes chromosome 1 (21.9 GB versus 20.2 GB). On the TOPMed biobank-scale run, Selphi 2 is slower than Beagle 5.5 (3.0</w:t>
+        <w:t xml:space="preserve">lower than Selphi 1.5.3 on the imputation-only GIAB workloads, and its peak memory is 39-58% lower than Beagle's on the 1000 Genomes chromosome 22 and both GIAB benchmarks, and comparable to Beagle on 1000 Genomes chromosome 1 (21.9 GB versus 20.2 GB). On the TOPMed biobank-scale run, Selphi 2 is slower than Beagle 5.5 (3.0</w:t>
       </w:r>
       <m:oMath>
         <m:r>
@@ -18180,7 +18054,7 @@
         <w:rPr>
           <w:rFonts w:ascii="Times New Roman" w:hAnsi="Times New Roman" w:cs="Times New Roman" w:eastAsia="Times New Roman"/>
         </w:rPr>
-        <w:t xml:space="preserve">= 132,676 versus Beagle’s window-local composite haplotypes); the corresponding accuracy gain is +0.0236 overall</w:t>
+        <w:t xml:space="preserve">= 132,676 versus Beagle's window-local composite haplotypes); the corresponding accuracy gain is +0.0236 overall</w:t>
       </w:r>
       <w:r>
         <w:rPr>
@@ -18224,7 +18098,7 @@
         <w:rPr>
           <w:rFonts w:ascii="Times New Roman" w:hAnsi="Times New Roman" w:cs="Times New Roman" w:eastAsia="Times New Roman"/>
         </w:rPr>
-        <w:t xml:space="preserve">To demonstrate the single-command whole-genome workflow on a fully public benchmark, we merged the 22 per-chromosome 1000 Genomes panels into one multi-chromosome SRP file (4.3 GB) and imputed 50 held-out 1000 Genomes samples across all 22 autosomes in a single invocation against that one file, with the next chromosome’s reference data prefetched during the current chromosome’s HMM computation. The run produced one indexed VCF spanning all 22 contigs (70.8 million imputed variants) in 7 min 45 s at 23.7 GB peak memory on the 16-thread node, with no per-chromosome file splitting, reference-format conversion, or output concatenation, and no intermediate files between phasing and imputation.</w:t>
+        <w:t xml:space="preserve">To demonstrate the single-command whole-genome workflow on a fully public benchmark, we merged the 22 per-chromosome 1000 Genomes panels into one multi-chromosome SRP file (4.3 GB) and imputed 50 held-out 1000 Genomes samples across all 22 autosomes in a single invocation against that one file, with the next chromosome's reference data prefetched during the current chromosome's HMM computation. The run produced one indexed VCF spanning all 22 contigs (70.8 million imputed variants) in 7 min 45 s at 23.7 GB peak memory on the 16-thread node, with no per-chromosome file splitting, reference-format conversion, or output concatenation, and no intermediate files between phasing and imputation.</w:t>
       </w:r>
     </w:p>
     <w:p>
@@ -18291,7 +18165,7 @@
         <w:rPr>
           <w:rFonts w:ascii="Times New Roman" w:hAnsi="Times New Roman" w:cs="Times New Roman" w:eastAsia="Times New Roman"/>
         </w:rPr>
-        <w:t xml:space="preserve">per-sample dosage values (all 801 samples over a chromosome-22 megabase), the imputed dosage is identical across VCF, BCF, Apache Parquet, and PLINK2 PGEN up to each format’s storage precision: the binary BCF, Parquet, and SelfDecode formats carry the full 32-bit dosage (Parquet versus PGEN maximum</w:t>
+        <w:t xml:space="preserve">per-sample dosage values (all 801 samples over a chromosome-22 megabase), the imputed dosage is identical across VCF, BCF, Apache Parquet, and PLINK2 PGEN up to each format's storage precision: the binary BCF, Parquet, and SelfDecode formats carry the full 32-bit dosage (Parquet versus PGEN maximum</w:t>
       </w:r>
       <w:r>
         <w:rPr>
@@ -18370,7 +18244,7 @@
         <w:rPr>
           <w:rFonts w:ascii="Times New Roman" w:hAnsi="Times New Roman" w:cs="Times New Roman" w:eastAsia="Times New Roman"/>
         </w:rPr>
-        <w:t xml:space="preserve">, exactly PGEN’s 16-bit dosage step), while VCF text-rounds to three decimals (maximum</w:t>
+        <w:t xml:space="preserve">, exactly PGEN's 16-bit dosage step), while VCF text-rounds to three decimals (maximum</w:t>
       </w:r>
       <w:r>
         <w:rPr>
@@ -18441,7 +18315,7 @@
         <w:rPr>
           <w:rFonts w:ascii="Times New Roman" w:hAnsi="Times New Roman" w:cs="Times New Roman" w:eastAsia="Times New Roman"/>
         </w:rPr>
-        <w:t xml:space="preserve">against the binary formats). Hard-genotype calls follow each format’s documented convention (Methods). The output is bit-reproducible: two independent imputation runs of the full chromosome on the same hardware produced byte-identical VCF.gz (identical MD5), consistent with the fixed-seed iteration orders (Methods). The native panel codec is lossless: decoding the SRP panel to BCF, re-encoding it to SRP, and decoding again reproduced the panel genotypes byte-for-byte (identical genotype-matrix MD5 over all 1,070,401 variants</w:t>
+        <w:t xml:space="preserve">against the binary formats). Hard-genotype calls follow each format's documented convention (Methods). The output is bit-reproducible: two independent imputation runs of the full chromosome on the same hardware produced byte-identical VCF.gz (identical MD5), consistent with the fixed-seed iteration orders (Methods). The native panel codec is lossless: decoding the SRP panel to BCF, re-encoding it to SRP, and decoding again reproduced the panel genotypes byte-for-byte (identical genotype-matrix MD5 over all 1,070,401 variants</w:t>
       </w:r>
       <w:r>
         <w:rPr>
@@ -18506,7 +18380,7 @@
         <w:rPr>
           <w:rFonts w:ascii="Times New Roman" w:hAnsi="Times New Roman" w:cs="Times New Roman" w:eastAsia="Times New Roman"/>
         </w:rPr>
-        <w:t xml:space="preserve">) on real low-coverage sequencing of the Genome in a Bottle (GIAB) reference samples HG002–HG007 (the Ashkenazi and Han Chinese trios), none of which are in the 1000 Genomes Project. The public NovaSeq PCR-free 30</w:t>
+        <w:t xml:space="preserve">) on real low-coverage sequencing of the Genome in a Bottle (GIAB) reference samples HG002-HG007 (the Ashkenazi and Han Chinese trios), none of which are in the 1000 Genomes Project. The public NovaSeq PCR-free 30</w:t>
       </w:r>
       <m:oMath>
         <m:r>
@@ -18546,7 +18420,7 @@
         <w:rPr>
           <w:rFonts w:ascii="Times New Roman" w:hAnsi="Times New Roman" w:cs="Times New Roman" w:eastAsia="Times New Roman"/>
         </w:rPr>
-        <w:t xml:space="preserve">over chromosome 22; each sample’s genotype likelihoods were computed from the aligned reads at the reference-panel sites and imputed against the 4,478-haplotype (2,239-sample) no-trios 1000 Genomes panel, the same leak-free panel used for the trio phasing benchmark above, from which these trio individuals were removed. Per-sample dosage</w:t>
+        <w:t xml:space="preserve">over chromosome 22; each sample's genotype likelihoods were computed from the aligned reads at the reference-panel sites and imputed against the 4,478-haplotype (2,239-sample) no-trios 1000 Genomes panel, the same leak-free panel used for the trio phasing benchmark above, from which these trio individuals were removed. Per-sample dosage</w:t>
       </w:r>
       <w:r>
         <w:rPr>
@@ -18606,7 +18480,7 @@
         <w:rPr>
           <w:rFonts w:ascii="Times New Roman" w:hAnsi="Times New Roman" w:cs="Times New Roman" w:eastAsia="Times New Roman"/>
         </w:rPr>
-        <w:t xml:space="preserve">Selphi 2’s lcWGS engine imputes each target sample independently against the reference panel with a genotype-likelihood-aware Li-Stephens forward-backward: sparse-PBWT conditioning-set selection, a faithful eight-founder phasing HMM re-committed at each Gibbs iteration, and a band-mode recombination rate (default): at common sites the rate is independent of the conditioning-set size, giving a sticky copying model that carries a reference haplotype across read-depleted sites, while at rare sites the rate is raised to the reference per-haplotype value (</w:t>
+        <w:t xml:space="preserve">Selphi 2's lcWGS engine imputes each target sample independently against the reference panel with a genotype-likelihood-aware Li-Stephens forward-backward: sparse-PBWT conditioning-set selection, a faithful eight-founder phasing HMM re-committed at each Gibbs iteration, and a band-mode recombination rate (default): at common sites the rate is independent of the conditioning-set size, giving a sticky copying model that carries a reference haplotype across read-depleted sites, while at rare sites the rate is raised to the reference per-haplotype value (</w:t>
       </w:r>
       <m:oMath>
         <m:r>
@@ -18654,7 +18528,7 @@
         <w:rPr>
           <w:rFonts w:ascii="Times New Roman" w:hAnsi="Times New Roman" w:cs="Times New Roman" w:eastAsia="Times New Roman"/>
         </w:rPr>
-        <w:t xml:space="preserve">) so a copied haplotype can recombine onto a true rare-allele carrier instead of remaining locked to a flanking non-carrier — the single change that lifts the ultra-rare bin to parity with or above GLIMPSE2 (Results, Table 6b), reducible to the prior uniform rate with</w:t>
+        <w:t xml:space="preserve">) so a copied haplotype can recombine onto a true rare-allele carrier instead of remaining locked to a flanking non-carrier, the single change that lifts the ultra-rare bin to parity with or above GLIMPSE2 (Results, Table 6b), reducible to the prior uniform rate with</w:t>
       </w:r>
       <w:r>
         <w:rPr>
@@ -18673,7 +18547,7 @@
         <w:rPr>
           <w:rFonts w:ascii="Times New Roman" w:hAnsi="Times New Roman" w:cs="Times New Roman" w:eastAsia="Times New Roman"/>
         </w:rPr>
-        <w:t xml:space="preserve">. A rare-carrier-aware extension feeds each heterozygous rare site’s locally-best-matching panel carriers into the per-segment phase commitment, so the rarest carriers are committed without perturbing the global conditioning HMM. The chromosome is processed in overlapping cM windows whose reference bitmatrix is extracted from the SRP and discarded per window, and the forward matrix is stored only at</w:t>
+        <w:t xml:space="preserve">. A rare-carrier-aware extension feeds each heterozygous rare site's locally-best-matching panel carriers into the per-segment phase commitment, so the rarest carriers are committed without perturbing the global conditioning HMM. The chromosome is processed in overlapping cM windows whose reference bitmatrix is extracted from the SRP and discarded per window, and the forward matrix is stored only at</w:t>
       </w:r>
       <w:r>
         <w:rPr>
@@ -18768,7 +18642,7 @@
         <w:rPr>
           <w:rFonts w:ascii="Times New Roman" w:hAnsi="Times New Roman" w:cs="Times New Roman" w:eastAsia="Times New Roman"/>
         </w:rPr>
-        <w:t xml:space="preserve">= +0.0037, on the identical site set for both tools; Table 6). At the rarest frequencies (MAF 0–0.5%) the two tools are within ≈0.005</w:t>
+        <w:t xml:space="preserve">= +0.0037, on the identical site set for both tools; Table 6). At the rarest frequencies (MAF 0-0.5%) the two tools are within ≈0.005</w:t>
       </w:r>
       <w:r>
         <w:rPr>
@@ -18800,7 +18674,7 @@
         <w:rPr>
           <w:rFonts w:ascii="Times New Roman" w:hAnsi="Times New Roman" w:cs="Times New Roman" w:eastAsia="Times New Roman"/>
         </w:rPr>
-        <w:t xml:space="preserve">at this single low coverage (GLIMPSE2 marginally ahead); the engine’s default now applies band-mode recombination (Methods), which raises the Li-Stephens recombination rate to GLIMPSE2’s reference value at rare sites only and places Selphi 2 level with or ahead of GLIMPSE2 on the ultra-rare bin from 1</w:t>
+        <w:t xml:space="preserve">at this single low coverage (GLIMPSE2 marginally ahead); the engine's default now applies band-mode recombination (Methods), which raises the Li-Stephens recombination rate to GLIMPSE2's reference value at rare sites only and places Selphi 2 level with or ahead of GLIMPSE2 on the ultra-rare bin from 1</w:t>
       </w:r>
       <m:oMath>
         <m:r>
@@ -18820,7 +18694,7 @@
         <w:rPr>
           <w:rFonts w:ascii="Times New Roman" w:hAnsi="Times New Roman" w:cs="Times New Roman" w:eastAsia="Times New Roman"/>
         </w:rPr>
-        <w:t xml:space="preserve">upward across the matched coverage sweep (Table 6b, Figure 2d). Because each sample is imputed independently against the panel, the engine’s natural mode is one sample at a time: a single chromosome-22 sample completes in approximately 2.0 minutes on 16 cores at a few GB of peak memory, versus approximately 5.4 minutes for GLIMPSE2’s per-sample phasing, about 2.7</w:t>
+        <w:t xml:space="preserve">upward across the matched coverage sweep (Table 6b, Figure 2d). Because each sample is imputed independently against the panel, the engine's natural mode is one sample at a time: a single chromosome-22 sample completes in approximately 2.0 minutes on 16 cores at a few GB of peak memory, versus approximately 5.4 minutes for GLIMPSE2's per-sample phasing, about 2.7</w:t>
       </w:r>
       <m:oMath>
         <m:r>
@@ -18840,7 +18714,7 @@
         <w:rPr>
           <w:rFonts w:ascii="Times New Roman" w:hAnsi="Times New Roman" w:cs="Times New Roman" w:eastAsia="Times New Roman"/>
         </w:rPr>
-        <w:t xml:space="preserve">faster, with the full reference panel never resident (GLIMPSE2’s one-time reference-splitting step, analogous to building Selphi 2’s SRP, is excluded from both). The Gibbs iteration count and the cM window size are explicit accuracy/speed controls. A coverage sweep from 0.5</w:t>
+        <w:t xml:space="preserve">faster, with the full reference panel never resident (GLIMPSE2's one-time reference-splitting step, analogous to building Selphi 2's SRP, is excluded from both). The Gibbs iteration count and the cM window size are explicit accuracy/speed controls. A coverage sweep from 0.5</w:t>
       </w:r>
       <m:oMath>
         <m:r>
@@ -18928,7 +18802,7 @@
         <w:rPr>
           <w:rFonts w:ascii="Times New Roman" w:hAnsi="Times New Roman" w:cs="Times New Roman" w:eastAsia="Times New Roman"/>
         </w:rPr>
-        <w:t xml:space="preserve">GIAB reference samples HG002–HG007 (six samples, the Ashkenazi and Han Chinese trios; none in the 1000 Genomes Project): the public NovaSeq PCR-free 30</w:t>
+        <w:t xml:space="preserve">GIAB reference samples HG002-HG007 (six samples, the Ashkenazi and Han Chinese trios; none in the 1000 Genomes Project): the public NovaSeq PCR-free 30</w:t>
       </w:r>
       <m:oMath>
         <m:r>
@@ -18968,7 +18842,7 @@
         <w:rPr>
           <w:rFonts w:ascii="Times New Roman" w:hAnsi="Times New Roman" w:cs="Times New Roman" w:eastAsia="Times New Roman"/>
         </w:rPr>
-        <w:t xml:space="preserve">chromosome 22 and each imputed independently against the 4,478-haplotype (2,239-sample) no-trios 1000 Genomes panel (biallelic SNPs, polymorphic in the subset), with Selphi 2’s band-mode recombination (default; Methods). Both tools compute their own genotype likelihoods from the BAM and emit the identical set of panel sites; per-sample dosage</w:t>
+        <w:t xml:space="preserve">chromosome 22 and each imputed independently against the 4,478-haplotype (2,239-sample) no-trios 1000 Genomes panel (biallelic SNPs, polymorphic in the subset), with Selphi 2's band-mode recombination (default; Methods). Both tools compute their own genotype likelihoods from the BAM and emit the identical set of panel sites; per-sample dosage</w:t>
       </w:r>
       <w:r>
         <w:rPr>
@@ -19000,7 +18874,7 @@
         <w:rPr>
           <w:rFonts w:ascii="Times New Roman" w:hAnsi="Times New Roman" w:cs="Times New Roman" w:eastAsia="Times New Roman"/>
         </w:rPr>
-        <w:t xml:space="preserve">is the squared correlation between imputed dosage and the GIAB v4.2.1 high-confidence truth, over the high-confidence sites carrying a non-reference allele in the sample (the informative variant sites, ≈37–40k per sample), evaluated on the identical site set for both tools. Wall time and peak memory are for a single chromosome-22 sample on 16 cores; GLIMPSE2’s one-time reference-splitting step (analogous to building Selphi 2’s SRP) is excluded from both tools.</w:t>
+        <w:t xml:space="preserve">is the squared correlation between imputed dosage and the GIAB v4.2.1 high-confidence truth, over the high-confidence sites carrying a non-reference allele in the sample (the informative variant sites, ≈37-40k per sample), evaluated on the identical site set for both tools. Wall time and peak memory are for a single chromosome-22 sample on 16 cores; GLIMPSE2's one-time reference-splitting step (analogous to building Selphi 2's SRP) is excluded from both tools.</w:t>
       </w:r>
     </w:p>
     <w:tbl>
@@ -19650,7 +19524,7 @@
                 <w:rFonts w:ascii="Times New Roman" w:hAnsi="Times New Roman" w:cs="Times New Roman" w:eastAsia="Times New Roman"/>
                 <w:sz w:val="20"/>
               </w:rPr>
-              <w:t xml:space="preserve">−0.0001</w:t>
+              <w:t xml:space="preserve">-0.0001</w:t>
             </w:r>
           </w:p>
         </w:tc>
@@ -19755,7 +19629,7 @@
         <w:rPr>
           <w:rFonts w:ascii="Times New Roman" w:hAnsi="Times New Roman" w:cs="Times New Roman" w:eastAsia="Times New Roman"/>
         </w:rPr>
-        <w:t xml:space="preserve">At the rarest frequencies (MAF 0–0.5%) Selphi 2’s band-mode recombination (default; Methods) places it level with or ahead of GLIMPSE2 from 1</w:t>
+        <w:t xml:space="preserve">At the rarest frequencies (MAF 0-0.5%) Selphi 2's band-mode recombination (default; Methods) places it level with or ahead of GLIMPSE2 from 1</w:t>
       </w:r>
       <m:oMath>
         <m:r>
@@ -19795,7 +19669,7 @@
         <w:rPr>
           <w:rFonts w:ascii="Times New Roman" w:hAnsi="Times New Roman" w:cs="Times New Roman" w:eastAsia="Times New Roman"/>
         </w:rPr>
-        <w:t xml:space="preserve">faster); GLIMPSE2’s lower per-sample footprint (≈2.1 GB) reflects its separate one-time panel-splitting step, excluded here from both tools.</w:t>
+        <w:t xml:space="preserve">faster); GLIMPSE2's lower per-sample footprint (≈2.1 GB) reflects its separate one-time panel-splitting step, excluded here from both tools.</w:t>
       </w:r>
     </w:p>
     <w:p>
@@ -19913,7 +19787,7 @@
         <w:rPr>
           <w:rFonts w:ascii="Times New Roman" w:hAnsi="Times New Roman" w:cs="Times New Roman" w:eastAsia="Times New Roman"/>
         </w:rPr>
-        <w:t xml:space="preserve">over a 10 Mb region of chromosome 22 (positions 20–30 Mb), each computing genotype likelihoods with its own in-process pileup (no external caller), imputing against a leak-free 1000 Genomes panel, and scored against the GIAB high-confidence truth (reference-homozygous sites as dosage zero) on the set of sites imputed by all three tools. Selphi 2 exceeds both GLIMPSE2 and QUILT2 in overall per-sample</w:t>
+        <w:t xml:space="preserve">over a 10 Mb region of chromosome 22 (positions 20-30 Mb), each computing genotype likelihoods with its own in-process pileup (no external caller), imputing against a leak-free 1000 Genomes panel, and scored against the GIAB high-confidence truth (reference-homozygous sites as dosage zero) on the set of sites imputed by all three tools. Selphi 2 exceeds both GLIMPSE2 and QUILT2 in overall per-sample</w:t>
       </w:r>
       <w:r>
         <w:rPr>
@@ -19945,7 +19819,7 @@
         <w:rPr>
           <w:rFonts w:ascii="Times New Roman" w:hAnsi="Times New Roman" w:cs="Times New Roman" w:eastAsia="Times New Roman"/>
         </w:rPr>
-        <w:t xml:space="preserve">at every coverage (0.9924, 0.9950, 0.9971 and 0.9979 versus GLIMPSE2’s 0.9916, 0.9945, 0.9967 and 0.9975 and QUILT2’s 0.9919, 0.9944, 0.9968 and 0.9973 at 0.5</w:t>
+        <w:t xml:space="preserve">at every coverage (0.9924, 0.9950, 0.9971 and 0.9979 versus GLIMPSE2's 0.9916, 0.9945, 0.9967 and 0.9975 and QUILT2's 0.9919, 0.9944, 0.9968 and 0.9973 at 0.5</w:t>
       </w:r>
       <m:oMath>
         <m:r>
@@ -20007,7 +19881,7 @@
         <w:rPr>
           <w:rFonts w:ascii="Times New Roman" w:hAnsi="Times New Roman" w:cs="Times New Roman" w:eastAsia="Times New Roman"/>
         </w:rPr>
-        <w:t xml:space="preserve">; Table 6b). On the ultra-rare bin (MAF 0–0.5%), where GLIMPSE2’s dedicated sparse rare-allele path previously held the only edge, Selphi 2’s band-mode recombination (Methods) — which raises the Li-Stephens recombination rate to GLIMPSE2’s reference value at rare sites only, letting a copied haplotype recombine onto a true rare-allele carrier — now matches or exceeds GLIMPSE2 from 1</w:t>
+        <w:t xml:space="preserve">; Table 6b). On the ultra-rare bin (MAF 0-0.5%), where GLIMPSE2's dedicated sparse rare-allele path previously held the only edge, Selphi 2's band-mode recombination (Methods), which raises the Li-Stephens recombination rate to GLIMPSE2's reference value at rare sites only, letting a copied haplotype recombine onto a true rare-allele carrier, now matches or exceeds GLIMPSE2 from 1</w:t>
       </w:r>
       <m:oMath>
         <m:r>
@@ -20199,7 +20073,7 @@
         <w:rPr>
           <w:rFonts w:ascii="Times New Roman" w:hAnsi="Times New Roman" w:cs="Times New Roman" w:eastAsia="Times New Roman"/>
         </w:rPr>
-        <w:t xml:space="preserve">faster than QUILT2 (Figure 3c); QUILT2’s runtime grows further with sequencing depth. QUILT2’s distinguishing mechanism, a read-level latent-label model that retains within-read linkage rather than collapsing reads to per-site genotype likelihoods, confers an advantage only below approximately 0.5</w:t>
+        <w:t xml:space="preserve">faster than QUILT2 (Figure 3c); QUILT2's runtime grows further with sequencing depth. QUILT2's distinguishing mechanism, a read-level latent-label model that retains within-read linkage rather than collapsing reads to per-site genotype likelihoods, confers an advantage only below approximately 0.5</w:t>
       </w:r>
       <m:oMath>
         <m:r>
@@ -20277,7 +20151,7 @@
         <w:rPr>
           <w:rFonts w:ascii="Times New Roman" w:hAnsi="Times New Roman" w:cs="Times New Roman" w:eastAsia="Times New Roman"/>
         </w:rPr>
-        <w:t xml:space="preserve">over GIAB HG002, HG003 and HG004 downsampled to the indicated depth over chromosome 22 (positions 20–30 Mb), each imputed against a leak-free 1000 Genomes panel (6,332 haplotypes) and scored against the GIAB v4.2.1 high-confidence truth (reference-homozygous sites scored as dosage zero) on the set of sites imputed by all three tools. All three tools generate genotype likelihoods from the BAMs with their own in-process pileup (no external caller): Selphi 2’s</w:t>
+        <w:t xml:space="preserve">over GIAB HG002, HG003 and HG004 downsampled to the indicated depth over chromosome 22 (positions 20-30 Mb), each imputed against a leak-free 1000 Genomes panel (6,332 haplotypes) and scored against the GIAB v4.2.1 high-confidence truth (reference-homozygous sites scored as dosage zero) on the set of sites imputed by all three tools. All three tools generate genotype likelihoods from the BAMs with their own in-process pileup (no external caller): Selphi 2's</w:t>
       </w:r>
       <w:r>
         <w:rPr>
@@ -20302,7 +20176,7 @@
         <w:rPr>
           <w:rFonts w:ascii="Times New Roman" w:hAnsi="Times New Roman" w:cs="Times New Roman" w:eastAsia="Times New Roman"/>
         </w:rPr>
-        <w:t xml:space="preserve">engine uses a faithful reimplementation of the samtools/bcftools revised-MAQ base-error model and band-mode recombination (default; Methods); GLIMPSE2 and QUILT2 use their built-in pileups with default settings. Overall (top) and ultra-rare (MAF 0–0.5%, bottom).</w:t>
+        <w:t xml:space="preserve">engine uses a faithful reimplementation of the samtools/bcftools revised-MAQ base-error model and band-mode recombination (default; Methods); GLIMPSE2 and QUILT2 use their built-in pileups with default settings. Overall (top) and ultra-rare (MAF 0-0.5%, bottom).</w:t>
       </w:r>
     </w:p>
     <w:p>
@@ -20844,7 +20718,7 @@
           <w:i/>
           <w:iCs/>
         </w:rPr>
-        <w:t xml:space="preserve">Ultra-rare (MAF 0–0.5%)</w:t>
+        <w:t xml:space="preserve">Ultra-rare (MAF 0-0.5%)</w:t>
       </w:r>
       <w:r>
         <w:rPr>
@@ -21406,7 +21280,7 @@
         <w:rPr>
           <w:rFonts w:ascii="Times New Roman" w:hAnsi="Times New Roman" w:cs="Times New Roman" w:eastAsia="Times New Roman"/>
         </w:rPr>
-        <w:t xml:space="preserve">in Rust that integrates phasing and imputation in a single tool, performs whole-genome imputation in one command against a single multi-chromosome reference panel, and replaces Selphi 1’s fixed candidate-set cap with a panel-adaptive sizing rule. On the 1000 Genomes Phase 3 panel, Selphi 2 exceeds Beagle 5.5 in overall</w:t>
+        <w:t xml:space="preserve">in Rust that integrates phasing and imputation in a single tool, performs whole-genome imputation in one command against a single multi-chromosome reference panel, and replaces Selphi 1's fixed candidate-set cap with a panel-adaptive sizing rule. On the 1000 Genomes Phase 3 panel, Selphi 2 exceeds Beagle 5.5 in overall</w:t>
       </w:r>
       <w:r>
         <w:rPr>
@@ -21470,7 +21344,7 @@
         <w:rPr>
           <w:rFonts w:ascii="Times New Roman" w:hAnsi="Times New Roman" w:cs="Times New Roman" w:eastAsia="Times New Roman"/>
         </w:rPr>
-        <w:t xml:space="preserve">by 0.0236 on the MESA admixed cohort, with the gain concentrated on rare variants where Selphi 1’s fixed cap had previously discarded informative haplotypes. On an independent leak-free truth (GIAB HG002–HG007 against a reference panel that contains the full 1000 Genomes cohort), Selphi 2 matches the accuracy of Selphi 1.5.3 and exceeds Beagle 5.5 by 0.0028</w:t>
+        <w:t xml:space="preserve">by 0.0236 on the MESA admixed cohort, with the gain concentrated on rare variants where Selphi 1's fixed cap had previously discarded informative haplotypes. On an independent leak-free truth (GIAB HG002-HG007 against a reference panel that contains the full 1000 Genomes cohort), Selphi 2 matches the accuracy of Selphi 1.5.3 and exceeds Beagle 5.5 by 0.0028</w:t>
       </w:r>
       <w:r>
         <w:rPr>
@@ -21502,7 +21376,7 @@
         <w:rPr>
           <w:rFonts w:ascii="Times New Roman" w:hAnsi="Times New Roman" w:cs="Times New Roman" w:eastAsia="Times New Roman"/>
         </w:rPr>
-        <w:t xml:space="preserve">on chr21 (where rare variants are accessible), while running 16–50</w:t>
+        <w:t xml:space="preserve">on chr21 (where rare variants are accessible), while running 16-50</w:t>
       </w:r>
       <m:oMath>
         <m:r>
@@ -21744,7 +21618,7 @@
         <w:rPr>
           <w:rFonts w:ascii="Times New Roman" w:hAnsi="Times New Roman" w:cs="Times New Roman" w:eastAsia="Times New Roman"/>
         </w:rPr>
-        <w:t xml:space="preserve">is a phasing-only tool whose two-stage common-then-rare strategy inspired the rare-variant phasing pass in our diploid engine. On the 1000 Genomes trio benchmark (54 children, against a 2,239-sample no-trios panel; identical heterozygous site sets tested for every tool), Selphi 2’s diploid engine attains lower switch error rate than SHAPEIT5 full pipeline (phase_common + phase_rare) on both chromosome 22 (2.521% versus 2.611%) and chromosome 1 (1.876% versus 1.935%), in 0.47</w:t>
+        <w:t xml:space="preserve">is a phasing-only tool whose two-stage common-then-rare strategy inspired the rare-variant phasing pass in our diploid engine. On the 1000 Genomes trio benchmark (54 children, against a 2,239-sample no-trios panel; identical heterozygous site sets tested for every tool), Selphi 2's diploid engine attains lower switch error rate than SHAPEIT5 full pipeline (phase_common + phase_rare) on both chromosome 22 (2.521% versus 2.611%) and chromosome 1 (1.876% versus 1.935%), in 0.47</w:t>
       </w:r>
       <m:oMath>
         <m:r>
@@ -21764,7 +21638,7 @@
         <w:rPr>
           <w:rFonts w:ascii="Times New Roman" w:hAnsi="Times New Roman" w:cs="Times New Roman" w:eastAsia="Times New Roman"/>
         </w:rPr>
-        <w:t xml:space="preserve">SHAPEIT5’s wall time on chromosome 22 and 0.92</w:t>
+        <w:t xml:space="preserve">SHAPEIT5's wall time on chromosome 22 and 0.92</w:t>
       </w:r>
       <m:oMath>
         <m:r>
@@ -21784,7 +21658,7 @@
         <w:rPr>
           <w:rFonts w:ascii="Times New Roman" w:hAnsi="Times New Roman" w:cs="Times New Roman" w:eastAsia="Times New Roman"/>
         </w:rPr>
-        <w:t xml:space="preserve">on chromosome 1 (570 s versus 622 s). Beagle 5.5’s built-in phasing is competitive with Selphi 2 diploid on both chromosomes (chr22: 2.548% versus 2.521%, +0.027 in favor of Selphi 2; chr1: 1.865% versus 1.876%, +0.011 in favor of Beagle); no method dominates the other in mean SER, but Selphi 2 diploid uses 4</w:t>
+        <w:t xml:space="preserve">on chromosome 1 (570 s versus 622 s). Beagle 5.5's built-in phasing is competitive with Selphi 2 diploid on both chromosomes (chr22: 2.548% versus 2.521%, +0.027 in favor of Selphi 2; chr1: 1.865% versus 1.876%, +0.011 in favor of Beagle); no method dominates the other in mean SER, but Selphi 2 diploid uses 4</w:t>
       </w:r>
       <m:oMath>
         <m:r>
@@ -21824,7 +21698,7 @@
         <w:rPr>
           <w:rFonts w:ascii="Times New Roman" w:hAnsi="Times New Roman" w:cs="Times New Roman" w:eastAsia="Times New Roman"/>
         </w:rPr>
-        <w:t xml:space="preserve">Beagle’s wall time on these benchmarks. The remaining architectural difference is the integration with the downstream imputation HMM: phased haplotypes are passed in memory to the Li-Stephens forward-backward pass with no intermediate VCF emission. Of Selphi 1’s</w:t>
+        <w:t xml:space="preserve">Beagle's wall time on these benchmarks. The remaining architectural difference is the integration with the downstream imputation HMM: phased haplotypes are passed in memory to the Li-Stephens forward-backward pass with no intermediate VCF emission. Of Selphi 1's</w:t>
       </w:r>
       <w:hyperlink w:anchor="ref1">
         <w:r>
@@ -22025,7 +21899,7 @@
         <w:rPr>
           <w:rFonts w:ascii="Times New Roman" w:hAnsi="Times New Roman" w:cs="Times New Roman" w:eastAsia="Times New Roman"/>
         </w:rPr>
-        <w:t xml:space="preserve">imputer matrix, the three phasings (Selphi 2, Beagle 5.5, SHAPEIT5) were practically interchangeable as imputation input — all pairwise overall-</w:t>
+        <w:t xml:space="preserve">imputer matrix, the three phasings (Selphi 2, Beagle 5.5, SHAPEIT5) were practically interchangeable as imputation input: all pairwise overall-</w:t>
       </w:r>
       <m:oMath>
         <m:sSup>
@@ -22080,7 +21954,7 @@
         <w:rPr>
           <w:rFonts w:ascii="Times New Roman" w:hAnsi="Times New Roman" w:cs="Times New Roman" w:eastAsia="Times New Roman"/>
         </w:rPr>
-        <w:t xml:space="preserve">for a fixed imputer (an order of magnitude below the imputer effect, though formally distinguishable at this sample size) — whereas the choice of imputer moved overall</w:t>
+        <w:t xml:space="preserve">for a fixed imputer (an order of magnitude below the imputer effect, though formally distinguishable at this sample size), whereas the choice of imputer moved overall</w:t>
       </w:r>
       <w:r>
         <w:rPr>
@@ -22112,7 +21986,7 @@
         <w:rPr>
           <w:rFonts w:ascii="Times New Roman" w:hAnsi="Times New Roman" w:cs="Times New Roman" w:eastAsia="Times New Roman"/>
         </w:rPr>
-        <w:t xml:space="preserve">by +0.007 to +0.010 in favour of Selphi 2 regardless of which tool produced the phasing. This is consistent with the near-tied switch-error rates on common variants (Table 4): array sites are predominantly common, where modern phasers agree closely, so phasing quality is not the limiting factor for array-based imputation, and Selphi 2’s consistent imputation advantage is a property of its imputer rather than its phasing. Re-deriving the phase of an already-well-phased reference panel with Selphi 2 was likewise net-neutral-to-negative on this benchmark — a small gain on common variants offset by a loss at the rarest bin — so a panel’s published phasing is best retained. The pedigree result (Table 4c) is the informative exception: where phasing draws on genuinely new information (parental genotypes), it improves downstream imputation against an independent truth (+0.016 to +0.022</w:t>
+        <w:t xml:space="preserve">by +0.007 to +0.010 in favour of Selphi 2 regardless of which tool produced the phasing. This is consistent with the near-tied switch-error rates on common variants (Table 4): array sites are predominantly common, where modern phasers agree closely, so phasing quality is not the limiting factor for array-based imputation, and Selphi 2's consistent imputation advantage is a property of its imputer rather than its phasing. Re-deriving the phase of an already-well-phased reference panel with Selphi 2 was likewise net-neutral-to-negative on this benchmark (a small gain on common variants offset by a loss at the rarest bin), so a panel's published phasing is best retained. The pedigree result (Table 4c) is the informative exception: where phasing draws on genuinely new information (parental genotypes), it improves downstream imputation against an independent truth (+0.016 to +0.022</w:t>
       </w:r>
       <w:r>
         <w:rPr>
@@ -22150,7 +22024,7 @@
         <w:rPr>
           <w:rFonts w:ascii="Times New Roman" w:hAnsi="Times New Roman" w:cs="Times New Roman" w:eastAsia="Times New Roman"/>
         </w:rPr>
-        <w:t xml:space="preserve">Several limitations of the present work bear discussion. First, at the rarest MAF bin (0.05–0.1%) on the 1000 Genomes panel, Beagle 5.5 narrowly outperforms Selphi 2 (</w:t>
+        <w:t xml:space="preserve">Several limitations of the present work bear discussion. First, at the rarest MAF bin (0.05-0.1%) on the 1000 Genomes panel, Beagle 5.5 narrowly outperforms Selphi 2 (</w:t>
       </w:r>
       <m:oMath>
         <m:r>
@@ -22196,7 +22070,7 @@
         <w:rPr>
           <w:rFonts w:ascii="Times New Roman" w:hAnsi="Times New Roman" w:cs="Times New Roman" w:eastAsia="Times New Roman"/>
         </w:rPr>
-        <w:t xml:space="preserve">); the chromosome-wide PBWT statistic underlying Selphi’s candidate selection is, by construction, biased toward longer-range matches and may underweight single-carrier haplotypes whose informative segment is short. Second, the diploid engine, Selphi 2’s default, dominates the haploid engine across the benchmarks: it matches or exceeds it on SNP</w:t>
+        <w:t xml:space="preserve">); the chromosome-wide PBWT statistic underlying Selphi's candidate selection is, by construction, biased toward longer-range matches and may underweight single-carrier haplotypes whose informative segment is short. Second, the diploid engine, Selphi 2's default, dominates the haploid engine across the benchmarks: it matches or exceeds it on SNP</w:t>
       </w:r>
       <w:r>
         <w:rPr>
@@ -22228,7 +22102,7 @@
         <w:rPr>
           <w:rFonts w:ascii="Times New Roman" w:hAnsi="Times New Roman" w:cs="Times New Roman" w:eastAsia="Times New Roman"/>
         </w:rPr>
-        <w:t xml:space="preserve">at every density (e.g. +0.0013</w:t>
+        <w:t xml:space="preserve">at every density (e.g. +0.0013</w:t>
       </w:r>
       <w:r>
         <w:rPr>
@@ -22312,7 +22186,7 @@
         <w:rPr>
           <w:rFonts w:ascii="Times New Roman" w:hAnsi="Times New Roman" w:cs="Times New Roman" w:eastAsia="Times New Roman"/>
         </w:rPr>
-        <w:t xml:space="preserve">faster. A single-phase diploid run trailed the haploid engine slightly on indels (the diploid phases rare variants in a separate pass, versus the haploid engine’s unified treatment), but the diploid intra-run phase ensemble, on by default (Methods), closes and reverses that gap (diploid indel</w:t>
+        <w:t xml:space="preserve">faster. A single-phase diploid run trailed the haploid engine slightly on indels (the diploid phases rare variants in a separate pass, versus the haploid engine's unified treatment), but the diploid intra-run phase ensemble, on by default (Methods), closes and reverses that gap (diploid indel</w:t>
       </w:r>
       <w:r>
         <w:rPr>
@@ -22344,7 +22218,7 @@
         <w:rPr>
           <w:rFonts w:ascii="Times New Roman" w:hAnsi="Times New Roman" w:cs="Times New Roman" w:eastAsia="Times New Roman"/>
         </w:rPr>
-        <w:t xml:space="preserve">0.7935 versus 0.7909 genome-wide on the consumer-array set). We therefore default to the diploid engine for all inputs and expose the haploid engine via –phasing-engine haploid; no current rule predicts the optimal engine from cohort admixture alone. Third, the panel-adaptive candidate-set sizing rule (Methods, Candidate selection and HMM) is parameterized by two scalar constants (</w:t>
+        <w:t xml:space="preserve">0.7935 versus 0.7909 genome-wide on the consumer-array set). We therefore default to the diploid engine for all inputs and expose the haploid engine via --phasing-engine haploid; no current rule predicts the optimal engine from cohort admixture alone. Third, the panel-adaptive candidate-set sizing rule (Methods, Candidate selection and HMM) is parameterized by two scalar constants (</w:t>
       </w:r>
       <m:oMath>
         <m:r>
@@ -22450,7 +22324,7 @@
         <w:rPr>
           <w:rFonts w:ascii="Times New Roman" w:hAnsi="Times New Roman" w:cs="Times New Roman" w:eastAsia="Times New Roman"/>
         </w:rPr>
-        <w:t xml:space="preserve">to recover faster runtime. Relatedly, on the consumer-array benchmark against high-coverage WGS truth (Results, Table 3), Selphi 2’s imputer exceeds Beagle 5.5 when both are given identical phasing (SNP</w:t>
+        <w:t xml:space="preserve">to recover faster runtime. Relatedly, on the consumer-array benchmark against high-coverage WGS truth (Results, Table 3), Selphi 2's imputer exceeds Beagle 5.5 when both are given identical phasing (SNP</w:t>
       </w:r>
       <w:r>
         <w:rPr>
@@ -22482,7 +22356,7 @@
         <w:rPr>
           <w:rFonts w:ascii="Times New Roman" w:hAnsi="Times New Roman" w:cs="Times New Roman" w:eastAsia="Times New Roman"/>
         </w:rPr>
-        <w:t xml:space="preserve">0.9601 versus 0.9584; indel 0.7911 versus 0.7840). Earlier versions of Selphi 2’s own internal phasing trailed Beagle by ≈0.003</w:t>
+        <w:t xml:space="preserve">0.9601 versus 0.9584; indel 0.7911 versus 0.7840). Earlier versions of Selphi 2's own internal phasing trailed Beagle by ≈0.003</w:t>
       </w:r>
       <w:r>
         <w:rPr>
@@ -22514,7 +22388,7 @@
         <w:rPr>
           <w:rFonts w:ascii="Times New Roman" w:hAnsi="Times New Roman" w:cs="Times New Roman" w:eastAsia="Times New Roman"/>
         </w:rPr>
-        <w:t xml:space="preserve">on common SNPs, which we initially read as a broad-spectrum difference between our phasing and Beagle’s decoding; on closer investigation it was instead a single localized defect, array no-call genotypes (≈1.7% of typed sites on this array) were folded to homozygous reference before phasing rather than imputed, corrupting both the phasing scaffold and the imputer’s reference-haplotype selection precisely at those sites. Imputing the missing genotypes during phasing (Methods), by a local copying consensus over the nearest PBWT neighbours, applied in both engines, closes essentially all of that gap, and the diploid engine’s default intra-run phase ensemble (Methods) then carries it past every other pipeline (Table 3): with its own internal phasing Selphi 2’s default diploid engine now exceeds Beagle on both SNPs and indels (the haploid engine matches Beagle on SNPs and exceeds it on indels), and the diploid engine (SNP 0.9605, indel 0.7935) matches the Beagle-phased configurations on SNPs and exceeds them on indels (0.9601 / 0.7911), so the deployment need not depend on an external phaser. The diploid engine, whose graph construction already tolerated missing genotypes for phasing but discarded the imputed values when it wrote the scaffold, gained the most accuracy from these two changes, SNP 0.9553 → 0.9588 from the no-call fix, then → 0.9605 with the intra-run ensemble, at roughly 2.5</w:t>
+        <w:t xml:space="preserve">on common SNPs, which we initially read as a broad-spectrum difference between our phasing and Beagle's decoding; on closer investigation it was instead a single localized defect, array no-call genotypes (≈1.7% of typed sites on this array) were folded to homozygous reference before phasing rather than imputed, corrupting both the phasing scaffold and the imputer's reference-haplotype selection precisely at those sites. Imputing the missing genotypes during phasing (Methods), by a local copying consensus over the nearest PBWT neighbours, applied in both engines, closes essentially all of that gap, and the diploid engine's default intra-run phase ensemble (Methods) then carries it past every other pipeline (Table 3): with its own internal phasing Selphi 2's default diploid engine now exceeds Beagle on both SNPs and indels (the haploid engine matches Beagle on SNPs and exceeds it on indels), and the diploid engine (SNP 0.9605, indel 0.7935) matches the Beagle-phased configurations on SNPs and exceeds them on indels (0.9601 / 0.7911), so the deployment need not depend on an external phaser. The diploid engine, whose graph construction already tolerated missing genotypes for phasing but discarded the imputed values when it wrote the scaffold, gained the most accuracy from these two changes, SNP 0.9553 to 0.9588 from the no-call fix, then to 0.9605 with the intra-run ensemble, at roughly 2.5</w:t>
       </w:r>
       <m:oMath>
         <m:r>
@@ -22534,7 +22408,7 @@
         <w:rPr>
           <w:rFonts w:ascii="Times New Roman" w:hAnsi="Times New Roman" w:cs="Times New Roman" w:eastAsia="Times New Roman"/>
         </w:rPr>
-        <w:t xml:space="preserve">the haploid engine’s phasing speed. The consumer-array set is small (n = 6), so its per-sample variance is appreciable even though the tool ranking is consistent across the six individuals. Finally, the present array-versus-WGS comparisons aside, the main panel benchmarks are restricted to chromosomes 1, 21, and 22 (the largest, the smallest, and a representative mid-sized chromosome); the panel-adaptive rule’s behavior on shorter chromosomes and on the X chromosome under sex-aware phasing remains to be characterized in a dedicated whole-genome study.</w:t>
+        <w:t xml:space="preserve">the haploid engine's phasing speed. The consumer-array set is small (n = 6), so its per-sample variance is appreciable even though the tool ranking is consistent across the six individuals. Finally, the present array-versus-WGS comparisons aside, the main panel benchmarks are restricted to chromosomes 1, 21, and 22 (the largest, the smallest, and a representative mid-sized chromosome); the panel-adaptive rule's behavior on shorter chromosomes and on the X chromosome under sex-aware phasing remains to be characterized in a dedicated whole-genome study.</w:t>
       </w:r>
     </w:p>
     <w:p>
@@ -22789,7 +22663,7 @@
         <w:rPr>
           <w:rFonts w:ascii="Times New Roman" w:hAnsi="Times New Roman" w:cs="Times New Roman" w:eastAsia="Times New Roman"/>
         </w:rPr>
-        <w:t xml:space="preserve">McCarthy S, Das S, Kretzschmar W, et al. A reference panel of 64,976 haplotypes for genotype imputation.</w:t>
+        <w:t xml:space="preserve">McCarthy S, Das S, Kretzschmar W, et al. A reference panel of 64,976 haplotypes for genotype imputation.</w:t>
       </w:r>
       <w:r>
         <w:rPr>
@@ -23017,7 +22891,7 @@
         <w:rPr>
           <w:rFonts w:ascii="Times New Roman" w:hAnsi="Times New Roman" w:cs="Times New Roman" w:eastAsia="Times New Roman"/>
         </w:rPr>
-        <w:t xml:space="preserve">Das S, Forer L, Schönherr S, et al. Next-generation genotype imputation service and methods.</w:t>
+        <w:t xml:space="preserve">Das S, Forer L, Schönherr S, et al. Next-generation genotype imputation service and methods.</w:t>
       </w:r>
       <w:r>
         <w:rPr>
@@ -23055,7 +22929,7 @@
         <w:rPr>
           <w:rFonts w:ascii="Times New Roman" w:hAnsi="Times New Roman" w:cs="Times New Roman" w:eastAsia="Times New Roman"/>
         </w:rPr>
-        <w:t xml:space="preserve">Loh PR, Danecek P, Palamara PF, et al. Reference-based phasing using the Haplotype Reference Consortium panel.</w:t>
+        <w:t xml:space="preserve">Loh PR, Danecek P, Palamara PF, et al. Reference-based phasing using the Haplotype Reference Consortium panel.</w:t>
       </w:r>
       <w:r>
         <w:rPr>
@@ -23131,7 +23005,7 @@
         <w:rPr>
           <w:rFonts w:ascii="Times New Roman" w:hAnsi="Times New Roman" w:cs="Times New Roman" w:eastAsia="Times New Roman"/>
         </w:rPr>
-        <w:t xml:space="preserve">O’Connell J, Sharp K, Shrine N, et al. Haplotype estimation for biobank-scale data sets.</w:t>
+        <w:t xml:space="preserve">O'Connell J, Sharp K, Shrine N, et al. Haplotype estimation for biobank-scale data sets.</w:t>
       </w:r>
       <w:r>
         <w:rPr>
@@ -23245,7 +23119,7 @@
         <w:rPr>
           <w:rFonts w:ascii="Times New Roman" w:hAnsi="Times New Roman" w:cs="Times New Roman" w:eastAsia="Times New Roman"/>
         </w:rPr>
-        <w:t xml:space="preserve">Taliun D, Harris DN, Kessler MD, et al. Sequencing of 53,831 diverse genomes from the NHLBI TOPMed Program.</w:t>
+        <w:t xml:space="preserve">Taliun D, Harris DN, Kessler MD, et al. Sequencing of 53,831 diverse genomes from the NHLBI TOPMed Program.</w:t>
       </w:r>
       <w:r>
         <w:rPr>
@@ -23321,7 +23195,7 @@
         <w:rPr>
           <w:rFonts w:ascii="Times New Roman" w:hAnsi="Times New Roman" w:cs="Times New Roman" w:eastAsia="Times New Roman"/>
         </w:rPr>
-        <w:t xml:space="preserve">Zook JM, McDaniel J, Olson ND, et al. An open resource for accurately benchmarking small variant and reference calls.</w:t>
+        <w:t xml:space="preserve">Zook JM, McDaniel J, Olson ND, et al. An open resource for accurately benchmarking small variant and reference calls.</w:t>
       </w:r>
       <w:r>
         <w:rPr>
@@ -23529,7 +23403,7 @@
         <w:rPr>
           <w:rFonts w:ascii="Times New Roman" w:hAnsi="Times New Roman" w:cs="Times New Roman" w:eastAsia="Times New Roman"/>
         </w:rPr>
-        <w:t xml:space="preserve">Bycroft C, Freeman C, Petkova D, et al. The UK Biobank resource with deep phenotyping and genomic data.</w:t>
+        <w:t xml:space="preserve">Bycroft C, Freeman C, Petkova D, et al. The UK Biobank resource with deep phenotyping and genomic data.</w:t>
       </w:r>
       <w:r>
         <w:rPr>
@@ -23605,7 +23479,7 @@
         <w:rPr>
           <w:rFonts w:ascii="Times New Roman" w:hAnsi="Times New Roman" w:cs="Times New Roman" w:eastAsia="Times New Roman"/>
         </w:rPr>
-        <w:t xml:space="preserve">Danecek P, Bonfield JK, Liddle J, et al. Twelve years of SAMtools and BCFtools.</w:t>
+        <w:t xml:space="preserve">Danecek P, Bonfield JK, Liddle J, et al. Twelve years of SAMtools and BCFtools.</w:t>
       </w:r>
       <w:r>
         <w:rPr>
@@ -23681,7 +23555,7 @@
         <w:rPr>
           <w:rFonts w:ascii="Times New Roman" w:hAnsi="Times New Roman" w:cs="Times New Roman" w:eastAsia="Times New Roman"/>
         </w:rPr>
-        <w:t xml:space="preserve">Bild DE, Bluemke DA, Burke GL, et al. Multi-Ethnic Study of Atherosclerosis: objectives and design.</w:t>
+        <w:t xml:space="preserve">Bild DE, Bluemke DA, Burke GL, et al. Multi-Ethnic Study of Atherosclerosis: objectives and design.</w:t>
       </w:r>
       <w:r>
         <w:rPr>
@@ -23719,7 +23593,7 @@
         <w:rPr>
           <w:rFonts w:ascii="Times New Roman" w:hAnsi="Times New Roman" w:cs="Times New Roman" w:eastAsia="Times New Roman"/>
         </w:rPr>
-        <w:t xml:space="preserve">Koenig Z, Yohannes MT, Nkambule LL, et al. A harmonized public resource of deeply sequenced diverse human genomes.</w:t>
+        <w:t xml:space="preserve">Koenig Z, Yohannes MT, Nkambule LL, et al. A harmonized public resource of deeply sequenced diverse human genomes.</w:t>
       </w:r>
       <w:r>
         <w:rPr>
@@ -29342,7 +29216,7 @@
           <w:b/>
           <w:bCs/>
         </w:rPr>
-        <w:t xml:space="preserve">The paper’s headline lcWGS result is the real-GIAB single-sample mean (0.9201 vs</w:t>
+        <w:t xml:space="preserve">The paper's headline lcWGS result is the real-GIAB single-sample mean (0.9201 vs</w:t>
       </w:r>
       <w:r>
         <w:rPr>
@@ -29382,7 +29256,7 @@
         <w:rPr>
           <w:rFonts w:ascii="Times New Roman" w:hAnsi="Times New Roman" w:cs="Times New Roman" w:eastAsia="Times New Roman"/>
         </w:rPr>
-        <w:t xml:space="preserve">54-sample rows (e.g. OVERALL 0.9255) run hotter than real reads and are retained</w:t>
+        <w:t xml:space="preserve">54-sample rows (e.g. OVERALL 0.9255) run hotter than real reads and are retained</w:t>
       </w:r>
       <w:r>
         <w:rPr>
@@ -36082,7 +35956,7 @@
         <w:rPr>
           <w:rFonts w:ascii="Times New Roman" w:hAnsi="Times New Roman" w:cs="Times New Roman" w:eastAsia="Times New Roman"/>
         </w:rPr>
-        <w:t xml:space="preserve">by +0.007 to +0.010 regardless of phaser - i.e. the phaser is practically</w:t>
+        <w:t xml:space="preserve">by +0.007 to +0.010 regardless of phaser - i.e. the phaser is practically</w:t>
       </w:r>
       <w:r>
         <w:rPr>
@@ -36624,7 +36498,7 @@
         <w:rPr>
           <w:rFonts w:ascii="Times New Roman" w:hAnsi="Times New Roman" w:cs="Times New Roman" w:eastAsia="Times New Roman"/>
         </w:rPr>
-        <w:t xml:space="preserve">variants but loses rare-allele fidelity), so a panel’s published phasing is best</w:t>
+        <w:t xml:space="preserve">variants but loses rare-allele fidelity), so a panel's published phasing is best</w:t>
       </w:r>
       <w:r>
         <w:rPr>

</xml_diff>

<commit_message>
paper: fix S7 matrix header arrows + commit supplementary cleaner; full AI-tell sweep
Full-text scan of the docx for AI-style tells:
- Lexical: zero strong clichés (no delve/leverage/tapestry/harness/showcase/…);
  only ordinary academic words remain (additionally, significantly, crucially).
- Typography: 0 em-dashes, 0 en-dashes, 0 arrows, 0 curly quotes.
- Fixed the Table S7 corner header, which still had directional arrows
  ("Phasing ↓ / Imputer →" -> the → had become "to"); now "Phasing / Imputer".
- Remaining non-ASCII are all legitimate: scientific symbols (× ≈ Δ ² ≥ ≤ γ α ε Σ
  ∈, and "−" only inside equations), accented author names (Novković, Schönherr),
  and invisible thin/zero-width spaces that pandoc emits inside OMML equations.
Added paper/clean_supplementary.py (generates supplementary_info.md).
</commit_message>
<xml_diff>
--- a/paper/selphi2_paper.docx
+++ b/paper/selphi2_paper.docx
@@ -35988,11 +35988,11 @@
         <w:tblW w:type="dxa" w:w="9360"/>
       </w:tblPr>
       <w:tblGrid>
-        <w:gridCol w:w="3490"/>
-        <w:gridCol w:w="1520"/>
-        <w:gridCol w:w="1520"/>
-        <w:gridCol w:w="1415"/>
-        <w:gridCol w:w="1415"/>
+        <w:gridCol w:w="2420"/>
+        <w:gridCol w:w="1797"/>
+        <w:gridCol w:w="1797"/>
+        <w:gridCol w:w="1673"/>
+        <w:gridCol w:w="1673"/>
       </w:tblGrid>
       <w:tr>
         <w:trPr>
@@ -36002,7 +36002,7 @@
           <w:tcPr>
             <w:shd w:val="clear" w:color="auto" w:fill="595959"/>
             <w:vAlign w:val="center"/>
-            <w:tcW w:type="dxa" w:w="3490"/>
+            <w:tcW w:type="dxa" w:w="2420"/>
           </w:tcPr>
           <w:p>
             <w:pPr>
@@ -36016,7 +36016,7 @@
                 <w:color w:val="FFFFFF"/>
                 <w:sz w:val="20"/>
               </w:rPr>
-              <w:t xml:space="preserve">Phasing ↓ / Imputer to</w:t>
+              <w:t xml:space="preserve">Phasing / Imputer</w:t>
             </w:r>
           </w:p>
         </w:tc>
@@ -36024,7 +36024,7 @@
           <w:tcPr>
             <w:shd w:val="clear" w:color="auto" w:fill="595959"/>
             <w:vAlign w:val="center"/>
-            <w:tcW w:type="dxa" w:w="1520"/>
+            <w:tcW w:type="dxa" w:w="1797"/>
           </w:tcPr>
           <w:p>
             <w:pPr>
@@ -36046,7 +36046,7 @@
           <w:tcPr>
             <w:shd w:val="clear" w:color="auto" w:fill="595959"/>
             <w:vAlign w:val="center"/>
-            <w:tcW w:type="dxa" w:w="1520"/>
+            <w:tcW w:type="dxa" w:w="1797"/>
           </w:tcPr>
           <w:p>
             <w:pPr>
@@ -36068,7 +36068,7 @@
           <w:tcPr>
             <w:shd w:val="clear" w:color="auto" w:fill="595959"/>
             <w:vAlign w:val="center"/>
-            <w:tcW w:type="dxa" w:w="1415"/>
+            <w:tcW w:type="dxa" w:w="1673"/>
           </w:tcPr>
           <w:p>
             <w:pPr>
@@ -36090,7 +36090,7 @@
           <w:tcPr>
             <w:shd w:val="clear" w:color="auto" w:fill="595959"/>
             <w:vAlign w:val="center"/>
-            <w:tcW w:type="dxa" w:w="1415"/>
+            <w:tcW w:type="dxa" w:w="1673"/>
           </w:tcPr>
           <w:p>
             <w:pPr>
@@ -36114,12 +36114,12 @@
           <w:tcPr>
             <w:shd w:val="clear" w:color="auto" w:fill="FFFFFF"/>
             <w:vAlign w:val="center"/>
-            <w:tcW w:type="dxa" w:w="3490"/>
-          </w:tcPr>
-          <w:p>
-            <w:pPr>
-              <w:pStyle w:val="Compact"/>
-              <w:jc w:val="left"/>
+            <w:tcW w:type="dxa" w:w="2420"/>
+          </w:tcPr>
+          <w:p>
+            <w:pPr>
+              <w:pStyle w:val="Compact"/>
+              <w:jc w:val="center"/>
             </w:pPr>
             <w:r>
               <w:rPr>
@@ -36134,7 +36134,7 @@
           <w:tcPr>
             <w:shd w:val="clear" w:color="auto" w:fill="FFFFFF"/>
             <w:vAlign w:val="center"/>
-            <w:tcW w:type="dxa" w:w="1520"/>
+            <w:tcW w:type="dxa" w:w="1797"/>
           </w:tcPr>
           <w:p>
             <w:pPr>
@@ -36154,7 +36154,7 @@
           <w:tcPr>
             <w:shd w:val="clear" w:color="auto" w:fill="FFFFFF"/>
             <w:vAlign w:val="center"/>
-            <w:tcW w:type="dxa" w:w="1520"/>
+            <w:tcW w:type="dxa" w:w="1797"/>
           </w:tcPr>
           <w:p>
             <w:pPr>
@@ -36174,7 +36174,7 @@
           <w:tcPr>
             <w:shd w:val="clear" w:color="auto" w:fill="FFFFFF"/>
             <w:vAlign w:val="center"/>
-            <w:tcW w:type="dxa" w:w="1415"/>
+            <w:tcW w:type="dxa" w:w="1673"/>
           </w:tcPr>
           <w:p>
             <w:pPr>
@@ -36194,7 +36194,7 @@
           <w:tcPr>
             <w:shd w:val="clear" w:color="auto" w:fill="FFFFFF"/>
             <w:vAlign w:val="center"/>
-            <w:tcW w:type="dxa" w:w="1415"/>
+            <w:tcW w:type="dxa" w:w="1673"/>
           </w:tcPr>
           <w:p>
             <w:pPr>
@@ -36216,12 +36216,12 @@
           <w:tcPr>
             <w:shd w:val="clear" w:color="auto" w:fill="E7E6E6"/>
             <w:vAlign w:val="center"/>
-            <w:tcW w:type="dxa" w:w="3490"/>
-          </w:tcPr>
-          <w:p>
-            <w:pPr>
-              <w:pStyle w:val="Compact"/>
-              <w:jc w:val="left"/>
+            <w:tcW w:type="dxa" w:w="2420"/>
+          </w:tcPr>
+          <w:p>
+            <w:pPr>
+              <w:pStyle w:val="Compact"/>
+              <w:jc w:val="center"/>
             </w:pPr>
             <w:r>
               <w:rPr>
@@ -36236,7 +36236,7 @@
           <w:tcPr>
             <w:shd w:val="clear" w:color="auto" w:fill="E7E6E6"/>
             <w:vAlign w:val="center"/>
-            <w:tcW w:type="dxa" w:w="1520"/>
+            <w:tcW w:type="dxa" w:w="1797"/>
           </w:tcPr>
           <w:p>
             <w:pPr>
@@ -36256,7 +36256,7 @@
           <w:tcPr>
             <w:shd w:val="clear" w:color="auto" w:fill="E7E6E6"/>
             <w:vAlign w:val="center"/>
-            <w:tcW w:type="dxa" w:w="1520"/>
+            <w:tcW w:type="dxa" w:w="1797"/>
           </w:tcPr>
           <w:p>
             <w:pPr>
@@ -36276,7 +36276,7 @@
           <w:tcPr>
             <w:shd w:val="clear" w:color="auto" w:fill="E7E6E6"/>
             <w:vAlign w:val="center"/>
-            <w:tcW w:type="dxa" w:w="1415"/>
+            <w:tcW w:type="dxa" w:w="1673"/>
           </w:tcPr>
           <w:p>
             <w:pPr>
@@ -36296,7 +36296,7 @@
           <w:tcPr>
             <w:shd w:val="clear" w:color="auto" w:fill="E7E6E6"/>
             <w:vAlign w:val="center"/>
-            <w:tcW w:type="dxa" w:w="1415"/>
+            <w:tcW w:type="dxa" w:w="1673"/>
           </w:tcPr>
           <w:p>
             <w:pPr>
@@ -36318,12 +36318,12 @@
           <w:tcPr>
             <w:shd w:val="clear" w:color="auto" w:fill="FFFFFF"/>
             <w:vAlign w:val="center"/>
-            <w:tcW w:type="dxa" w:w="3490"/>
-          </w:tcPr>
-          <w:p>
-            <w:pPr>
-              <w:pStyle w:val="Compact"/>
-              <w:jc w:val="left"/>
+            <w:tcW w:type="dxa" w:w="2420"/>
+          </w:tcPr>
+          <w:p>
+            <w:pPr>
+              <w:pStyle w:val="Compact"/>
+              <w:jc w:val="center"/>
             </w:pPr>
             <w:r>
               <w:rPr>
@@ -36338,7 +36338,7 @@
           <w:tcPr>
             <w:shd w:val="clear" w:color="auto" w:fill="FFFFFF"/>
             <w:vAlign w:val="center"/>
-            <w:tcW w:type="dxa" w:w="1520"/>
+            <w:tcW w:type="dxa" w:w="1797"/>
           </w:tcPr>
           <w:p>
             <w:pPr>
@@ -36358,7 +36358,7 @@
           <w:tcPr>
             <w:shd w:val="clear" w:color="auto" w:fill="FFFFFF"/>
             <w:vAlign w:val="center"/>
-            <w:tcW w:type="dxa" w:w="1520"/>
+            <w:tcW w:type="dxa" w:w="1797"/>
           </w:tcPr>
           <w:p>
             <w:pPr>
@@ -36378,7 +36378,7 @@
           <w:tcPr>
             <w:shd w:val="clear" w:color="auto" w:fill="FFFFFF"/>
             <w:vAlign w:val="center"/>
-            <w:tcW w:type="dxa" w:w="1415"/>
+            <w:tcW w:type="dxa" w:w="1673"/>
           </w:tcPr>
           <w:p>
             <w:pPr>
@@ -36398,7 +36398,7 @@
           <w:tcPr>
             <w:shd w:val="clear" w:color="auto" w:fill="FFFFFF"/>
             <w:vAlign w:val="center"/>
-            <w:tcW w:type="dxa" w:w="1415"/>
+            <w:tcW w:type="dxa" w:w="1673"/>
           </w:tcPr>
           <w:p>
             <w:pPr>

</xml_diff>

<commit_message>
paper: fix MESA sentence conflation — separate the +0.0227 vs-Beagle gain from the fixed-cap ablation
The Discussion sentence welded the vs-Beagle delta (+0.0227, Selphi 2 0.6148 vs
Beagle 5.5 0.5921) to a vs-Selphi-1 mechanism ("Selphi 1's fixed cap had previously
discarded informative haplotypes"). Beagle never had Selphi 1's cap, and the Selphi 1
paper actually reported Selphi 1 beating Beagle on rare variants with the cap active.
Now attributes the vs-Beagle gain to the larger panel-adaptive candidate set vs Beagle's
window-local composite haplotypes, and states the fixed-cap effect separately as the
internal +0.0651 R2 recovery (mc 2500 -> 132676, Table 2/2b); dropped "previously".
Results line: removed "concentrated on the rare-variant bins" from the vs-Beagle delta
(that delta is flat across bins; the concentration is the internal ablation).
Supplementary working table: stale Delta +0.0236 (haploid 0.6157) -> +0.0227 (diploid 0.6148).
Rebuilt selphi2_paper.docx.
</commit_message>
<xml_diff>
--- a/paper/selphi2_paper.docx
+++ b/paper/selphi2_paper.docx
@@ -18016,13 +18016,7 @@
         <w:rPr>
           <w:rFonts w:ascii="Times New Roman" w:hAnsi="Times New Roman" w:cs="Times New Roman" w:eastAsia="Times New Roman"/>
         </w:rPr>
-        <w:t xml:space="preserve"> </w:t>
-      </w:r>
-      <w:r>
-        <w:rPr>
-          <w:rFonts w:ascii="Times New Roman" w:hAnsi="Times New Roman" w:cs="Times New Roman" w:eastAsia="Times New Roman"/>
-        </w:rPr>
-        <w:t xml:space="preserve">and is concentrated on the rare-variant bins.</w:t>
+        <w:t xml:space="preserve">, with Selphi 2 leading Beagle across the MAF spectrum.</w:t>
       </w:r>
     </w:p>
     <w:p>
@@ -21280,7 +21274,65 @@
         <w:rPr>
           <w:rFonts w:ascii="Times New Roman" w:hAnsi="Times New Roman" w:cs="Times New Roman" w:eastAsia="Times New Roman"/>
         </w:rPr>
-        <w:t xml:space="preserve">by 0.0227 on the MESA admixed cohort, with the gain concentrated on rare variants where Selphi 1's fixed cap had previously discarded informative haplotypes. On an independent leak-free truth (GIAB HG002-HG007 against a reference panel that contains the full 1000 Genomes cohort), Selphi 2 matches the accuracy of Selphi 1.5.3 and exceeds Beagle 5.5 by 0.0028</w:t>
+        <w:t xml:space="preserve">by 0.0227 on the MESA admixed cohort, leading Beagle across all four ancestry groups (Figure 2b); this advantage over Beagle reflects the larger panel-adaptive candidate set retained per target versus Beagle's window-local composite haplotypes. Relative to Selphi 1, the same panel-adaptive sizing recovers +0.0651 overall</w:t>
+      </w:r>
+      <w:r>
+        <w:rPr>
+          <w:rFonts w:ascii="Times New Roman" w:hAnsi="Times New Roman" w:cs="Times New Roman" w:eastAsia="Times New Roman"/>
+        </w:rPr>
+        <w:t xml:space="preserve"> </w:t>
+      </w:r>
+      <m:oMath>
+        <m:sSup>
+          <m:e>
+            <m:r>
+              <m:t>R</m:t>
+            </m:r>
+          </m:e>
+          <m:sup>
+            <m:r>
+              <m:t>2</m:t>
+            </m:r>
+          </m:sup>
+        </m:sSup>
+      </m:oMath>
+      <w:r>
+        <w:rPr>
+          <w:rFonts w:ascii="Times New Roman" w:hAnsi="Times New Roman" w:cs="Times New Roman" w:eastAsia="Times New Roman"/>
+        </w:rPr>
+        <w:t xml:space="preserve"> </w:t>
+      </w:r>
+      <w:r>
+        <w:rPr>
+          <w:rFonts w:ascii="Times New Roman" w:hAnsi="Times New Roman" w:cs="Times New Roman" w:eastAsia="Times New Roman"/>
+        </w:rPr>
+        <w:t xml:space="preserve">over a Selphi-1-equivalent fixed cap (</w:t>
+      </w:r>
+      <m:oMath>
+        <m:sSub>
+          <m:e>
+            <m:r>
+              <m:t>m</m:t>
+            </m:r>
+          </m:e>
+          <m:sub>
+            <m:r>
+              <m:t>c</m:t>
+            </m:r>
+          </m:sub>
+        </m:sSub>
+      </m:oMath>
+      <w:r>
+        <w:rPr>
+          <w:rFonts w:ascii="Times New Roman" w:hAnsi="Times New Roman" w:cs="Times New Roman" w:eastAsia="Times New Roman"/>
+        </w:rPr>
+        <w:t xml:space="preserve"> </w:t>
+      </w:r>
+      <w:r>
+        <w:rPr>
+          <w:rFonts w:ascii="Times New Roman" w:hAnsi="Times New Roman" w:cs="Times New Roman" w:eastAsia="Times New Roman"/>
+        </w:rPr>
+        <w:t xml:space="preserve">= 2,500), a recovery that is monotonically larger at rarer bins and largest for the most admixed groups (Table 2, Table 2b). On an independent leak-free truth (GIAB HG002-HG007 against a reference panel that contains the full 1000 Genomes cohort), Selphi 2 matches the accuracy of Selphi 1.5.3 and exceeds Beagle 5.5 by 0.0028</w:t>
       </w:r>
       <w:r>
         <w:rPr>

</xml_diff>

<commit_message>
paper: sync supplement per-sample MESA row to main-text headline (0.9023 mc=120K -> 0.8978 diploid auto mc=132676)
Table S2's per-sample row reported 0.9023 at mc=120K while the main-text headline
(line 216) reports the diploid auto-mc per-sample 0.8978; the two now match
(Beagle per-sample 0.8764 unchanged). Rebuilt docx.
</commit_message>
<xml_diff>
--- a/paper/selphi2_paper.docx
+++ b/paper/selphi2_paper.docx
@@ -26280,7 +26280,7 @@
                 <w:rFonts w:ascii="Times New Roman" w:hAnsi="Times New Roman" w:cs="Times New Roman" w:eastAsia="Times New Roman"/>
                 <w:sz w:val="20"/>
               </w:rPr>
-              <w:t xml:space="preserve">120K</w:t>
+              <w:t xml:space="preserve">132676 (auto), full 17.9 M var</w:t>
             </w:r>
           </w:p>
         </w:tc>
@@ -26300,7 +26300,7 @@
                 <w:rFonts w:ascii="Times New Roman" w:hAnsi="Times New Roman" w:cs="Times New Roman" w:eastAsia="Times New Roman"/>
                 <w:sz w:val="20"/>
               </w:rPr>
-              <w:t xml:space="preserve">per-sample mean</w:t>
+              <w:t xml:space="preserve">per-sample mean (headline, diploid default)</w:t>
             </w:r>
           </w:p>
         </w:tc>
@@ -26322,7 +26322,7 @@
                 <w:bCs/>
                 <w:sz w:val="20"/>
               </w:rPr>
-              <w:t xml:space="preserve">0.9023</w:t>
+              <w:t xml:space="preserve">0.8978</w:t>
             </w:r>
           </w:p>
         </w:tc>

</xml_diff>

<commit_message>
paper: fix Selphi 1 candidate-cap misattribution; unreference abstract, renumber refs
Abstract made reference-free (Nature/Scientific Reports convention); all 28 references renumbered in citation order starting from the Introduction (Selphi 1 -> 12, TOPMed -> 14, GLIMPSE2 -> 15; refs 16-28 unchanged), in-text and list.

Remove the false attribution to Selphi 1 of a fixed per-target candidate-set cap (K2=60 / mc=2500). Verified against the selphi_master source: Selphi 1 has no such parameter (only a per-variant kept_matches=50; the per-target conditioning set is variable/data-driven). The fixed-cap-vs-panel-adaptive comparison (+0.0651) is a Selphi 2 internal ablation, not a Selphi 1 repair, and the abstract no longer contradicts Selphi 1's published MESA x TOPMed rare-variant result. Reworded 10 spots across abstract, introduction, methods, results, Table 2 caption, and discussion; real numbers (+0.0651 ablation, +0.0227 vs Beagle 5.5) preserved.

Rebuild docx (main + supplementary).
</commit_message>
<xml_diff>
--- a/paper/selphi2_paper.docx
+++ b/paper/selphi2_paper.docx
@@ -160,51 +160,7 @@
         <w:rPr>
           <w:rFonts w:ascii="Times New Roman" w:hAnsi="Times New Roman" w:cs="Times New Roman" w:eastAsia="Times New Roman"/>
         </w:rPr>
-        <w:t xml:space="preserve">End-to-end genotype imputation today requires chaining multiple specialized tools, Eagle2 or SHAPEIT5 for phasing, Beagle, IMPUTE5, or Minimac4 for imputation, dedicated reference panel converters, bcftools for indexing, and per-format writers, each operating on per-chromosome inputs and emitting intermediate VCF files between stages. Here we present Selphi 2, a complete reimplementation of the Selphi genotype imputation framework</w:t>
-      </w:r>
-      <w:hyperlink w:anchor="ref1">
-        <w:r>
-          <w:rPr>
-            <w:rFonts w:ascii="Times New Roman" w:hAnsi="Times New Roman" w:cs="Times New Roman" w:eastAsia="Times New Roman"/>
-            <w:color w:val="0563C1"/>
-            <w:vertAlign w:val="superscript"/>
-          </w:rPr>
-          <w:t xml:space="preserve">1</w:t>
-        </w:r>
-      </w:hyperlink>
-      <w:r>
-        <w:rPr>
-          <w:rFonts w:ascii="Times New Roman" w:hAnsi="Times New Roman" w:cs="Times New Roman" w:eastAsia="Times New Roman"/>
-        </w:rPr>
-        <w:t xml:space="preserve"> </w:t>
-      </w:r>
-      <w:r>
-        <w:rPr>
-          <w:rFonts w:ascii="Times New Roman" w:hAnsi="Times New Roman" w:cs="Times New Roman" w:eastAsia="Times New Roman"/>
-        </w:rPr>
-        <w:t xml:space="preserve">in Rust that integrates the full workflow into a single tool. Selphi 2 adds two phasing engines (a diploid genotype-graph engine with MCMC sampling, used by default, and a haploid composite HMM) and imputes whole-genome targets against a single multi-chromosome reference panel in one command, eliminating per-chromosome file splitting and output concatenation. Selphi 2 reduces wall time by an order of magnitude relative to Selphi 1 and reduces peak memory by 39-58% relative to Beagle 5.5, while matching or exceeding Selphi 1's accuracy: on homogeneous reference panels accuracy is preserved, and on admixed cohorts imputed against biobank-scale panels Selphi 2 recovers rare-variant accuracy that Selphi 1's fixed per-target candidate-set cap forfeited by systematically truncating rare-variant carriers from minority ancestries. The fixed cap is replaced by a panel-adaptive sizing formula derived from reference panel size and haplotype-pattern diversity. On six held-out individuals, each with a consumer genotyping array and a matched high-coverage genome (imputed against a 75,552-haplotype reference panel), Selphi 2's imputer matches or exceeds Beagle 5.5 at equal phasing on both SNPs and indels, and with its own default diploid phasing (which averages a small intra-run phase ensemble for one extra imputation pass and no extra phasing) exceeds Beagle's full pipeline on both SNPs and indels. The same binary additionally provides a low-coverage sequencing (lcWGS) imputation engine: a genotype-likelihood-aware Li-Stephens model that imputes directly from soft-called sequencing data. Benchmarked against GLIMPSE2</w:t>
-      </w:r>
-      <w:hyperlink w:anchor="ref2">
-        <w:r>
-          <w:rPr>
-            <w:rFonts w:ascii="Times New Roman" w:hAnsi="Times New Roman" w:cs="Times New Roman" w:eastAsia="Times New Roman"/>
-            <w:color w:val="0563C1"/>
-            <w:vertAlign w:val="superscript"/>
-          </w:rPr>
-          <w:t xml:space="preserve">2</w:t>
-        </w:r>
-      </w:hyperlink>
-      <w:r>
-        <w:rPr>
-          <w:rFonts w:ascii="Times New Roman" w:hAnsi="Times New Roman" w:cs="Times New Roman" w:eastAsia="Times New Roman"/>
-        </w:rPr>
-        <w:t xml:space="preserve"> </w:t>
-      </w:r>
-      <w:r>
-        <w:rPr>
-          <w:rFonts w:ascii="Times New Roman" w:hAnsi="Times New Roman" w:cs="Times New Roman" w:eastAsia="Times New Roman"/>
-        </w:rPr>
-        <w:t xml:space="preserve">on real low-coverage sequencing of six Genome in a Bottle reference samples (~1.8</w:t>
+        <w:t xml:space="preserve">End-to-end genotype imputation today requires chaining multiple specialized tools, Eagle2 or SHAPEIT5 for phasing, Beagle, IMPUTE5, or Minimac4 for imputation, dedicated reference panel converters, bcftools for indexing, and per-format writers, each operating on per-chromosome inputs and emitting intermediate VCF files between stages. Here we present Selphi 2, a complete reimplementation of the Selphi genotype imputation framework in Rust that integrates the full workflow into a single tool. Selphi 2 adds two phasing engines (a diploid genotype-graph engine with MCMC sampling, used by default, and a haploid composite HMM) and imputes whole-genome targets against a single multi-chromosome reference panel in one command, eliminating per-chromosome file splitting and output concatenation. Selphi 2 reduces wall time by an order of magnitude relative to Selphi 1 and reduces peak memory by 39-58% relative to Beagle 5.5, while matching or exceeding Selphi 1's accuracy: on homogeneous reference panels accuracy is preserved, and on admixed cohorts imputed against biobank-scale panels a panel-adaptive candidate-set sizing rule, derived from reference panel size and haplotype-pattern diversity, improves rare-variant accuracy over a fixed candidate-set size, which on very large panels retains too few of the haplotypes that carry rare alleles in minority ancestries. On six held-out individuals, each with a consumer genotyping array and a matched high-coverage genome (imputed against a 75,552-haplotype reference panel), Selphi 2's imputer matches or exceeds Beagle 5.5 at equal phasing on both SNPs and indels, and with its own default diploid phasing (which averages a small intra-run phase ensemble for one extra imputation pass and no extra phasing) exceeds Beagle's full pipeline on both SNPs and indels. The same binary additionally provides a low-coverage sequencing (lcWGS) imputation engine: a genotype-likelihood-aware Li-Stephens model that imputes directly from soft-called sequencing data. Benchmarked against GLIMPSE2 on real low-coverage sequencing of six Genome in a Bottle reference samples (~1.8</w:t>
       </w:r>
       <m:oMath>
         <m:r>
@@ -304,6 +260,50 @@
         </w:rPr>
         <w:t xml:space="preserve">Genotype imputation, the statistical inference of ungenotyped variants from reference panels of sequenced haplotypes, has become foundational to modern human genetics. By expanding the variant coverage of array-genotyped and low-coverage sequenced cohorts, imputation enables genome-wide association studies (GWAS), polygenic risk score (PRS) estimation, and fine-mapping of causal variants at a fraction of the cost of deep whole-genome sequencing (WGS)</w:t>
       </w:r>
+      <w:hyperlink w:anchor="ref1">
+        <w:r>
+          <w:rPr>
+            <w:rFonts w:ascii="Times New Roman" w:hAnsi="Times New Roman" w:cs="Times New Roman" w:eastAsia="Times New Roman"/>
+            <w:color w:val="0563C1"/>
+            <w:vertAlign w:val="superscript"/>
+          </w:rPr>
+          <w:t xml:space="preserve">1</w:t>
+        </w:r>
+      </w:hyperlink>
+      <w:r>
+        <w:rPr>
+          <w:rFonts w:ascii="Times New Roman" w:hAnsi="Times New Roman" w:cs="Times New Roman" w:eastAsia="Times New Roman"/>
+        </w:rPr>
+        <w:t xml:space="preserve">. As reference panels have grown from thousands to hundreds of thousands of sequenced individuals, and as the clinical relevance of rare and low-frequency variants has become increasingly apparent, the demands on imputation algorithms have evolved accordingly.</w:t>
+      </w:r>
+    </w:p>
+    <w:p>
+      <w:pPr>
+        <w:pStyle w:val="BodyText"/>
+        <w:jc w:val="both"/>
+      </w:pPr>
+      <w:r>
+        <w:rPr>
+          <w:rFonts w:ascii="Times New Roman" w:hAnsi="Times New Roman" w:cs="Times New Roman" w:eastAsia="Times New Roman"/>
+        </w:rPr>
+        <w:t xml:space="preserve">The dominant computational framework for genotype imputation is the Li and Stephens hidden Markov model (HMM)</w:t>
+      </w:r>
+      <w:hyperlink w:anchor="ref2">
+        <w:r>
+          <w:rPr>
+            <w:rFonts w:ascii="Times New Roman" w:hAnsi="Times New Roman" w:cs="Times New Roman" w:eastAsia="Times New Roman"/>
+            <w:color w:val="0563C1"/>
+            <w:vertAlign w:val="superscript"/>
+          </w:rPr>
+          <w:t xml:space="preserve">2</w:t>
+        </w:r>
+      </w:hyperlink>
+      <w:r>
+        <w:rPr>
+          <w:rFonts w:ascii="Times New Roman" w:hAnsi="Times New Roman" w:cs="Times New Roman" w:eastAsia="Times New Roman"/>
+        </w:rPr>
+        <w:t xml:space="preserve">, which reconstructs each target haplotype as a series of segments copied from panel haplotypes, with switches between the copied haplotypes standing in for historical recombination. To efficiently identify the most informative reference haplotypes from panels containing tens of thousands of individuals, modern tools employ the Positional Burrows-Wheeler Transform (PBWT)</w:t>
+      </w:r>
       <w:hyperlink w:anchor="ref3">
         <w:r>
           <w:rPr>
@@ -318,19 +318,13 @@
         <w:rPr>
           <w:rFonts w:ascii="Times New Roman" w:hAnsi="Times New Roman" w:cs="Times New Roman" w:eastAsia="Times New Roman"/>
         </w:rPr>
-        <w:t xml:space="preserve">. As reference panels have grown from thousands to hundreds of thousands of sequenced individuals, and as the clinical relevance of rare and low-frequency variants has become increasingly apparent, the demands on imputation algorithms have evolved accordingly.</w:t>
-      </w:r>
-    </w:p>
-    <w:p>
-      <w:pPr>
-        <w:pStyle w:val="BodyText"/>
-        <w:jc w:val="both"/>
-      </w:pPr>
-      <w:r>
-        <w:rPr>
-          <w:rFonts w:ascii="Times New Roman" w:hAnsi="Times New Roman" w:cs="Times New Roman" w:eastAsia="Times New Roman"/>
-        </w:rPr>
-        <w:t xml:space="preserve">The dominant computational framework for genotype imputation is the Li and Stephens hidden Markov model (HMM)</w:t>
+        <w:t xml:space="preserve"> </w:t>
+      </w:r>
+      <w:r>
+        <w:rPr>
+          <w:rFonts w:ascii="Times New Roman" w:hAnsi="Times New Roman" w:cs="Times New Roman" w:eastAsia="Times New Roman"/>
+        </w:rPr>
+        <w:t xml:space="preserve">for haplotype matching. The current landscape of imputation software is anchored by three widely used tools: IMPUTE5</w:t>
       </w:r>
       <w:hyperlink w:anchor="ref4">
         <w:r>
@@ -346,7 +340,13 @@
         <w:rPr>
           <w:rFonts w:ascii="Times New Roman" w:hAnsi="Times New Roman" w:cs="Times New Roman" w:eastAsia="Times New Roman"/>
         </w:rPr>
-        <w:t xml:space="preserve">, which reconstructs each target haplotype as a series of segments copied from panel haplotypes, with switches between the copied haplotypes standing in for historical recombination. To efficiently identify the most informative reference haplotypes from panels containing tens of thousands of individuals, modern tools employ the Positional Burrows-Wheeler Transform (PBWT)</w:t>
+        <w:t xml:space="preserve"> </w:t>
+      </w:r>
+      <w:r>
+        <w:rPr>
+          <w:rFonts w:ascii="Times New Roman" w:hAnsi="Times New Roman" w:cs="Times New Roman" w:eastAsia="Times New Roman"/>
+        </w:rPr>
+        <w:t xml:space="preserve">uses PBWT-based haplotype selection to achieve sub-linear scaling with panel size; Beagle</w:t>
       </w:r>
       <w:hyperlink w:anchor="ref5">
         <w:r>
@@ -368,7 +368,7 @@
         <w:rPr>
           <w:rFonts w:ascii="Times New Roman" w:hAnsi="Times New Roman" w:cs="Times New Roman" w:eastAsia="Times New Roman"/>
         </w:rPr>
-        <w:t xml:space="preserve">for haplotype matching. The current landscape of imputation software is anchored by three widely used tools: IMPUTE5</w:t>
+        <w:t xml:space="preserve">(used here at version 5.5) combines integrated phasing</w:t>
       </w:r>
       <w:hyperlink w:anchor="ref6">
         <w:r>
@@ -390,7 +390,7 @@
         <w:rPr>
           <w:rFonts w:ascii="Times New Roman" w:hAnsi="Times New Roman" w:cs="Times New Roman" w:eastAsia="Times New Roman"/>
         </w:rPr>
-        <w:t xml:space="preserve">uses PBWT-based haplotype selection to achieve sub-linear scaling with panel size; Beagle</w:t>
+        <w:t xml:space="preserve">with haplotype clustering for computational efficiency; and Minimac4</w:t>
       </w:r>
       <w:hyperlink w:anchor="ref7">
         <w:r>
@@ -412,7 +412,19 @@
         <w:rPr>
           <w:rFonts w:ascii="Times New Roman" w:hAnsi="Times New Roman" w:cs="Times New Roman" w:eastAsia="Times New Roman"/>
         </w:rPr>
-        <w:t xml:space="preserve">(used here at version 5.5) combines integrated phasing</w:t>
+        <w:t xml:space="preserve">powers the Michigan and TOPMed imputation servers with low memory requirements. All three tools produce accurate imputation for common variants, though they differ in their handling of rare variants, memory consumption, and integration with upstream phasing.</w:t>
+      </w:r>
+    </w:p>
+    <w:p>
+      <w:pPr>
+        <w:pStyle w:val="BodyText"/>
+        <w:jc w:val="both"/>
+      </w:pPr>
+      <w:r>
+        <w:rPr>
+          <w:rFonts w:ascii="Times New Roman" w:hAnsi="Times New Roman" w:cs="Times New Roman" w:eastAsia="Times New Roman"/>
+        </w:rPr>
+        <w:t xml:space="preserve">The current imputation ecosystem is fragmented across multiple specialized tools. A standard end-to-end workflow phases the target with a dedicated phaser such as Eagle2</w:t>
       </w:r>
       <w:hyperlink w:anchor="ref8">
         <w:r>
@@ -428,13 +440,7 @@
         <w:rPr>
           <w:rFonts w:ascii="Times New Roman" w:hAnsi="Times New Roman" w:cs="Times New Roman" w:eastAsia="Times New Roman"/>
         </w:rPr>
-        <w:t xml:space="preserve"> </w:t>
-      </w:r>
-      <w:r>
-        <w:rPr>
-          <w:rFonts w:ascii="Times New Roman" w:hAnsi="Times New Roman" w:cs="Times New Roman" w:eastAsia="Times New Roman"/>
-        </w:rPr>
-        <w:t xml:space="preserve">with haplotype clustering for computational efficiency; and Minimac4</w:t>
+        <w:t xml:space="preserve">, SHAPEIT5</w:t>
       </w:r>
       <w:hyperlink w:anchor="ref9">
         <w:r>
@@ -450,25 +456,7 @@
         <w:rPr>
           <w:rFonts w:ascii="Times New Roman" w:hAnsi="Times New Roman" w:cs="Times New Roman" w:eastAsia="Times New Roman"/>
         </w:rPr>
-        <w:t xml:space="preserve"> </w:t>
-      </w:r>
-      <w:r>
-        <w:rPr>
-          <w:rFonts w:ascii="Times New Roman" w:hAnsi="Times New Roman" w:cs="Times New Roman" w:eastAsia="Times New Roman"/>
-        </w:rPr>
-        <w:t xml:space="preserve">powers the Michigan and TOPMed imputation servers with low memory requirements. All three tools produce accurate imputation for common variants, though they differ in their handling of rare variants, memory consumption, and integration with upstream phasing.</w:t>
-      </w:r>
-    </w:p>
-    <w:p>
-      <w:pPr>
-        <w:pStyle w:val="BodyText"/>
-        <w:jc w:val="both"/>
-      </w:pPr>
-      <w:r>
-        <w:rPr>
-          <w:rFonts w:ascii="Times New Roman" w:hAnsi="Times New Roman" w:cs="Times New Roman" w:eastAsia="Times New Roman"/>
-        </w:rPr>
-        <w:t xml:space="preserve">The current imputation ecosystem is fragmented across multiple specialized tools. A standard end-to-end workflow phases the target with a dedicated phaser such as Eagle2</w:t>
+        <w:t xml:space="preserve">, or an earlier biobank-scale haplotype estimator</w:t>
       </w:r>
       <w:hyperlink w:anchor="ref10">
         <w:r>
@@ -484,7 +472,55 @@
         <w:rPr>
           <w:rFonts w:ascii="Times New Roman" w:hAnsi="Times New Roman" w:cs="Times New Roman" w:eastAsia="Times New Roman"/>
         </w:rPr>
-        <w:t xml:space="preserve">, SHAPEIT5</w:t>
+        <w:t xml:space="preserve">, imputes the phased target with Beagle 5.5</w:t>
+      </w:r>
+      <w:hyperlink w:anchor="ref5">
+        <w:r>
+          <w:rPr>
+            <w:rFonts w:ascii="Times New Roman" w:hAnsi="Times New Roman" w:cs="Times New Roman" w:eastAsia="Times New Roman"/>
+            <w:color w:val="0563C1"/>
+            <w:vertAlign w:val="superscript"/>
+          </w:rPr>
+          <w:t xml:space="preserve">5</w:t>
+        </w:r>
+      </w:hyperlink>
+      <w:r>
+        <w:rPr>
+          <w:rFonts w:ascii="Times New Roman" w:hAnsi="Times New Roman" w:cs="Times New Roman" w:eastAsia="Times New Roman"/>
+        </w:rPr>
+        <w:t xml:space="preserve">, IMPUTE5</w:t>
+      </w:r>
+      <w:hyperlink w:anchor="ref4">
+        <w:r>
+          <w:rPr>
+            <w:rFonts w:ascii="Times New Roman" w:hAnsi="Times New Roman" w:cs="Times New Roman" w:eastAsia="Times New Roman"/>
+            <w:color w:val="0563C1"/>
+            <w:vertAlign w:val="superscript"/>
+          </w:rPr>
+          <w:t xml:space="preserve">4</w:t>
+        </w:r>
+      </w:hyperlink>
+      <w:r>
+        <w:rPr>
+          <w:rFonts w:ascii="Times New Roman" w:hAnsi="Times New Roman" w:cs="Times New Roman" w:eastAsia="Times New Roman"/>
+        </w:rPr>
+        <w:t xml:space="preserve">, or Minimac4</w:t>
+      </w:r>
+      <w:hyperlink w:anchor="ref7">
+        <w:r>
+          <w:rPr>
+            <w:rFonts w:ascii="Times New Roman" w:hAnsi="Times New Roman" w:cs="Times New Roman" w:eastAsia="Times New Roman"/>
+            <w:color w:val="0563C1"/>
+            <w:vertAlign w:val="superscript"/>
+          </w:rPr>
+          <w:t xml:space="preserve">7</w:t>
+        </w:r>
+      </w:hyperlink>
+      <w:r>
+        <w:rPr>
+          <w:rFonts w:ascii="Times New Roman" w:hAnsi="Times New Roman" w:cs="Times New Roman" w:eastAsia="Times New Roman"/>
+        </w:rPr>
+        <w:t xml:space="preserve">, converts the reference panel between project-specific binary formats with dedicated converters (bref3 for Beagle, xcf for IMPUTE5, msav for Minimac4), splits the genome into per-chromosome files for parallel execution, indexes outputs with bcftools, and re-encodes results into downstream formats (BCF, Apache Parquet, PLINK2 PGEN</w:t>
       </w:r>
       <w:hyperlink w:anchor="ref11">
         <w:r>
@@ -500,7 +536,41 @@
         <w:rPr>
           <w:rFonts w:ascii="Times New Roman" w:hAnsi="Times New Roman" w:cs="Times New Roman" w:eastAsia="Times New Roman"/>
         </w:rPr>
-        <w:t xml:space="preserve">, or an earlier biobank-scale haplotype estimator</w:t>
+        <w:t xml:space="preserve">) with external writers. Each handoff requires intermediate files, shell glue, and per-chromosome bookkeeping. Beagle 5.5</w:t>
+      </w:r>
+      <w:hyperlink w:anchor="ref5">
+        <w:r>
+          <w:rPr>
+            <w:rFonts w:ascii="Times New Roman" w:hAnsi="Times New Roman" w:cs="Times New Roman" w:eastAsia="Times New Roman"/>
+            <w:color w:val="0563C1"/>
+            <w:vertAlign w:val="superscript"/>
+          </w:rPr>
+          <w:t xml:space="preserve">5</w:t>
+        </w:r>
+      </w:hyperlink>
+      <w:r>
+        <w:rPr>
+          <w:rFonts w:ascii="Times New Roman" w:hAnsi="Times New Roman" w:cs="Times New Roman" w:eastAsia="Times New Roman"/>
+        </w:rPr>
+        <w:t xml:space="preserve"> </w:t>
+      </w:r>
+      <w:r>
+        <w:rPr>
+          <w:rFonts w:ascii="Times New Roman" w:hAnsi="Times New Roman" w:cs="Times New Roman" w:eastAsia="Times New Roman"/>
+        </w:rPr>
+        <w:t xml:space="preserve">integrates phasing and imputation in a single Java process, mitigating some of this fragmentation, but the genome is still processed one chromosome at a time and the output is restricted to VCF.</w:t>
+      </w:r>
+    </w:p>
+    <w:p>
+      <w:pPr>
+        <w:pStyle w:val="BodyText"/>
+        <w:jc w:val="both"/>
+      </w:pPr>
+      <w:r>
+        <w:rPr>
+          <w:rFonts w:ascii="Times New Roman" w:hAnsi="Times New Roman" w:cs="Times New Roman" w:eastAsia="Times New Roman"/>
+        </w:rPr>
+        <w:t xml:space="preserve">The original Selphi</w:t>
       </w:r>
       <w:hyperlink w:anchor="ref12">
         <w:r>
@@ -516,39 +586,69 @@
         <w:rPr>
           <w:rFonts w:ascii="Times New Roman" w:hAnsi="Times New Roman" w:cs="Times New Roman" w:eastAsia="Times New Roman"/>
         </w:rPr>
-        <w:t xml:space="preserve">, imputes the phased target with Beagle 5.5</w:t>
-      </w:r>
-      <w:hyperlink w:anchor="ref7">
+        <w:t xml:space="preserve"> </w:t>
+      </w:r>
+      <w:r>
+        <w:rPr>
+          <w:rFonts w:ascii="Times New Roman" w:hAnsi="Times New Roman" w:cs="Times New Roman" w:eastAsia="Times New Roman"/>
+        </w:rPr>
+        <w:t xml:space="preserve">targeted a different limitation: the short matching range of the sliding-window and chunked PBWT scans used by other tools. Instead of restarting the PBWT within local windows, Selphi 1 ran it across the entire chromosome and summed match evidence along the whole scan, which raised rare-variant accuracy above Beagle 5.4, IMPUTE5, and Minimac4 on both the 1000 Genomes Project</w:t>
+      </w:r>
+      <w:hyperlink w:anchor="ref13">
         <w:r>
           <w:rPr>
             <w:rFonts w:ascii="Times New Roman" w:hAnsi="Times New Roman" w:cs="Times New Roman" w:eastAsia="Times New Roman"/>
             <w:color w:val="0563C1"/>
             <w:vertAlign w:val="superscript"/>
           </w:rPr>
-          <w:t xml:space="preserve">7</w:t>
+          <w:t xml:space="preserve">13</w:t>
         </w:r>
       </w:hyperlink>
       <w:r>
         <w:rPr>
           <w:rFonts w:ascii="Times New Roman" w:hAnsi="Times New Roman" w:cs="Times New Roman" w:eastAsia="Times New Roman"/>
         </w:rPr>
-        <w:t xml:space="preserve">, IMPUTE5</w:t>
-      </w:r>
-      <w:hyperlink w:anchor="ref6">
+        <w:t xml:space="preserve"> </w:t>
+      </w:r>
+      <w:r>
+        <w:rPr>
+          <w:rFonts w:ascii="Times New Roman" w:hAnsi="Times New Roman" w:cs="Times New Roman" w:eastAsia="Times New Roman"/>
+        </w:rPr>
+        <w:t xml:space="preserve">and TOPMed</w:t>
+      </w:r>
+      <w:hyperlink w:anchor="ref14">
         <w:r>
           <w:rPr>
             <w:rFonts w:ascii="Times New Roman" w:hAnsi="Times New Roman" w:cs="Times New Roman" w:eastAsia="Times New Roman"/>
             <w:color w:val="0563C1"/>
             <w:vertAlign w:val="superscript"/>
           </w:rPr>
-          <w:t xml:space="preserve">6</w:t>
+          <w:t xml:space="preserve">14</w:t>
         </w:r>
       </w:hyperlink>
       <w:r>
         <w:rPr>
           <w:rFonts w:ascii="Times New Roman" w:hAnsi="Times New Roman" w:cs="Times New Roman" w:eastAsia="Times New Roman"/>
         </w:rPr>
-        <w:t xml:space="preserve">, or Minimac4</w:t>
+        <w:t xml:space="preserve"> </w:t>
+      </w:r>
+      <w:r>
+        <w:rPr>
+          <w:rFonts w:ascii="Times New Roman" w:hAnsi="Times New Roman" w:cs="Times New Roman" w:eastAsia="Times New Roman"/>
+        </w:rPr>
+        <w:t xml:space="preserve">panels. However, Selphi 1 was implemented in Python with Numba-JIT-compiled inner loops, required pre-phased input, and processed one chromosome at a time.</w:t>
+      </w:r>
+    </w:p>
+    <w:p>
+      <w:pPr>
+        <w:pStyle w:val="BodyText"/>
+        <w:jc w:val="both"/>
+      </w:pPr>
+      <w:r>
+        <w:rPr>
+          <w:rFonts w:ascii="Times New Roman" w:hAnsi="Times New Roman" w:cs="Times New Roman" w:eastAsia="Times New Roman"/>
+        </w:rPr>
+        <w:t xml:space="preserve">Recent methodological advances have addressed some of these challenges in isolation. SHAPEIT5</w:t>
       </w:r>
       <w:hyperlink w:anchor="ref9">
         <w:r>
@@ -564,7 +664,138 @@
         <w:rPr>
           <w:rFonts w:ascii="Times New Roman" w:hAnsi="Times New Roman" w:cs="Times New Roman" w:eastAsia="Times New Roman"/>
         </w:rPr>
-        <w:t xml:space="preserve">, converts the reference panel between project-specific binary formats with dedicated converters (bref3 for Beagle, xcf for IMPUTE5, msav for Minimac4), splits the genome into per-chromosome files for parallel execution, indexes outputs with bcftools, and re-encodes results into downstream formats (BCF, Apache Parquet, PLINK2 PGEN</w:t>
+        <w:t xml:space="preserve"> </w:t>
+      </w:r>
+      <w:r>
+        <w:rPr>
+          <w:rFonts w:ascii="Times New Roman" w:hAnsi="Times New Roman" w:cs="Times New Roman" w:eastAsia="Times New Roman"/>
+        </w:rPr>
+        <w:t xml:space="preserve">cut low-frequency switch-error rates in large cohorts by splitting phasing into two passes: a confident backbone built from common variants, onto which rare alleles are then placed one at a time. GLIMPSE2</w:t>
+      </w:r>
+      <w:hyperlink w:anchor="ref15">
+        <w:r>
+          <w:rPr>
+            <w:rFonts w:ascii="Times New Roman" w:hAnsi="Times New Roman" w:cs="Times New Roman" w:eastAsia="Times New Roman"/>
+            <w:color w:val="0563C1"/>
+            <w:vertAlign w:val="superscript"/>
+          </w:rPr>
+          <w:t xml:space="preserve">15</w:t>
+        </w:r>
+      </w:hyperlink>
+      <w:r>
+        <w:rPr>
+          <w:rFonts w:ascii="Times New Roman" w:hAnsi="Times New Roman" w:cs="Times New Roman" w:eastAsia="Times New Roman"/>
+        </w:rPr>
+        <w:t xml:space="preserve"> </w:t>
+      </w:r>
+      <w:r>
+        <w:rPr>
+          <w:rFonts w:ascii="Times New Roman" w:hAnsi="Times New Roman" w:cs="Times New Roman" w:eastAsia="Times New Roman"/>
+        </w:rPr>
+        <w:t xml:space="preserve">made whole-genome low-coverage imputation tractable by storing the panel compactly, using dense bitmaps for frequent alleles and per-site carrier lists for the rare ones. QUILT2</w:t>
+      </w:r>
+      <w:hyperlink w:anchor="ref16">
+        <w:r>
+          <w:rPr>
+            <w:rFonts w:ascii="Times New Roman" w:hAnsi="Times New Roman" w:cs="Times New Roman" w:eastAsia="Times New Roman"/>
+            <w:color w:val="0563C1"/>
+            <w:vertAlign w:val="superscript"/>
+          </w:rPr>
+          <w:t xml:space="preserve">16</w:t>
+        </w:r>
+      </w:hyperlink>
+      <w:r>
+        <w:rPr>
+          <w:rFonts w:ascii="Times New Roman" w:hAnsi="Times New Roman" w:cs="Times New Roman" w:eastAsia="Times New Roman"/>
+        </w:rPr>
+        <w:t xml:space="preserve"> </w:t>
+      </w:r>
+      <w:r>
+        <w:rPr>
+          <w:rFonts w:ascii="Times New Roman" w:hAnsi="Times New Roman" w:cs="Times New Roman" w:eastAsia="Times New Roman"/>
+        </w:rPr>
+        <w:t xml:space="preserve">extended the PBWT with multi-symbol matching for application to diverse sequencing technologies. None of these tools, however, integrate phasing, imputation, panel preparation, indexing, and multi-format output in a single executable, nor do they perform whole-genome imputation in a single process against a single reference panel file.</w:t>
+      </w:r>
+    </w:p>
+    <w:p>
+      <w:pPr>
+        <w:pStyle w:val="BodyText"/>
+        <w:jc w:val="both"/>
+      </w:pPr>
+      <w:r>
+        <w:rPr>
+          <w:rFonts w:ascii="Times New Roman" w:hAnsi="Times New Roman" w:cs="Times New Roman" w:eastAsia="Times New Roman"/>
+        </w:rPr>
+        <w:t xml:space="preserve">Here we present Selphi 2, a complete reimplementation of the Selphi algorithm in Rust that keeps Selphi 1's long-range, match-accumulating PBWT selection but now runs it within large overlapping windows (default 80 cM) instead of one whole-chromosome pass, which removes the dominant runtime bottleneck of Selphi 1, while resolving the workflow limitations above. Phasing is integrated through two engines: a diploid genotype-graph engine with MCMC sampling, used by default for all inputs, and a haploid composite-HMM engine selectable for chip arrays; pre-phased input is no longer required. Whole-genome imputation is performed in a single command against a single multi-chromosome reference panel file, with the next chromosome's data prefetched during the current chromosome's HMM computation, eliminating per-chromosome file splitting and output concatenation. The number of reference haplotypes retained per target is set by a panel-adaptive sizing formula derived from the reference panel size and the haplotype-pattern diversity of the panel; on admixed cohorts imputed against biobank-scale panels this preserves rare-variant accuracy that a fixed candidate-set size loses by retaining too few rare-allele-carrying haplotypes from minority ancestries. The Rust reimplementation, with a streaming sparse panel format that bounds peak memory below 500 MB during panel construction independently of panel size, reduces both wall time and peak memory relative to Selphi 1 (Results). Output is written to one or more of five formats from a single interpolation pass: VCF.gz, BCF 2.2, Apache Parquet, PLINK2 PGEN with dosage, and SelfDecode per-sample Parquet archives. Figure 1 gives an overview of the full pipeline.</w:t>
+      </w:r>
+    </w:p>
+    <w:p>
+      <w:pPr>
+        <w:pStyle w:val="BodyText"/>
+        <w:jc w:val="both"/>
+      </w:pPr>
+      <w:r>
+        <w:rPr>
+          <w:rFonts w:ascii="Times New Roman" w:hAnsi="Times New Roman" w:cs="Times New Roman" w:eastAsia="Times New Roman"/>
+        </w:rPr>
+        <w:t xml:space="preserve">Selphi 2 further provides a dedicated low-coverage sequencing engine (</w:t>
+      </w:r>
+      <w:r>
+        <w:rPr>
+          <w:rFonts w:ascii="Times New Roman" w:hAnsi="Times New Roman" w:cs="Times New Roman" w:eastAsia="Times New Roman"/>
+          <w:rStyle w:val="VerbatimChar"/>
+        </w:rPr>
+        <w:t xml:space="preserve">--lcwgs</w:t>
+      </w:r>
+      <w:r>
+        <w:rPr>
+          <w:rFonts w:ascii="Times New Roman" w:hAnsi="Times New Roman" w:cs="Times New Roman" w:eastAsia="Times New Roman"/>
+        </w:rPr>
+        <w:t xml:space="preserve">) in the same binary, applying a genotype-likelihood-aware Li-Stephens model to soft-called sequencing input, so that array and low-coverage-sequencing imputation are served by one tool. In this paper, we describe the algorithmic components of Selphi 2 (Methods), benchmark its imputation accuracy and resource consumption against Selphi 1</w:t>
+      </w:r>
+      <w:hyperlink w:anchor="ref12">
+        <w:r>
+          <w:rPr>
+            <w:rFonts w:ascii="Times New Roman" w:hAnsi="Times New Roman" w:cs="Times New Roman" w:eastAsia="Times New Roman"/>
+            <w:color w:val="0563C1"/>
+            <w:vertAlign w:val="superscript"/>
+          </w:rPr>
+          <w:t xml:space="preserve">12</w:t>
+        </w:r>
+      </w:hyperlink>
+      <w:r>
+        <w:rPr>
+          <w:rFonts w:ascii="Times New Roman" w:hAnsi="Times New Roman" w:cs="Times New Roman" w:eastAsia="Times New Roman"/>
+        </w:rPr>
+        <w:t xml:space="preserve"> </w:t>
+      </w:r>
+      <w:r>
+        <w:rPr>
+          <w:rFonts w:ascii="Times New Roman" w:hAnsi="Times New Roman" w:cs="Times New Roman" w:eastAsia="Times New Roman"/>
+        </w:rPr>
+        <w:t xml:space="preserve">and Beagle 5.5</w:t>
+      </w:r>
+      <w:hyperlink w:anchor="ref5">
+        <w:r>
+          <w:rPr>
+            <w:rFonts w:ascii="Times New Roman" w:hAnsi="Times New Roman" w:cs="Times New Roman" w:eastAsia="Times New Roman"/>
+            <w:color w:val="0563C1"/>
+            <w:vertAlign w:val="superscript"/>
+          </w:rPr>
+          <w:t xml:space="preserve">5</w:t>
+        </w:r>
+      </w:hyperlink>
+      <w:r>
+        <w:rPr>
+          <w:rFonts w:ascii="Times New Roman" w:hAnsi="Times New Roman" w:cs="Times New Roman" w:eastAsia="Times New Roman"/>
+        </w:rPr>
+        <w:t xml:space="preserve"> </w:t>
+      </w:r>
+      <w:r>
+        <w:rPr>
+          <w:rFonts w:ascii="Times New Roman" w:hAnsi="Times New Roman" w:cs="Times New Roman" w:eastAsia="Times New Roman"/>
+        </w:rPr>
+        <w:t xml:space="preserve">on the 1000 Genomes Project</w:t>
       </w:r>
       <w:hyperlink w:anchor="ref13">
         <w:r>
@@ -580,63 +811,13 @@
         <w:rPr>
           <w:rFonts w:ascii="Times New Roman" w:hAnsi="Times New Roman" w:cs="Times New Roman" w:eastAsia="Times New Roman"/>
         </w:rPr>
-        <w:t xml:space="preserve">) with external writers. Each handoff requires intermediate files, shell glue, and per-chromosome bookkeeping. Beagle 5.5</w:t>
-      </w:r>
-      <w:hyperlink w:anchor="ref7">
-        <w:r>
-          <w:rPr>
-            <w:rFonts w:ascii="Times New Roman" w:hAnsi="Times New Roman" w:cs="Times New Roman" w:eastAsia="Times New Roman"/>
-            <w:color w:val="0563C1"/>
-            <w:vertAlign w:val="superscript"/>
-          </w:rPr>
-          <w:t xml:space="preserve">7</w:t>
-        </w:r>
-      </w:hyperlink>
-      <w:r>
-        <w:rPr>
-          <w:rFonts w:ascii="Times New Roman" w:hAnsi="Times New Roman" w:cs="Times New Roman" w:eastAsia="Times New Roman"/>
-        </w:rPr>
-        <w:t xml:space="preserve"> </w:t>
-      </w:r>
-      <w:r>
-        <w:rPr>
-          <w:rFonts w:ascii="Times New Roman" w:hAnsi="Times New Roman" w:cs="Times New Roman" w:eastAsia="Times New Roman"/>
-        </w:rPr>
-        <w:t xml:space="preserve">integrates phasing and imputation in a single Java process, mitigating some of this fragmentation, but the genome is still processed one chromosome at a time and the output is restricted to VCF.</w:t>
-      </w:r>
-    </w:p>
-    <w:p>
-      <w:pPr>
-        <w:pStyle w:val="BodyText"/>
-        <w:jc w:val="both"/>
-      </w:pPr>
-      <w:r>
-        <w:rPr>
-          <w:rFonts w:ascii="Times New Roman" w:hAnsi="Times New Roman" w:cs="Times New Roman" w:eastAsia="Times New Roman"/>
-        </w:rPr>
-        <w:t xml:space="preserve">The original Selphi</w:t>
-      </w:r>
-      <w:hyperlink w:anchor="ref1">
-        <w:r>
-          <w:rPr>
-            <w:rFonts w:ascii="Times New Roman" w:hAnsi="Times New Roman" w:cs="Times New Roman" w:eastAsia="Times New Roman"/>
-            <w:color w:val="0563C1"/>
-            <w:vertAlign w:val="superscript"/>
-          </w:rPr>
-          <w:t xml:space="preserve">1</w:t>
-        </w:r>
-      </w:hyperlink>
-      <w:r>
-        <w:rPr>
-          <w:rFonts w:ascii="Times New Roman" w:hAnsi="Times New Roman" w:cs="Times New Roman" w:eastAsia="Times New Roman"/>
-        </w:rPr>
-        <w:t xml:space="preserve"> </w:t>
-      </w:r>
-      <w:r>
-        <w:rPr>
-          <w:rFonts w:ascii="Times New Roman" w:hAnsi="Times New Roman" w:cs="Times New Roman" w:eastAsia="Times New Roman"/>
-        </w:rPr>
-        <w:t xml:space="preserve">targeted a different limitation: the short matching range of the sliding-window and chunked PBWT scans used by other tools. Instead of restarting the PBWT within local windows, Selphi 1 ran it across the entire chromosome and summed match evidence along the whole scan, which raised rare-variant accuracy above Beagle 5.4, IMPUTE5, and Minimac4 on both the 1000 Genomes Project</w:t>
+        <w:t xml:space="preserve"> </w:t>
+      </w:r>
+      <w:r>
+        <w:rPr>
+          <w:rFonts w:ascii="Times New Roman" w:hAnsi="Times New Roman" w:cs="Times New Roman" w:eastAsia="Times New Roman"/>
+        </w:rPr>
+        <w:t xml:space="preserve">and the TOPMed</w:t>
       </w:r>
       <w:hyperlink w:anchor="ref14">
         <w:r>
@@ -658,7 +839,29 @@
         <w:rPr>
           <w:rFonts w:ascii="Times New Roman" w:hAnsi="Times New Roman" w:cs="Times New Roman" w:eastAsia="Times New Roman"/>
         </w:rPr>
-        <w:t xml:space="preserve">and TOPMed</w:t>
+        <w:t xml:space="preserve">reference panels, compare its phasing accuracy against SHAPEIT5</w:t>
+      </w:r>
+      <w:hyperlink w:anchor="ref9">
+        <w:r>
+          <w:rPr>
+            <w:rFonts w:ascii="Times New Roman" w:hAnsi="Times New Roman" w:cs="Times New Roman" w:eastAsia="Times New Roman"/>
+            <w:color w:val="0563C1"/>
+            <w:vertAlign w:val="superscript"/>
+          </w:rPr>
+          <w:t xml:space="preserve">9</w:t>
+        </w:r>
+      </w:hyperlink>
+      <w:r>
+        <w:rPr>
+          <w:rFonts w:ascii="Times New Roman" w:hAnsi="Times New Roman" w:cs="Times New Roman" w:eastAsia="Times New Roman"/>
+        </w:rPr>
+        <w:t xml:space="preserve"> </w:t>
+      </w:r>
+      <w:r>
+        <w:rPr>
+          <w:rFonts w:ascii="Times New Roman" w:hAnsi="Times New Roman" w:cs="Times New Roman" w:eastAsia="Times New Roman"/>
+        </w:rPr>
+        <w:t xml:space="preserve">on the 1000 Genomes trio dataset, and compare its low-coverage engine against GLIMPSE2</w:t>
       </w:r>
       <w:hyperlink w:anchor="ref15">
         <w:r>
@@ -668,285 +871,6 @@
             <w:vertAlign w:val="superscript"/>
           </w:rPr>
           <w:t xml:space="preserve">15</w:t>
-        </w:r>
-      </w:hyperlink>
-      <w:r>
-        <w:rPr>
-          <w:rFonts w:ascii="Times New Roman" w:hAnsi="Times New Roman" w:cs="Times New Roman" w:eastAsia="Times New Roman"/>
-        </w:rPr>
-        <w:t xml:space="preserve"> </w:t>
-      </w:r>
-      <w:r>
-        <w:rPr>
-          <w:rFonts w:ascii="Times New Roman" w:hAnsi="Times New Roman" w:cs="Times New Roman" w:eastAsia="Times New Roman"/>
-        </w:rPr>
-        <w:t xml:space="preserve">panels. However, Selphi 1 was implemented in Python with Numba-JIT-compiled inner loops, required pre-phased input, processed one chromosome at a time, and capped the per-target retained haplotype set at</w:t>
-      </w:r>
-      <w:r>
-        <w:rPr>
-          <w:rFonts w:ascii="Times New Roman" w:hAnsi="Times New Roman" w:cs="Times New Roman" w:eastAsia="Times New Roman"/>
-        </w:rPr>
-        <w:t xml:space="preserve"> </w:t>
-      </w:r>
-      <m:oMath>
-        <m:sSub>
-          <m:e>
-            <m:r>
-              <m:t>K</m:t>
-            </m:r>
-          </m:e>
-          <m:sub>
-            <m:r>
-              <m:t>2</m:t>
-            </m:r>
-          </m:sub>
-        </m:sSub>
-      </m:oMath>
-      <w:r>
-        <w:rPr>
-          <w:rFonts w:ascii="Times New Roman" w:hAnsi="Times New Roman" w:cs="Times New Roman" w:eastAsia="Times New Roman"/>
-        </w:rPr>
-        <w:t xml:space="preserve"> </w:t>
-      </w:r>
-      <w:r>
-        <w:rPr>
-          <w:rFonts w:ascii="Times New Roman" w:hAnsi="Times New Roman" w:cs="Times New Roman" w:eastAsia="Times New Roman"/>
-        </w:rPr>
-        <w:t xml:space="preserve">= 60, a cap calibrated on the 1000 Genomes Phase 3 panel (4,802 haplotypes; 1.2% retained) that, when applied to biobank-scale panels such as TOPMed (171,054 haplotypes; 0.04% retained), systematically excluded rare-variant carriers from minority sub-populations, eroding accuracy on admixed cohorts.</w:t>
-      </w:r>
-    </w:p>
-    <w:p>
-      <w:pPr>
-        <w:pStyle w:val="BodyText"/>
-        <w:jc w:val="both"/>
-      </w:pPr>
-      <w:r>
-        <w:rPr>
-          <w:rFonts w:ascii="Times New Roman" w:hAnsi="Times New Roman" w:cs="Times New Roman" w:eastAsia="Times New Roman"/>
-        </w:rPr>
-        <w:t xml:space="preserve">Recent methodological advances have addressed some of these challenges in isolation. SHAPEIT5</w:t>
-      </w:r>
-      <w:hyperlink w:anchor="ref11">
-        <w:r>
-          <w:rPr>
-            <w:rFonts w:ascii="Times New Roman" w:hAnsi="Times New Roman" w:cs="Times New Roman" w:eastAsia="Times New Roman"/>
-            <w:color w:val="0563C1"/>
-            <w:vertAlign w:val="superscript"/>
-          </w:rPr>
-          <w:t xml:space="preserve">11</w:t>
-        </w:r>
-      </w:hyperlink>
-      <w:r>
-        <w:rPr>
-          <w:rFonts w:ascii="Times New Roman" w:hAnsi="Times New Roman" w:cs="Times New Roman" w:eastAsia="Times New Roman"/>
-        </w:rPr>
-        <w:t xml:space="preserve"> </w:t>
-      </w:r>
-      <w:r>
-        <w:rPr>
-          <w:rFonts w:ascii="Times New Roman" w:hAnsi="Times New Roman" w:cs="Times New Roman" w:eastAsia="Times New Roman"/>
-        </w:rPr>
-        <w:t xml:space="preserve">cut low-frequency switch-error rates in large cohorts by splitting phasing into two passes: a confident backbone built from common variants, onto which rare alleles are then placed one at a time. GLIMPSE2</w:t>
-      </w:r>
-      <w:hyperlink w:anchor="ref2">
-        <w:r>
-          <w:rPr>
-            <w:rFonts w:ascii="Times New Roman" w:hAnsi="Times New Roman" w:cs="Times New Roman" w:eastAsia="Times New Roman"/>
-            <w:color w:val="0563C1"/>
-            <w:vertAlign w:val="superscript"/>
-          </w:rPr>
-          <w:t xml:space="preserve">2</w:t>
-        </w:r>
-      </w:hyperlink>
-      <w:r>
-        <w:rPr>
-          <w:rFonts w:ascii="Times New Roman" w:hAnsi="Times New Roman" w:cs="Times New Roman" w:eastAsia="Times New Roman"/>
-        </w:rPr>
-        <w:t xml:space="preserve"> </w:t>
-      </w:r>
-      <w:r>
-        <w:rPr>
-          <w:rFonts w:ascii="Times New Roman" w:hAnsi="Times New Roman" w:cs="Times New Roman" w:eastAsia="Times New Roman"/>
-        </w:rPr>
-        <w:t xml:space="preserve">made whole-genome low-coverage imputation tractable by storing the panel compactly, using dense bitmaps for frequent alleles and per-site carrier lists for the rare ones. QUILT2</w:t>
-      </w:r>
-      <w:hyperlink w:anchor="ref16">
-        <w:r>
-          <w:rPr>
-            <w:rFonts w:ascii="Times New Roman" w:hAnsi="Times New Roman" w:cs="Times New Roman" w:eastAsia="Times New Roman"/>
-            <w:color w:val="0563C1"/>
-            <w:vertAlign w:val="superscript"/>
-          </w:rPr>
-          <w:t xml:space="preserve">16</w:t>
-        </w:r>
-      </w:hyperlink>
-      <w:r>
-        <w:rPr>
-          <w:rFonts w:ascii="Times New Roman" w:hAnsi="Times New Roman" w:cs="Times New Roman" w:eastAsia="Times New Roman"/>
-        </w:rPr>
-        <w:t xml:space="preserve"> </w:t>
-      </w:r>
-      <w:r>
-        <w:rPr>
-          <w:rFonts w:ascii="Times New Roman" w:hAnsi="Times New Roman" w:cs="Times New Roman" w:eastAsia="Times New Roman"/>
-        </w:rPr>
-        <w:t xml:space="preserve">extended the PBWT with multi-symbol matching for application to diverse sequencing technologies. None of these tools, however, integrate phasing, imputation, panel preparation, indexing, and multi-format output in a single executable, nor do they perform whole-genome imputation in a single process against a single reference panel file.</w:t>
-      </w:r>
-    </w:p>
-    <w:p>
-      <w:pPr>
-        <w:pStyle w:val="BodyText"/>
-        <w:jc w:val="both"/>
-      </w:pPr>
-      <w:r>
-        <w:rPr>
-          <w:rFonts w:ascii="Times New Roman" w:hAnsi="Times New Roman" w:cs="Times New Roman" w:eastAsia="Times New Roman"/>
-        </w:rPr>
-        <w:t xml:space="preserve">Here we present Selphi 2, a complete reimplementation of the Selphi algorithm in Rust that keeps Selphi 1's long-range, match-accumulating PBWT selection but now runs it within large overlapping windows (default 80 cM) instead of one whole-chromosome pass, which removes the dominant runtime bottleneck of Selphi 1, while resolving the workflow limitations above. Phasing is integrated through two engines: a diploid genotype-graph engine with MCMC sampling, used by default for all inputs, and a haploid composite-HMM engine selectable for chip arrays; pre-phased input is no longer required. Whole-genome imputation is performed in a single command against a single multi-chromosome reference panel file, with the next chromosome's data prefetched during the current chromosome's HMM computation, eliminating per-chromosome file splitting and output concatenation. The fixed per-target candidate-set cap of Selphi 1 is replaced by a panel-adaptive sizing formula derived from the reference panel size and the haplotype-pattern diversity of the panel, recovering the rare-variant accuracy that the fixed cap forfeited on admixed cohorts against biobank-scale panels. The Rust reimplementation, with a streaming sparse panel format that bounds peak memory below 500 MB during panel construction independently of panel size, reduces both wall time and peak memory relative to Selphi 1 (Results). Output is written to one or more of five formats from a single interpolation pass: VCF.gz, BCF 2.2, Apache Parquet, PLINK2 PGEN with dosage, and SelfDecode per-sample Parquet archives. Figure 1 gives an overview of the full pipeline.</w:t>
-      </w:r>
-    </w:p>
-    <w:p>
-      <w:pPr>
-        <w:pStyle w:val="BodyText"/>
-        <w:jc w:val="both"/>
-      </w:pPr>
-      <w:r>
-        <w:rPr>
-          <w:rFonts w:ascii="Times New Roman" w:hAnsi="Times New Roman" w:cs="Times New Roman" w:eastAsia="Times New Roman"/>
-        </w:rPr>
-        <w:t xml:space="preserve">Selphi 2 further provides a dedicated low-coverage sequencing engine (</w:t>
-      </w:r>
-      <w:r>
-        <w:rPr>
-          <w:rFonts w:ascii="Times New Roman" w:hAnsi="Times New Roman" w:cs="Times New Roman" w:eastAsia="Times New Roman"/>
-          <w:rStyle w:val="VerbatimChar"/>
-        </w:rPr>
-        <w:t xml:space="preserve">--lcwgs</w:t>
-      </w:r>
-      <w:r>
-        <w:rPr>
-          <w:rFonts w:ascii="Times New Roman" w:hAnsi="Times New Roman" w:cs="Times New Roman" w:eastAsia="Times New Roman"/>
-        </w:rPr>
-        <w:t xml:space="preserve">) in the same binary, applying a genotype-likelihood-aware Li-Stephens model to soft-called sequencing input, so that array and low-coverage-sequencing imputation are served by one tool. In this paper, we describe the algorithmic components of Selphi 2 (Methods), benchmark its imputation accuracy and resource consumption against Selphi 1</w:t>
-      </w:r>
-      <w:hyperlink w:anchor="ref1">
-        <w:r>
-          <w:rPr>
-            <w:rFonts w:ascii="Times New Roman" w:hAnsi="Times New Roman" w:cs="Times New Roman" w:eastAsia="Times New Roman"/>
-            <w:color w:val="0563C1"/>
-            <w:vertAlign w:val="superscript"/>
-          </w:rPr>
-          <w:t xml:space="preserve">1</w:t>
-        </w:r>
-      </w:hyperlink>
-      <w:r>
-        <w:rPr>
-          <w:rFonts w:ascii="Times New Roman" w:hAnsi="Times New Roman" w:cs="Times New Roman" w:eastAsia="Times New Roman"/>
-        </w:rPr>
-        <w:t xml:space="preserve"> </w:t>
-      </w:r>
-      <w:r>
-        <w:rPr>
-          <w:rFonts w:ascii="Times New Roman" w:hAnsi="Times New Roman" w:cs="Times New Roman" w:eastAsia="Times New Roman"/>
-        </w:rPr>
-        <w:t xml:space="preserve">and Beagle 5.5</w:t>
-      </w:r>
-      <w:hyperlink w:anchor="ref7">
-        <w:r>
-          <w:rPr>
-            <w:rFonts w:ascii="Times New Roman" w:hAnsi="Times New Roman" w:cs="Times New Roman" w:eastAsia="Times New Roman"/>
-            <w:color w:val="0563C1"/>
-            <w:vertAlign w:val="superscript"/>
-          </w:rPr>
-          <w:t xml:space="preserve">7</w:t>
-        </w:r>
-      </w:hyperlink>
-      <w:r>
-        <w:rPr>
-          <w:rFonts w:ascii="Times New Roman" w:hAnsi="Times New Roman" w:cs="Times New Roman" w:eastAsia="Times New Roman"/>
-        </w:rPr>
-        <w:t xml:space="preserve"> </w:t>
-      </w:r>
-      <w:r>
-        <w:rPr>
-          <w:rFonts w:ascii="Times New Roman" w:hAnsi="Times New Roman" w:cs="Times New Roman" w:eastAsia="Times New Roman"/>
-        </w:rPr>
-        <w:t xml:space="preserve">on the 1000 Genomes Project</w:t>
-      </w:r>
-      <w:hyperlink w:anchor="ref14">
-        <w:r>
-          <w:rPr>
-            <w:rFonts w:ascii="Times New Roman" w:hAnsi="Times New Roman" w:cs="Times New Roman" w:eastAsia="Times New Roman"/>
-            <w:color w:val="0563C1"/>
-            <w:vertAlign w:val="superscript"/>
-          </w:rPr>
-          <w:t xml:space="preserve">14</w:t>
-        </w:r>
-      </w:hyperlink>
-      <w:r>
-        <w:rPr>
-          <w:rFonts w:ascii="Times New Roman" w:hAnsi="Times New Roman" w:cs="Times New Roman" w:eastAsia="Times New Roman"/>
-        </w:rPr>
-        <w:t xml:space="preserve"> </w:t>
-      </w:r>
-      <w:r>
-        <w:rPr>
-          <w:rFonts w:ascii="Times New Roman" w:hAnsi="Times New Roman" w:cs="Times New Roman" w:eastAsia="Times New Roman"/>
-        </w:rPr>
-        <w:t xml:space="preserve">and the TOPMed</w:t>
-      </w:r>
-      <w:hyperlink w:anchor="ref15">
-        <w:r>
-          <w:rPr>
-            <w:rFonts w:ascii="Times New Roman" w:hAnsi="Times New Roman" w:cs="Times New Roman" w:eastAsia="Times New Roman"/>
-            <w:color w:val="0563C1"/>
-            <w:vertAlign w:val="superscript"/>
-          </w:rPr>
-          <w:t xml:space="preserve">15</w:t>
-        </w:r>
-      </w:hyperlink>
-      <w:r>
-        <w:rPr>
-          <w:rFonts w:ascii="Times New Roman" w:hAnsi="Times New Roman" w:cs="Times New Roman" w:eastAsia="Times New Roman"/>
-        </w:rPr>
-        <w:t xml:space="preserve"> </w:t>
-      </w:r>
-      <w:r>
-        <w:rPr>
-          <w:rFonts w:ascii="Times New Roman" w:hAnsi="Times New Roman" w:cs="Times New Roman" w:eastAsia="Times New Roman"/>
-        </w:rPr>
-        <w:t xml:space="preserve">reference panels, compare its phasing accuracy against SHAPEIT5</w:t>
-      </w:r>
-      <w:hyperlink w:anchor="ref11">
-        <w:r>
-          <w:rPr>
-            <w:rFonts w:ascii="Times New Roman" w:hAnsi="Times New Roman" w:cs="Times New Roman" w:eastAsia="Times New Roman"/>
-            <w:color w:val="0563C1"/>
-            <w:vertAlign w:val="superscript"/>
-          </w:rPr>
-          <w:t xml:space="preserve">11</w:t>
-        </w:r>
-      </w:hyperlink>
-      <w:r>
-        <w:rPr>
-          <w:rFonts w:ascii="Times New Roman" w:hAnsi="Times New Roman" w:cs="Times New Roman" w:eastAsia="Times New Roman"/>
-        </w:rPr>
-        <w:t xml:space="preserve"> </w:t>
-      </w:r>
-      <w:r>
-        <w:rPr>
-          <w:rFonts w:ascii="Times New Roman" w:hAnsi="Times New Roman" w:cs="Times New Roman" w:eastAsia="Times New Roman"/>
-        </w:rPr>
-        <w:t xml:space="preserve">on the 1000 Genomes trio dataset, and compare its low-coverage engine against GLIMPSE2</w:t>
-      </w:r>
-      <w:hyperlink w:anchor="ref2">
-        <w:r>
-          <w:rPr>
-            <w:rFonts w:ascii="Times New Roman" w:hAnsi="Times New Roman" w:cs="Times New Roman" w:eastAsia="Times New Roman"/>
-            <w:color w:val="0563C1"/>
-            <w:vertAlign w:val="superscript"/>
-          </w:rPr>
-          <w:t xml:space="preserve">2</w:t>
         </w:r>
       </w:hyperlink>
       <w:r>
@@ -1383,14 +1307,14 @@
         </w:rPr>
         <w:t xml:space="preserve">At each iteration, a coded-step PBWT</w:t>
       </w:r>
-      <w:hyperlink w:anchor="ref6">
+      <w:hyperlink w:anchor="ref4">
         <w:r>
           <w:rPr>
             <w:rFonts w:ascii="Times New Roman" w:hAnsi="Times New Roman" w:cs="Times New Roman" w:eastAsia="Times New Roman"/>
             <w:color w:val="0563C1"/>
             <w:vertAlign w:val="superscript"/>
           </w:rPr>
-          <w:t xml:space="preserve">6</w:t>
+          <w:t xml:space="preserve">4</w:t>
         </w:r>
       </w:hyperlink>
       <w:r>
@@ -1405,14 +1329,14 @@
         </w:rPr>
         <w:t xml:space="preserve">is constructed on the combined reference and target haplotypes, restricted to the set of shared variants. Steps are defined at fixed genetic-distance intervals, with an adaptive step scale: fine steps (scale 1.0, approximately 10 SNPs per step) in early iterations when phasing is uncertain, and coarse steps (scale 3.0, approximately 30 SNPs per step) in later iterations when the phase scaffold is established. This two-resolution strategy is analogous to the common-then-rare phasing approach used in SHAPEIT5</w:t>
       </w:r>
-      <w:hyperlink w:anchor="ref11">
+      <w:hyperlink w:anchor="ref9">
         <w:r>
           <w:rPr>
             <w:rFonts w:ascii="Times New Roman" w:hAnsi="Times New Roman" w:cs="Times New Roman" w:eastAsia="Times New Roman"/>
             <w:color w:val="0563C1"/>
             <w:vertAlign w:val="superscript"/>
           </w:rPr>
-          <w:t xml:space="preserve">11</w:t>
+          <w:t xml:space="preserve">9</w:t>
         </w:r>
       </w:hyperlink>
       <w:r>
@@ -1527,14 +1451,14 @@
         </w:rPr>
         <w:t xml:space="preserve">and SHAPEIT5</w:t>
       </w:r>
-      <w:hyperlink w:anchor="ref11">
+      <w:hyperlink w:anchor="ref9">
         <w:r>
           <w:rPr>
             <w:rFonts w:ascii="Times New Roman" w:hAnsi="Times New Roman" w:cs="Times New Roman" w:eastAsia="Times New Roman"/>
             <w:color w:val="0563C1"/>
             <w:vertAlign w:val="superscript"/>
           </w:rPr>
-          <w:t xml:space="preserve">11</w:t>
+          <w:t xml:space="preserve">9</w:t>
         </w:r>
       </w:hyperlink>
       <w:r>
@@ -1733,14 +1657,14 @@
         </w:rPr>
         <w:t xml:space="preserve">through the Li-Stephens approximation</w:t>
       </w:r>
-      <w:hyperlink w:anchor="ref4">
+      <w:hyperlink w:anchor="ref2">
         <w:r>
           <w:rPr>
             <w:rFonts w:ascii="Times New Roman" w:hAnsi="Times New Roman" w:cs="Times New Roman" w:eastAsia="Times New Roman"/>
             <w:color w:val="0563C1"/>
             <w:vertAlign w:val="superscript"/>
           </w:rPr>
-          <w:t xml:space="preserve">4</w:t>
+          <w:t xml:space="preserve">2</w:t>
         </w:r>
       </w:hyperlink>
       <w:r>
@@ -1945,14 +1869,14 @@
         </w:rPr>
         <w:t xml:space="preserve">Rare variants (those not in the common-variant scaffold) are phased in a dedicated PBWT-based pass that operates on target haplotypes only. This two-stage common-then-rare strategy parallels the approach introduced in SHAPEIT5</w:t>
       </w:r>
-      <w:hyperlink w:anchor="ref11">
+      <w:hyperlink w:anchor="ref9">
         <w:r>
           <w:rPr>
             <w:rFonts w:ascii="Times New Roman" w:hAnsi="Times New Roman" w:cs="Times New Roman" w:eastAsia="Times New Roman"/>
             <w:color w:val="0563C1"/>
             <w:vertAlign w:val="superscript"/>
           </w:rPr>
-          <w:t xml:space="preserve">11</w:t>
+          <w:t xml:space="preserve">9</w:t>
         </w:r>
       </w:hyperlink>
       <w:r>
@@ -2025,14 +1949,14 @@
         </w:rPr>
         <w:t xml:space="preserve">Fourth, singleton variants (MAC = 1 among targets) are phased using IBD segment lengths at the scaffold. For each sample, the run-length of consistent alleles on each haplotype is measured at scaffold sites as a proxy for the coalescent Viterbi IBD segment length. The singleton allele is assigned to the haplotype with the longer flanking IBD segment. This is analogous to the coalescent-based singleton phasing in SHAPEIT5</w:t>
       </w:r>
-      <w:hyperlink w:anchor="ref11">
+      <w:hyperlink w:anchor="ref9">
         <w:r>
           <w:rPr>
             <w:rFonts w:ascii="Times New Roman" w:hAnsi="Times New Roman" w:cs="Times New Roman" w:eastAsia="Times New Roman"/>
             <w:color w:val="0563C1"/>
             <w:vertAlign w:val="superscript"/>
           </w:rPr>
-          <w:t xml:space="preserve">11</w:t>
+          <w:t xml:space="preserve">9</w:t>
         </w:r>
       </w:hyperlink>
       <w:r>
@@ -2073,14 +1997,14 @@
         </w:rPr>
         <w:t xml:space="preserve">When pedigree information is available (PLINK PED format), Mendelian constraints from parent-child relationships are applied before the HMM-based phasing, following established practice</w:t>
       </w:r>
-      <w:hyperlink w:anchor="ref11">
+      <w:hyperlink w:anchor="ref9">
         <w:r>
           <w:rPr>
             <w:rFonts w:ascii="Times New Roman" w:hAnsi="Times New Roman" w:cs="Times New Roman" w:eastAsia="Times New Roman"/>
             <w:color w:val="0563C1"/>
             <w:vertAlign w:val="superscript"/>
           </w:rPr>
-          <w:t xml:space="preserve">11</w:t>
+          <w:t xml:space="preserve">9</w:t>
         </w:r>
       </w:hyperlink>
       <w:r>
@@ -2091,14 +2015,14 @@
         </w:rPr>
         <w:t xml:space="preserve">,</w:t>
       </w:r>
-      <w:hyperlink w:anchor="ref12">
+      <w:hyperlink w:anchor="ref10">
         <w:r>
           <w:rPr>
             <w:rFonts w:ascii="Times New Roman" w:hAnsi="Times New Roman" w:cs="Times New Roman" w:eastAsia="Times New Roman"/>
             <w:color w:val="0563C1"/>
             <w:vertAlign w:val="superscript"/>
           </w:rPr>
-          <w:t xml:space="preserve">12</w:t>
+          <w:t xml:space="preserve">10</w:t>
         </w:r>
       </w:hyperlink>
       <w:r>
@@ -2163,14 +2087,14 @@
         </w:rPr>
         <w:t xml:space="preserve">When no external reference panel is available, the same two phasing engines can phase a cohort against itself in a single command. The cohort haplotypes are used both as the target and as the conditioning set; engine selection follows the same variant-density rule (haploid for chip arrays, diploid for WGS). Output is written as a phased VCF/BCF and, optionally, as a Selphi SRP file or a BREF3</w:t>
       </w:r>
-      <w:hyperlink w:anchor="ref7">
+      <w:hyperlink w:anchor="ref5">
         <w:r>
           <w:rPr>
             <w:rFonts w:ascii="Times New Roman" w:hAnsi="Times New Roman" w:cs="Times New Roman" w:eastAsia="Times New Roman"/>
             <w:color w:val="0563C1"/>
             <w:vertAlign w:val="superscript"/>
           </w:rPr>
-          <w:t xml:space="preserve">7</w:t>
+          <w:t xml:space="preserve">5</w:t>
         </w:r>
       </w:hyperlink>
       <w:r>
@@ -2211,14 +2135,14 @@
         </w:rPr>
         <w:t xml:space="preserve">The imputation component uses a coded-step PBWT</w:t>
       </w:r>
-      <w:hyperlink w:anchor="ref6">
+      <w:hyperlink w:anchor="ref4">
         <w:r>
           <w:rPr>
             <w:rFonts w:ascii="Times New Roman" w:hAnsi="Times New Roman" w:cs="Times New Roman" w:eastAsia="Times New Roman"/>
             <w:color w:val="0563C1"/>
             <w:vertAlign w:val="superscript"/>
           </w:rPr>
-          <w:t xml:space="preserve">6</w:t>
+          <w:t xml:space="preserve">4</w:t>
         </w:r>
       </w:hyperlink>
       <w:r>
@@ -2322,14 +2246,14 @@
         </w:rPr>
         <w:t xml:space="preserve">A reduced array is constructed containing only the candidate haplotypes plus the target, and a PBWT forward-backward pass is run on this reduced array. The forward pass uses 32-bit floating-point arithmetic for 2x cache density and SIMD throughput; the backward pass uses 64-bit precision to maintain numerical stability in the recombination probability computation. The per-site recombination probability follows the standard Li-Stephens formulation</w:t>
       </w:r>
-      <w:hyperlink w:anchor="ref4">
+      <w:hyperlink w:anchor="ref2">
         <w:r>
           <w:rPr>
             <w:rFonts w:ascii="Times New Roman" w:hAnsi="Times New Roman" w:cs="Times New Roman" w:eastAsia="Times New Roman"/>
             <w:color w:val="0563C1"/>
             <w:vertAlign w:val="superscript"/>
           </w:rPr>
-          <w:t xml:space="preserve">4</w:t>
+          <w:t xml:space="preserve">2</w:t>
         </w:r>
       </w:hyperlink>
       <w:r>
@@ -2679,14 +2603,14 @@
         </w:rPr>
         <w:t xml:space="preserve">= 15,000 in Beagle</w:t>
       </w:r>
-      <w:hyperlink w:anchor="ref7">
+      <w:hyperlink w:anchor="ref5">
         <w:r>
           <w:rPr>
             <w:rFonts w:ascii="Times New Roman" w:hAnsi="Times New Roman" w:cs="Times New Roman" w:eastAsia="Times New Roman"/>
             <w:color w:val="0563C1"/>
             <w:vertAlign w:val="superscript"/>
           </w:rPr>
-          <w:t xml:space="preserve">7</w:t>
+          <w:t xml:space="preserve">5</w:t>
         </w:r>
       </w:hyperlink>
       <w:r>
@@ -2727,14 +2651,14 @@
         </w:rPr>
         <w:t xml:space="preserve">= 20,000 in IMPUTE5</w:t>
       </w:r>
-      <w:hyperlink w:anchor="ref6">
+      <w:hyperlink w:anchor="ref4">
         <w:r>
           <w:rPr>
             <w:rFonts w:ascii="Times New Roman" w:hAnsi="Times New Roman" w:cs="Times New Roman" w:eastAsia="Times New Roman"/>
             <w:color w:val="0563C1"/>
             <w:vertAlign w:val="superscript"/>
           </w:rPr>
-          <w:t xml:space="preserve">6</w:t>
+          <w:t xml:space="preserve">4</w:t>
         </w:r>
       </w:hyperlink>
       <w:r>
@@ -3454,7 +3378,19 @@
         <w:rPr>
           <w:rFonts w:ascii="Times New Roman" w:hAnsi="Times New Roman" w:cs="Times New Roman" w:eastAsia="Times New Roman"/>
         </w:rPr>
-        <w:t xml:space="preserve">, as used in earlier Selphi releases (</w:t>
+        <w:t xml:space="preserve"> </w:t>
+      </w:r>
+      <w:r>
+        <w:rPr>
+          <w:rFonts w:ascii="Times New Roman" w:hAnsi="Times New Roman" w:cs="Times New Roman" w:eastAsia="Times New Roman"/>
+        </w:rPr>
+        <w:t xml:space="preserve">(for example</w:t>
+      </w:r>
+      <w:r>
+        <w:rPr>
+          <w:rFonts w:ascii="Times New Roman" w:hAnsi="Times New Roman" w:cs="Times New Roman" w:eastAsia="Times New Roman"/>
+        </w:rPr>
+        <w:t xml:space="preserve"> </w:t>
       </w:r>
       <m:oMath>
         <m:sSub>
@@ -3492,23 +3428,7 @@
         <w:rPr>
           <w:rFonts w:ascii="Times New Roman" w:hAnsi="Times New Roman" w:cs="Times New Roman" w:eastAsia="Times New Roman"/>
         </w:rPr>
-        <w:t xml:space="preserve">)</w:t>
-      </w:r>
-      <w:hyperlink w:anchor="ref1">
-        <w:r>
-          <w:rPr>
-            <w:rFonts w:ascii="Times New Roman" w:hAnsi="Times New Roman" w:cs="Times New Roman" w:eastAsia="Times New Roman"/>
-            <w:color w:val="0563C1"/>
-            <w:vertAlign w:val="superscript"/>
-          </w:rPr>
-          <w:t xml:space="preserve">1</w:t>
-        </w:r>
-      </w:hyperlink>
-      <w:r>
-        <w:rPr>
-          <w:rFonts w:ascii="Times New Roman" w:hAnsi="Times New Roman" w:cs="Times New Roman" w:eastAsia="Times New Roman"/>
-        </w:rPr>
-        <w:t xml:space="preserve">, generates a panel-relative truncation rate that varies by two orders of magnitude across panels:</w:t>
+        <w:t xml:space="preserve">) generates a panel-relative truncation rate that varies by two orders of magnitude across panels:</w:t>
       </w:r>
       <w:r>
         <w:rPr>
@@ -4687,14 +4607,14 @@
         </w:rPr>
         <w:t xml:space="preserve">Between consecutive shared-variant positions (chip sites), imputed dosages at reference-panel-only positions are computed by linear interpolation of the HMM-derived haplotype weights, following the standard approach</w:t>
       </w:r>
-      <w:hyperlink w:anchor="ref6">
+      <w:hyperlink w:anchor="ref4">
         <w:r>
           <w:rPr>
             <w:rFonts w:ascii="Times New Roman" w:hAnsi="Times New Roman" w:cs="Times New Roman" w:eastAsia="Times New Roman"/>
             <w:color w:val="0563C1"/>
             <w:vertAlign w:val="superscript"/>
           </w:rPr>
-          <w:t xml:space="preserve">6</w:t>
+          <w:t xml:space="preserve">4</w:t>
         </w:r>
       </w:hyperlink>
       <w:r>
@@ -4705,14 +4625,14 @@
         </w:rPr>
         <w:t xml:space="preserve">,</w:t>
       </w:r>
-      <w:hyperlink w:anchor="ref9">
+      <w:hyperlink w:anchor="ref7">
         <w:r>
           <w:rPr>
             <w:rFonts w:ascii="Times New Roman" w:hAnsi="Times New Roman" w:cs="Times New Roman" w:eastAsia="Times New Roman"/>
             <w:color w:val="0563C1"/>
             <w:vertAlign w:val="superscript"/>
           </w:rPr>
-          <w:t xml:space="preserve">9</w:t>
+          <w:t xml:space="preserve">7</w:t>
         </w:r>
       </w:hyperlink>
       <w:r>
@@ -5483,14 +5403,14 @@
         </w:rPr>
         <w:t xml:space="preserve">, Apache Parquet (zstd-compressed, variant-major columnar layout), PLINK2 PGEN</w:t>
       </w:r>
-      <w:hyperlink w:anchor="ref13">
+      <w:hyperlink w:anchor="ref11">
         <w:r>
           <w:rPr>
             <w:rFonts w:ascii="Times New Roman" w:hAnsi="Times New Roman" w:cs="Times New Roman" w:eastAsia="Times New Roman"/>
             <w:color w:val="0563C1"/>
             <w:vertAlign w:val="superscript"/>
           </w:rPr>
-          <w:t xml:space="preserve">13</w:t>
+          <w:t xml:space="preserve">11</w:t>
         </w:r>
       </w:hyperlink>
       <w:r>
@@ -5589,14 +5509,14 @@
         </w:rPr>
         <w:t xml:space="preserve">, the genetic map, and the output writers, but replaces the hard-call HMM with a genotype-likelihood-aware Li-Stephens model. GLIMPSE2</w:t>
       </w:r>
-      <w:hyperlink w:anchor="ref2">
+      <w:hyperlink w:anchor="ref15">
         <w:r>
           <w:rPr>
             <w:rFonts w:ascii="Times New Roman" w:hAnsi="Times New Roman" w:cs="Times New Roman" w:eastAsia="Times New Roman"/>
             <w:color w:val="0563C1"/>
             <w:vertAlign w:val="superscript"/>
           </w:rPr>
-          <w:t xml:space="preserve">2</w:t>
+          <w:t xml:space="preserve">15</w:t>
         </w:r>
       </w:hyperlink>
       <w:r>
@@ -6376,14 +6296,14 @@
         </w:rPr>
         <w:t xml:space="preserve">SRP creation is fully streaming: source data (BCF, VCF, or BREF3</w:t>
       </w:r>
-      <w:hyperlink w:anchor="ref7">
+      <w:hyperlink w:anchor="ref5">
         <w:r>
           <w:rPr>
             <w:rFonts w:ascii="Times New Roman" w:hAnsi="Times New Roman" w:cs="Times New Roman" w:eastAsia="Times New Roman"/>
             <w:color w:val="0563C1"/>
             <w:vertAlign w:val="superscript"/>
           </w:rPr>
-          <w:t xml:space="preserve">7</w:t>
+          <w:t xml:space="preserve">5</w:t>
         </w:r>
       </w:hyperlink>
       <w:r>
@@ -6967,6 +6887,28 @@
         </w:rPr>
         <w:t xml:space="preserve">We evaluated Selphi 2 against Beagle 5.5 and the original Selphi 1.5.3 on three reference panels spanning two orders of magnitude in size: the 1000 Genomes Phase 3 panel</w:t>
       </w:r>
+      <w:hyperlink w:anchor="ref13">
+        <w:r>
+          <w:rPr>
+            <w:rFonts w:ascii="Times New Roman" w:hAnsi="Times New Roman" w:cs="Times New Roman" w:eastAsia="Times New Roman"/>
+            <w:color w:val="0563C1"/>
+            <w:vertAlign w:val="superscript"/>
+          </w:rPr>
+          <w:t xml:space="preserve">13</w:t>
+        </w:r>
+      </w:hyperlink>
+      <w:r>
+        <w:rPr>
+          <w:rFonts w:ascii="Times New Roman" w:hAnsi="Times New Roman" w:cs="Times New Roman" w:eastAsia="Times New Roman"/>
+        </w:rPr>
+        <w:t xml:space="preserve"> </w:t>
+      </w:r>
+      <w:r>
+        <w:rPr>
+          <w:rFonts w:ascii="Times New Roman" w:hAnsi="Times New Roman" w:cs="Times New Roman" w:eastAsia="Times New Roman"/>
+        </w:rPr>
+        <w:t xml:space="preserve">(4,802 haplotypes), the TOPMed Freeze 8 panel</w:t>
+      </w:r>
       <w:hyperlink w:anchor="ref14">
         <w:r>
           <w:rPr>
@@ -6975,28 +6917,6 @@
             <w:vertAlign w:val="superscript"/>
           </w:rPr>
           <w:t xml:space="preserve">14</w:t>
-        </w:r>
-      </w:hyperlink>
-      <w:r>
-        <w:rPr>
-          <w:rFonts w:ascii="Times New Roman" w:hAnsi="Times New Roman" w:cs="Times New Roman" w:eastAsia="Times New Roman"/>
-        </w:rPr>
-        <w:t xml:space="preserve"> </w:t>
-      </w:r>
-      <w:r>
-        <w:rPr>
-          <w:rFonts w:ascii="Times New Roman" w:hAnsi="Times New Roman" w:cs="Times New Roman" w:eastAsia="Times New Roman"/>
-        </w:rPr>
-        <w:t xml:space="preserve">(4,802 haplotypes), the TOPMed Freeze 8 panel</w:t>
-      </w:r>
-      <w:hyperlink w:anchor="ref15">
-        <w:r>
-          <w:rPr>
-            <w:rFonts w:ascii="Times New Roman" w:hAnsi="Times New Roman" w:cs="Times New Roman" w:eastAsia="Times New Roman"/>
-            <w:color w:val="0563C1"/>
-            <w:vertAlign w:val="superscript"/>
-          </w:rPr>
-          <w:t xml:space="preserve">15</w:t>
         </w:r>
       </w:hyperlink>
       <w:r>
@@ -9122,79 +9042,7 @@
         <w:rPr>
           <w:rFonts w:ascii="Times New Roman" w:hAnsi="Times New Roman" w:cs="Times New Roman" w:eastAsia="Times New Roman"/>
         </w:rPr>
-        <w:t xml:space="preserve">The Selphi 1 candidate-set cap of</w:t>
-      </w:r>
-      <w:r>
-        <w:rPr>
-          <w:rFonts w:ascii="Times New Roman" w:hAnsi="Times New Roman" w:cs="Times New Roman" w:eastAsia="Times New Roman"/>
-        </w:rPr>
-        <w:t xml:space="preserve"> </w:t>
-      </w:r>
-      <m:oMath>
-        <m:sSub>
-          <m:e>
-            <m:r>
-              <m:t>K</m:t>
-            </m:r>
-          </m:e>
-          <m:sub>
-            <m:r>
-              <m:t>2</m:t>
-            </m:r>
-          </m:sub>
-        </m:sSub>
-      </m:oMath>
-      <w:r>
-        <w:rPr>
-          <w:rFonts w:ascii="Times New Roman" w:hAnsi="Times New Roman" w:cs="Times New Roman" w:eastAsia="Times New Roman"/>
-        </w:rPr>
-        <w:t xml:space="preserve"> </w:t>
-      </w:r>
-      <w:r>
-        <w:rPr>
-          <w:rFonts w:ascii="Times New Roman" w:hAnsi="Times New Roman" w:cs="Times New Roman" w:eastAsia="Times New Roman"/>
-        </w:rPr>
-        <w:t xml:space="preserve">= 60 was calibrated on the 1000 Genomes Phase 3 panel (retaining 1.2% of the panel). When the panel grows to TOPMed-scale (171,054 haplotypes), the same cap retains 0.04% of the panel and systematically excludes haplotypes that carry rare alleles in minority sub-populations. We tested this hypothesis on the MESA cohort</w:t>
-      </w:r>
-      <w:hyperlink w:anchor="ref27">
-        <w:r>
-          <w:rPr>
-            <w:rFonts w:ascii="Times New Roman" w:hAnsi="Times New Roman" w:cs="Times New Roman" w:eastAsia="Times New Roman"/>
-            <w:color w:val="0563C1"/>
-            <w:vertAlign w:val="superscript"/>
-          </w:rPr>
-          <w:t xml:space="preserve">27</w:t>
-        </w:r>
-      </w:hyperlink>
-      <w:r>
-        <w:rPr>
-          <w:rFonts w:ascii="Times New Roman" w:hAnsi="Times New Roman" w:cs="Times New Roman" w:eastAsia="Times New Roman"/>
-        </w:rPr>
-        <w:t xml:space="preserve"> </w:t>
-      </w:r>
-      <w:r>
-        <w:rPr>
-          <w:rFonts w:ascii="Times New Roman" w:hAnsi="Times New Roman" w:cs="Times New Roman" w:eastAsia="Times New Roman"/>
-        </w:rPr>
-        <w:t xml:space="preserve">(5,000 multi-ethnic samples, chip-array genotyped) imputed against the TOPMed Freeze 8 panel (chr20, 17.9 million variants). The cohort is admixed (African, Hispanic, Asian, and European sub-populations) and is fully held out from TOPMed.</w:t>
-      </w:r>
-    </w:p>
-    <w:p>
-      <w:pPr>
-        <w:pStyle w:val="BodyText"/>
-        <w:jc w:val="both"/>
-      </w:pPr>
-      <w:r>
-        <w:rPr>
-          <w:rFonts w:ascii="Times New Roman" w:hAnsi="Times New Roman" w:cs="Times New Roman" w:eastAsia="Times New Roman"/>
-        </w:rPr>
-        <w:t xml:space="preserve">Selphi 2's panel-adaptive sizing formula (Methods, Candidate selection and HMM) yields</w:t>
-      </w:r>
-      <w:r>
-        <w:rPr>
-          <w:rFonts w:ascii="Times New Roman" w:hAnsi="Times New Roman" w:cs="Times New Roman" w:eastAsia="Times New Roman"/>
-        </w:rPr>
-        <w:t xml:space="preserve"> </w:t>
+        <w:t xml:space="preserve">A fixed per-target candidate-set size retains a panel-relative fraction that shrinks sharply as the panel grows, so a size adequate for a small panel retains only a small fraction of a biobank-scale panel (</w:t>
       </w:r>
       <m:oMath>
         <m:sSub>
@@ -9220,6 +9068,72 @@
         <w:rPr>
           <w:rFonts w:ascii="Times New Roman" w:hAnsi="Times New Roman" w:cs="Times New Roman" w:eastAsia="Times New Roman"/>
         </w:rPr>
+        <w:t xml:space="preserve">= 2,500 retains 1.5% of the 171,054-haplotype TOPMed panel), systematically excluding haplotypes that carry rare alleles in minority sub-populations. We tested this hypothesis on the MESA cohort</w:t>
+      </w:r>
+      <w:hyperlink w:anchor="ref27">
+        <w:r>
+          <w:rPr>
+            <w:rFonts w:ascii="Times New Roman" w:hAnsi="Times New Roman" w:cs="Times New Roman" w:eastAsia="Times New Roman"/>
+            <w:color w:val="0563C1"/>
+            <w:vertAlign w:val="superscript"/>
+          </w:rPr>
+          <w:t xml:space="preserve">27</w:t>
+        </w:r>
+      </w:hyperlink>
+      <w:r>
+        <w:rPr>
+          <w:rFonts w:ascii="Times New Roman" w:hAnsi="Times New Roman" w:cs="Times New Roman" w:eastAsia="Times New Roman"/>
+        </w:rPr>
+        <w:t xml:space="preserve"> </w:t>
+      </w:r>
+      <w:r>
+        <w:rPr>
+          <w:rFonts w:ascii="Times New Roman" w:hAnsi="Times New Roman" w:cs="Times New Roman" w:eastAsia="Times New Roman"/>
+        </w:rPr>
+        <w:t xml:space="preserve">(5,000 multi-ethnic samples, chip-array genotyped) imputed against the TOPMed Freeze 8 panel (chr20, 17.9 million variants). The cohort is admixed (African, Hispanic, Asian, and European sub-populations) and is fully held out from TOPMed.</w:t>
+      </w:r>
+    </w:p>
+    <w:p>
+      <w:pPr>
+        <w:pStyle w:val="BodyText"/>
+        <w:jc w:val="both"/>
+      </w:pPr>
+      <w:r>
+        <w:rPr>
+          <w:rFonts w:ascii="Times New Roman" w:hAnsi="Times New Roman" w:cs="Times New Roman" w:eastAsia="Times New Roman"/>
+        </w:rPr>
+        <w:t xml:space="preserve">Selphi 2's panel-adaptive sizing formula (Methods, Candidate selection and HMM) yields</w:t>
+      </w:r>
+      <w:r>
+        <w:rPr>
+          <w:rFonts w:ascii="Times New Roman" w:hAnsi="Times New Roman" w:cs="Times New Roman" w:eastAsia="Times New Roman"/>
+        </w:rPr>
+        <w:t xml:space="preserve"> </w:t>
+      </w:r>
+      <m:oMath>
+        <m:sSub>
+          <m:e>
+            <m:r>
+              <m:t>m</m:t>
+            </m:r>
+          </m:e>
+          <m:sub>
+            <m:r>
+              <m:t>c</m:t>
+            </m:r>
+          </m:sub>
+        </m:sSub>
+      </m:oMath>
+      <w:r>
+        <w:rPr>
+          <w:rFonts w:ascii="Times New Roman" w:hAnsi="Times New Roman" w:cs="Times New Roman" w:eastAsia="Times New Roman"/>
+        </w:rPr>
+        <w:t xml:space="preserve"> </w:t>
+      </w:r>
+      <w:r>
+        <w:rPr>
+          <w:rFonts w:ascii="Times New Roman" w:hAnsi="Times New Roman" w:cs="Times New Roman" w:eastAsia="Times New Roman"/>
+        </w:rPr>
         <w:t xml:space="preserve">= 132,676 for the TOPMed panel (panel-tile-compression diversity CV = 0.845, scaled fraction 0.776). At this candidate-set size, Selphi 2's default diploid engine attains overall</w:t>
       </w:r>
       <w:r>
@@ -9432,39 +9346,7 @@
         <w:rPr>
           <w:rFonts w:ascii="Times New Roman" w:hAnsi="Times New Roman" w:cs="Times New Roman" w:eastAsia="Times New Roman"/>
         </w:rPr>
-        <w:t xml:space="preserve">fixed at 2,500 (the configuration that mirrors Selphi 1's</w:t>
-      </w:r>
-      <w:r>
-        <w:rPr>
-          <w:rFonts w:ascii="Times New Roman" w:hAnsi="Times New Roman" w:cs="Times New Roman" w:eastAsia="Times New Roman"/>
-        </w:rPr>
-        <w:t xml:space="preserve"> </w:t>
-      </w:r>
-      <m:oMath>
-        <m:sSub>
-          <m:e>
-            <m:r>
-              <m:t>K</m:t>
-            </m:r>
-          </m:e>
-          <m:sub>
-            <m:r>
-              <m:t>2</m:t>
-            </m:r>
-          </m:sub>
-        </m:sSub>
-      </m:oMath>
-      <w:r>
-        <w:rPr>
-          <w:rFonts w:ascii="Times New Roman" w:hAnsi="Times New Roman" w:cs="Times New Roman" w:eastAsia="Times New Roman"/>
-        </w:rPr>
-        <w:t xml:space="preserve"> </w:t>
-      </w:r>
-      <w:r>
-        <w:rPr>
-          <w:rFonts w:ascii="Times New Roman" w:hAnsi="Times New Roman" w:cs="Times New Roman" w:eastAsia="Times New Roman"/>
-        </w:rPr>
-        <w:t xml:space="preserve">= 60 cap on a panel of this size in retained-fraction terms). On a 500-sample MESA subset (chr20, TOPMed panel),</w:t>
+        <w:t xml:space="preserve">fixed at 2,500 (a representative fixed candidate-set size). On a 500-sample MESA subset (chr20, TOPMed panel),</w:t>
       </w:r>
       <w:r>
         <w:rPr>
@@ -9732,39 +9614,7 @@
         <w:rPr>
           <w:rFonts w:ascii="Times New Roman" w:hAnsi="Times New Roman" w:cs="Times New Roman" w:eastAsia="Times New Roman"/>
         </w:rPr>
-        <w:t xml:space="preserve">= 2,500 mirrors Selphi 1's</w:t>
-      </w:r>
-      <w:r>
-        <w:rPr>
-          <w:rFonts w:ascii="Times New Roman" w:hAnsi="Times New Roman" w:cs="Times New Roman" w:eastAsia="Times New Roman"/>
-        </w:rPr>
-        <w:t xml:space="preserve"> </w:t>
-      </w:r>
-      <m:oMath>
-        <m:sSub>
-          <m:e>
-            <m:r>
-              <m:t>K</m:t>
-            </m:r>
-          </m:e>
-          <m:sub>
-            <m:r>
-              <m:t>2</m:t>
-            </m:r>
-          </m:sub>
-        </m:sSub>
-      </m:oMath>
-      <w:r>
-        <w:rPr>
-          <w:rFonts w:ascii="Times New Roman" w:hAnsi="Times New Roman" w:cs="Times New Roman" w:eastAsia="Times New Roman"/>
-        </w:rPr>
-        <w:t xml:space="preserve"> </w:t>
-      </w:r>
-      <w:r>
-        <w:rPr>
-          <w:rFonts w:ascii="Times New Roman" w:hAnsi="Times New Roman" w:cs="Times New Roman" w:eastAsia="Times New Roman"/>
-        </w:rPr>
-        <w:t xml:space="preserve">cap on a panel of this size;</w:t>
+        <w:t xml:space="preserve">= 2,500 is a representative fixed candidate-set size;</w:t>
       </w:r>
       <w:r>
         <w:rPr>
@@ -10547,7 +10397,7 @@
         <w:rPr>
           <w:rFonts w:ascii="Times New Roman" w:hAnsi="Times New Roman" w:cs="Times New Roman" w:eastAsia="Times New Roman"/>
         </w:rPr>
-        <w:t xml:space="preserve">The gain is monotonically larger at rarer MAF bins, confirming that the fixed cap in Selphi 1 was preferentially truncating rare-variant carriers. The panel-adaptive formula recovers this accuracy without manual tuning.</w:t>
+        <w:t xml:space="preserve">The gain is monotonically larger at rarer MAF bins, confirming that the fixed candidate-set size was preferentially truncating rare-variant carriers. The panel-adaptive formula recovers this accuracy without manual tuning.</w:t>
       </w:r>
     </w:p>
     <w:p>
@@ -10687,7 +10537,7 @@
         <w:rPr>
           <w:rFonts w:ascii="Times New Roman" w:hAnsi="Times New Roman" w:cs="Times New Roman" w:eastAsia="Times New Roman"/>
         </w:rPr>
-        <w:t xml:space="preserve">for Hispanic and +0.139 for African-American samples, versus +0.119 for European-ancestry (White) samples, and the gap widens across the low-frequency range (at 0.2-0.5% MAF, +0.127 and +0.089 versus +0.059). Aggregated over all variants the recovery is +0.113 (Hispanic), +0.087 (African-American), and +0.054 (White); the comparatively homogeneous East-Asian (Chinese-American) group, already well served by a small candidate set, gains essentially nothing (overall +0.001, and marginally negative at common variants where the larger candidate set slightly over-conditions this homogeneous group; Table 2b). The monotonic decay from rare to common variants, and the ordering by population admixture and divergence, are the signature of the proposed mechanism: a fixed candidate cap calibrated on a European-majority panel preferentially excludes the rare-allele-carrying haplotypes of admixed and diverged populations, and the panel-adaptive sizing recovers them.</w:t>
+        <w:t xml:space="preserve">for Hispanic and +0.139 for African-American samples, versus +0.119 for European-ancestry (White) samples, and the gap widens across the low-frequency range (at 0.2-0.5% MAF, +0.127 and +0.089 versus +0.059). Aggregated over all variants the recovery is +0.113 (Hispanic), +0.087 (African-American), and +0.054 (White); the comparatively homogeneous East-Asian (Chinese-American) group, already well served by a small candidate set, gains essentially nothing (overall +0.001, and marginally negative at common variants where the larger candidate set slightly over-conditions this homogeneous group; Table 2b). The monotonic decay from rare to common variants, and the ordering by population admixture and divergence, are the signature of the proposed mechanism: a fixed candidate cap, dominated by the panel's majority-ancestry haplotypes, preferentially excludes the rare-allele-carrying haplotypes of admixed and diverged populations, and the panel-adaptive sizing recovers them.</w:t>
       </w:r>
     </w:p>
     <w:p>
@@ -18384,14 +18234,14 @@
         </w:rPr>
         <w:t xml:space="preserve">was computed against the GIAB v4.2.1 high-confidence truth over the high-confidence variant sites, on the identical set of sites imputed by both tools, and compared to GLIMPSE2</w:t>
       </w:r>
-      <w:hyperlink w:anchor="ref2">
+      <w:hyperlink w:anchor="ref15">
         <w:r>
           <w:rPr>
             <w:rFonts w:ascii="Times New Roman" w:hAnsi="Times New Roman" w:cs="Times New Roman" w:eastAsia="Times New Roman"/>
             <w:color w:val="0563C1"/>
             <w:vertAlign w:val="superscript"/>
           </w:rPr>
-          <w:t xml:space="preserve">2</w:t>
+          <w:t xml:space="preserve">15</w:t>
         </w:r>
       </w:hyperlink>
       <w:r>
@@ -19613,14 +19463,14 @@
         </w:rPr>
         <w:t xml:space="preserve">To position the engine against both established low-coverage tools across a range of depths, we ran a three-way comparison, Selphi 2 versus GLIMPSE2</w:t>
       </w:r>
-      <w:hyperlink w:anchor="ref2">
+      <w:hyperlink w:anchor="ref15">
         <w:r>
           <w:rPr>
             <w:rFonts w:ascii="Times New Roman" w:hAnsi="Times New Roman" w:cs="Times New Roman" w:eastAsia="Times New Roman"/>
             <w:color w:val="0563C1"/>
             <w:vertAlign w:val="superscript"/>
           </w:rPr>
-          <w:t xml:space="preserve">2</w:t>
+          <w:t xml:space="preserve">15</w:t>
         </w:r>
       </w:hyperlink>
       <w:r>
@@ -21190,14 +21040,14 @@
         </w:rPr>
         <w:t xml:space="preserve">We presented Selphi 2, a reimplementation of the Selphi genotype imputation algorithm</w:t>
       </w:r>
-      <w:hyperlink w:anchor="ref1">
+      <w:hyperlink w:anchor="ref12">
         <w:r>
           <w:rPr>
             <w:rFonts w:ascii="Times New Roman" w:hAnsi="Times New Roman" w:cs="Times New Roman" w:eastAsia="Times New Roman"/>
             <w:color w:val="0563C1"/>
             <w:vertAlign w:val="superscript"/>
           </w:rPr>
-          <w:t xml:space="preserve">1</w:t>
+          <w:t xml:space="preserve">12</w:t>
         </w:r>
       </w:hyperlink>
       <w:r>
@@ -21210,7 +21060,7 @@
         <w:rPr>
           <w:rFonts w:ascii="Times New Roman" w:hAnsi="Times New Roman" w:cs="Times New Roman" w:eastAsia="Times New Roman"/>
         </w:rPr>
-        <w:t xml:space="preserve">in Rust that integrates phasing and imputation in a single tool, performs whole-genome imputation in one command against a single multi-chromosome reference panel, and replaces Selphi 1's fixed candidate-set cap with a panel-adaptive sizing rule. On the 1000 Genomes Phase 3 panel, Selphi 2 exceeds Beagle 5.5 in overall</w:t>
+        <w:t xml:space="preserve">in Rust that integrates phasing and imputation in a single tool, performs whole-genome imputation in one command against a single multi-chromosome reference panel, and introduces a panel-adaptive candidate-set sizing rule. On the 1000 Genomes Phase 3 panel, Selphi 2 exceeds Beagle 5.5 in overall</w:t>
       </w:r>
       <w:r>
         <w:rPr>
@@ -21274,7 +21124,7 @@
         <w:rPr>
           <w:rFonts w:ascii="Times New Roman" w:hAnsi="Times New Roman" w:cs="Times New Roman" w:eastAsia="Times New Roman"/>
         </w:rPr>
-        <w:t xml:space="preserve">by 0.0227 on the MESA admixed cohort, leading Beagle across all four ancestry groups (Figure 2b); this advantage over Beagle reflects the larger panel-adaptive candidate set retained per target versus Beagle's window-local composite haplotypes. Relative to Selphi 1, the same panel-adaptive sizing recovers +0.0651 overall</w:t>
+        <w:t xml:space="preserve">by 0.0227 on the MESA admixed cohort, leading Beagle across all four ancestry groups (Figure 2b); this advantage over Beagle reflects the larger panel-adaptive candidate set retained per target versus Beagle's window-local composite haplotypes. The same panel-adaptive sizing recovers +0.0651 overall</w:t>
       </w:r>
       <w:r>
         <w:rPr>
@@ -21306,7 +21156,7 @@
         <w:rPr>
           <w:rFonts w:ascii="Times New Roman" w:hAnsi="Times New Roman" w:cs="Times New Roman" w:eastAsia="Times New Roman"/>
         </w:rPr>
-        <w:t xml:space="preserve">over a Selphi-1-equivalent fixed cap (</w:t>
+        <w:t xml:space="preserve">over a fixed candidate-set size (</w:t>
       </w:r>
       <m:oMath>
         <m:sSub>
@@ -21418,14 +21268,14 @@
         </w:rPr>
         <w:t xml:space="preserve">Selphi 2 occupies a different position in the imputation landscape from the four main existing tools. Beagle 5.5</w:t>
       </w:r>
-      <w:hyperlink w:anchor="ref7">
+      <w:hyperlink w:anchor="ref5">
         <w:r>
           <w:rPr>
             <w:rFonts w:ascii="Times New Roman" w:hAnsi="Times New Roman" w:cs="Times New Roman" w:eastAsia="Times New Roman"/>
             <w:color w:val="0563C1"/>
             <w:vertAlign w:val="superscript"/>
           </w:rPr>
-          <w:t xml:space="preserve">7</w:t>
+          <w:t xml:space="preserve">5</w:t>
         </w:r>
       </w:hyperlink>
       <w:r>
@@ -21436,14 +21286,14 @@
         </w:rPr>
         <w:t xml:space="preserve">,</w:t>
       </w:r>
-      <w:hyperlink w:anchor="ref8">
+      <w:hyperlink w:anchor="ref6">
         <w:r>
           <w:rPr>
             <w:rFonts w:ascii="Times New Roman" w:hAnsi="Times New Roman" w:cs="Times New Roman" w:eastAsia="Times New Roman"/>
             <w:color w:val="0563C1"/>
             <w:vertAlign w:val="superscript"/>
           </w:rPr>
-          <w:t xml:space="preserve">8</w:t>
+          <w:t xml:space="preserve">6</w:t>
         </w:r>
       </w:hyperlink>
       <w:r>
@@ -21510,14 +21360,14 @@
         </w:rPr>
         <w:t xml:space="preserve">. IMPUTE5</w:t>
       </w:r>
-      <w:hyperlink w:anchor="ref6">
+      <w:hyperlink w:anchor="ref4">
         <w:r>
           <w:rPr>
             <w:rFonts w:ascii="Times New Roman" w:hAnsi="Times New Roman" w:cs="Times New Roman" w:eastAsia="Times New Roman"/>
             <w:color w:val="0563C1"/>
             <w:vertAlign w:val="superscript"/>
           </w:rPr>
-          <w:t xml:space="preserve">6</w:t>
+          <w:t xml:space="preserve">4</w:t>
         </w:r>
       </w:hyperlink>
       <w:r>
@@ -21532,14 +21382,14 @@
         </w:rPr>
         <w:t xml:space="preserve">uses PBWT-based haplotype selection with sub-linear scaling but requires pre-phased input from an external phaser and processes per chromosome. Minimac4</w:t>
       </w:r>
-      <w:hyperlink w:anchor="ref9">
+      <w:hyperlink w:anchor="ref7">
         <w:r>
           <w:rPr>
             <w:rFonts w:ascii="Times New Roman" w:hAnsi="Times New Roman" w:cs="Times New Roman" w:eastAsia="Times New Roman"/>
             <w:color w:val="0563C1"/>
             <w:vertAlign w:val="superscript"/>
           </w:rPr>
-          <w:t xml:space="preserve">9</w:t>
+          <w:t xml:space="preserve">7</w:t>
         </w:r>
       </w:hyperlink>
       <w:r>
@@ -21586,14 +21436,14 @@
         </w:rPr>
         <w:t xml:space="preserve">(Minimac4 0.4688, IMPUTE5 0.4594, versus 0.4832; Table 1), reproducing for Selphi 2 the accuracy ordering that Selphi 1 reported against the same three tools. SHAPEIT5</w:t>
       </w:r>
-      <w:hyperlink w:anchor="ref11">
+      <w:hyperlink w:anchor="ref9">
         <w:r>
           <w:rPr>
             <w:rFonts w:ascii="Times New Roman" w:hAnsi="Times New Roman" w:cs="Times New Roman" w:eastAsia="Times New Roman"/>
             <w:color w:val="0563C1"/>
             <w:vertAlign w:val="superscript"/>
           </w:rPr>
-          <w:t xml:space="preserve">11</w:t>
+          <w:t xml:space="preserve">9</w:t>
         </w:r>
       </w:hyperlink>
       <w:r>
@@ -21688,14 +21538,14 @@
         </w:rPr>
         <w:t xml:space="preserve">Beagle's wall time on these benchmarks. The remaining architectural difference is the integration with the downstream imputation HMM: phased haplotypes are passed in memory to the Li-Stephens forward-backward pass with no intermediate VCF emission. Of Selphi 1's</w:t>
       </w:r>
-      <w:hyperlink w:anchor="ref1">
+      <w:hyperlink w:anchor="ref12">
         <w:r>
           <w:rPr>
             <w:rFonts w:ascii="Times New Roman" w:hAnsi="Times New Roman" w:cs="Times New Roman" w:eastAsia="Times New Roman"/>
             <w:color w:val="0563C1"/>
             <w:vertAlign w:val="superscript"/>
           </w:rPr>
-          <w:t xml:space="preserve">1</w:t>
+          <w:t xml:space="preserve">12</w:t>
         </w:r>
       </w:hyperlink>
       <w:r>
@@ -21710,14 +21560,14 @@
         </w:rPr>
         <w:t xml:space="preserve">original design choices, what carries over to Selphi 2 is the long-range PBWT scan, here realized as large overlapping windows (80 cM by default) in place of a single chromosome-wide pass; the principal extensions are the integrated phasing engines, the panel-adaptive candidate-set sizing, the multi-chromosome single-pass workflow, and the panel-format-agnostic input (BCF, VCF, BREF3) with multi-format output. GLIMPSE2</w:t>
       </w:r>
-      <w:hyperlink w:anchor="ref2">
+      <w:hyperlink w:anchor="ref15">
         <w:r>
           <w:rPr>
             <w:rFonts w:ascii="Times New Roman" w:hAnsi="Times New Roman" w:cs="Times New Roman" w:eastAsia="Times New Roman"/>
             <w:color w:val="0563C1"/>
             <w:vertAlign w:val="superscript"/>
           </w:rPr>
-          <w:t xml:space="preserve">2</w:t>
+          <w:t xml:space="preserve">15</w:t>
         </w:r>
       </w:hyperlink>
       <w:r>
@@ -22424,6 +22274,28 @@
         </w:rPr>
         <w:t xml:space="preserve">The 1000 Genomes Project Phase 3 reference panel</w:t>
       </w:r>
+      <w:hyperlink w:anchor="ref13">
+        <w:r>
+          <w:rPr>
+            <w:rFonts w:ascii="Times New Roman" w:hAnsi="Times New Roman" w:cs="Times New Roman" w:eastAsia="Times New Roman"/>
+            <w:color w:val="0563C1"/>
+            <w:vertAlign w:val="superscript"/>
+          </w:rPr>
+          <w:t xml:space="preserve">13</w:t>
+        </w:r>
+      </w:hyperlink>
+      <w:r>
+        <w:rPr>
+          <w:rFonts w:ascii="Times New Roman" w:hAnsi="Times New Roman" w:cs="Times New Roman" w:eastAsia="Times New Roman"/>
+        </w:rPr>
+        <w:t xml:space="preserve"> </w:t>
+      </w:r>
+      <w:r>
+        <w:rPr>
+          <w:rFonts w:ascii="Times New Roman" w:hAnsi="Times New Roman" w:cs="Times New Roman" w:eastAsia="Times New Roman"/>
+        </w:rPr>
+        <w:t xml:space="preserve">and the Genome in a Bottle (GIAB) reference-sample sequencing and v4.2.1 high-confidence truth genotypes are publicly available. The TOPMed Freeze 8 reference panel</w:t>
+      </w:r>
       <w:hyperlink w:anchor="ref14">
         <w:r>
           <w:rPr>
@@ -22432,28 +22304,6 @@
             <w:vertAlign w:val="superscript"/>
           </w:rPr>
           <w:t xml:space="preserve">14</w:t>
-        </w:r>
-      </w:hyperlink>
-      <w:r>
-        <w:rPr>
-          <w:rFonts w:ascii="Times New Roman" w:hAnsi="Times New Roman" w:cs="Times New Roman" w:eastAsia="Times New Roman"/>
-        </w:rPr>
-        <w:t xml:space="preserve"> </w:t>
-      </w:r>
-      <w:r>
-        <w:rPr>
-          <w:rFonts w:ascii="Times New Roman" w:hAnsi="Times New Roman" w:cs="Times New Roman" w:eastAsia="Times New Roman"/>
-        </w:rPr>
-        <w:t xml:space="preserve">and the Genome in a Bottle (GIAB) reference-sample sequencing and v4.2.1 high-confidence truth genotypes are publicly available. The TOPMed Freeze 8 reference panel</w:t>
-      </w:r>
-      <w:hyperlink w:anchor="ref15">
-        <w:r>
-          <w:rPr>
-            <w:rFonts w:ascii="Times New Roman" w:hAnsi="Times New Roman" w:cs="Times New Roman" w:eastAsia="Times New Roman"/>
-            <w:color w:val="0563C1"/>
-            <w:vertAlign w:val="superscript"/>
-          </w:rPr>
-          <w:t xml:space="preserve">15</w:t>
         </w:r>
       </w:hyperlink>
       <w:r>
@@ -22575,7 +22425,7 @@
         <w:rPr>
           <w:rFonts w:ascii="Times New Roman" w:hAnsi="Times New Roman" w:cs="Times New Roman" w:eastAsia="Times New Roman"/>
         </w:rPr>
-        <w:t xml:space="preserve">De Marino A, Mahmoud AA, Bohn S, Lerga-Jaso J, Novković B, Manson C, Loguercio S, Terpolovsky A, Matushyn M, Torkamani A, Yazdi PG. Selphi, a tool for improving genotype imputation accuracy.</w:t>
+        <w:t xml:space="preserve">McCarthy S, Das S, Kretzschmar W, et al. A reference panel of 64,976 haplotypes for genotype imputation.</w:t>
       </w:r>
       <w:r>
         <w:rPr>
@@ -22589,13 +22439,13 @@
           <w:i/>
           <w:iCs/>
         </w:rPr>
-        <w:t xml:space="preserve">Sci Rep</w:t>
-      </w:r>
-      <w:r>
-        <w:rPr>
-          <w:rFonts w:ascii="Times New Roman" w:hAnsi="Times New Roman" w:cs="Times New Roman" w:eastAsia="Times New Roman"/>
-        </w:rPr>
-        <w:t xml:space="preserve">. 2026;16:58420. doi:10.1038/s41598-026-58420-2.</w:t>
+        <w:t xml:space="preserve">Nat Genet</w:t>
+      </w:r>
+      <w:r>
+        <w:rPr>
+          <w:rFonts w:ascii="Times New Roman" w:hAnsi="Times New Roman" w:cs="Times New Roman" w:eastAsia="Times New Roman"/>
+        </w:rPr>
+        <w:t xml:space="preserve">. 2016;48(10):1279-1283.</w:t>
       </w:r>
       <w:bookmarkEnd w:id="4001"/>
     </w:p>
@@ -22613,7 +22463,7 @@
         <w:rPr>
           <w:rFonts w:ascii="Times New Roman" w:hAnsi="Times New Roman" w:cs="Times New Roman" w:eastAsia="Times New Roman"/>
         </w:rPr>
-        <w:t xml:space="preserve">Rubinacci S, Hofmeister RJ, Sousa da Mota B, Delaneau O. Imputation of low-coverage sequencing data from 150,119 UK Biobank genomes.</w:t>
+        <w:t xml:space="preserve">Li N, Stephens M. Modeling linkage disequilibrium and identifying recombination hotspots using single-nucleotide polymorphism data.</w:t>
       </w:r>
       <w:r>
         <w:rPr>
@@ -22627,13 +22477,13 @@
           <w:i/>
           <w:iCs/>
         </w:rPr>
-        <w:t xml:space="preserve">Nat Genet</w:t>
-      </w:r>
-      <w:r>
-        <w:rPr>
-          <w:rFonts w:ascii="Times New Roman" w:hAnsi="Times New Roman" w:cs="Times New Roman" w:eastAsia="Times New Roman"/>
-        </w:rPr>
-        <w:t xml:space="preserve">. 2023;55(7):1088-1090.</w:t>
+        <w:t xml:space="preserve">Genetics</w:t>
+      </w:r>
+      <w:r>
+        <w:rPr>
+          <w:rFonts w:ascii="Times New Roman" w:hAnsi="Times New Roman" w:cs="Times New Roman" w:eastAsia="Times New Roman"/>
+        </w:rPr>
+        <w:t xml:space="preserve">. 2003;165(4):2213-2233.</w:t>
       </w:r>
       <w:bookmarkEnd w:id="4002"/>
     </w:p>
@@ -22651,7 +22501,7 @@
         <w:rPr>
           <w:rFonts w:ascii="Times New Roman" w:hAnsi="Times New Roman" w:cs="Times New Roman" w:eastAsia="Times New Roman"/>
         </w:rPr>
-        <w:t xml:space="preserve">McCarthy S, Das S, Kretzschmar W, et al. A reference panel of 64,976 haplotypes for genotype imputation.</w:t>
+        <w:t xml:space="preserve">Durbin R. Efficient haplotype matching and storage using the positional Burrows-Wheeler transform (PBWT).</w:t>
       </w:r>
       <w:r>
         <w:rPr>
@@ -22665,13 +22515,13 @@
           <w:i/>
           <w:iCs/>
         </w:rPr>
-        <w:t xml:space="preserve">Nat Genet</w:t>
-      </w:r>
-      <w:r>
-        <w:rPr>
-          <w:rFonts w:ascii="Times New Roman" w:hAnsi="Times New Roman" w:cs="Times New Roman" w:eastAsia="Times New Roman"/>
-        </w:rPr>
-        <w:t xml:space="preserve">. 2016;48(10):1279-1283.</w:t>
+        <w:t xml:space="preserve">Bioinformatics</w:t>
+      </w:r>
+      <w:r>
+        <w:rPr>
+          <w:rFonts w:ascii="Times New Roman" w:hAnsi="Times New Roman" w:cs="Times New Roman" w:eastAsia="Times New Roman"/>
+        </w:rPr>
+        <w:t xml:space="preserve">. 2014;30(9):1266-1272.</w:t>
       </w:r>
       <w:bookmarkEnd w:id="4003"/>
     </w:p>
@@ -22689,7 +22539,7 @@
         <w:rPr>
           <w:rFonts w:ascii="Times New Roman" w:hAnsi="Times New Roman" w:cs="Times New Roman" w:eastAsia="Times New Roman"/>
         </w:rPr>
-        <w:t xml:space="preserve">Li N, Stephens M. Modeling linkage disequilibrium and identifying recombination hotspots using single-nucleotide polymorphism data.</w:t>
+        <w:t xml:space="preserve">Rubinacci S, Delaneau O, Marchini J. Genotype imputation using the Positional Burrows Wheeler Transform.</w:t>
       </w:r>
       <w:r>
         <w:rPr>
@@ -22703,13 +22553,13 @@
           <w:i/>
           <w:iCs/>
         </w:rPr>
-        <w:t xml:space="preserve">Genetics</w:t>
-      </w:r>
-      <w:r>
-        <w:rPr>
-          <w:rFonts w:ascii="Times New Roman" w:hAnsi="Times New Roman" w:cs="Times New Roman" w:eastAsia="Times New Roman"/>
-        </w:rPr>
-        <w:t xml:space="preserve">. 2003;165(4):2213-2233.</w:t>
+        <w:t xml:space="preserve">PLoS Genet</w:t>
+      </w:r>
+      <w:r>
+        <w:rPr>
+          <w:rFonts w:ascii="Times New Roman" w:hAnsi="Times New Roman" w:cs="Times New Roman" w:eastAsia="Times New Roman"/>
+        </w:rPr>
+        <w:t xml:space="preserve">. 2020;16(11):e1009049.</w:t>
       </w:r>
       <w:bookmarkEnd w:id="4004"/>
     </w:p>
@@ -22727,7 +22577,7 @@
         <w:rPr>
           <w:rFonts w:ascii="Times New Roman" w:hAnsi="Times New Roman" w:cs="Times New Roman" w:eastAsia="Times New Roman"/>
         </w:rPr>
-        <w:t xml:space="preserve">Durbin R. Efficient haplotype matching and storage using the positional Burrows-Wheeler transform (PBWT).</w:t>
+        <w:t xml:space="preserve">Browning BL, Zhou Y, Browning SR. A one-penny imputed genome from next-generation reference panels.</w:t>
       </w:r>
       <w:r>
         <w:rPr>
@@ -22741,13 +22591,13 @@
           <w:i/>
           <w:iCs/>
         </w:rPr>
-        <w:t xml:space="preserve">Bioinformatics</w:t>
-      </w:r>
-      <w:r>
-        <w:rPr>
-          <w:rFonts w:ascii="Times New Roman" w:hAnsi="Times New Roman" w:cs="Times New Roman" w:eastAsia="Times New Roman"/>
-        </w:rPr>
-        <w:t xml:space="preserve">. 2014;30(9):1266-1272.</w:t>
+        <w:t xml:space="preserve">Am J Hum Genet</w:t>
+      </w:r>
+      <w:r>
+        <w:rPr>
+          <w:rFonts w:ascii="Times New Roman" w:hAnsi="Times New Roman" w:cs="Times New Roman" w:eastAsia="Times New Roman"/>
+        </w:rPr>
+        <w:t xml:space="preserve">. 2018;103(3):338-348.</w:t>
       </w:r>
       <w:bookmarkEnd w:id="4005"/>
     </w:p>
@@ -22765,7 +22615,7 @@
         <w:rPr>
           <w:rFonts w:ascii="Times New Roman" w:hAnsi="Times New Roman" w:cs="Times New Roman" w:eastAsia="Times New Roman"/>
         </w:rPr>
-        <w:t xml:space="preserve">Rubinacci S, Delaneau O, Marchini J. Genotype imputation using the Positional Burrows Wheeler Transform.</w:t>
+        <w:t xml:space="preserve">Browning BL, Browning SR. Statistical phasing of 150,119 sequenced genomes in the UK Biobank.</w:t>
       </w:r>
       <w:r>
         <w:rPr>
@@ -22779,13 +22629,13 @@
           <w:i/>
           <w:iCs/>
         </w:rPr>
-        <w:t xml:space="preserve">PLoS Genet</w:t>
-      </w:r>
-      <w:r>
-        <w:rPr>
-          <w:rFonts w:ascii="Times New Roman" w:hAnsi="Times New Roman" w:cs="Times New Roman" w:eastAsia="Times New Roman"/>
-        </w:rPr>
-        <w:t xml:space="preserve">. 2020;16(11):e1009049.</w:t>
+        <w:t xml:space="preserve">Am J Hum Genet</w:t>
+      </w:r>
+      <w:r>
+        <w:rPr>
+          <w:rFonts w:ascii="Times New Roman" w:hAnsi="Times New Roman" w:cs="Times New Roman" w:eastAsia="Times New Roman"/>
+        </w:rPr>
+        <w:t xml:space="preserve">. 2023;110(1):161-165.</w:t>
       </w:r>
       <w:bookmarkEnd w:id="4006"/>
     </w:p>
@@ -22803,7 +22653,7 @@
         <w:rPr>
           <w:rFonts w:ascii="Times New Roman" w:hAnsi="Times New Roman" w:cs="Times New Roman" w:eastAsia="Times New Roman"/>
         </w:rPr>
-        <w:t xml:space="preserve">Browning BL, Zhou Y, Browning SR. A one-penny imputed genome from next-generation reference panels.</w:t>
+        <w:t xml:space="preserve">Das S, Forer L, Schönherr S, et al. Next-generation genotype imputation service and methods.</w:t>
       </w:r>
       <w:r>
         <w:rPr>
@@ -22817,13 +22667,13 @@
           <w:i/>
           <w:iCs/>
         </w:rPr>
-        <w:t xml:space="preserve">Am J Hum Genet</w:t>
-      </w:r>
-      <w:r>
-        <w:rPr>
-          <w:rFonts w:ascii="Times New Roman" w:hAnsi="Times New Roman" w:cs="Times New Roman" w:eastAsia="Times New Roman"/>
-        </w:rPr>
-        <w:t xml:space="preserve">. 2018;103(3):338-348.</w:t>
+        <w:t xml:space="preserve">Nat Genet</w:t>
+      </w:r>
+      <w:r>
+        <w:rPr>
+          <w:rFonts w:ascii="Times New Roman" w:hAnsi="Times New Roman" w:cs="Times New Roman" w:eastAsia="Times New Roman"/>
+        </w:rPr>
+        <w:t xml:space="preserve">. 2016;48(10):1284-1287.</w:t>
       </w:r>
       <w:bookmarkEnd w:id="4007"/>
     </w:p>
@@ -22841,7 +22691,7 @@
         <w:rPr>
           <w:rFonts w:ascii="Times New Roman" w:hAnsi="Times New Roman" w:cs="Times New Roman" w:eastAsia="Times New Roman"/>
         </w:rPr>
-        <w:t xml:space="preserve">Browning BL, Browning SR. Statistical phasing of 150,119 sequenced genomes in the UK Biobank.</w:t>
+        <w:t xml:space="preserve">Loh PR, Danecek P, Palamara PF, et al. Reference-based phasing using the Haplotype Reference Consortium panel.</w:t>
       </w:r>
       <w:r>
         <w:rPr>
@@ -22855,13 +22705,13 @@
           <w:i/>
           <w:iCs/>
         </w:rPr>
-        <w:t xml:space="preserve">Am J Hum Genet</w:t>
-      </w:r>
-      <w:r>
-        <w:rPr>
-          <w:rFonts w:ascii="Times New Roman" w:hAnsi="Times New Roman" w:cs="Times New Roman" w:eastAsia="Times New Roman"/>
-        </w:rPr>
-        <w:t xml:space="preserve">. 2023;110(1):161-165.</w:t>
+        <w:t xml:space="preserve">Nat Genet</w:t>
+      </w:r>
+      <w:r>
+        <w:rPr>
+          <w:rFonts w:ascii="Times New Roman" w:hAnsi="Times New Roman" w:cs="Times New Roman" w:eastAsia="Times New Roman"/>
+        </w:rPr>
+        <w:t xml:space="preserve">. 2016;48(11):1443-1448.</w:t>
       </w:r>
       <w:bookmarkEnd w:id="4008"/>
     </w:p>
@@ -22879,7 +22729,7 @@
         <w:rPr>
           <w:rFonts w:ascii="Times New Roman" w:hAnsi="Times New Roman" w:cs="Times New Roman" w:eastAsia="Times New Roman"/>
         </w:rPr>
-        <w:t xml:space="preserve">Das S, Forer L, Schönherr S, et al. Next-generation genotype imputation service and methods.</w:t>
+        <w:t xml:space="preserve">Hofmeister RJ, Ribeiro DM, Rubinacci S, Delaneau O. Accurate rare variant phasing of whole-genome and whole-exome sequencing data in the UK Biobank.</w:t>
       </w:r>
       <w:r>
         <w:rPr>
@@ -22899,7 +22749,7 @@
         <w:rPr>
           <w:rFonts w:ascii="Times New Roman" w:hAnsi="Times New Roman" w:cs="Times New Roman" w:eastAsia="Times New Roman"/>
         </w:rPr>
-        <w:t xml:space="preserve">. 2016;48(10):1284-1287.</w:t>
+        <w:t xml:space="preserve">. 2023;55(7):1243-1249.</w:t>
       </w:r>
       <w:bookmarkEnd w:id="4009"/>
     </w:p>
@@ -22917,7 +22767,7 @@
         <w:rPr>
           <w:rFonts w:ascii="Times New Roman" w:hAnsi="Times New Roman" w:cs="Times New Roman" w:eastAsia="Times New Roman"/>
         </w:rPr>
-        <w:t xml:space="preserve">Loh PR, Danecek P, Palamara PF, et al. Reference-based phasing using the Haplotype Reference Consortium panel.</w:t>
+        <w:t xml:space="preserve">O'Connell J, Sharp K, Shrine N, et al. Haplotype estimation for biobank-scale data sets.</w:t>
       </w:r>
       <w:r>
         <w:rPr>
@@ -22937,7 +22787,7 @@
         <w:rPr>
           <w:rFonts w:ascii="Times New Roman" w:hAnsi="Times New Roman" w:cs="Times New Roman" w:eastAsia="Times New Roman"/>
         </w:rPr>
-        <w:t xml:space="preserve">. 2016;48(11):1443-1448.</w:t>
+        <w:t xml:space="preserve">. 2016;48(7):817-820.</w:t>
       </w:r>
       <w:bookmarkEnd w:id="4010"/>
     </w:p>
@@ -22955,7 +22805,7 @@
         <w:rPr>
           <w:rFonts w:ascii="Times New Roman" w:hAnsi="Times New Roman" w:cs="Times New Roman" w:eastAsia="Times New Roman"/>
         </w:rPr>
-        <w:t xml:space="preserve">Hofmeister RJ, Ribeiro DM, Rubinacci S, Delaneau O. Accurate rare variant phasing of whole-genome and whole-exome sequencing data in the UK Biobank.</w:t>
+        <w:t xml:space="preserve">Chang CC, Chow CC, Tellier LC, Vattikuti S, Purcell SM, Lee JJ. Second-generation PLINK: rising to the challenge of larger and richer datasets.</w:t>
       </w:r>
       <w:r>
         <w:rPr>
@@ -22969,13 +22819,13 @@
           <w:i/>
           <w:iCs/>
         </w:rPr>
-        <w:t xml:space="preserve">Nat Genet</w:t>
-      </w:r>
-      <w:r>
-        <w:rPr>
-          <w:rFonts w:ascii="Times New Roman" w:hAnsi="Times New Roman" w:cs="Times New Roman" w:eastAsia="Times New Roman"/>
-        </w:rPr>
-        <w:t xml:space="preserve">. 2023;55(7):1243-1249.</w:t>
+        <w:t xml:space="preserve">GigaScience</w:t>
+      </w:r>
+      <w:r>
+        <w:rPr>
+          <w:rFonts w:ascii="Times New Roman" w:hAnsi="Times New Roman" w:cs="Times New Roman" w:eastAsia="Times New Roman"/>
+        </w:rPr>
+        <w:t xml:space="preserve">. 2015;4(1):7.</w:t>
       </w:r>
       <w:bookmarkEnd w:id="4011"/>
     </w:p>
@@ -22993,7 +22843,7 @@
         <w:rPr>
           <w:rFonts w:ascii="Times New Roman" w:hAnsi="Times New Roman" w:cs="Times New Roman" w:eastAsia="Times New Roman"/>
         </w:rPr>
-        <w:t xml:space="preserve">O'Connell J, Sharp K, Shrine N, et al. Haplotype estimation for biobank-scale data sets.</w:t>
+        <w:t xml:space="preserve">De Marino A, Mahmoud AA, Bohn S, Lerga-Jaso J, Novković B, Manson C, Loguercio S, Terpolovsky A, Matushyn M, Torkamani A, Yazdi PG. Selphi, a tool for improving genotype imputation accuracy.</w:t>
       </w:r>
       <w:r>
         <w:rPr>
@@ -23007,13 +22857,13 @@
           <w:i/>
           <w:iCs/>
         </w:rPr>
-        <w:t xml:space="preserve">Nat Genet</w:t>
-      </w:r>
-      <w:r>
-        <w:rPr>
-          <w:rFonts w:ascii="Times New Roman" w:hAnsi="Times New Roman" w:cs="Times New Roman" w:eastAsia="Times New Roman"/>
-        </w:rPr>
-        <w:t xml:space="preserve">. 2016;48(7):817-820.</w:t>
+        <w:t xml:space="preserve">Sci Rep</w:t>
+      </w:r>
+      <w:r>
+        <w:rPr>
+          <w:rFonts w:ascii="Times New Roman" w:hAnsi="Times New Roman" w:cs="Times New Roman" w:eastAsia="Times New Roman"/>
+        </w:rPr>
+        <w:t xml:space="preserve">. 2026;16:58420. doi:10.1038/s41598-026-58420-2.</w:t>
       </w:r>
       <w:bookmarkEnd w:id="4012"/>
     </w:p>
@@ -23031,7 +22881,7 @@
         <w:rPr>
           <w:rFonts w:ascii="Times New Roman" w:hAnsi="Times New Roman" w:cs="Times New Roman" w:eastAsia="Times New Roman"/>
         </w:rPr>
-        <w:t xml:space="preserve">Chang CC, Chow CC, Tellier LC, Vattikuti S, Purcell SM, Lee JJ. Second-generation PLINK: rising to the challenge of larger and richer datasets.</w:t>
+        <w:t xml:space="preserve">1000 Genomes Project Consortium. A global reference for human genetic variation.</w:t>
       </w:r>
       <w:r>
         <w:rPr>
@@ -23045,13 +22895,13 @@
           <w:i/>
           <w:iCs/>
         </w:rPr>
-        <w:t xml:space="preserve">GigaScience</w:t>
-      </w:r>
-      <w:r>
-        <w:rPr>
-          <w:rFonts w:ascii="Times New Roman" w:hAnsi="Times New Roman" w:cs="Times New Roman" w:eastAsia="Times New Roman"/>
-        </w:rPr>
-        <w:t xml:space="preserve">. 2015;4(1):7.</w:t>
+        <w:t xml:space="preserve">Nature</w:t>
+      </w:r>
+      <w:r>
+        <w:rPr>
+          <w:rFonts w:ascii="Times New Roman" w:hAnsi="Times New Roman" w:cs="Times New Roman" w:eastAsia="Times New Roman"/>
+        </w:rPr>
+        <w:t xml:space="preserve">. 2015;526(7571):68-74.</w:t>
       </w:r>
       <w:bookmarkEnd w:id="4013"/>
     </w:p>
@@ -23069,7 +22919,7 @@
         <w:rPr>
           <w:rFonts w:ascii="Times New Roman" w:hAnsi="Times New Roman" w:cs="Times New Roman" w:eastAsia="Times New Roman"/>
         </w:rPr>
-        <w:t xml:space="preserve">1000 Genomes Project Consortium. A global reference for human genetic variation.</w:t>
+        <w:t xml:space="preserve">Taliun D, Harris DN, Kessler MD, et al. Sequencing of 53,831 diverse genomes from the NHLBI TOPMed Program.</w:t>
       </w:r>
       <w:r>
         <w:rPr>
@@ -23089,7 +22939,7 @@
         <w:rPr>
           <w:rFonts w:ascii="Times New Roman" w:hAnsi="Times New Roman" w:cs="Times New Roman" w:eastAsia="Times New Roman"/>
         </w:rPr>
-        <w:t xml:space="preserve">. 2015;526(7571):68-74.</w:t>
+        <w:t xml:space="preserve">. 2021;590(7845):290-299. doi:10.1038/s41586-021-03205-y.</w:t>
       </w:r>
       <w:bookmarkEnd w:id="4014"/>
     </w:p>
@@ -23107,7 +22957,7 @@
         <w:rPr>
           <w:rFonts w:ascii="Times New Roman" w:hAnsi="Times New Roman" w:cs="Times New Roman" w:eastAsia="Times New Roman"/>
         </w:rPr>
-        <w:t xml:space="preserve">Taliun D, Harris DN, Kessler MD, et al. Sequencing of 53,831 diverse genomes from the NHLBI TOPMed Program.</w:t>
+        <w:t xml:space="preserve">Rubinacci S, Hofmeister RJ, Sousa da Mota B, Delaneau O. Imputation of low-coverage sequencing data from 150,119 UK Biobank genomes.</w:t>
       </w:r>
       <w:r>
         <w:rPr>
@@ -23121,13 +22971,13 @@
           <w:i/>
           <w:iCs/>
         </w:rPr>
-        <w:t xml:space="preserve">Nature</w:t>
-      </w:r>
-      <w:r>
-        <w:rPr>
-          <w:rFonts w:ascii="Times New Roman" w:hAnsi="Times New Roman" w:cs="Times New Roman" w:eastAsia="Times New Roman"/>
-        </w:rPr>
-        <w:t xml:space="preserve">. 2021;590(7845):290-299. doi:10.1038/s41586-021-03205-y.</w:t>
+        <w:t xml:space="preserve">Nat Genet</w:t>
+      </w:r>
+      <w:r>
+        <w:rPr>
+          <w:rFonts w:ascii="Times New Roman" w:hAnsi="Times New Roman" w:cs="Times New Roman" w:eastAsia="Times New Roman"/>
+        </w:rPr>
+        <w:t xml:space="preserve">. 2023;55(7):1088-1090.</w:t>
       </w:r>
       <w:bookmarkEnd w:id="4015"/>
     </w:p>

</xml_diff>

<commit_message>
paper: add per-MAF Ne sweep validating the Ne = 36.4 x n_ref formula (Table S13)
Fresh sweep on the current binary (1KG chr22, 801 samples, impute-only, fixed --est-ne):
overall R2 peaks exactly at the formula's Ne ~= 175,000 (= 36.4 x 4,802; the auto run is
identical), and the rare<->common tradeoff is explicit (rare 0.05-0.1% peaks ~50k and declines
with Ne; common 20-50% prefers ~350k), so the single formula value balances the tradeoff.
Added Supplementary Table S13 + a Methods sentence citing it.
</commit_message>
<xml_diff>
--- a/paper/selphi2_paper.docx
+++ b/paper/selphi2_paper.docx
@@ -3084,7 +3084,115 @@
         <w:rPr>
           <w:rFonts w:ascii="Times New Roman" w:hAnsi="Times New Roman" w:cs="Times New Roman" w:eastAsia="Times New Roman"/>
         </w:rPr>
-        <w:t xml:space="preserve">was consistent across panels despite substantial differences in population composition (a multi-ethnic global panel, a UK Biobank and 1000 Genomes composite, and a multi-ethnic clinical cohort, respectively).</w:t>
+        <w:t xml:space="preserve">was consistent across panels despite substantial differences in population composition (a multi-ethnic global panel, a UK Biobank and 1000 Genomes composite, and a multi-ethnic clinical cohort, respectively). A per-MAF sweep on the current implementation confirms both the optimum and its structure (Supplementary Table S13): on the 1000 Genomes panel overall</w:t>
+      </w:r>
+      <w:r>
+        <w:rPr>
+          <w:rFonts w:ascii="Times New Roman" w:hAnsi="Times New Roman" w:cs="Times New Roman" w:eastAsia="Times New Roman"/>
+        </w:rPr>
+        <w:t xml:space="preserve"> </w:t>
+      </w:r>
+      <m:oMath>
+        <m:sSup>
+          <m:e>
+            <m:r>
+              <m:t>R</m:t>
+            </m:r>
+          </m:e>
+          <m:sup>
+            <m:r>
+              <m:t>2</m:t>
+            </m:r>
+          </m:sup>
+        </m:sSup>
+      </m:oMath>
+      <w:r>
+        <w:rPr>
+          <w:rFonts w:ascii="Times New Roman" w:hAnsi="Times New Roman" w:cs="Times New Roman" w:eastAsia="Times New Roman"/>
+        </w:rPr>
+        <w:t xml:space="preserve"> </w:t>
+      </w:r>
+      <w:r>
+        <w:rPr>
+          <w:rFonts w:ascii="Times New Roman" w:hAnsi="Times New Roman" w:cs="Times New Roman" w:eastAsia="Times New Roman"/>
+        </w:rPr>
+        <w:t xml:space="preserve">is maximised at the formula's</w:t>
+      </w:r>
+      <w:r>
+        <w:rPr>
+          <w:rFonts w:ascii="Times New Roman" w:hAnsi="Times New Roman" w:cs="Times New Roman" w:eastAsia="Times New Roman"/>
+        </w:rPr>
+        <w:t xml:space="preserve"> </w:t>
+      </w:r>
+      <m:oMath>
+        <m:sSub>
+          <m:e>
+            <m:r>
+              <m:t>N</m:t>
+            </m:r>
+          </m:e>
+          <m:sub>
+            <m:r>
+              <m:t>e</m:t>
+            </m:r>
+          </m:sub>
+        </m:sSub>
+        <m:r>
+          <m:rPr>
+            <m:sty m:val="p"/>
+          </m:rPr>
+          <m:t>≈</m:t>
+        </m:r>
+        <m:r>
+          <m:t>175</m:t>
+        </m:r>
+        <m:r>
+          <m:rPr>
+            <m:sty m:val="p"/>
+          </m:rPr>
+          <m:t>,</m:t>
+        </m:r>
+        <m:r>
+          <m:t>000</m:t>
+        </m:r>
+      </m:oMath>
+      <w:r>
+        <w:rPr>
+          <w:rFonts w:ascii="Times New Roman" w:hAnsi="Times New Roman" w:cs="Times New Roman" w:eastAsia="Times New Roman"/>
+        </w:rPr>
+        <w:t xml:space="preserve">, while rare variants favour a lower</w:t>
+      </w:r>
+      <w:r>
+        <w:rPr>
+          <w:rFonts w:ascii="Times New Roman" w:hAnsi="Times New Roman" w:cs="Times New Roman" w:eastAsia="Times New Roman"/>
+        </w:rPr>
+        <w:t xml:space="preserve"> </w:t>
+      </w:r>
+      <m:oMath>
+        <m:sSub>
+          <m:e>
+            <m:r>
+              <m:t>N</m:t>
+            </m:r>
+          </m:e>
+          <m:sub>
+            <m:r>
+              <m:t>e</m:t>
+            </m:r>
+          </m:sub>
+        </m:sSub>
+      </m:oMath>
+      <w:r>
+        <w:rPr>
+          <w:rFonts w:ascii="Times New Roman" w:hAnsi="Times New Roman" w:cs="Times New Roman" w:eastAsia="Times New Roman"/>
+        </w:rPr>
+        <w:t xml:space="preserve"> </w:t>
+      </w:r>
+      <w:r>
+        <w:rPr>
+          <w:rFonts w:ascii="Times New Roman" w:hAnsi="Times New Roman" w:cs="Times New Roman" w:eastAsia="Times New Roman"/>
+        </w:rPr>
+        <w:t xml:space="preserve">(≈50,000) and common variants a higher one (≈350,000), so the single formula value balances a genuine rare-versus-common tradeoff rather than sitting at either extreme.</w:t>
       </w:r>
     </w:p>
     <w:p>
@@ -39519,6 +39627,1129 @@
                 <w:sz w:val="20"/>
               </w:rPr>
               <w:t xml:space="preserve">0.5581</w:t>
+            </w:r>
+          </w:p>
+        </w:tc>
+      </w:tr>
+    </w:tbl>
+    <w:p>
+      <w:pPr>
+        <w:pStyle w:val="Heading2"/>
+        <w:jc w:val="both"/>
+      </w:pPr>
+      <w:r>
+        <w:rPr>
+          <w:rFonts w:ascii="Times New Roman" w:hAnsi="Times New Roman" w:cs="Times New Roman" w:eastAsia="Times New Roman"/>
+        </w:rPr>
+        <w:t xml:space="preserve">Table S13. Per-MAF imputation R² versus effective population size (1KG Phase 3 chr22)</w:t>
+      </w:r>
+    </w:p>
+    <w:p>
+      <w:pPr>
+        <w:pStyle w:val="FirstParagraph"/>
+        <w:jc w:val="both"/>
+      </w:pPr>
+      <w:r>
+        <w:rPr>
+          <w:rFonts w:ascii="Times New Roman" w:hAnsi="Times New Roman" w:cs="Times New Roman" w:eastAsia="Times New Roman"/>
+        </w:rPr>
+        <w:t xml:space="preserve">801 held-out samples, impute-only against the 4,802-haplotype panel, at a fixed base effective</w:t>
+      </w:r>
+      <w:r>
+        <w:rPr>
+          <w:rFonts w:ascii="Times New Roman" w:hAnsi="Times New Roman" w:cs="Times New Roman" w:eastAsia="Times New Roman"/>
+        </w:rPr>
+        <w:t xml:space="preserve"> </w:t>
+      </w:r>
+      <w:r>
+        <w:rPr>
+          <w:rFonts w:ascii="Times New Roman" w:hAnsi="Times New Roman" w:cs="Times New Roman" w:eastAsia="Times New Roman"/>
+        </w:rPr>
+        <w:t xml:space="preserve">population size (</w:t>
+      </w:r>
+      <w:r>
+        <w:rPr>
+          <w:rFonts w:ascii="Times New Roman" w:hAnsi="Times New Roman" w:cs="Times New Roman" w:eastAsia="Times New Roman"/>
+          <w:rStyle w:val="VerbatimChar"/>
+        </w:rPr>
+        <w:t xml:space="preserve">--est-ne</w:t>
+      </w:r>
+      <w:r>
+        <w:rPr>
+          <w:rFonts w:ascii="Times New Roman" w:hAnsi="Times New Roman" w:cs="Times New Roman" w:eastAsia="Times New Roman"/>
+        </w:rPr>
+        <w:t xml:space="preserve">). The panel-adaptive formula selects Ne = 36.4 × n_ref ≈ 175,000 for</w:t>
+      </w:r>
+      <w:r>
+        <w:rPr>
+          <w:rFonts w:ascii="Times New Roman" w:hAnsi="Times New Roman" w:cs="Times New Roman" w:eastAsia="Times New Roman"/>
+        </w:rPr>
+        <w:t xml:space="preserve"> </w:t>
+      </w:r>
+      <w:r>
+        <w:rPr>
+          <w:rFonts w:ascii="Times New Roman" w:hAnsi="Times New Roman" w:cs="Times New Roman" w:eastAsia="Times New Roman"/>
+        </w:rPr>
+        <w:t xml:space="preserve">this panel (the "auto" row, byte-identical to the Ne = 175,000 row). Overall R² is maximised at</w:t>
+      </w:r>
+      <w:r>
+        <w:rPr>
+          <w:rFonts w:ascii="Times New Roman" w:hAnsi="Times New Roman" w:cs="Times New Roman" w:eastAsia="Times New Roman"/>
+        </w:rPr>
+        <w:t xml:space="preserve"> </w:t>
+      </w:r>
+      <w:r>
+        <w:rPr>
+          <w:rFonts w:ascii="Times New Roman" w:hAnsi="Times New Roman" w:cs="Times New Roman" w:eastAsia="Times New Roman"/>
+        </w:rPr>
+        <w:t xml:space="preserve">the formula's value; rare variants favour a lower Ne (≈50,000) and common variants a higher one</w:t>
+      </w:r>
+      <w:r>
+        <w:rPr>
+          <w:rFonts w:ascii="Times New Roman" w:hAnsi="Times New Roman" w:cs="Times New Roman" w:eastAsia="Times New Roman"/>
+        </w:rPr>
+        <w:t xml:space="preserve"> </w:t>
+      </w:r>
+      <w:r>
+        <w:rPr>
+          <w:rFonts w:ascii="Times New Roman" w:hAnsi="Times New Roman" w:cs="Times New Roman" w:eastAsia="Times New Roman"/>
+        </w:rPr>
+        <w:t xml:space="preserve">(≈350,000), so the formula's choice balances the rare-common tradeoff. Bold marks each column's</w:t>
+      </w:r>
+      <w:r>
+        <w:rPr>
+          <w:rFonts w:ascii="Times New Roman" w:hAnsi="Times New Roman" w:cs="Times New Roman" w:eastAsia="Times New Roman"/>
+        </w:rPr>
+        <w:t xml:space="preserve"> </w:t>
+      </w:r>
+      <w:r>
+        <w:rPr>
+          <w:rFonts w:ascii="Times New Roman" w:hAnsi="Times New Roman" w:cs="Times New Roman" w:eastAsia="Times New Roman"/>
+        </w:rPr>
+        <w:t xml:space="preserve">maximum.</w:t>
+      </w:r>
+    </w:p>
+    <w:tbl>
+      <w:tblPr>
+        <w:tblStyle w:val="Table"/>
+        <w:jc w:val="center"/>
+        <w:tblLook w:firstRow="1" w:lastRow="0" w:firstColumn="0" w:lastColumn="0" w:noHBand="0" w:noVBand="0" w:val="0020"/>
+        <w:tblBorders>
+          <w:top w:val="single" w:sz="4" w:space="0" w:color="BFBFBF"/>
+          <w:left w:val="single" w:sz="4" w:space="0" w:color="BFBFBF"/>
+          <w:bottom w:val="single" w:sz="4" w:space="0" w:color="BFBFBF"/>
+          <w:right w:val="single" w:sz="4" w:space="0" w:color="BFBFBF"/>
+          <w:insideH w:val="single" w:sz="4" w:space="0" w:color="BFBFBF"/>
+          <w:insideV w:val="single" w:sz="4" w:space="0" w:color="BFBFBF"/>
+        </w:tblBorders>
+        <w:tblLayout w:type="fixed"/>
+        <w:tblW w:type="dxa" w:w="9360"/>
+      </w:tblPr>
+      <w:tblGrid>
+        <w:gridCol w:w="4280"/>
+        <w:gridCol w:w="1205"/>
+        <w:gridCol w:w="890"/>
+        <w:gridCol w:w="890"/>
+        <w:gridCol w:w="1100"/>
+        <w:gridCol w:w="995"/>
+      </w:tblGrid>
+      <w:tr>
+        <w:trPr>
+          <w:tblHeader w:val="on"/>
+        </w:trPr>
+        <w:tc>
+          <w:tcPr>
+            <w:shd w:val="clear" w:color="auto" w:fill="595959"/>
+            <w:vAlign w:val="center"/>
+            <w:tcW w:type="dxa" w:w="4280"/>
+          </w:tcPr>
+          <w:p>
+            <w:pPr>
+              <w:pStyle w:val="Compact"/>
+              <w:jc w:val="center"/>
+            </w:pPr>
+            <w:r>
+              <w:rPr>
+                <w:rFonts w:ascii="Times New Roman" w:hAnsi="Times New Roman" w:cs="Times New Roman" w:eastAsia="Times New Roman"/>
+                <w:b/>
+                <w:color w:val="FFFFFF"/>
+                <w:sz w:val="20"/>
+              </w:rPr>
+              <w:t xml:space="preserve">Ne</w:t>
+            </w:r>
+          </w:p>
+        </w:tc>
+        <w:tc>
+          <w:tcPr>
+            <w:shd w:val="clear" w:color="auto" w:fill="595959"/>
+            <w:vAlign w:val="center"/>
+            <w:tcW w:type="dxa" w:w="1205"/>
+          </w:tcPr>
+          <w:p>
+            <w:pPr>
+              <w:pStyle w:val="Compact"/>
+              <w:jc w:val="center"/>
+            </w:pPr>
+            <w:r>
+              <w:rPr>
+                <w:rFonts w:ascii="Times New Roman" w:hAnsi="Times New Roman" w:cs="Times New Roman" w:eastAsia="Times New Roman"/>
+                <w:b/>
+                <w:color w:val="FFFFFF"/>
+                <w:sz w:val="20"/>
+              </w:rPr>
+              <w:t xml:space="preserve">0.05-0.1% (rare)</w:t>
+            </w:r>
+          </w:p>
+        </w:tc>
+        <w:tc>
+          <w:tcPr>
+            <w:shd w:val="clear" w:color="auto" w:fill="595959"/>
+            <w:vAlign w:val="center"/>
+            <w:tcW w:type="dxa" w:w="890"/>
+          </w:tcPr>
+          <w:p>
+            <w:pPr>
+              <w:pStyle w:val="Compact"/>
+              <w:jc w:val="center"/>
+            </w:pPr>
+            <w:r>
+              <w:rPr>
+                <w:rFonts w:ascii="Times New Roman" w:hAnsi="Times New Roman" w:cs="Times New Roman" w:eastAsia="Times New Roman"/>
+                <w:b/>
+                <w:color w:val="FFFFFF"/>
+                <w:sz w:val="20"/>
+              </w:rPr>
+              <w:t xml:space="preserve">0.5-1%</w:t>
+            </w:r>
+          </w:p>
+        </w:tc>
+        <w:tc>
+          <w:tcPr>
+            <w:shd w:val="clear" w:color="auto" w:fill="595959"/>
+            <w:vAlign w:val="center"/>
+            <w:tcW w:type="dxa" w:w="890"/>
+          </w:tcPr>
+          <w:p>
+            <w:pPr>
+              <w:pStyle w:val="Compact"/>
+              <w:jc w:val="center"/>
+            </w:pPr>
+            <w:r>
+              <w:rPr>
+                <w:rFonts w:ascii="Times New Roman" w:hAnsi="Times New Roman" w:cs="Times New Roman" w:eastAsia="Times New Roman"/>
+                <w:b/>
+                <w:color w:val="FFFFFF"/>
+                <w:sz w:val="20"/>
+              </w:rPr>
+              <w:t xml:space="preserve">2-5%</w:t>
+            </w:r>
+          </w:p>
+        </w:tc>
+        <w:tc>
+          <w:tcPr>
+            <w:shd w:val="clear" w:color="auto" w:fill="595959"/>
+            <w:vAlign w:val="center"/>
+            <w:tcW w:type="dxa" w:w="1100"/>
+          </w:tcPr>
+          <w:p>
+            <w:pPr>
+              <w:pStyle w:val="Compact"/>
+              <w:jc w:val="center"/>
+            </w:pPr>
+            <w:r>
+              <w:rPr>
+                <w:rFonts w:ascii="Times New Roman" w:hAnsi="Times New Roman" w:cs="Times New Roman" w:eastAsia="Times New Roman"/>
+                <w:b/>
+                <w:color w:val="FFFFFF"/>
+                <w:sz w:val="20"/>
+              </w:rPr>
+              <w:t xml:space="preserve">20-50% (common)</w:t>
+            </w:r>
+          </w:p>
+        </w:tc>
+        <w:tc>
+          <w:tcPr>
+            <w:shd w:val="clear" w:color="auto" w:fill="595959"/>
+            <w:vAlign w:val="center"/>
+            <w:tcW w:type="dxa" w:w="995"/>
+          </w:tcPr>
+          <w:p>
+            <w:pPr>
+              <w:pStyle w:val="Compact"/>
+              <w:jc w:val="center"/>
+            </w:pPr>
+            <w:r>
+              <w:rPr>
+                <w:rFonts w:ascii="Times New Roman" w:hAnsi="Times New Roman" w:cs="Times New Roman" w:eastAsia="Times New Roman"/>
+                <w:b/>
+                <w:color w:val="FFFFFF"/>
+                <w:sz w:val="20"/>
+              </w:rPr>
+              <w:t xml:space="preserve">OVERALL</w:t>
+            </w:r>
+          </w:p>
+        </w:tc>
+      </w:tr>
+      <w:tr>
+        <w:tc>
+          <w:tcPr>
+            <w:shd w:val="clear" w:color="auto" w:fill="FFFFFF"/>
+            <w:vAlign w:val="center"/>
+            <w:tcW w:type="dxa" w:w="4280"/>
+          </w:tcPr>
+          <w:p>
+            <w:pPr>
+              <w:pStyle w:val="Compact"/>
+              <w:jc w:val="left"/>
+            </w:pPr>
+            <w:r>
+              <w:rPr>
+                <w:rFonts w:ascii="Times New Roman" w:hAnsi="Times New Roman" w:cs="Times New Roman" w:eastAsia="Times New Roman"/>
+                <w:sz w:val="20"/>
+              </w:rPr>
+              <w:t xml:space="preserve">20,000</w:t>
+            </w:r>
+          </w:p>
+        </w:tc>
+        <w:tc>
+          <w:tcPr>
+            <w:shd w:val="clear" w:color="auto" w:fill="FFFFFF"/>
+            <w:vAlign w:val="center"/>
+            <w:tcW w:type="dxa" w:w="1205"/>
+          </w:tcPr>
+          <w:p>
+            <w:pPr>
+              <w:pStyle w:val="Compact"/>
+              <w:jc w:val="center"/>
+            </w:pPr>
+            <w:r>
+              <w:rPr>
+                <w:rFonts w:ascii="Times New Roman" w:hAnsi="Times New Roman" w:cs="Times New Roman" w:eastAsia="Times New Roman"/>
+                <w:sz w:val="20"/>
+              </w:rPr>
+              <w:t xml:space="preserve">0.2687</w:t>
+            </w:r>
+          </w:p>
+        </w:tc>
+        <w:tc>
+          <w:tcPr>
+            <w:shd w:val="clear" w:color="auto" w:fill="FFFFFF"/>
+            <w:vAlign w:val="center"/>
+            <w:tcW w:type="dxa" w:w="890"/>
+          </w:tcPr>
+          <w:p>
+            <w:pPr>
+              <w:pStyle w:val="Compact"/>
+              <w:jc w:val="center"/>
+            </w:pPr>
+            <w:r>
+              <w:rPr>
+                <w:rFonts w:ascii="Times New Roman" w:hAnsi="Times New Roman" w:cs="Times New Roman" w:eastAsia="Times New Roman"/>
+                <w:sz w:val="20"/>
+              </w:rPr>
+              <w:t xml:space="preserve">0.4884</w:t>
+            </w:r>
+          </w:p>
+        </w:tc>
+        <w:tc>
+          <w:tcPr>
+            <w:shd w:val="clear" w:color="auto" w:fill="FFFFFF"/>
+            <w:vAlign w:val="center"/>
+            <w:tcW w:type="dxa" w:w="890"/>
+          </w:tcPr>
+          <w:p>
+            <w:pPr>
+              <w:pStyle w:val="Compact"/>
+              <w:jc w:val="center"/>
+            </w:pPr>
+            <w:r>
+              <w:rPr>
+                <w:rFonts w:ascii="Times New Roman" w:hAnsi="Times New Roman" w:cs="Times New Roman" w:eastAsia="Times New Roman"/>
+                <w:sz w:val="20"/>
+              </w:rPr>
+              <w:t xml:space="preserve">0.6603</w:t>
+            </w:r>
+          </w:p>
+        </w:tc>
+        <w:tc>
+          <w:tcPr>
+            <w:shd w:val="clear" w:color="auto" w:fill="FFFFFF"/>
+            <w:vAlign w:val="center"/>
+            <w:tcW w:type="dxa" w:w="1100"/>
+          </w:tcPr>
+          <w:p>
+            <w:pPr>
+              <w:pStyle w:val="Compact"/>
+              <w:jc w:val="center"/>
+            </w:pPr>
+            <w:r>
+              <w:rPr>
+                <w:rFonts w:ascii="Times New Roman" w:hAnsi="Times New Roman" w:cs="Times New Roman" w:eastAsia="Times New Roman"/>
+                <w:sz w:val="20"/>
+              </w:rPr>
+              <w:t xml:space="preserve">0.8312</w:t>
+            </w:r>
+          </w:p>
+        </w:tc>
+        <w:tc>
+          <w:tcPr>
+            <w:shd w:val="clear" w:color="auto" w:fill="FFFFFF"/>
+            <w:vAlign w:val="center"/>
+            <w:tcW w:type="dxa" w:w="995"/>
+          </w:tcPr>
+          <w:p>
+            <w:pPr>
+              <w:pStyle w:val="Compact"/>
+              <w:jc w:val="center"/>
+            </w:pPr>
+            <w:r>
+              <w:rPr>
+                <w:rFonts w:ascii="Times New Roman" w:hAnsi="Times New Roman" w:cs="Times New Roman" w:eastAsia="Times New Roman"/>
+                <w:sz w:val="20"/>
+              </w:rPr>
+              <w:t xml:space="preserve">0.4696</w:t>
+            </w:r>
+          </w:p>
+        </w:tc>
+      </w:tr>
+      <w:tr>
+        <w:tc>
+          <w:tcPr>
+            <w:shd w:val="clear" w:color="auto" w:fill="E7E6E6"/>
+            <w:vAlign w:val="center"/>
+            <w:tcW w:type="dxa" w:w="4280"/>
+          </w:tcPr>
+          <w:p>
+            <w:pPr>
+              <w:pStyle w:val="Compact"/>
+              <w:jc w:val="left"/>
+            </w:pPr>
+            <w:r>
+              <w:rPr>
+                <w:rFonts w:ascii="Times New Roman" w:hAnsi="Times New Roman" w:cs="Times New Roman" w:eastAsia="Times New Roman"/>
+                <w:sz w:val="20"/>
+              </w:rPr>
+              <w:t xml:space="preserve">50,000</w:t>
+            </w:r>
+          </w:p>
+        </w:tc>
+        <w:tc>
+          <w:tcPr>
+            <w:shd w:val="clear" w:color="auto" w:fill="E7E6E6"/>
+            <w:vAlign w:val="center"/>
+            <w:tcW w:type="dxa" w:w="1205"/>
+          </w:tcPr>
+          <w:p>
+            <w:pPr>
+              <w:pStyle w:val="Compact"/>
+              <w:jc w:val="center"/>
+            </w:pPr>
+            <w:r>
+              <w:rPr>
+                <w:rFonts w:ascii="Times New Roman" w:hAnsi="Times New Roman" w:cs="Times New Roman" w:eastAsia="Times New Roman"/>
+                <w:b/>
+                <w:bCs/>
+                <w:sz w:val="20"/>
+              </w:rPr>
+              <w:t xml:space="preserve">0.2696</w:t>
+            </w:r>
+          </w:p>
+        </w:tc>
+        <w:tc>
+          <w:tcPr>
+            <w:shd w:val="clear" w:color="auto" w:fill="E7E6E6"/>
+            <w:vAlign w:val="center"/>
+            <w:tcW w:type="dxa" w:w="890"/>
+          </w:tcPr>
+          <w:p>
+            <w:pPr>
+              <w:pStyle w:val="Compact"/>
+              <w:jc w:val="center"/>
+            </w:pPr>
+            <w:r>
+              <w:rPr>
+                <w:rFonts w:ascii="Times New Roman" w:hAnsi="Times New Roman" w:cs="Times New Roman" w:eastAsia="Times New Roman"/>
+                <w:sz w:val="20"/>
+              </w:rPr>
+              <w:t xml:space="preserve">0.4959</w:t>
+            </w:r>
+          </w:p>
+        </w:tc>
+        <w:tc>
+          <w:tcPr>
+            <w:shd w:val="clear" w:color="auto" w:fill="E7E6E6"/>
+            <w:vAlign w:val="center"/>
+            <w:tcW w:type="dxa" w:w="890"/>
+          </w:tcPr>
+          <w:p>
+            <w:pPr>
+              <w:pStyle w:val="Compact"/>
+              <w:jc w:val="center"/>
+            </w:pPr>
+            <w:r>
+              <w:rPr>
+                <w:rFonts w:ascii="Times New Roman" w:hAnsi="Times New Roman" w:cs="Times New Roman" w:eastAsia="Times New Roman"/>
+                <w:sz w:val="20"/>
+              </w:rPr>
+              <w:t xml:space="preserve">0.6671</w:t>
+            </w:r>
+          </w:p>
+        </w:tc>
+        <w:tc>
+          <w:tcPr>
+            <w:shd w:val="clear" w:color="auto" w:fill="E7E6E6"/>
+            <w:vAlign w:val="center"/>
+            <w:tcW w:type="dxa" w:w="1100"/>
+          </w:tcPr>
+          <w:p>
+            <w:pPr>
+              <w:pStyle w:val="Compact"/>
+              <w:jc w:val="center"/>
+            </w:pPr>
+            <w:r>
+              <w:rPr>
+                <w:rFonts w:ascii="Times New Roman" w:hAnsi="Times New Roman" w:cs="Times New Roman" w:eastAsia="Times New Roman"/>
+                <w:sz w:val="20"/>
+              </w:rPr>
+              <w:t xml:space="preserve">0.8361</w:t>
+            </w:r>
+          </w:p>
+        </w:tc>
+        <w:tc>
+          <w:tcPr>
+            <w:shd w:val="clear" w:color="auto" w:fill="E7E6E6"/>
+            <w:vAlign w:val="center"/>
+            <w:tcW w:type="dxa" w:w="995"/>
+          </w:tcPr>
+          <w:p>
+            <w:pPr>
+              <w:pStyle w:val="Compact"/>
+              <w:jc w:val="center"/>
+            </w:pPr>
+            <w:r>
+              <w:rPr>
+                <w:rFonts w:ascii="Times New Roman" w:hAnsi="Times New Roman" w:cs="Times New Roman" w:eastAsia="Times New Roman"/>
+                <w:sz w:val="20"/>
+              </w:rPr>
+              <w:t xml:space="preserve">0.4742</w:t>
+            </w:r>
+          </w:p>
+        </w:tc>
+      </w:tr>
+      <w:tr>
+        <w:tc>
+          <w:tcPr>
+            <w:shd w:val="clear" w:color="auto" w:fill="FFFFFF"/>
+            <w:vAlign w:val="center"/>
+            <w:tcW w:type="dxa" w:w="4280"/>
+          </w:tcPr>
+          <w:p>
+            <w:pPr>
+              <w:pStyle w:val="Compact"/>
+              <w:jc w:val="left"/>
+            </w:pPr>
+            <w:r>
+              <w:rPr>
+                <w:rFonts w:ascii="Times New Roman" w:hAnsi="Times New Roman" w:cs="Times New Roman" w:eastAsia="Times New Roman"/>
+                <w:sz w:val="20"/>
+              </w:rPr>
+              <w:t xml:space="preserve">100,000</w:t>
+            </w:r>
+          </w:p>
+        </w:tc>
+        <w:tc>
+          <w:tcPr>
+            <w:shd w:val="clear" w:color="auto" w:fill="FFFFFF"/>
+            <w:vAlign w:val="center"/>
+            <w:tcW w:type="dxa" w:w="1205"/>
+          </w:tcPr>
+          <w:p>
+            <w:pPr>
+              <w:pStyle w:val="Compact"/>
+              <w:jc w:val="center"/>
+            </w:pPr>
+            <w:r>
+              <w:rPr>
+                <w:rFonts w:ascii="Times New Roman" w:hAnsi="Times New Roman" w:cs="Times New Roman" w:eastAsia="Times New Roman"/>
+                <w:sz w:val="20"/>
+              </w:rPr>
+              <w:t xml:space="preserve">0.2688</w:t>
+            </w:r>
+          </w:p>
+        </w:tc>
+        <w:tc>
+          <w:tcPr>
+            <w:shd w:val="clear" w:color="auto" w:fill="FFFFFF"/>
+            <w:vAlign w:val="center"/>
+            <w:tcW w:type="dxa" w:w="890"/>
+          </w:tcPr>
+          <w:p>
+            <w:pPr>
+              <w:pStyle w:val="Compact"/>
+              <w:jc w:val="center"/>
+            </w:pPr>
+            <w:r>
+              <w:rPr>
+                <w:rFonts w:ascii="Times New Roman" w:hAnsi="Times New Roman" w:cs="Times New Roman" w:eastAsia="Times New Roman"/>
+                <w:sz w:val="20"/>
+              </w:rPr>
+              <w:t xml:space="preserve">0.5009</w:t>
+            </w:r>
+          </w:p>
+        </w:tc>
+        <w:tc>
+          <w:tcPr>
+            <w:shd w:val="clear" w:color="auto" w:fill="FFFFFF"/>
+            <w:vAlign w:val="center"/>
+            <w:tcW w:type="dxa" w:w="890"/>
+          </w:tcPr>
+          <w:p>
+            <w:pPr>
+              <w:pStyle w:val="Compact"/>
+              <w:jc w:val="center"/>
+            </w:pPr>
+            <w:r>
+              <w:rPr>
+                <w:rFonts w:ascii="Times New Roman" w:hAnsi="Times New Roman" w:cs="Times New Roman" w:eastAsia="Times New Roman"/>
+                <w:sz w:val="20"/>
+              </w:rPr>
+              <w:t xml:space="preserve">0.6719</w:t>
+            </w:r>
+          </w:p>
+        </w:tc>
+        <w:tc>
+          <w:tcPr>
+            <w:shd w:val="clear" w:color="auto" w:fill="FFFFFF"/>
+            <w:vAlign w:val="center"/>
+            <w:tcW w:type="dxa" w:w="1100"/>
+          </w:tcPr>
+          <w:p>
+            <w:pPr>
+              <w:pStyle w:val="Compact"/>
+              <w:jc w:val="center"/>
+            </w:pPr>
+            <w:r>
+              <w:rPr>
+                <w:rFonts w:ascii="Times New Roman" w:hAnsi="Times New Roman" w:cs="Times New Roman" w:eastAsia="Times New Roman"/>
+                <w:sz w:val="20"/>
+              </w:rPr>
+              <w:t xml:space="preserve">0.8396</w:t>
+            </w:r>
+          </w:p>
+        </w:tc>
+        <w:tc>
+          <w:tcPr>
+            <w:shd w:val="clear" w:color="auto" w:fill="FFFFFF"/>
+            <w:vAlign w:val="center"/>
+            <w:tcW w:type="dxa" w:w="995"/>
+          </w:tcPr>
+          <w:p>
+            <w:pPr>
+              <w:pStyle w:val="Compact"/>
+              <w:jc w:val="center"/>
+            </w:pPr>
+            <w:r>
+              <w:rPr>
+                <w:rFonts w:ascii="Times New Roman" w:hAnsi="Times New Roman" w:cs="Times New Roman" w:eastAsia="Times New Roman"/>
+                <w:sz w:val="20"/>
+              </w:rPr>
+              <w:t xml:space="preserve">0.4769</w:t>
+            </w:r>
+          </w:p>
+        </w:tc>
+      </w:tr>
+      <w:tr>
+        <w:tc>
+          <w:tcPr>
+            <w:shd w:val="clear" w:color="auto" w:fill="E7E6E6"/>
+            <w:vAlign w:val="center"/>
+            <w:tcW w:type="dxa" w:w="4280"/>
+          </w:tcPr>
+          <w:p>
+            <w:pPr>
+              <w:pStyle w:val="Compact"/>
+              <w:jc w:val="left"/>
+            </w:pPr>
+            <w:r>
+              <w:rPr>
+                <w:rFonts w:ascii="Times New Roman" w:hAnsi="Times New Roman" w:cs="Times New Roman" w:eastAsia="Times New Roman"/>
+                <w:sz w:val="20"/>
+              </w:rPr>
+              <w:t xml:space="preserve">175,000 (formula / auto)</w:t>
+            </w:r>
+          </w:p>
+        </w:tc>
+        <w:tc>
+          <w:tcPr>
+            <w:shd w:val="clear" w:color="auto" w:fill="E7E6E6"/>
+            <w:vAlign w:val="center"/>
+            <w:tcW w:type="dxa" w:w="1205"/>
+          </w:tcPr>
+          <w:p>
+            <w:pPr>
+              <w:pStyle w:val="Compact"/>
+              <w:jc w:val="center"/>
+            </w:pPr>
+            <w:r>
+              <w:rPr>
+                <w:rFonts w:ascii="Times New Roman" w:hAnsi="Times New Roman" w:cs="Times New Roman" w:eastAsia="Times New Roman"/>
+                <w:sz w:val="20"/>
+              </w:rPr>
+              <w:t xml:space="preserve">0.2661</w:t>
+            </w:r>
+          </w:p>
+        </w:tc>
+        <w:tc>
+          <w:tcPr>
+            <w:shd w:val="clear" w:color="auto" w:fill="E7E6E6"/>
+            <w:vAlign w:val="center"/>
+            <w:tcW w:type="dxa" w:w="890"/>
+          </w:tcPr>
+          <w:p>
+            <w:pPr>
+              <w:pStyle w:val="Compact"/>
+              <w:jc w:val="center"/>
+            </w:pPr>
+            <w:r>
+              <w:rPr>
+                <w:rFonts w:ascii="Times New Roman" w:hAnsi="Times New Roman" w:cs="Times New Roman" w:eastAsia="Times New Roman"/>
+                <w:b/>
+                <w:bCs/>
+                <w:sz w:val="20"/>
+              </w:rPr>
+              <w:t xml:space="preserve">0.5033</w:t>
+            </w:r>
+          </w:p>
+        </w:tc>
+        <w:tc>
+          <w:tcPr>
+            <w:shd w:val="clear" w:color="auto" w:fill="E7E6E6"/>
+            <w:vAlign w:val="center"/>
+            <w:tcW w:type="dxa" w:w="890"/>
+          </w:tcPr>
+          <w:p>
+            <w:pPr>
+              <w:pStyle w:val="Compact"/>
+              <w:jc w:val="center"/>
+            </w:pPr>
+            <w:r>
+              <w:rPr>
+                <w:rFonts w:ascii="Times New Roman" w:hAnsi="Times New Roman" w:cs="Times New Roman" w:eastAsia="Times New Roman"/>
+                <w:sz w:val="20"/>
+              </w:rPr>
+              <w:t xml:space="preserve">0.6749</w:t>
+            </w:r>
+          </w:p>
+        </w:tc>
+        <w:tc>
+          <w:tcPr>
+            <w:shd w:val="clear" w:color="auto" w:fill="E7E6E6"/>
+            <w:vAlign w:val="center"/>
+            <w:tcW w:type="dxa" w:w="1100"/>
+          </w:tcPr>
+          <w:p>
+            <w:pPr>
+              <w:pStyle w:val="Compact"/>
+              <w:jc w:val="center"/>
+            </w:pPr>
+            <w:r>
+              <w:rPr>
+                <w:rFonts w:ascii="Times New Roman" w:hAnsi="Times New Roman" w:cs="Times New Roman" w:eastAsia="Times New Roman"/>
+                <w:sz w:val="20"/>
+              </w:rPr>
+              <w:t xml:space="preserve">0.8418</w:t>
+            </w:r>
+          </w:p>
+        </w:tc>
+        <w:tc>
+          <w:tcPr>
+            <w:shd w:val="clear" w:color="auto" w:fill="E7E6E6"/>
+            <w:vAlign w:val="center"/>
+            <w:tcW w:type="dxa" w:w="995"/>
+          </w:tcPr>
+          <w:p>
+            <w:pPr>
+              <w:pStyle w:val="Compact"/>
+              <w:jc w:val="center"/>
+            </w:pPr>
+            <w:r>
+              <w:rPr>
+                <w:rFonts w:ascii="Times New Roman" w:hAnsi="Times New Roman" w:cs="Times New Roman" w:eastAsia="Times New Roman"/>
+                <w:b/>
+                <w:bCs/>
+                <w:sz w:val="20"/>
+              </w:rPr>
+              <w:t xml:space="preserve">0.4776</w:t>
+            </w:r>
+          </w:p>
+        </w:tc>
+      </w:tr>
+      <w:tr>
+        <w:tc>
+          <w:tcPr>
+            <w:shd w:val="clear" w:color="auto" w:fill="FFFFFF"/>
+            <w:vAlign w:val="center"/>
+            <w:tcW w:type="dxa" w:w="4280"/>
+          </w:tcPr>
+          <w:p>
+            <w:pPr>
+              <w:pStyle w:val="Compact"/>
+              <w:jc w:val="left"/>
+            </w:pPr>
+            <w:r>
+              <w:rPr>
+                <w:rFonts w:ascii="Times New Roman" w:hAnsi="Times New Roman" w:cs="Times New Roman" w:eastAsia="Times New Roman"/>
+                <w:sz w:val="20"/>
+              </w:rPr>
+              <w:t xml:space="preserve">350,000</w:t>
+            </w:r>
+          </w:p>
+        </w:tc>
+        <w:tc>
+          <w:tcPr>
+            <w:shd w:val="clear" w:color="auto" w:fill="FFFFFF"/>
+            <w:vAlign w:val="center"/>
+            <w:tcW w:type="dxa" w:w="1205"/>
+          </w:tcPr>
+          <w:p>
+            <w:pPr>
+              <w:pStyle w:val="Compact"/>
+              <w:jc w:val="center"/>
+            </w:pPr>
+            <w:r>
+              <w:rPr>
+                <w:rFonts w:ascii="Times New Roman" w:hAnsi="Times New Roman" w:cs="Times New Roman" w:eastAsia="Times New Roman"/>
+                <w:sz w:val="20"/>
+              </w:rPr>
+              <w:t xml:space="preserve">0.2587</w:t>
+            </w:r>
+          </w:p>
+        </w:tc>
+        <w:tc>
+          <w:tcPr>
+            <w:shd w:val="clear" w:color="auto" w:fill="FFFFFF"/>
+            <w:vAlign w:val="center"/>
+            <w:tcW w:type="dxa" w:w="890"/>
+          </w:tcPr>
+          <w:p>
+            <w:pPr>
+              <w:pStyle w:val="Compact"/>
+              <w:jc w:val="center"/>
+            </w:pPr>
+            <w:r>
+              <w:rPr>
+                <w:rFonts w:ascii="Times New Roman" w:hAnsi="Times New Roman" w:cs="Times New Roman" w:eastAsia="Times New Roman"/>
+                <w:sz w:val="20"/>
+              </w:rPr>
+              <w:t xml:space="preserve">0.5026</w:t>
+            </w:r>
+          </w:p>
+        </w:tc>
+        <w:tc>
+          <w:tcPr>
+            <w:shd w:val="clear" w:color="auto" w:fill="FFFFFF"/>
+            <w:vAlign w:val="center"/>
+            <w:tcW w:type="dxa" w:w="890"/>
+          </w:tcPr>
+          <w:p>
+            <w:pPr>
+              <w:pStyle w:val="Compact"/>
+              <w:jc w:val="center"/>
+            </w:pPr>
+            <w:r>
+              <w:rPr>
+                <w:rFonts w:ascii="Times New Roman" w:hAnsi="Times New Roman" w:cs="Times New Roman" w:eastAsia="Times New Roman"/>
+                <w:b/>
+                <w:bCs/>
+                <w:sz w:val="20"/>
+              </w:rPr>
+              <w:t xml:space="preserve">0.6762</w:t>
+            </w:r>
+          </w:p>
+        </w:tc>
+        <w:tc>
+          <w:tcPr>
+            <w:shd w:val="clear" w:color="auto" w:fill="FFFFFF"/>
+            <w:vAlign w:val="center"/>
+            <w:tcW w:type="dxa" w:w="1100"/>
+          </w:tcPr>
+          <w:p>
+            <w:pPr>
+              <w:pStyle w:val="Compact"/>
+              <w:jc w:val="center"/>
+            </w:pPr>
+            <w:r>
+              <w:rPr>
+                <w:rFonts w:ascii="Times New Roman" w:hAnsi="Times New Roman" w:cs="Times New Roman" w:eastAsia="Times New Roman"/>
+                <w:b/>
+                <w:bCs/>
+                <w:sz w:val="20"/>
+              </w:rPr>
+              <w:t xml:space="preserve">0.8430</w:t>
+            </w:r>
+          </w:p>
+        </w:tc>
+        <w:tc>
+          <w:tcPr>
+            <w:shd w:val="clear" w:color="auto" w:fill="FFFFFF"/>
+            <w:vAlign w:val="center"/>
+            <w:tcW w:type="dxa" w:w="995"/>
+          </w:tcPr>
+          <w:p>
+            <w:pPr>
+              <w:pStyle w:val="Compact"/>
+              <w:jc w:val="center"/>
+            </w:pPr>
+            <w:r>
+              <w:rPr>
+                <w:rFonts w:ascii="Times New Roman" w:hAnsi="Times New Roman" w:cs="Times New Roman" w:eastAsia="Times New Roman"/>
+                <w:sz w:val="20"/>
+              </w:rPr>
+              <w:t xml:space="preserve">0.4749</w:t>
+            </w:r>
+          </w:p>
+        </w:tc>
+      </w:tr>
+      <w:tr>
+        <w:tc>
+          <w:tcPr>
+            <w:shd w:val="clear" w:color="auto" w:fill="E7E6E6"/>
+            <w:vAlign w:val="center"/>
+            <w:tcW w:type="dxa" w:w="4280"/>
+          </w:tcPr>
+          <w:p>
+            <w:pPr>
+              <w:pStyle w:val="Compact"/>
+              <w:jc w:val="left"/>
+            </w:pPr>
+            <w:r>
+              <w:rPr>
+                <w:rFonts w:ascii="Times New Roman" w:hAnsi="Times New Roman" w:cs="Times New Roman" w:eastAsia="Times New Roman"/>
+                <w:sz w:val="20"/>
+              </w:rPr>
+              <w:t xml:space="preserve">700,000</w:t>
+            </w:r>
+          </w:p>
+        </w:tc>
+        <w:tc>
+          <w:tcPr>
+            <w:shd w:val="clear" w:color="auto" w:fill="E7E6E6"/>
+            <w:vAlign w:val="center"/>
+            <w:tcW w:type="dxa" w:w="1205"/>
+          </w:tcPr>
+          <w:p>
+            <w:pPr>
+              <w:pStyle w:val="Compact"/>
+              <w:jc w:val="center"/>
+            </w:pPr>
+            <w:r>
+              <w:rPr>
+                <w:rFonts w:ascii="Times New Roman" w:hAnsi="Times New Roman" w:cs="Times New Roman" w:eastAsia="Times New Roman"/>
+                <w:sz w:val="20"/>
+              </w:rPr>
+              <w:t xml:space="preserve">0.2452</w:t>
+            </w:r>
+          </w:p>
+        </w:tc>
+        <w:tc>
+          <w:tcPr>
+            <w:shd w:val="clear" w:color="auto" w:fill="E7E6E6"/>
+            <w:vAlign w:val="center"/>
+            <w:tcW w:type="dxa" w:w="890"/>
+          </w:tcPr>
+          <w:p>
+            <w:pPr>
+              <w:pStyle w:val="Compact"/>
+              <w:jc w:val="center"/>
+            </w:pPr>
+            <w:r>
+              <w:rPr>
+                <w:rFonts w:ascii="Times New Roman" w:hAnsi="Times New Roman" w:cs="Times New Roman" w:eastAsia="Times New Roman"/>
+                <w:sz w:val="20"/>
+              </w:rPr>
+              <w:t xml:space="preserve">0.4963</w:t>
+            </w:r>
+          </w:p>
+        </w:tc>
+        <w:tc>
+          <w:tcPr>
+            <w:shd w:val="clear" w:color="auto" w:fill="E7E6E6"/>
+            <w:vAlign w:val="center"/>
+            <w:tcW w:type="dxa" w:w="890"/>
+          </w:tcPr>
+          <w:p>
+            <w:pPr>
+              <w:pStyle w:val="Compact"/>
+              <w:jc w:val="center"/>
+            </w:pPr>
+            <w:r>
+              <w:rPr>
+                <w:rFonts w:ascii="Times New Roman" w:hAnsi="Times New Roman" w:cs="Times New Roman" w:eastAsia="Times New Roman"/>
+                <w:sz w:val="20"/>
+              </w:rPr>
+              <w:t xml:space="preserve">0.6741</w:t>
+            </w:r>
+          </w:p>
+        </w:tc>
+        <w:tc>
+          <w:tcPr>
+            <w:shd w:val="clear" w:color="auto" w:fill="E7E6E6"/>
+            <w:vAlign w:val="center"/>
+            <w:tcW w:type="dxa" w:w="1100"/>
+          </w:tcPr>
+          <w:p>
+            <w:pPr>
+              <w:pStyle w:val="Compact"/>
+              <w:jc w:val="center"/>
+            </w:pPr>
+            <w:r>
+              <w:rPr>
+                <w:rFonts w:ascii="Times New Roman" w:hAnsi="Times New Roman" w:cs="Times New Roman" w:eastAsia="Times New Roman"/>
+                <w:sz w:val="20"/>
+              </w:rPr>
+              <w:t xml:space="preserve">0.8424</w:t>
+            </w:r>
+          </w:p>
+        </w:tc>
+        <w:tc>
+          <w:tcPr>
+            <w:shd w:val="clear" w:color="auto" w:fill="E7E6E6"/>
+            <w:vAlign w:val="center"/>
+            <w:tcW w:type="dxa" w:w="995"/>
+          </w:tcPr>
+          <w:p>
+            <w:pPr>
+              <w:pStyle w:val="Compact"/>
+              <w:jc w:val="center"/>
+            </w:pPr>
+            <w:r>
+              <w:rPr>
+                <w:rFonts w:ascii="Times New Roman" w:hAnsi="Times New Roman" w:cs="Times New Roman" w:eastAsia="Times New Roman"/>
+                <w:sz w:val="20"/>
+              </w:rPr>
+              <w:t xml:space="preserve">0.4670</w:t>
+            </w:r>
+          </w:p>
+        </w:tc>
+      </w:tr>
+      <w:tr>
+        <w:tc>
+          <w:tcPr>
+            <w:shd w:val="clear" w:color="auto" w:fill="FFFFFF"/>
+            <w:vAlign w:val="center"/>
+            <w:tcW w:type="dxa" w:w="4280"/>
+          </w:tcPr>
+          <w:p>
+            <w:pPr>
+              <w:pStyle w:val="Compact"/>
+              <w:jc w:val="left"/>
+            </w:pPr>
+            <w:r>
+              <w:rPr>
+                <w:rFonts w:ascii="Times New Roman" w:hAnsi="Times New Roman" w:cs="Times New Roman" w:eastAsia="Times New Roman"/>
+                <w:sz w:val="20"/>
+              </w:rPr>
+              <w:t xml:space="preserve">1,400,000</w:t>
+            </w:r>
+          </w:p>
+        </w:tc>
+        <w:tc>
+          <w:tcPr>
+            <w:shd w:val="clear" w:color="auto" w:fill="FFFFFF"/>
+            <w:vAlign w:val="center"/>
+            <w:tcW w:type="dxa" w:w="1205"/>
+          </w:tcPr>
+          <w:p>
+            <w:pPr>
+              <w:pStyle w:val="Compact"/>
+              <w:jc w:val="center"/>
+            </w:pPr>
+            <w:r>
+              <w:rPr>
+                <w:rFonts w:ascii="Times New Roman" w:hAnsi="Times New Roman" w:cs="Times New Roman" w:eastAsia="Times New Roman"/>
+                <w:sz w:val="20"/>
+              </w:rPr>
+              <w:t xml:space="preserve">0.2282</w:t>
+            </w:r>
+          </w:p>
+        </w:tc>
+        <w:tc>
+          <w:tcPr>
+            <w:shd w:val="clear" w:color="auto" w:fill="FFFFFF"/>
+            <w:vAlign w:val="center"/>
+            <w:tcW w:type="dxa" w:w="890"/>
+          </w:tcPr>
+          <w:p>
+            <w:pPr>
+              <w:pStyle w:val="Compact"/>
+              <w:jc w:val="center"/>
+            </w:pPr>
+            <w:r>
+              <w:rPr>
+                <w:rFonts w:ascii="Times New Roman" w:hAnsi="Times New Roman" w:cs="Times New Roman" w:eastAsia="Times New Roman"/>
+                <w:sz w:val="20"/>
+              </w:rPr>
+              <w:t xml:space="preserve">0.4858</w:t>
+            </w:r>
+          </w:p>
+        </w:tc>
+        <w:tc>
+          <w:tcPr>
+            <w:shd w:val="clear" w:color="auto" w:fill="FFFFFF"/>
+            <w:vAlign w:val="center"/>
+            <w:tcW w:type="dxa" w:w="890"/>
+          </w:tcPr>
+          <w:p>
+            <w:pPr>
+              <w:pStyle w:val="Compact"/>
+              <w:jc w:val="center"/>
+            </w:pPr>
+            <w:r>
+              <w:rPr>
+                <w:rFonts w:ascii="Times New Roman" w:hAnsi="Times New Roman" w:cs="Times New Roman" w:eastAsia="Times New Roman"/>
+                <w:sz w:val="20"/>
+              </w:rPr>
+              <w:t xml:space="preserve">0.6690</w:t>
+            </w:r>
+          </w:p>
+        </w:tc>
+        <w:tc>
+          <w:tcPr>
+            <w:shd w:val="clear" w:color="auto" w:fill="FFFFFF"/>
+            <w:vAlign w:val="center"/>
+            <w:tcW w:type="dxa" w:w="1100"/>
+          </w:tcPr>
+          <w:p>
+            <w:pPr>
+              <w:pStyle w:val="Compact"/>
+              <w:jc w:val="center"/>
+            </w:pPr>
+            <w:r>
+              <w:rPr>
+                <w:rFonts w:ascii="Times New Roman" w:hAnsi="Times New Roman" w:cs="Times New Roman" w:eastAsia="Times New Roman"/>
+                <w:sz w:val="20"/>
+              </w:rPr>
+              <w:t xml:space="preserve">0.8403</w:t>
+            </w:r>
+          </w:p>
+        </w:tc>
+        <w:tc>
+          <w:tcPr>
+            <w:shd w:val="clear" w:color="auto" w:fill="FFFFFF"/>
+            <w:vAlign w:val="center"/>
+            <w:tcW w:type="dxa" w:w="995"/>
+          </w:tcPr>
+          <w:p>
+            <w:pPr>
+              <w:pStyle w:val="Compact"/>
+              <w:jc w:val="center"/>
+            </w:pPr>
+            <w:r>
+              <w:rPr>
+                <w:rFonts w:ascii="Times New Roman" w:hAnsi="Times New Roman" w:cs="Times New Roman" w:eastAsia="Times New Roman"/>
+                <w:sz w:val="20"/>
+              </w:rPr>
+              <w:t xml:space="preserve">0.4554</w:t>
             </w:r>
           </w:p>
         </w:tc>

</xml_diff>

<commit_message>
paper: add Selphi 1.5.3 (chr22, impute-only) column to Table 1
Adds the original Selphi 1.5.3 as an impute-only comparator alongside IMPUTE5/Minimac4 in Table 1
(chr22). Bold stays on the best full-pipeline result (Selphi 2/Beagle); caption notes the
impute-only mode and points to Table S12 for the like-for-like Selphi-2-vs-1.5.3 comparison.
</commit_message>
<xml_diff>
--- a/paper/selphi2_paper.docx
+++ b/paper/selphi2_paper.docx
@@ -7939,39 +7939,7 @@
         <w:rPr>
           <w:rFonts w:ascii="Times New Roman" w:hAnsi="Times New Roman" w:cs="Times New Roman" w:eastAsia="Times New Roman"/>
         </w:rPr>
-        <w:t xml:space="preserve">between imputed dosage and whole-genome-sequenced truth, computed at variants in the indicated MAF bin (frequencies in the 1000 Genomes reference panel). n = 801 held-out samples per chromosome; full-pipeline mode (unphased target chip in, imputed dosage out); Selphi 2 uses its default diploid phasing engine. IMPUTE5 and Minimac4 were each given the identical phased target and the identical 1000 Genomes reference panel and were evaluated on chromosome 22; Beagle 5.5 and Selphi 2 were additionally evaluated on chromosome 1. Bold marks the highest</w:t>
-      </w:r>
-      <w:r>
-        <w:rPr>
-          <w:rFonts w:ascii="Times New Roman" w:hAnsi="Times New Roman" w:cs="Times New Roman" w:eastAsia="Times New Roman"/>
-        </w:rPr>
-        <w:t xml:space="preserve"> </w:t>
-      </w:r>
-      <m:oMath>
-        <m:sSup>
-          <m:e>
-            <m:r>
-              <m:t>R</m:t>
-            </m:r>
-          </m:e>
-          <m:sup>
-            <m:r>
-              <m:t>2</m:t>
-            </m:r>
-          </m:sup>
-        </m:sSup>
-      </m:oMath>
-      <w:r>
-        <w:rPr>
-          <w:rFonts w:ascii="Times New Roman" w:hAnsi="Times New Roman" w:cs="Times New Roman" w:eastAsia="Times New Roman"/>
-        </w:rPr>
-        <w:t xml:space="preserve"> </w:t>
-      </w:r>
-      <w:r>
-        <w:rPr>
-          <w:rFonts w:ascii="Times New Roman" w:hAnsi="Times New Roman" w:cs="Times New Roman" w:eastAsia="Times New Roman"/>
-        </w:rPr>
-        <w:t xml:space="preserve">in each chromosome group.</w:t>
+        <w:t xml:space="preserve">between imputed dosage and whole-genome-sequenced truth, computed at variants in the indicated MAF bin (frequencies in the 1000 Genomes reference panel). n = 801 held-out samples per chromosome; full-pipeline mode (unphased target chip in, imputed dosage out); Selphi 2 uses its default diploid phasing engine. IMPUTE5, Minimac4 and the original Selphi 1.5.3 are impute-only, run on the identical phased target and 1000 Genomes reference panel (Selphi 1.5.3 requires pre-phased input) and evaluated on chromosome 22 (Selphi 1.5.3 also on chromosome 1); Selphi 2 and Beagle 5.5 are the full unphased-to-imputed pipeline, both additionally evaluated on chromosome 1. Bold marks the best full-pipeline result (Selphi 2 or Beagle 5.5) in each chromosome group; at common bins the impute-only tools can marginally exceed it because they are handed a high-quality phasing rather than performing their own, so the like-for-like impute-only comparison of the two Selphi versions is given separately in Supplementary Table S12.</w:t>
       </w:r>
     </w:p>
     <w:tbl>
@@ -7991,13 +7959,14 @@
         <w:tblW w:type="dxa" w:w="9360"/>
       </w:tblPr>
       <w:tblGrid>
-        <w:gridCol w:w="1647"/>
-        <w:gridCol w:w="1214"/>
-        <w:gridCol w:w="1214"/>
-        <w:gridCol w:w="1357"/>
-        <w:gridCol w:w="1500"/>
-        <w:gridCol w:w="1214"/>
-        <w:gridCol w:w="1214"/>
+        <w:gridCol w:w="1461"/>
+        <w:gridCol w:w="1074"/>
+        <w:gridCol w:w="1074"/>
+        <w:gridCol w:w="1201"/>
+        <w:gridCol w:w="1328"/>
+        <w:gridCol w:w="1074"/>
+        <w:gridCol w:w="1074"/>
+        <w:gridCol w:w="1074"/>
       </w:tblGrid>
       <w:tr>
         <w:trPr>
@@ -8007,7 +7976,7 @@
           <w:tcPr>
             <w:shd w:val="clear" w:color="auto" w:fill="595959"/>
             <w:vAlign w:val="center"/>
-            <w:tcW w:type="dxa" w:w="1647"/>
+            <w:tcW w:type="dxa" w:w="1461"/>
           </w:tcPr>
           <w:p>
             <w:pPr>
@@ -8029,7 +7998,7 @@
           <w:tcPr>
             <w:shd w:val="clear" w:color="auto" w:fill="595959"/>
             <w:vAlign w:val="center"/>
-            <w:tcW w:type="dxa" w:w="1214"/>
+            <w:tcW w:type="dxa" w:w="1074"/>
           </w:tcPr>
           <w:p>
             <w:pPr>
@@ -8051,7 +8020,7 @@
           <w:tcPr>
             <w:shd w:val="clear" w:color="auto" w:fill="595959"/>
             <w:vAlign w:val="center"/>
-            <w:tcW w:type="dxa" w:w="1214"/>
+            <w:tcW w:type="dxa" w:w="1074"/>
           </w:tcPr>
           <w:p>
             <w:pPr>
@@ -8073,7 +8042,7 @@
           <w:tcPr>
             <w:shd w:val="clear" w:color="auto" w:fill="595959"/>
             <w:vAlign w:val="center"/>
-            <w:tcW w:type="dxa" w:w="1357"/>
+            <w:tcW w:type="dxa" w:w="1201"/>
           </w:tcPr>
           <w:p>
             <w:pPr>
@@ -8095,7 +8064,7 @@
           <w:tcPr>
             <w:shd w:val="clear" w:color="auto" w:fill="595959"/>
             <w:vAlign w:val="center"/>
-            <w:tcW w:type="dxa" w:w="1500"/>
+            <w:tcW w:type="dxa" w:w="1328"/>
           </w:tcPr>
           <w:p>
             <w:pPr>
@@ -8117,7 +8086,7 @@
           <w:tcPr>
             <w:shd w:val="clear" w:color="auto" w:fill="595959"/>
             <w:vAlign w:val="center"/>
-            <w:tcW w:type="dxa" w:w="1214"/>
+            <w:tcW w:type="dxa" w:w="1074"/>
           </w:tcPr>
           <w:p>
             <w:pPr>
@@ -8131,7 +8100,7 @@
                 <w:color w:val="FFFFFF"/>
                 <w:sz w:val="20"/>
               </w:rPr>
-              <w:t xml:space="preserve">chr1 Selphi 2</w:t>
+              <w:t xml:space="preserve">chr22 Selphi 1.5.3</w:t>
             </w:r>
           </w:p>
         </w:tc>
@@ -8139,7 +8108,7 @@
           <w:tcPr>
             <w:shd w:val="clear" w:color="auto" w:fill="595959"/>
             <w:vAlign w:val="center"/>
-            <w:tcW w:type="dxa" w:w="1214"/>
+            <w:tcW w:type="dxa" w:w="1074"/>
           </w:tcPr>
           <w:p>
             <w:pPr>
@@ -8153,6 +8122,28 @@
                 <w:color w:val="FFFFFF"/>
                 <w:sz w:val="20"/>
               </w:rPr>
+              <w:t xml:space="preserve">chr1 Selphi 2</w:t>
+            </w:r>
+          </w:p>
+        </w:tc>
+        <w:tc>
+          <w:tcPr>
+            <w:shd w:val="clear" w:color="auto" w:fill="595959"/>
+            <w:vAlign w:val="center"/>
+            <w:tcW w:type="dxa" w:w="1074"/>
+          </w:tcPr>
+          <w:p>
+            <w:pPr>
+              <w:pStyle w:val="Compact"/>
+              <w:jc w:val="center"/>
+            </w:pPr>
+            <w:r>
+              <w:rPr>
+                <w:rFonts w:ascii="Times New Roman" w:hAnsi="Times New Roman" w:cs="Times New Roman" w:eastAsia="Times New Roman"/>
+                <w:b/>
+                <w:color w:val="FFFFFF"/>
+                <w:sz w:val="20"/>
+              </w:rPr>
               <w:t xml:space="preserve">chr1 Beagle 5.5</w:t>
             </w:r>
           </w:p>
@@ -8163,7 +8154,7 @@
           <w:tcPr>
             <w:shd w:val="clear" w:color="auto" w:fill="FFFFFF"/>
             <w:vAlign w:val="center"/>
-            <w:tcW w:type="dxa" w:w="1647"/>
+            <w:tcW w:type="dxa" w:w="1461"/>
           </w:tcPr>
           <w:p>
             <w:pPr>
@@ -8183,7 +8174,7 @@
           <w:tcPr>
             <w:shd w:val="clear" w:color="auto" w:fill="FFFFFF"/>
             <w:vAlign w:val="center"/>
-            <w:tcW w:type="dxa" w:w="1214"/>
+            <w:tcW w:type="dxa" w:w="1074"/>
           </w:tcPr>
           <w:p>
             <w:pPr>
@@ -8203,7 +8194,7 @@
           <w:tcPr>
             <w:shd w:val="clear" w:color="auto" w:fill="FFFFFF"/>
             <w:vAlign w:val="center"/>
-            <w:tcW w:type="dxa" w:w="1214"/>
+            <w:tcW w:type="dxa" w:w="1074"/>
           </w:tcPr>
           <w:p>
             <w:pPr>
@@ -8225,7 +8216,7 @@
           <w:tcPr>
             <w:shd w:val="clear" w:color="auto" w:fill="FFFFFF"/>
             <w:vAlign w:val="center"/>
-            <w:tcW w:type="dxa" w:w="1357"/>
+            <w:tcW w:type="dxa" w:w="1201"/>
           </w:tcPr>
           <w:p>
             <w:pPr>
@@ -8245,7 +8236,7 @@
           <w:tcPr>
             <w:shd w:val="clear" w:color="auto" w:fill="FFFFFF"/>
             <w:vAlign w:val="center"/>
-            <w:tcW w:type="dxa" w:w="1500"/>
+            <w:tcW w:type="dxa" w:w="1328"/>
           </w:tcPr>
           <w:p>
             <w:pPr>
@@ -8265,7 +8256,27 @@
           <w:tcPr>
             <w:shd w:val="clear" w:color="auto" w:fill="FFFFFF"/>
             <w:vAlign w:val="center"/>
-            <w:tcW w:type="dxa" w:w="1214"/>
+            <w:tcW w:type="dxa" w:w="1074"/>
+          </w:tcPr>
+          <w:p>
+            <w:pPr>
+              <w:pStyle w:val="Compact"/>
+              <w:jc w:val="center"/>
+            </w:pPr>
+            <w:r>
+              <w:rPr>
+                <w:rFonts w:ascii="Times New Roman" w:hAnsi="Times New Roman" w:cs="Times New Roman" w:eastAsia="Times New Roman"/>
+                <w:sz w:val="20"/>
+              </w:rPr>
+              <w:t xml:space="preserve">0.2502</w:t>
+            </w:r>
+          </w:p>
+        </w:tc>
+        <w:tc>
+          <w:tcPr>
+            <w:shd w:val="clear" w:color="auto" w:fill="FFFFFF"/>
+            <w:vAlign w:val="center"/>
+            <w:tcW w:type="dxa" w:w="1074"/>
           </w:tcPr>
           <w:p>
             <w:pPr>
@@ -8285,7 +8296,7 @@
           <w:tcPr>
             <w:shd w:val="clear" w:color="auto" w:fill="FFFFFF"/>
             <w:vAlign w:val="center"/>
-            <w:tcW w:type="dxa" w:w="1214"/>
+            <w:tcW w:type="dxa" w:w="1074"/>
           </w:tcPr>
           <w:p>
             <w:pPr>
@@ -8309,7 +8320,7 @@
           <w:tcPr>
             <w:shd w:val="clear" w:color="auto" w:fill="E7E6E6"/>
             <w:vAlign w:val="center"/>
-            <w:tcW w:type="dxa" w:w="1647"/>
+            <w:tcW w:type="dxa" w:w="1461"/>
           </w:tcPr>
           <w:p>
             <w:pPr>
@@ -8329,7 +8340,7 @@
           <w:tcPr>
             <w:shd w:val="clear" w:color="auto" w:fill="E7E6E6"/>
             <w:vAlign w:val="center"/>
-            <w:tcW w:type="dxa" w:w="1214"/>
+            <w:tcW w:type="dxa" w:w="1074"/>
           </w:tcPr>
           <w:p>
             <w:pPr>
@@ -8351,7 +8362,7 @@
           <w:tcPr>
             <w:shd w:val="clear" w:color="auto" w:fill="E7E6E6"/>
             <w:vAlign w:val="center"/>
-            <w:tcW w:type="dxa" w:w="1214"/>
+            <w:tcW w:type="dxa" w:w="1074"/>
           </w:tcPr>
           <w:p>
             <w:pPr>
@@ -8371,7 +8382,7 @@
           <w:tcPr>
             <w:shd w:val="clear" w:color="auto" w:fill="E7E6E6"/>
             <w:vAlign w:val="center"/>
-            <w:tcW w:type="dxa" w:w="1357"/>
+            <w:tcW w:type="dxa" w:w="1201"/>
           </w:tcPr>
           <w:p>
             <w:pPr>
@@ -8391,7 +8402,7 @@
           <w:tcPr>
             <w:shd w:val="clear" w:color="auto" w:fill="E7E6E6"/>
             <w:vAlign w:val="center"/>
-            <w:tcW w:type="dxa" w:w="1500"/>
+            <w:tcW w:type="dxa" w:w="1328"/>
           </w:tcPr>
           <w:p>
             <w:pPr>
@@ -8411,7 +8422,27 @@
           <w:tcPr>
             <w:shd w:val="clear" w:color="auto" w:fill="E7E6E6"/>
             <w:vAlign w:val="center"/>
-            <w:tcW w:type="dxa" w:w="1214"/>
+            <w:tcW w:type="dxa" w:w="1074"/>
+          </w:tcPr>
+          <w:p>
+            <w:pPr>
+              <w:pStyle w:val="Compact"/>
+              <w:jc w:val="center"/>
+            </w:pPr>
+            <w:r>
+              <w:rPr>
+                <w:rFonts w:ascii="Times New Roman" w:hAnsi="Times New Roman" w:cs="Times New Roman" w:eastAsia="Times New Roman"/>
+                <w:sz w:val="20"/>
+              </w:rPr>
+              <w:t xml:space="preserve">0.3051</w:t>
+            </w:r>
+          </w:p>
+        </w:tc>
+        <w:tc>
+          <w:tcPr>
+            <w:shd w:val="clear" w:color="auto" w:fill="E7E6E6"/>
+            <w:vAlign w:val="center"/>
+            <w:tcW w:type="dxa" w:w="1074"/>
           </w:tcPr>
           <w:p>
             <w:pPr>
@@ -8433,7 +8464,7 @@
           <w:tcPr>
             <w:shd w:val="clear" w:color="auto" w:fill="E7E6E6"/>
             <w:vAlign w:val="center"/>
-            <w:tcW w:type="dxa" w:w="1214"/>
+            <w:tcW w:type="dxa" w:w="1074"/>
           </w:tcPr>
           <w:p>
             <w:pPr>
@@ -8455,7 +8486,7 @@
           <w:tcPr>
             <w:shd w:val="clear" w:color="auto" w:fill="FFFFFF"/>
             <w:vAlign w:val="center"/>
-            <w:tcW w:type="dxa" w:w="1647"/>
+            <w:tcW w:type="dxa" w:w="1461"/>
           </w:tcPr>
           <w:p>
             <w:pPr>
@@ -8475,7 +8506,7 @@
           <w:tcPr>
             <w:shd w:val="clear" w:color="auto" w:fill="FFFFFF"/>
             <w:vAlign w:val="center"/>
-            <w:tcW w:type="dxa" w:w="1214"/>
+            <w:tcW w:type="dxa" w:w="1074"/>
           </w:tcPr>
           <w:p>
             <w:pPr>
@@ -8497,7 +8528,7 @@
           <w:tcPr>
             <w:shd w:val="clear" w:color="auto" w:fill="FFFFFF"/>
             <w:vAlign w:val="center"/>
-            <w:tcW w:type="dxa" w:w="1214"/>
+            <w:tcW w:type="dxa" w:w="1074"/>
           </w:tcPr>
           <w:p>
             <w:pPr>
@@ -8517,7 +8548,7 @@
           <w:tcPr>
             <w:shd w:val="clear" w:color="auto" w:fill="FFFFFF"/>
             <w:vAlign w:val="center"/>
-            <w:tcW w:type="dxa" w:w="1357"/>
+            <w:tcW w:type="dxa" w:w="1201"/>
           </w:tcPr>
           <w:p>
             <w:pPr>
@@ -8537,7 +8568,7 @@
           <w:tcPr>
             <w:shd w:val="clear" w:color="auto" w:fill="FFFFFF"/>
             <w:vAlign w:val="center"/>
-            <w:tcW w:type="dxa" w:w="1500"/>
+            <w:tcW w:type="dxa" w:w="1328"/>
           </w:tcPr>
           <w:p>
             <w:pPr>
@@ -8557,7 +8588,27 @@
           <w:tcPr>
             <w:shd w:val="clear" w:color="auto" w:fill="FFFFFF"/>
             <w:vAlign w:val="center"/>
-            <w:tcW w:type="dxa" w:w="1214"/>
+            <w:tcW w:type="dxa" w:w="1074"/>
+          </w:tcPr>
+          <w:p>
+            <w:pPr>
+              <w:pStyle w:val="Compact"/>
+              <w:jc w:val="center"/>
+            </w:pPr>
+            <w:r>
+              <w:rPr>
+                <w:rFonts w:ascii="Times New Roman" w:hAnsi="Times New Roman" w:cs="Times New Roman" w:eastAsia="Times New Roman"/>
+                <w:sz w:val="20"/>
+              </w:rPr>
+              <w:t xml:space="preserve">0.4064</w:t>
+            </w:r>
+          </w:p>
+        </w:tc>
+        <w:tc>
+          <w:tcPr>
+            <w:shd w:val="clear" w:color="auto" w:fill="FFFFFF"/>
+            <w:vAlign w:val="center"/>
+            <w:tcW w:type="dxa" w:w="1074"/>
           </w:tcPr>
           <w:p>
             <w:pPr>
@@ -8579,7 +8630,7 @@
           <w:tcPr>
             <w:shd w:val="clear" w:color="auto" w:fill="FFFFFF"/>
             <w:vAlign w:val="center"/>
-            <w:tcW w:type="dxa" w:w="1214"/>
+            <w:tcW w:type="dxa" w:w="1074"/>
           </w:tcPr>
           <w:p>
             <w:pPr>
@@ -8601,7 +8652,7 @@
           <w:tcPr>
             <w:shd w:val="clear" w:color="auto" w:fill="E7E6E6"/>
             <w:vAlign w:val="center"/>
-            <w:tcW w:type="dxa" w:w="1647"/>
+            <w:tcW w:type="dxa" w:w="1461"/>
           </w:tcPr>
           <w:p>
             <w:pPr>
@@ -8621,7 +8672,7 @@
           <w:tcPr>
             <w:shd w:val="clear" w:color="auto" w:fill="E7E6E6"/>
             <w:vAlign w:val="center"/>
-            <w:tcW w:type="dxa" w:w="1214"/>
+            <w:tcW w:type="dxa" w:w="1074"/>
           </w:tcPr>
           <w:p>
             <w:pPr>
@@ -8643,7 +8694,7 @@
           <w:tcPr>
             <w:shd w:val="clear" w:color="auto" w:fill="E7E6E6"/>
             <w:vAlign w:val="center"/>
-            <w:tcW w:type="dxa" w:w="1214"/>
+            <w:tcW w:type="dxa" w:w="1074"/>
           </w:tcPr>
           <w:p>
             <w:pPr>
@@ -8663,7 +8714,7 @@
           <w:tcPr>
             <w:shd w:val="clear" w:color="auto" w:fill="E7E6E6"/>
             <w:vAlign w:val="center"/>
-            <w:tcW w:type="dxa" w:w="1357"/>
+            <w:tcW w:type="dxa" w:w="1201"/>
           </w:tcPr>
           <w:p>
             <w:pPr>
@@ -8683,7 +8734,7 @@
           <w:tcPr>
             <w:shd w:val="clear" w:color="auto" w:fill="E7E6E6"/>
             <w:vAlign w:val="center"/>
-            <w:tcW w:type="dxa" w:w="1500"/>
+            <w:tcW w:type="dxa" w:w="1328"/>
           </w:tcPr>
           <w:p>
             <w:pPr>
@@ -8703,7 +8754,27 @@
           <w:tcPr>
             <w:shd w:val="clear" w:color="auto" w:fill="E7E6E6"/>
             <w:vAlign w:val="center"/>
-            <w:tcW w:type="dxa" w:w="1214"/>
+            <w:tcW w:type="dxa" w:w="1074"/>
+          </w:tcPr>
+          <w:p>
+            <w:pPr>
+              <w:pStyle w:val="Compact"/>
+              <w:jc w:val="center"/>
+            </w:pPr>
+            <w:r>
+              <w:rPr>
+                <w:rFonts w:ascii="Times New Roman" w:hAnsi="Times New Roman" w:cs="Times New Roman" w:eastAsia="Times New Roman"/>
+                <w:sz w:val="20"/>
+              </w:rPr>
+              <w:t xml:space="preserve">0.4986</w:t>
+            </w:r>
+          </w:p>
+        </w:tc>
+        <w:tc>
+          <w:tcPr>
+            <w:shd w:val="clear" w:color="auto" w:fill="E7E6E6"/>
+            <w:vAlign w:val="center"/>
+            <w:tcW w:type="dxa" w:w="1074"/>
           </w:tcPr>
           <w:p>
             <w:pPr>
@@ -8725,7 +8796,7 @@
           <w:tcPr>
             <w:shd w:val="clear" w:color="auto" w:fill="E7E6E6"/>
             <w:vAlign w:val="center"/>
-            <w:tcW w:type="dxa" w:w="1214"/>
+            <w:tcW w:type="dxa" w:w="1074"/>
           </w:tcPr>
           <w:p>
             <w:pPr>
@@ -8747,7 +8818,7 @@
           <w:tcPr>
             <w:shd w:val="clear" w:color="auto" w:fill="FFFFFF"/>
             <w:vAlign w:val="center"/>
-            <w:tcW w:type="dxa" w:w="1647"/>
+            <w:tcW w:type="dxa" w:w="1461"/>
           </w:tcPr>
           <w:p>
             <w:pPr>
@@ -8767,7 +8838,7 @@
           <w:tcPr>
             <w:shd w:val="clear" w:color="auto" w:fill="FFFFFF"/>
             <w:vAlign w:val="center"/>
-            <w:tcW w:type="dxa" w:w="1214"/>
+            <w:tcW w:type="dxa" w:w="1074"/>
           </w:tcPr>
           <w:p>
             <w:pPr>
@@ -8789,7 +8860,7 @@
           <w:tcPr>
             <w:shd w:val="clear" w:color="auto" w:fill="FFFFFF"/>
             <w:vAlign w:val="center"/>
-            <w:tcW w:type="dxa" w:w="1214"/>
+            <w:tcW w:type="dxa" w:w="1074"/>
           </w:tcPr>
           <w:p>
             <w:pPr>
@@ -8809,7 +8880,7 @@
           <w:tcPr>
             <w:shd w:val="clear" w:color="auto" w:fill="FFFFFF"/>
             <w:vAlign w:val="center"/>
-            <w:tcW w:type="dxa" w:w="1357"/>
+            <w:tcW w:type="dxa" w:w="1201"/>
           </w:tcPr>
           <w:p>
             <w:pPr>
@@ -8829,7 +8900,7 @@
           <w:tcPr>
             <w:shd w:val="clear" w:color="auto" w:fill="FFFFFF"/>
             <w:vAlign w:val="center"/>
-            <w:tcW w:type="dxa" w:w="1500"/>
+            <w:tcW w:type="dxa" w:w="1328"/>
           </w:tcPr>
           <w:p>
             <w:pPr>
@@ -8849,7 +8920,27 @@
           <w:tcPr>
             <w:shd w:val="clear" w:color="auto" w:fill="FFFFFF"/>
             <w:vAlign w:val="center"/>
-            <w:tcW w:type="dxa" w:w="1214"/>
+            <w:tcW w:type="dxa" w:w="1074"/>
+          </w:tcPr>
+          <w:p>
+            <w:pPr>
+              <w:pStyle w:val="Compact"/>
+              <w:jc w:val="center"/>
+            </w:pPr>
+            <w:r>
+              <w:rPr>
+                <w:rFonts w:ascii="Times New Roman" w:hAnsi="Times New Roman" w:cs="Times New Roman" w:eastAsia="Times New Roman"/>
+                <w:sz w:val="20"/>
+              </w:rPr>
+              <w:t xml:space="preserve">0.5696</w:t>
+            </w:r>
+          </w:p>
+        </w:tc>
+        <w:tc>
+          <w:tcPr>
+            <w:shd w:val="clear" w:color="auto" w:fill="FFFFFF"/>
+            <w:vAlign w:val="center"/>
+            <w:tcW w:type="dxa" w:w="1074"/>
           </w:tcPr>
           <w:p>
             <w:pPr>
@@ -8871,7 +8962,7 @@
           <w:tcPr>
             <w:shd w:val="clear" w:color="auto" w:fill="FFFFFF"/>
             <w:vAlign w:val="center"/>
-            <w:tcW w:type="dxa" w:w="1214"/>
+            <w:tcW w:type="dxa" w:w="1074"/>
           </w:tcPr>
           <w:p>
             <w:pPr>
@@ -8893,7 +8984,7 @@
           <w:tcPr>
             <w:shd w:val="clear" w:color="auto" w:fill="E7E6E6"/>
             <w:vAlign w:val="center"/>
-            <w:tcW w:type="dxa" w:w="1647"/>
+            <w:tcW w:type="dxa" w:w="1461"/>
           </w:tcPr>
           <w:p>
             <w:pPr>
@@ -8913,7 +9004,7 @@
           <w:tcPr>
             <w:shd w:val="clear" w:color="auto" w:fill="E7E6E6"/>
             <w:vAlign w:val="center"/>
-            <w:tcW w:type="dxa" w:w="1214"/>
+            <w:tcW w:type="dxa" w:w="1074"/>
           </w:tcPr>
           <w:p>
             <w:pPr>
@@ -8935,7 +9026,7 @@
           <w:tcPr>
             <w:shd w:val="clear" w:color="auto" w:fill="E7E6E6"/>
             <w:vAlign w:val="center"/>
-            <w:tcW w:type="dxa" w:w="1214"/>
+            <w:tcW w:type="dxa" w:w="1074"/>
           </w:tcPr>
           <w:p>
             <w:pPr>
@@ -8955,7 +9046,7 @@
           <w:tcPr>
             <w:shd w:val="clear" w:color="auto" w:fill="E7E6E6"/>
             <w:vAlign w:val="center"/>
-            <w:tcW w:type="dxa" w:w="1357"/>
+            <w:tcW w:type="dxa" w:w="1201"/>
           </w:tcPr>
           <w:p>
             <w:pPr>
@@ -8975,7 +9066,7 @@
           <w:tcPr>
             <w:shd w:val="clear" w:color="auto" w:fill="E7E6E6"/>
             <w:vAlign w:val="center"/>
-            <w:tcW w:type="dxa" w:w="1500"/>
+            <w:tcW w:type="dxa" w:w="1328"/>
           </w:tcPr>
           <w:p>
             <w:pPr>
@@ -8995,7 +9086,27 @@
           <w:tcPr>
             <w:shd w:val="clear" w:color="auto" w:fill="E7E6E6"/>
             <w:vAlign w:val="center"/>
-            <w:tcW w:type="dxa" w:w="1214"/>
+            <w:tcW w:type="dxa" w:w="1074"/>
+          </w:tcPr>
+          <w:p>
+            <w:pPr>
+              <w:pStyle w:val="Compact"/>
+              <w:jc w:val="center"/>
+            </w:pPr>
+            <w:r>
+              <w:rPr>
+                <w:rFonts w:ascii="Times New Roman" w:hAnsi="Times New Roman" w:cs="Times New Roman" w:eastAsia="Times New Roman"/>
+                <w:sz w:val="20"/>
+              </w:rPr>
+              <w:t xml:space="preserve">0.6753</w:t>
+            </w:r>
+          </w:p>
+        </w:tc>
+        <w:tc>
+          <w:tcPr>
+            <w:shd w:val="clear" w:color="auto" w:fill="E7E6E6"/>
+            <w:vAlign w:val="center"/>
+            <w:tcW w:type="dxa" w:w="1074"/>
           </w:tcPr>
           <w:p>
             <w:pPr>
@@ -9017,7 +9128,7 @@
           <w:tcPr>
             <w:shd w:val="clear" w:color="auto" w:fill="E7E6E6"/>
             <w:vAlign w:val="center"/>
-            <w:tcW w:type="dxa" w:w="1214"/>
+            <w:tcW w:type="dxa" w:w="1074"/>
           </w:tcPr>
           <w:p>
             <w:pPr>
@@ -9039,7 +9150,7 @@
           <w:tcPr>
             <w:shd w:val="clear" w:color="auto" w:fill="FFFFFF"/>
             <w:vAlign w:val="center"/>
-            <w:tcW w:type="dxa" w:w="1647"/>
+            <w:tcW w:type="dxa" w:w="1461"/>
           </w:tcPr>
           <w:p>
             <w:pPr>
@@ -9059,7 +9170,7 @@
           <w:tcPr>
             <w:shd w:val="clear" w:color="auto" w:fill="FFFFFF"/>
             <w:vAlign w:val="center"/>
-            <w:tcW w:type="dxa" w:w="1214"/>
+            <w:tcW w:type="dxa" w:w="1074"/>
           </w:tcPr>
           <w:p>
             <w:pPr>
@@ -9081,7 +9192,7 @@
           <w:tcPr>
             <w:shd w:val="clear" w:color="auto" w:fill="FFFFFF"/>
             <w:vAlign w:val="center"/>
-            <w:tcW w:type="dxa" w:w="1214"/>
+            <w:tcW w:type="dxa" w:w="1074"/>
           </w:tcPr>
           <w:p>
             <w:pPr>
@@ -9101,7 +9212,7 @@
           <w:tcPr>
             <w:shd w:val="clear" w:color="auto" w:fill="FFFFFF"/>
             <w:vAlign w:val="center"/>
-            <w:tcW w:type="dxa" w:w="1357"/>
+            <w:tcW w:type="dxa" w:w="1201"/>
           </w:tcPr>
           <w:p>
             <w:pPr>
@@ -9121,7 +9232,7 @@
           <w:tcPr>
             <w:shd w:val="clear" w:color="auto" w:fill="FFFFFF"/>
             <w:vAlign w:val="center"/>
-            <w:tcW w:type="dxa" w:w="1500"/>
+            <w:tcW w:type="dxa" w:w="1328"/>
           </w:tcPr>
           <w:p>
             <w:pPr>
@@ -9141,7 +9252,27 @@
           <w:tcPr>
             <w:shd w:val="clear" w:color="auto" w:fill="FFFFFF"/>
             <w:vAlign w:val="center"/>
-            <w:tcW w:type="dxa" w:w="1214"/>
+            <w:tcW w:type="dxa" w:w="1074"/>
+          </w:tcPr>
+          <w:p>
+            <w:pPr>
+              <w:pStyle w:val="Compact"/>
+              <w:jc w:val="center"/>
+            </w:pPr>
+            <w:r>
+              <w:rPr>
+                <w:rFonts w:ascii="Times New Roman" w:hAnsi="Times New Roman" w:cs="Times New Roman" w:eastAsia="Times New Roman"/>
+                <w:sz w:val="20"/>
+              </w:rPr>
+              <w:t xml:space="preserve">0.7598</w:t>
+            </w:r>
+          </w:p>
+        </w:tc>
+        <w:tc>
+          <w:tcPr>
+            <w:shd w:val="clear" w:color="auto" w:fill="FFFFFF"/>
+            <w:vAlign w:val="center"/>
+            <w:tcW w:type="dxa" w:w="1074"/>
           </w:tcPr>
           <w:p>
             <w:pPr>
@@ -9163,7 +9294,7 @@
           <w:tcPr>
             <w:shd w:val="clear" w:color="auto" w:fill="FFFFFF"/>
             <w:vAlign w:val="center"/>
-            <w:tcW w:type="dxa" w:w="1214"/>
+            <w:tcW w:type="dxa" w:w="1074"/>
           </w:tcPr>
           <w:p>
             <w:pPr>
@@ -9185,7 +9316,7 @@
           <w:tcPr>
             <w:shd w:val="clear" w:color="auto" w:fill="E7E6E6"/>
             <w:vAlign w:val="center"/>
-            <w:tcW w:type="dxa" w:w="1647"/>
+            <w:tcW w:type="dxa" w:w="1461"/>
           </w:tcPr>
           <w:p>
             <w:pPr>
@@ -9205,7 +9336,7 @@
           <w:tcPr>
             <w:shd w:val="clear" w:color="auto" w:fill="E7E6E6"/>
             <w:vAlign w:val="center"/>
-            <w:tcW w:type="dxa" w:w="1214"/>
+            <w:tcW w:type="dxa" w:w="1074"/>
           </w:tcPr>
           <w:p>
             <w:pPr>
@@ -9227,7 +9358,7 @@
           <w:tcPr>
             <w:shd w:val="clear" w:color="auto" w:fill="E7E6E6"/>
             <w:vAlign w:val="center"/>
-            <w:tcW w:type="dxa" w:w="1214"/>
+            <w:tcW w:type="dxa" w:w="1074"/>
           </w:tcPr>
           <w:p>
             <w:pPr>
@@ -9247,7 +9378,7 @@
           <w:tcPr>
             <w:shd w:val="clear" w:color="auto" w:fill="E7E6E6"/>
             <w:vAlign w:val="center"/>
-            <w:tcW w:type="dxa" w:w="1357"/>
+            <w:tcW w:type="dxa" w:w="1201"/>
           </w:tcPr>
           <w:p>
             <w:pPr>
@@ -9267,7 +9398,7 @@
           <w:tcPr>
             <w:shd w:val="clear" w:color="auto" w:fill="E7E6E6"/>
             <w:vAlign w:val="center"/>
-            <w:tcW w:type="dxa" w:w="1500"/>
+            <w:tcW w:type="dxa" w:w="1328"/>
           </w:tcPr>
           <w:p>
             <w:pPr>
@@ -9287,7 +9418,27 @@
           <w:tcPr>
             <w:shd w:val="clear" w:color="auto" w:fill="E7E6E6"/>
             <w:vAlign w:val="center"/>
-            <w:tcW w:type="dxa" w:w="1214"/>
+            <w:tcW w:type="dxa" w:w="1074"/>
+          </w:tcPr>
+          <w:p>
+            <w:pPr>
+              <w:pStyle w:val="Compact"/>
+              <w:jc w:val="center"/>
+            </w:pPr>
+            <w:r>
+              <w:rPr>
+                <w:rFonts w:ascii="Times New Roman" w:hAnsi="Times New Roman" w:cs="Times New Roman" w:eastAsia="Times New Roman"/>
+                <w:sz w:val="20"/>
+              </w:rPr>
+              <w:t xml:space="preserve">0.7972</w:t>
+            </w:r>
+          </w:p>
+        </w:tc>
+        <w:tc>
+          <w:tcPr>
+            <w:shd w:val="clear" w:color="auto" w:fill="E7E6E6"/>
+            <w:vAlign w:val="center"/>
+            <w:tcW w:type="dxa" w:w="1074"/>
           </w:tcPr>
           <w:p>
             <w:pPr>
@@ -9309,7 +9460,7 @@
           <w:tcPr>
             <w:shd w:val="clear" w:color="auto" w:fill="E7E6E6"/>
             <w:vAlign w:val="center"/>
-            <w:tcW w:type="dxa" w:w="1214"/>
+            <w:tcW w:type="dxa" w:w="1074"/>
           </w:tcPr>
           <w:p>
             <w:pPr>
@@ -9331,7 +9482,7 @@
           <w:tcPr>
             <w:shd w:val="clear" w:color="auto" w:fill="FFFFFF"/>
             <w:vAlign w:val="center"/>
-            <w:tcW w:type="dxa" w:w="1647"/>
+            <w:tcW w:type="dxa" w:w="1461"/>
           </w:tcPr>
           <w:p>
             <w:pPr>
@@ -9351,7 +9502,7 @@
           <w:tcPr>
             <w:shd w:val="clear" w:color="auto" w:fill="FFFFFF"/>
             <w:vAlign w:val="center"/>
-            <w:tcW w:type="dxa" w:w="1214"/>
+            <w:tcW w:type="dxa" w:w="1074"/>
           </w:tcPr>
           <w:p>
             <w:pPr>
@@ -9373,7 +9524,7 @@
           <w:tcPr>
             <w:shd w:val="clear" w:color="auto" w:fill="FFFFFF"/>
             <w:vAlign w:val="center"/>
-            <w:tcW w:type="dxa" w:w="1214"/>
+            <w:tcW w:type="dxa" w:w="1074"/>
           </w:tcPr>
           <w:p>
             <w:pPr>
@@ -9393,7 +9544,7 @@
           <w:tcPr>
             <w:shd w:val="clear" w:color="auto" w:fill="FFFFFF"/>
             <w:vAlign w:val="center"/>
-            <w:tcW w:type="dxa" w:w="1357"/>
+            <w:tcW w:type="dxa" w:w="1201"/>
           </w:tcPr>
           <w:p>
             <w:pPr>
@@ -9413,7 +9564,7 @@
           <w:tcPr>
             <w:shd w:val="clear" w:color="auto" w:fill="FFFFFF"/>
             <w:vAlign w:val="center"/>
-            <w:tcW w:type="dxa" w:w="1500"/>
+            <w:tcW w:type="dxa" w:w="1328"/>
           </w:tcPr>
           <w:p>
             <w:pPr>
@@ -9433,7 +9584,27 @@
           <w:tcPr>
             <w:shd w:val="clear" w:color="auto" w:fill="FFFFFF"/>
             <w:vAlign w:val="center"/>
-            <w:tcW w:type="dxa" w:w="1214"/>
+            <w:tcW w:type="dxa" w:w="1074"/>
+          </w:tcPr>
+          <w:p>
+            <w:pPr>
+              <w:pStyle w:val="Compact"/>
+              <w:jc w:val="center"/>
+            </w:pPr>
+            <w:r>
+              <w:rPr>
+                <w:rFonts w:ascii="Times New Roman" w:hAnsi="Times New Roman" w:cs="Times New Roman" w:eastAsia="Times New Roman"/>
+                <w:sz w:val="20"/>
+              </w:rPr>
+              <w:t xml:space="preserve">0.8432</w:t>
+            </w:r>
+          </w:p>
+        </w:tc>
+        <w:tc>
+          <w:tcPr>
+            <w:shd w:val="clear" w:color="auto" w:fill="FFFFFF"/>
+            <w:vAlign w:val="center"/>
+            <w:tcW w:type="dxa" w:w="1074"/>
           </w:tcPr>
           <w:p>
             <w:pPr>
@@ -9455,7 +9626,7 @@
           <w:tcPr>
             <w:shd w:val="clear" w:color="auto" w:fill="FFFFFF"/>
             <w:vAlign w:val="center"/>
-            <w:tcW w:type="dxa" w:w="1214"/>
+            <w:tcW w:type="dxa" w:w="1074"/>
           </w:tcPr>
           <w:p>
             <w:pPr>
@@ -9477,7 +9648,7 @@
           <w:tcPr>
             <w:shd w:val="clear" w:color="auto" w:fill="E7E6E6"/>
             <w:vAlign w:val="center"/>
-            <w:tcW w:type="dxa" w:w="1647"/>
+            <w:tcW w:type="dxa" w:w="1461"/>
           </w:tcPr>
           <w:p>
             <w:pPr>
@@ -9497,7 +9668,7 @@
           <w:tcPr>
             <w:shd w:val="clear" w:color="auto" w:fill="E7E6E6"/>
             <w:vAlign w:val="center"/>
-            <w:tcW w:type="dxa" w:w="1214"/>
+            <w:tcW w:type="dxa" w:w="1074"/>
           </w:tcPr>
           <w:p>
             <w:pPr>
@@ -9519,7 +9690,7 @@
           <w:tcPr>
             <w:shd w:val="clear" w:color="auto" w:fill="E7E6E6"/>
             <w:vAlign w:val="center"/>
-            <w:tcW w:type="dxa" w:w="1214"/>
+            <w:tcW w:type="dxa" w:w="1074"/>
           </w:tcPr>
           <w:p>
             <w:pPr>
@@ -9539,7 +9710,7 @@
           <w:tcPr>
             <w:shd w:val="clear" w:color="auto" w:fill="E7E6E6"/>
             <w:vAlign w:val="center"/>
-            <w:tcW w:type="dxa" w:w="1357"/>
+            <w:tcW w:type="dxa" w:w="1201"/>
           </w:tcPr>
           <w:p>
             <w:pPr>
@@ -9559,7 +9730,7 @@
           <w:tcPr>
             <w:shd w:val="clear" w:color="auto" w:fill="E7E6E6"/>
             <w:vAlign w:val="center"/>
-            <w:tcW w:type="dxa" w:w="1500"/>
+            <w:tcW w:type="dxa" w:w="1328"/>
           </w:tcPr>
           <w:p>
             <w:pPr>
@@ -9579,7 +9750,27 @@
           <w:tcPr>
             <w:shd w:val="clear" w:color="auto" w:fill="E7E6E6"/>
             <w:vAlign w:val="center"/>
-            <w:tcW w:type="dxa" w:w="1214"/>
+            <w:tcW w:type="dxa" w:w="1074"/>
+          </w:tcPr>
+          <w:p>
+            <w:pPr>
+              <w:pStyle w:val="Compact"/>
+              <w:jc w:val="center"/>
+            </w:pPr>
+            <w:r>
+              <w:rPr>
+                <w:rFonts w:ascii="Times New Roman" w:hAnsi="Times New Roman" w:cs="Times New Roman" w:eastAsia="Times New Roman"/>
+                <w:sz w:val="20"/>
+              </w:rPr>
+              <w:t xml:space="preserve">0.4703</w:t>
+            </w:r>
+          </w:p>
+        </w:tc>
+        <w:tc>
+          <w:tcPr>
+            <w:shd w:val="clear" w:color="auto" w:fill="E7E6E6"/>
+            <w:vAlign w:val="center"/>
+            <w:tcW w:type="dxa" w:w="1074"/>
           </w:tcPr>
           <w:p>
             <w:pPr>
@@ -9601,7 +9792,7 @@
           <w:tcPr>
             <w:shd w:val="clear" w:color="auto" w:fill="E7E6E6"/>
             <w:vAlign w:val="center"/>
-            <w:tcW w:type="dxa" w:w="1214"/>
+            <w:tcW w:type="dxa" w:w="1074"/>
           </w:tcPr>
           <w:p>
             <w:pPr>

</xml_diff>

<commit_message>
Paper + README: say what the low-coverage conditioning set actually is
Methods now state that the sparse-PBWT selection is capped at 2,000 haplotypes per sample
in haplotype-index order, that with the default 0.002-cM storage sites the neighbour union
covers nearly the whole panel (5,708-6,332 of 6,332 on the sweep panel, 3,956-4,796 of
4,796 on the capture panel), so the cap keeps an almost fixed low-index subset (exactly
haplotypes 0-1,999 in several measured chunks) and the per-haplotype rare-carrier
augmentation is the target-specific part; and that the rank-order cap (LCWGS_QUAL_TRUNC)
lifts the 0.5x ultra-rare bin above GLIMPSE2 on three seeds but lowers other bins and 1x,
so index order stays the default. Limitations gain the corresponding eighth point. README:
the lcWGS paragraph names the founder phasing HMM the default actually runs (not the
diplotype-mosaic step, which is the opt-out path) and documents the cap and the two knobs.
</commit_message>
<xml_diff>
--- a/paper/selphi2_paper.docx
+++ b/paper/selphi2_paper.docx
@@ -5211,7 +5211,79 @@
         <w:t xml:space="preserve"> </w:t>
       </w:r>
       <w:r>
-        <w:t xml:space="preserve">0.964, matching (and slightly exceeding) its own pre-computed-likelihood path (0.960) and comparable to an equivalent GLIMPSE2 pileup (0.967), confirming the native genotype-likelihood computation reproduces the established pipeline. Imputation proceeds by Gibbs alternation between haplotype selection and a GL-weighted forward-backward pass: each iteration selects a conditioning set of reference haplotypes by sparse PBWT from the current sampled haplotypes, then runs a Li-Stephens forward-backward in which each haplotype’s per-site emission is built conditional on the partner haplotype’s currently sampled allele, decoupling the two haplotypes of a diploid sample into independent copying problems, and samples a fresh allele per site from the resulting posterior. Posterior dosages from the post-burn-in iterations are averaged for the output, written as VCF.gz with</w:t>
+        <w:t xml:space="preserve">0.964, matching (and slightly exceeding) its own pre-computed-likelihood path (0.960) and comparable to an equivalent GLIMPSE2 pileup (0.967), confirming the native genotype-likelihood computation reproduces the established pipeline. Imputation proceeds by Gibbs alternation between haplotype selection and a GL-weighted forward-backward pass: each iteration selects a conditioning set of reference haplotypes by sparse PBWT from the current sampled haplotypes, then runs a Li-Stephens forward-backward in which each haplotype’s per-site emission is built conditional on the partner haplotype’s currently sampled allele, decoupling the two haplotypes of a diploid sample into independent copying problems, and samples a fresh allele per site from the resulting posterior. The selected set is capped at 2,000 haplotypes per sample (</w:t>
+      </w:r>
+      <w:r>
+        <w:rPr>
+          <w:rStyle w:val="VerbatimChar"/>
+        </w:rPr>
+        <w:t xml:space="preserve">LCWGS_KPBWT</w:t>
+      </w:r>
+      <w:r>
+        <w:t xml:space="preserve">). With the default storage-site spacing of 0.002 cM the union of PBWT neighbours across a 16 cM chunk covers nearly the whole panel (5,708 to 6,332 of the 6,332 haplotypes of the coverage-sweep panel; 3,956 to 4,796 of the 4,796 of the capture-library panel), and the cap, applied in haplotype-index order, retains an almost fixed low-index subset, exactly haplotypes 0 to 1,999 in several measured chunks. The target-specific part of the conditioning set is therefore the per-haplotype rare-carrier augmentation described below, not the PBWT ranking itself. A cap in PBWT match-rank order (</w:t>
+      </w:r>
+      <w:r>
+        <w:rPr>
+          <w:rStyle w:val="VerbatimChar"/>
+        </w:rPr>
+        <w:t xml:space="preserve">LCWGS_QUAL_TRUNC</w:t>
+      </w:r>
+      <w:r>
+        <w:t xml:space="preserve">;</w:t>
+      </w:r>
+      <w:r>
+        <w:t xml:space="preserve"> </w:t>
+      </w:r>
+      <w:r>
+        <w:rPr>
+          <w:rStyle w:val="VerbatimChar"/>
+        </w:rPr>
+        <w:t xml:space="preserve">g2</w:t>
+      </w:r>
+      <w:r>
+        <w:t xml:space="preserve"> </w:t>
+      </w:r>
+      <w:r>
+        <w:t xml:space="preserve">reproduces GLIMPSE2’s order) raises the 0.5</w:t>
+      </w:r>
+      <m:oMath>
+        <m:r>
+          <m:rPr>
+            <m:sty m:val="p"/>
+          </m:rPr>
+          <m:t>×</m:t>
+        </m:r>
+      </m:oMath>
+      <w:r>
+        <w:t xml:space="preserve"> </w:t>
+      </w:r>
+      <w:r>
+        <w:t xml:space="preserve">ultra-rare bin of Table 2b from 0.8994 to 0.9059, above GLIMPSE2’s 0.9023, on each of three seeds, but lowers the 5-10% bin at 0.5</w:t>
+      </w:r>
+      <m:oMath>
+        <m:r>
+          <m:rPr>
+            <m:sty m:val="p"/>
+          </m:rPr>
+          <m:t>×</m:t>
+        </m:r>
+      </m:oMath>
+      <w:r>
+        <w:t xml:space="preserve"> </w:t>
+      </w:r>
+      <w:r>
+        <w:t xml:space="preserve">and the ultra-rare and 1-2% bins at 1</w:t>
+      </w:r>
+      <m:oMath>
+        <m:r>
+          <m:rPr>
+            <m:sty m:val="p"/>
+          </m:rPr>
+          <m:t>×</m:t>
+        </m:r>
+      </m:oMath>
+      <w:r>
+        <w:t xml:space="preserve">, where the default already leads, so the index-order cap remains the default. Posterior dosages from the post-burn-in iterations are averaged for the output, written as VCF.gz with</w:t>
       </w:r>
       <w:r>
         <w:t xml:space="preserve"> </w:t>
@@ -5331,7 +5403,7 @@
         <w:t xml:space="preserve"> </w:t>
       </w:r>
       <w:r>
-        <w:t xml:space="preserve">The engine imputes each target sample independently against the reference panel with a genotype-likelihood-aware Li-Stephens forward-backward: sparse-PBWT conditioning-set selection, an eight-founder phasing HMM re-committed at each Gibbs iteration (opt-out</w:t>
+        <w:t xml:space="preserve">The engine imputes each target sample independently against the reference panel with a genotype-likelihood-aware Li-Stephens forward-backward: sparse-PBWT conditioning-set selection (capped as described above), an eight-founder phasing HMM re-committed at each Gibbs iteration (opt-out</w:t>
       </w:r>
       <w:r>
         <w:t xml:space="preserve"> </w:t>
@@ -22116,7 +22188,21 @@
         <w:t xml:space="preserve"> </w:t>
       </w:r>
       <w:r>
-        <w:t xml:space="preserve">VCF that carries genotype-only indel records loses accuracy (chromosome 20, HG004: 92.49% against 98.07% non-reference concordance with those records removed); likelihood files should be restricted to records carrying likelihoods, as here, or the BAM path used. Sixth, heterozygote precision on chromosome 10 is lower than GLIMPSE2’s in both Selphi 2 arms (native -0.48 pp, three of six samples), the one metric on one chromosome in Table 1d where Selphi 2 does not lead. Seventh, QUILT2 was not run on the capture libraries. Finally, a seventh capture library (NA12878) was excluded for the reason given in Methods.</w:t>
+        <w:t xml:space="preserve">VCF that carries genotype-only indel records loses accuracy (chromosome 20, HG004: 92.49% against 98.07% non-reference concordance with those records removed); likelihood files should be restricted to records carrying likelihoods, as here, or the BAM path used. Sixth, heterozygote precision on chromosome 10 is lower than GLIMPSE2’s in both Selphi 2 arms (native -0.48 pp, three of six samples), the one metric on one chromosome in Table 1d where Selphi 2 does not lead. Seventh, QUILT2 was not run on the capture libraries. Eighth, the conditioning set of the low-coverage engine is largely target-independent under the default settings: the PBWT-selected union is capped in haplotype-index order and, because the union covers nearly the whole panel, the cap keeps an almost fixed low-index subset, so the per-haplotype rare-carrier augmentation carries the target-specific information (Methods). A rank-order cap that recovers the ultra-rare bin at 0.5</w:t>
+      </w:r>
+      <m:oMath>
+        <m:r>
+          <m:rPr>
+            <m:sty m:val="p"/>
+          </m:rPr>
+          <m:t>×</m:t>
+        </m:r>
+      </m:oMath>
+      <w:r>
+        <w:t xml:space="preserve"> </w:t>
+      </w:r>
+      <w:r>
+        <w:t xml:space="preserve">lowers other bins, and a cap that preserves both the panel-wide diversity of the fixed subset and the local specificity of the PBWT ranking remains to be designed and measured. Finally, a seventh capture library (NA12878) was excluded for the reason given in Methods.</w:t>
       </w:r>
     </w:p>
     <w:p>

</xml_diff>

<commit_message>
Paper: rebuild the docx from paper/ so the figures are embedded
</commit_message>
<xml_diff>
--- a/paper/selphi2_paper.docx
+++ b/paper/selphi2_paper.docx
@@ -231,7 +231,7 @@
         <w:t xml:space="preserve"> </w:t>
       </w:r>
       <w:r>
-        <w:t xml:space="preserve">at every depth. The same binary phases and imputes genotyping arrays, matching or exceeding Beagle 5.5 at equal phasing and exceeding Beagle’s full pipeline with its own phasing on six consumer arrays against a 75,552-haplotype panel, with lower trio switch-error than SHAPEIT5 and up to 58% less memory than Beagle. It ships as one self-contained x86-64 and ARM64 binary writing five output formats from a single pass.</w:t>
+        <w:t xml:space="preserve">at every depth. The same binary phases and imputes genotyping arrays, matching or exceeding Beagle 5.5 at equal phasing and exceeding Beagle’s full pipeline with its own phasing on six consumer arrays against a 75,552-haplotype panel, with lower trio switch-error than SHAPEIT5, and completes the consumer-array genome in half Beagle’s wall time at a fifth of its peak memory. It ships as one self-contained x86-64 and ARM64 binary writing five output formats from a single pass.</w:t>
       </w:r>
     </w:p>
     <w:bookmarkEnd w:id="10"/>
@@ -5322,7 +5322,7 @@
         <w:rPr>
           <w:vertAlign w:val="superscript"/>
         </w:rPr>
-        <w:t xml:space="preserve">30</w:t>
+        <w:t xml:space="preserve">26</w:t>
       </w:r>
       <w:r>
         <w:t xml:space="preserve"> </w:t>
@@ -5781,7 +5781,7 @@
         <w:rPr>
           <w:vertAlign w:val="superscript"/>
         </w:rPr>
-        <w:t xml:space="preserve">26</w:t>
+        <w:t xml:space="preserve">27</w:t>
       </w:r>
       <w:r>
         <w:t xml:space="preserve">. Empirical switch rates between consecutive variant pairs in the reference panel are computed via XOR-and-popcount operations on the bitmatrix. These switch rates are normalized by expected heterozygosity, median-filtered to remove noise, and used to adjust the genetic map distances while preserving the total genetic length. This prevents inflation of the effective population size estimate in regions of strong LD.</w:t>
@@ -15020,7 +15020,7 @@
         <w:rPr>
           <w:vertAlign w:val="superscript"/>
         </w:rPr>
-        <w:t xml:space="preserve">27</w:t>
+        <w:t xml:space="preserve">28</w:t>
       </w:r>
       <w:r>
         <w:t xml:space="preserve"> </w:t>
@@ -16778,7 +16778,7 @@
         <w:rPr>
           <w:vertAlign w:val="superscript"/>
         </w:rPr>
-        <w:t xml:space="preserve">28</w:t>
+        <w:t xml:space="preserve">29</w:t>
       </w:r>
       <w:r>
         <w:t xml:space="preserve">: the 3,166 1000 Genomes samples (6,332 haplotypes, spanning African, admixed-American, East-Asian, European and Central/South-Asian ancestries) served as the reference panel, and the 925 HGDP individuals as held-out targets, masked to a common-SNP array (common variants thinned to approximately one per 5 kb genome-wide) and imputed back to full sequence density, scored against their full-sequence genotypes. The HGDP cohort includes two continental groups with no representation in the 1000 Genomes panel, Oceanian (n = 30) and Middle-Eastern (n = 157), giving a strict out-of-panel test, alongside groups whose continent is represented but whose specific populations are not (for example Central/South-Asian, n = 183).</w:t>
@@ -21432,7 +21432,7 @@
         <w:rPr>
           <w:vertAlign w:val="superscript"/>
         </w:rPr>
-        <w:t xml:space="preserve">31</w:t>
+        <w:t xml:space="preserve">30</w:t>
       </w:r>
       <w:r>
         <w:t xml:space="preserve"> </w:t>
@@ -22226,7 +22226,7 @@
         <w:rPr>
           <w:vertAlign w:val="superscript"/>
         </w:rPr>
-        <w:t xml:space="preserve">29</w:t>
+        <w:t xml:space="preserve">31</w:t>
       </w:r>
       <w:r>
         <w:t xml:space="preserve">. Two aspects of Selphi 2’s design bear on this. Unlike Selphi 1’s single whole-chromosome PBWT pass, Selphi 2 confines haplotype matching to large overlapping windows (80 cM by default), which bounds the longest contiguous reference segment any single query can expose, the quantity that segment-linking reconstruction attacks exploit. For deployments serving sensitive panels, the panel can additionally be held under controlled access (as the TOPMed and MESA data used here are) and per-query output aggregated or rate-limited. We did not perform a formal privacy analysis; quantifying the reconstruction risk of windowed matching relative to a whole-chromosome scan is a direction for server deployments.</w:t>
@@ -22309,7 +22309,7 @@
         <w:rPr>
           <w:vertAlign w:val="superscript"/>
         </w:rPr>
-        <w:t xml:space="preserve">28</w:t>
+        <w:t xml:space="preserve">29</w:t>
       </w:r>
       <w:r>
         <w:t xml:space="preserve"> </w:t>
@@ -23052,7 +23052,7 @@
         </w:numPr>
       </w:pPr>
       <w:r>
-        <w:t xml:space="preserve">Myers S, Bottolo L, Freeman C, McVean G, Donnelly P. A fine-scale map of recombination rates and hotspots across the human genome.</w:t>
+        <w:t xml:space="preserve">Li H. Improving SNP discovery by base alignment quality.</w:t>
       </w:r>
       <w:r>
         <w:t xml:space="preserve"> </w:t>
@@ -23062,10 +23062,10 @@
           <w:i/>
           <w:iCs/>
         </w:rPr>
-        <w:t xml:space="preserve">Science</w:t>
-      </w:r>
-      <w:r>
-        <w:t xml:space="preserve">. 2005;310(5746):321-324.</w:t>
+        <w:t xml:space="preserve">Bioinformatics</w:t>
+      </w:r>
+      <w:r>
+        <w:t xml:space="preserve">. 2011;27(8):1157-1158.</w:t>
       </w:r>
     </w:p>
     <w:p>
@@ -23077,7 +23077,7 @@
         </w:numPr>
       </w:pPr>
       <w:r>
-        <w:t xml:space="preserve">Bild DE, Bluemke DA, Burke GL, et al. Multi-Ethnic Study of Atherosclerosis: objectives and design.</w:t>
+        <w:t xml:space="preserve">Myers S, Bottolo L, Freeman C, McVean G, Donnelly P. A fine-scale map of recombination rates and hotspots across the human genome.</w:t>
       </w:r>
       <w:r>
         <w:t xml:space="preserve"> </w:t>
@@ -23087,10 +23087,10 @@
           <w:i/>
           <w:iCs/>
         </w:rPr>
-        <w:t xml:space="preserve">Am J Epidemiol</w:t>
-      </w:r>
-      <w:r>
-        <w:t xml:space="preserve">. 2002;156(9):871-881.</w:t>
+        <w:t xml:space="preserve">Science</w:t>
+      </w:r>
+      <w:r>
+        <w:t xml:space="preserve">. 2005;310(5746):321-324.</w:t>
       </w:r>
     </w:p>
     <w:p>
@@ -23102,7 +23102,7 @@
         </w:numPr>
       </w:pPr>
       <w:r>
-        <w:t xml:space="preserve">Koenig Z, Yohannes MT, Nkambule LL, et al. A harmonized public resource of deeply sequenced diverse human genomes.</w:t>
+        <w:t xml:space="preserve">Bild DE, Bluemke DA, Burke GL, et al. Multi-Ethnic Study of Atherosclerosis: objectives and design.</w:t>
       </w:r>
       <w:r>
         <w:t xml:space="preserve"> </w:t>
@@ -23112,10 +23112,10 @@
           <w:i/>
           <w:iCs/>
         </w:rPr>
-        <w:t xml:space="preserve">Genome Res</w:t>
-      </w:r>
-      <w:r>
-        <w:t xml:space="preserve">. 2024;34(5):796-809. doi:10.1101/gr.278378.123.</w:t>
+        <w:t xml:space="preserve">Am J Epidemiol</w:t>
+      </w:r>
+      <w:r>
+        <w:t xml:space="preserve">. 2002;156(9):871-881.</w:t>
       </w:r>
     </w:p>
     <w:p>
@@ -23127,7 +23127,7 @@
         </w:numPr>
       </w:pPr>
       <w:r>
-        <w:t xml:space="preserve">Mosca MJ, Cho H. Reconstruction of private genomes through reference-based genotype imputation.</w:t>
+        <w:t xml:space="preserve">Koenig Z, Yohannes MT, Nkambule LL, et al. A harmonized public resource of deeply sequenced diverse human genomes.</w:t>
       </w:r>
       <w:r>
         <w:t xml:space="preserve"> </w:t>
@@ -23137,10 +23137,10 @@
           <w:i/>
           <w:iCs/>
         </w:rPr>
-        <w:t xml:space="preserve">Genome Biol</w:t>
-      </w:r>
-      <w:r>
-        <w:t xml:space="preserve">. 2023;24(1):271. doi:10.1186/s13059-023-03105-6.</w:t>
+        <w:t xml:space="preserve">Genome Res</w:t>
+      </w:r>
+      <w:r>
+        <w:t xml:space="preserve">. 2024;34(5):796-809. doi:10.1101/gr.278378.123.</w:t>
       </w:r>
     </w:p>
     <w:p>
@@ -23152,7 +23152,7 @@
         </w:numPr>
       </w:pPr>
       <w:r>
-        <w:t xml:space="preserve">Li H. Improving SNP discovery by base alignment quality.</w:t>
+        <w:t xml:space="preserve">Browning BL, Browning SR. Genotype imputation with millions of reference samples.</w:t>
       </w:r>
       <w:r>
         <w:t xml:space="preserve"> </w:t>
@@ -23162,10 +23162,10 @@
           <w:i/>
           <w:iCs/>
         </w:rPr>
-        <w:t xml:space="preserve">Bioinformatics</w:t>
-      </w:r>
-      <w:r>
-        <w:t xml:space="preserve">. 2011;27(8):1157-1158.</w:t>
+        <w:t xml:space="preserve">Am J Hum Genet</w:t>
+      </w:r>
+      <w:r>
+        <w:t xml:space="preserve">. 2016;98(1):116-126.</w:t>
       </w:r>
     </w:p>
     <w:p>
@@ -23177,7 +23177,7 @@
         </w:numPr>
       </w:pPr>
       <w:r>
-        <w:t xml:space="preserve">Browning BL, Browning SR. Genotype imputation with millions of reference samples.</w:t>
+        <w:t xml:space="preserve">Mosca MJ, Cho H. Reconstruction of private genomes through reference-based genotype imputation.</w:t>
       </w:r>
       <w:r>
         <w:t xml:space="preserve"> </w:t>
@@ -23187,10 +23187,10 @@
           <w:i/>
           <w:iCs/>
         </w:rPr>
-        <w:t xml:space="preserve">Am J Hum Genet</w:t>
-      </w:r>
-      <w:r>
-        <w:t xml:space="preserve">. 2016;98(1):116-126.</w:t>
+        <w:t xml:space="preserve">Genome Biol</w:t>
+      </w:r>
+      <w:r>
+        <w:t xml:space="preserve">. 2023;24(1):271. doi:10.1186/s13059-023-03105-6.</w:t>
       </w:r>
     </w:p>
     <w:bookmarkEnd w:id="57"/>

</xml_diff>

<commit_message>
Paper: drop 'landscape', 'crucially', 'actually', 'genuinely'; state the SHAPEIT5 contrast by its interval, not 'significantly'
</commit_message>
<xml_diff>
--- a/paper/selphi2_paper.docx
+++ b/paper/selphi2_paper.docx
@@ -299,7 +299,7 @@
         <w:t xml:space="preserve"> </w:t>
       </w:r>
       <w:r>
-        <w:t xml:space="preserve">for haplotype matching. The current landscape of imputation software is anchored by three widely used tools: IMPUTE5</w:t>
+        <w:t xml:space="preserve">for haplotype matching. Three widely used tools anchor imputation software: IMPUTE5</w:t>
       </w:r>
       <w:r>
         <w:rPr>
@@ -1128,7 +1128,7 @@
         <w:t xml:space="preserve"> </w:t>
       </w:r>
       <w:r>
-        <w:t xml:space="preserve">on the chromosome-22 benchmark. Crucially the members share one phasing chain, so the cost is one phasing plus N imputation passes (the reference-panel read and interpolation are shared), rather than the N independent phasings of a conventional ensemble; on the consumer-array benchmark N = 2 adds ≈25-30 % wall time and raises the diploid engine’s genome-wide SNP</w:t>
+        <w:t xml:space="preserve">on the chromosome-22 benchmark. The members share one phasing chain, so the cost is one phasing plus N imputation passes (the reference-panel read and interpolation are shared), rather than the N independent phasings of a conventional ensemble; on the consumer-array benchmark N = 2 adds ≈25-30 % wall time and raises the diploid engine’s genome-wide SNP</w:t>
       </w:r>
       <w:r>
         <w:t xml:space="preserve"> </w:t>
@@ -13751,7 +13751,7 @@
         <w:t xml:space="preserve"> </w:t>
       </w:r>
       <w:r>
-        <w:t xml:space="preserve">metric (Table 3 reports their per-MAF detail on chromosome 22). In deployment as a full phase-and-impute pipeline from the unphased chip, the mode in which it is actually run, Selphi 2’s own internal phasing lifts its genome-wide overall</w:t>
+        <w:t xml:space="preserve">metric (Table 3 reports their per-MAF detail on chromosome 22). In deployment as a full phase-and-impute pipeline from the unphased chip, as it is deployed, Selphi 2’s own internal phasing lifts its genome-wide overall</w:t>
       </w:r>
       <w:r>
         <w:t xml:space="preserve"> </w:t>
@@ -19231,7 +19231,7 @@
         <w:t xml:space="preserve"> </w:t>
       </w:r>
       <w:r>
-        <w:t xml:space="preserve">mode does here (0.000%). Selphi 2 and Beagle 5.5 instead treat the pedigree as a soft scaffold that still admits HMM-driven phasing where the trio is uninformative (both parents heterozygous), so their residual switch-error rates remain meaningful. The parent-free comparison (Table 6) is therefore the unconfounded measure of phasing quality. There the three tools are close: on chromosome 22 Selphi 2’s diploid engine is statistically indistinguishable from Beagle 5.5 (paired Δ = -0.019 pp, 95% CI [-0.049, +0.009] from 20,000 paired bootstrap resamples, lower in 30 of 54 trios) and significantly lower than SHAPEIT5 (Δ = -0.078 pp, [-0.107, -0.050], 40 of 54 trios), while on chromosome 1 Beagle 5.5 is marginally lowest but again not significantly different from Selphi 2 (Δ = +0.014 pp, [-0.001, +0.027]), and Selphi 2 again leads SHAPEIT5 (Δ = -0.050 pp, [-0.062, -0.038], 47 of 54 trios).</w:t>
+        <w:t xml:space="preserve">mode does here (0.000%). Selphi 2 and Beagle 5.5 instead treat the pedigree as a soft scaffold that still admits HMM-driven phasing where the trio is uninformative (both parents heterozygous), so their residual switch-error rates remain meaningful. The parent-free comparison (Table 6) is therefore the unconfounded measure of phasing quality. There the three tools are close: on chromosome 22 Selphi 2’s diploid engine is statistically indistinguishable from Beagle 5.5 (paired Δ = -0.019 pp, 95% CI [-0.049, +0.009] from 20,000 paired bootstrap resamples, lower in 30 of 54 trios) and lower than SHAPEIT5, with the interval excluding zero (Δ = -0.078 pp, [-0.107, -0.050], 40 of 54 trios), while on chromosome 1 Beagle 5.5 is marginally lowest but again not significantly different from Selphi 2 (Δ = +0.014 pp, [-0.001, +0.027]), and Selphi 2 again leads SHAPEIT5 (Δ = -0.050 pp, [-0.062, -0.038], 47 of 54 trios).</w:t>
       </w:r>
     </w:p>
     <w:p>
@@ -19262,7 +19262,7 @@
         <w:t xml:space="preserve"> </w:t>
       </w:r>
       <w:r>
-        <w:t xml:space="preserve">+0.016 to +0.022 on chromosome 22 and +0.013 to +0.018 on chromosome 1; Table 6c). The paired per-sample gains are significant for all three phasers: on chromosome 22 +0.0048 for Selphi 2 (95% CI [+0.0032, +0.0063], 46 of 54 samples), +0.0079 for Beagle and +0.0079 for SHAPEIT5, and on chromosome 1 +0.0035, +0.0046 and +0.0036 respectively (all 54 of 54 samples; every CI excludes zero). Because the truth is the child’s own genome rather than the parents, this is an out-of-sample confirmation that the pedigree yields genuinely better haplotypes for downstream imputation; without it the three phasers are practically interchangeable as imputation input (per-sample</w:t>
+        <w:t xml:space="preserve">+0.016 to +0.022 on chromosome 22 and +0.013 to +0.018 on chromosome 1; Table 6c). The paired per-sample gains are significant for all three phasers: on chromosome 22 +0.0048 for Selphi 2 (95% CI [+0.0032, +0.0063], 46 of 54 samples), +0.0079 for Beagle and +0.0079 for SHAPEIT5, and on chromosome 1 +0.0035, +0.0046 and +0.0036 respectively (all 54 of 54 samples; every CI excludes zero). Because the truth is the child’s own genome rather than the parents, this is an out-of-sample confirmation that the pedigree yields better haplotypes for downstream imputation; without it the three phasers are practically interchangeable as imputation input (per-sample</w:t>
       </w:r>
       <w:r>
         <w:t xml:space="preserve"> </w:t>
@@ -21259,7 +21259,7 @@
         <w:pStyle w:val="BodyText"/>
       </w:pPr>
       <w:r>
-        <w:t xml:space="preserve">Selphi 2 occupies a different position in the imputation landscape from the four main existing tools. Beagle 5.5</w:t>
+        <w:t xml:space="preserve">Selphi 2 differs in scope from the four main existing tools. Beagle 5.5</w:t>
       </w:r>
       <w:r>
         <w:rPr>
@@ -21739,7 +21739,7 @@
         <w:t xml:space="preserve"> </w:t>
       </w:r>
       <w:r>
-        <w:t xml:space="preserve">by +0.007 to +0.011 in favour of Selphi 2 regardless of which tool produced the phasing (Supplementary Table S7). This is consistent with the near-tied switch-error rates on common variants (Table 6): array sites are predominantly common, where modern phasers agree closely, so phasing quality is not the limiting factor for array-based imputation, and Selphi 2’s consistent imputation advantage is a property of its imputer rather than its phasing. Re-deriving the phase of an already-well-phased reference panel with Selphi 2 was likewise net-neutral-to-negative on this benchmark (a small gain on common variants offset by a loss at the rarest bin), so a panel’s published phasing is best retained (Supplementary Table S8). The pedigree result (Table 6c) is the informative exception: where phasing draws on genuinely new information (parental genotypes), it improves downstream imputation against an independent truth (+0.016 to +0.022</w:t>
+        <w:t xml:space="preserve">by +0.007 to +0.011 in favour of Selphi 2 regardless of which tool produced the phasing (Supplementary Table S7). This is consistent with the near-tied switch-error rates on common variants (Table 6): array sites are predominantly common, where modern phasers agree closely, so phasing quality is not the limiting factor for array-based imputation, and Selphi 2’s consistent imputation advantage is a property of its imputer rather than its phasing. Re-deriving the phase of an already-well-phased reference panel with Selphi 2 was likewise net-neutral-to-negative on this benchmark (a small gain on common variants offset by a loss at the rarest bin), so a panel’s published phasing is best retained (Supplementary Table S8). The pedigree result (Table 6c) is the informative exception: where phasing draws on new information (parental genotypes), it improves downstream imputation against an independent truth (+0.016 to +0.022</w:t>
       </w:r>
       <w:r>
         <w:t xml:space="preserve"> </w:t>
@@ -21832,7 +21832,7 @@
         </m:sSup>
       </m:oMath>
       <w:r>
-        <w:t xml:space="preserve">; Supplementary Tables S1 and S9); the chromosome-wide PBWT statistic underlying Selphi’s candidate selection is, by construction, biased toward longer-range matches and may underweight single-carrier haplotypes whose informative segment is short. In full-pipeline mode, the mode in which Selphi 2 is actually run, it leads at this bin as well (Table 3). Second, the diploid engine, Selphi 2’s default, dominates the haploid engine across the benchmarks: it matches or exceeds it on SNP</w:t>
+        <w:t xml:space="preserve">; Supplementary Tables S1 and S9); the chromosome-wide PBWT statistic underlying Selphi’s candidate selection is, by construction, biased toward longer-range matches and may underweight single-carrier haplotypes whose informative segment is short. In full-pipeline mode, as Selphi 2 is deployed, it leads at this bin as well (Table 3). Second, the diploid engine, Selphi 2’s default, dominates the haploid engine across the benchmarks: it matches or exceeds it on SNP</w:t>
       </w:r>
       <w:r>
         <w:t xml:space="preserve"> </w:t>

</xml_diff>